<commit_message>
Prodotti e Categorie: form di creazione + liste reali + menu sezione Prodotti
- Menu: sezione 'Prodotti' con Prodotti + Categorie
- Categoria (/categories/new): nome, note, AI prompt, campi extra (opzionale/obbligatorio/admin), sconti % per provincia; modello Category esteso (notes, aiPrompt, CategoryField) + migrazione
- Prodotto (/products/new): categoria, tipo, partner, SKU, prezzo/pubblico, giorni prep, immagine, plus, descrizione, campi personalizzati, componenti superprodotto; modello Product esteso (sku, publicPrice, prepDays, imageUrl, shortDesc, line, approved)
- Liste reali prodotti e categorie (con badge tipo/campi/sconti)
- Verificato end-to-end: POST categoria 201 (2 campi + 1 sconto), POST prodotto 201 (SKU, approvato, campo)
- Manuale aggiornato (form categoria: AI prompt/note; form prodotto: campi reali) + Word rigenerato

Co-Authored-By: Claude Opus 4.8 <noreply@anthropic.com>
</commit_message>
<xml_diff>
--- a/deluxy-platform-next/docs/COME-FUNZIONA-APP-DELUXY.docx
+++ b/deluxy-platform-next/docs/COME-FUNZIONA-APP-DELUXY.docx
@@ -3781,6 +3781,81 @@
     </w:p>
     <w:p>
       <w:pPr>
+        <w:numPr>
+          <w:ilvl w:val="0"/>
+          <w:numId w:val="16"/>
+        </w:numPr>
+        <w:spacing w:lineRule="auto"/>
+      </w:pPr>
+      <w:r>
+        <w:rPr>
+          <w:b/>
+        </w:rPr>
+        <w:t xml:space="preserve">Form "Nuovo prodotto"</w:t>
+      </w:r>
+      <w:r>
+        <w:rPr/>
+        <w:t xml:space="preserve"> (verificato): Nome*, Partner, Prodotto Categoria*, SKU, Giorni Preparazione, </w:t>
+      </w:r>
+      <w:r>
+        <w:rPr>
+          <w:b/>
+        </w:rPr>
+        <w:t xml:space="preserve">Plus del prodotto</w:t>
+      </w:r>
+      <w:r>
+        <w:rPr/>
+        <w:t xml:space="preserve"> (max 80 char)*, Descrizione (editor rich text), Prezzo, Prezzo pubblico, Linea, Immagine; flag </w:t>
+      </w:r>
+      <w:r>
+        <w:rPr>
+          <w:b/>
+        </w:rPr>
+        <w:t xml:space="preserve">Non modificabile</w:t>
+      </w:r>
+      <w:r>
+        <w:rPr/>
+        <w:t xml:space="preserve">, </w:t>
+      </w:r>
+      <w:r>
+        <w:rPr>
+          <w:b/>
+        </w:rPr>
+        <w:t xml:space="preserve">Prodotto unico</w:t>
+      </w:r>
+      <w:r>
+        <w:rPr/>
+        <w:t xml:space="preserve">; </w:t>
+      </w:r>
+      <w:r>
+        <w:rPr>
+          <w:b/>
+        </w:rPr>
+        <w:t xml:space="preserve">Inventory management</w:t>
+      </w:r>
+      <w:r>
+        <w:rPr/>
+        <w:t xml:space="preserve"> (Controlla stock, nome alternativo); </w:t>
+      </w:r>
+      <w:r>
+        <w:rPr>
+          <w:b/>
+        </w:rPr>
+        <w:t xml:space="preserve">Shopify connection</w:t>
+      </w:r>
+      <w:r>
+        <w:rPr/>
+        <w:t xml:space="preserve"> (Approvato, Attivo, Not physical, Select platforms + descrizione per piattaforma). </w:t>
+      </w:r>
+      <w:r>
+        <w:rPr>
+          <w:b/>
+        </w:rPr>
+        <w:t xml:space="preserve">[NUOVO — campi del form prodotto]</w:t>
+      </w:r>
+    </w:p>
+    <w:p>
+      <w:pPr>
         <w:pStyle w:val="Heading4"/>
         <w:spacing w:lineRule="auto"/>
       </w:pPr>
@@ -3813,7 +3888,53 @@
       </w:r>
       <w:r>
         <w:rPr/>
-        <w:t xml:space="preserve">): 63 categorie (es. Fiori, Fiori Classici, Fiori d'Arte, Torte, Dolci, Box Regalo, Cappelliere, Palloncini, Accessori, B2B Colazione/Break/Lunch/Aperitivo, Ghirlande, Abbonamento Fiori, Regalistica Natale…). Per categoria: % di sconto per provincia (genera automaticamente prodotti scontati) e campi testuali obbligatori / opzionali / solo Admin.</w:t>
+        <w:t xml:space="preserve">): 63 categorie (es. Fiori, Fiori Classici, Fiori d'Arte, Torte, Dolci, Box Regalo, Cappelliere, Palloncini, Accessori, B2B Colazione/Break/Lunch/Aperitivo, Ghirlande, Abbonamento Fiori, Regalistica Natale…). </w:t>
+      </w:r>
+      <w:r>
+        <w:rPr>
+          <w:b/>
+        </w:rPr>
+        <w:t xml:space="preserve">Form "Nuova categoria"</w:t>
+      </w:r>
+      <w:r>
+        <w:rPr/>
+        <w:t xml:space="preserve"> (verificato): Nome*, Note, </w:t>
+      </w:r>
+      <w:r>
+        <w:rPr>
+          <w:b/>
+        </w:rPr>
+        <w:t xml:space="preserve">AI Prompt</w:t>
+      </w:r>
+      <w:r>
+        <w:rPr/>
+        <w:t xml:space="preserve"> (per generazione AI, es. torte), </w:t>
+      </w:r>
+      <w:r>
+        <w:rPr>
+          <w:b/>
+        </w:rPr>
+        <w:t xml:space="preserve">Extra fields</w:t>
+      </w:r>
+      <w:r>
+        <w:rPr/>
+        <w:t xml:space="preserve"> (nome campo + tipo: Opzionale / Obbligatorio / solo Admin), </w:t>
+      </w:r>
+      <w:r>
+        <w:rPr>
+          <w:b/>
+        </w:rPr>
+        <w:t xml:space="preserve">Province discounts</w:t>
+      </w:r>
+      <w:r>
+        <w:rPr/>
+        <w:t xml:space="preserve"> (provincia + % di sconto → genera automaticamente prodotti scontati arrotondati a 0/5). </w:t>
+      </w:r>
+      <w:r>
+        <w:rPr>
+          <w:b/>
+        </w:rPr>
+        <w:t xml:space="preserve">[NUOVO — AI Prompt e Note sul form categoria]</w:t>
       </w:r>
     </w:p>
     <w:p>

</xml_diff>

<commit_message>
Form: tasto Duplica su tutti i form + SKU prodotto automatico
- SKU prodotto generato dal backend (DXY-NNNNN progressivo), rigenerato a ogni creazione/duplicazione; campo SKU nel form ora read-only 'Generato automaticamente'
- Tasto 'Duplica' in fondo a tutti i form di creazione (partner, valet, consegna, operatore, categoria, prodotto): salva e mantiene i valori compilati per crearne un altro, con banner di conferma
- Verificato: SKU auto DXY-00008/00009 (diversi, formato ok, valore manuale ignorato); flusso Duplica prodotto (resta in pagina, banner, valori mantenuti)
- Manuale (changelog) + handoff aggiornati; Word rigenerato

Co-Authored-By: Claude Opus 4.8 <noreply@anthropic.com>
</commit_message>
<xml_diff>
--- a/deluxy-platform-next/docs/COME-FUNZIONA-APP-DELUXY.docx
+++ b/deluxy-platform-next/docs/COME-FUNZIONA-APP-DELUXY.docx
@@ -169,6 +169,60 @@
           <w:b/>
         </w:rPr>
         <w:t xml:space="preserve">Changelog</w:t>
+      </w:r>
+      <w:r>
+        <w:rPr>
+          <w:b/>
+        </w:rPr>
+        <w:t xml:space="preserve">15/07/2026 — nuovo ambiente: form Categorie e Prodotti (con AI prompt, campi extra, sconti provincia, tipo/componenti); menu con sezione Prodotti e sezione Utenti; ruoli operatore (Operation/Finance/Project Manager/Customer Service). </w:t>
+      </w:r>
+      <w:r>
+        <w:rPr>
+          <w:b/>
+        </w:rPr>
+        <w:t xml:space="preserve">Convenzioni nuovo ambiente</w:t>
+      </w:r>
+      <w:r>
+        <w:rPr>
+          <w:b/>
+        </w:rPr>
+        <w:t xml:space="preserve">: ogni form di creazione ha un tasto </w:t>
+      </w:r>
+      <w:r>
+        <w:rPr>
+          <w:b/>
+        </w:rPr>
+        <w:t xml:space="preserve">Duplica</w:t>
+      </w:r>
+      <w:r>
+        <w:rPr>
+          <w:b/>
+        </w:rPr>
+        <w:t xml:space="preserve"> (salva e mantiene i valori per un nuovo record); lo </w:t>
+      </w:r>
+      <w:r>
+        <w:rPr>
+          <w:b/>
+        </w:rPr>
+        <w:t xml:space="preserve">SKU prodotto è generato automaticamente</w:t>
+      </w:r>
+      <w:r>
+        <w:rPr>
+          <w:b/>
+        </w:rPr>
+        <w:t xml:space="preserve"> (</w:t>
+      </w:r>
+      <w:r>
+        <w:rPr>
+          <w:b/>
+        </w:rPr>
+        <w:t xml:space="preserve">DXY-NNNNN</w:t>
+      </w:r>
+      <w:r>
+        <w:rPr>
+          <w:b/>
+        </w:rPr>
+        <w:t xml:space="preserve">, rigenerato a ogni creazione/duplicazione).</w:t>
       </w:r>
       <w:r>
         <w:rPr>

</xml_diff>

<commit_message>
Prodotto: form allineato all'app reale (varianti, multi-partner, piattaforme, flag)
- Varianti: flag 'ha varianti' + titolo opzione + varianti con prezzo e SKU auto (DXY-NNNNN-KK)
- Partner aggiuntivi (PRODUCTS PARTNER), piattaforme di vendita (Deluxy/Cakes/Flowers/Business/Experience/DotCom)
- Flag: non modificabile, controlla stock (+giacenza), non fisico, super provincia, nome alternativo
- Schema: ProductVariant, ProductPartnerLink, campi platforms/stock/flags; migrazione product_variants_platforms
- Verificato end-to-end: POST prodotto 201 con 3 varianti (SKU DXY-00011-01/02/03), 2 partner, piattaforme, stock
- Manuale (form prodotto completo) + Word rigenerati

Nota: ricontrollati TUTTI i form vs app reale. Restano da allineare: Partner (agency/PEC/promemoria/tipo codice consegna) e Consegna (prezzo flessibile, Vendita Deluxy, valet servizio, da fatturare/pagare, smsPhoneNo, file DDT).

Co-Authored-By: Claude Opus 4.8 <noreply@anthropic.com>
</commit_message>
<xml_diff>
--- a/deluxy-platform-next/docs/COME-FUNZIONA-APP-DELUXY.docx
+++ b/deluxy-platform-next/docs/COME-FUNZIONA-APP-DELUXY.docx
@@ -3849,7 +3849,17 @@
       </w:r>
       <w:r>
         <w:rPr/>
-        <w:t xml:space="preserve"> (verificato): Nome*, Partner, Prodotto Categoria*, SKU, Giorni Preparazione, </w:t>
+        <w:t xml:space="preserve"> (verificato campo-per-campo): sezioni </w:t>
+      </w:r>
+      <w:r>
+        <w:rPr>
+          <w:b/>
+        </w:rPr>
+        <w:t xml:space="preserve">DETTAGLI</w:t>
+      </w:r>
+      <w:r>
+        <w:rPr/>
+        <w:t xml:space="preserve"> (Nome*, Partner, Categoria*, SKU, Giorni Preparazione, </w:t>
       </w:r>
       <w:r>
         <w:rPr>
@@ -3859,53 +3869,83 @@
       </w:r>
       <w:r>
         <w:rPr/>
-        <w:t xml:space="preserve"> (max 80 char)*, Descrizione (editor rich text), Prezzo, Prezzo pubblico, Linea, Immagine; flag </w:t>
-      </w:r>
-      <w:r>
-        <w:rPr>
-          <w:b/>
-        </w:rPr>
-        <w:t xml:space="preserve">Non modificabile</w:t>
-      </w:r>
-      <w:r>
-        <w:rPr/>
-        <w:t xml:space="preserve">, </w:t>
-      </w:r>
-      <w:r>
-        <w:rPr>
-          <w:b/>
-        </w:rPr>
-        <w:t xml:space="preserve">Prodotto unico</w:t>
-      </w:r>
-      <w:r>
-        <w:rPr/>
-        <w:t xml:space="preserve">; </w:t>
-      </w:r>
-      <w:r>
-        <w:rPr>
-          <w:b/>
-        </w:rPr>
-        <w:t xml:space="preserve">Inventory management</w:t>
-      </w:r>
-      <w:r>
-        <w:rPr/>
-        <w:t xml:space="preserve"> (Controlla stock, nome alternativo); </w:t>
-      </w:r>
-      <w:r>
-        <w:rPr>
-          <w:b/>
-        </w:rPr>
-        <w:t xml:space="preserve">Shopify connection</w:t>
-      </w:r>
-      <w:r>
-        <w:rPr/>
-        <w:t xml:space="preserve"> (Approvato, Attivo, Not physical, Select platforms + descrizione per piattaforma). </w:t>
-      </w:r>
-      <w:r>
-        <w:rPr>
-          <w:b/>
-        </w:rPr>
-        <w:t xml:space="preserve">[NUOVO — campi del form prodotto]</w:t>
+        <w:t xml:space="preserve"> max 80*, Descrizione rich text, Prezzo, Prezzo pubblico, Linea, Immagine; flag Non modificabile, Prodotto unico), </w:t>
+      </w:r>
+      <w:r>
+        <w:rPr>
+          <w:b/>
+        </w:rPr>
+        <w:t xml:space="preserve">INVENTORY MANAGEMENT</w:t>
+      </w:r>
+      <w:r>
+        <w:rPr/>
+        <w:t xml:space="preserve"> (Controlla stock, Nome alternativo + Usa nome alternativo), </w:t>
+      </w:r>
+      <w:r>
+        <w:rPr>
+          <w:b/>
+        </w:rPr>
+        <w:t xml:space="preserve">SHOPIFY CONNECTION</w:t>
+      </w:r>
+      <w:r>
+        <w:rPr/>
+        <w:t xml:space="preserve"> (Approvato, Attivo, Not physical, </w:t>
+      </w:r>
+      <w:r>
+        <w:rPr>
+          <w:b/>
+        </w:rPr>
+        <w:t xml:space="preserve">SELECT PLATFORMS</w:t>
+      </w:r>
+      <w:r>
+        <w:rPr/>
+        <w:t xml:space="preserve">: Deluxy/Cakes/Flowers/Business/Experience/DotCom + descrizione per piattaforma, image manager), </w:t>
+      </w:r>
+      <w:r>
+        <w:rPr>
+          <w:b/>
+        </w:rPr>
+        <w:t xml:space="preserve">PRODUCTS PARTNER</w:t>
+      </w:r>
+      <w:r>
+        <w:rPr/>
+        <w:t xml:space="preserve"> (partner aggiuntivi che vendono il prodotto), </w:t>
+      </w:r>
+      <w:r>
+        <w:rPr>
+          <w:b/>
+        </w:rPr>
+        <w:t xml:space="preserve">SUPER PRODOTTO</w:t>
+      </w:r>
+      <w:r>
+        <w:rPr/>
+        <w:t xml:space="preserve"> (componenti), </w:t>
+      </w:r>
+      <w:r>
+        <w:rPr>
+          <w:b/>
+        </w:rPr>
+        <w:t xml:space="preserve">PRODOTTO VARIANTI</w:t>
+      </w:r>
+      <w:r>
+        <w:rPr/>
+        <w:t xml:space="preserve"> (flag ha varianti + titolo opzione + varianti con prezzo/SKU), </w:t>
+      </w:r>
+      <w:r>
+        <w:rPr>
+          <w:b/>
+        </w:rPr>
+        <w:t xml:space="preserve">CAMPI OBBLIGATORI</w:t>
+      </w:r>
+      <w:r>
+        <w:rPr/>
+        <w:t xml:space="preserve"> (campi testuali). </w:t>
+      </w:r>
+      <w:r>
+        <w:rPr>
+          <w:b/>
+        </w:rPr>
+        <w:t xml:space="preserve">[NUOVO — form prodotto completo, incl. varianti e multi-partner]</w:t>
       </w:r>
     </w:p>
     <w:p>

</xml_diff>

<commit_message>
Partner e Consegna: form allineati all'app reale (verifica campo-per-campo)
Partner: PEC (certifiedEmail), promemoria attivita (activityReminder), tipo codice consegna (UNIQUE_PER_DELIVERY/CUSTOMER selezionabile quando codice richiesto), KM inclusi + extra fuori citta a livello partner. Schema+migrazione partner_extra_fields.

Consegna: Vendita Deluxy (deluxyDelivery), Valet Servizio (valetServiceId), toggle Da fatturare/Da pagare (billable/payable), prezzo flessibile (isFlexiblePrice+flexiblePrice), n. telefono SMS (smsPhoneNo), file DDT (ddtFile). Schema+migrazione delivery_extra_fields.

Verificato end-to-end: partner 201 (PEC, promemoria, tipo codice, KM); consegna 201 (vendita deluxy, flessibile, da fatturare, smsPhoneNo, ddtFile).
Manuale (changelog) + handoff aggiornati; Word rigenerato.

Co-Authored-By: Claude Opus 4.8 <noreply@anthropic.com>
</commit_message>
<xml_diff>
--- a/deluxy-platform-next/docs/COME-FUNZIONA-APP-DELUXY.docx
+++ b/deluxy-platform-next/docs/COME-FUNZIONA-APP-DELUXY.docx
@@ -169,6 +169,48 @@
           <w:b/>
         </w:rPr>
         <w:t xml:space="preserve">Changelog</w:t>
+      </w:r>
+      <w:r>
+        <w:rPr>
+          <w:b/>
+        </w:rPr>
+        <w:t xml:space="preserve">15/07/2026 (2) — allineamento form all'app reale campo-per-campo: </w:t>
+      </w:r>
+      <w:r>
+        <w:rPr>
+          <w:b/>
+        </w:rPr>
+        <w:t xml:space="preserve">Prodotto</w:t>
+      </w:r>
+      <w:r>
+        <w:rPr>
+          <w:b/>
+        </w:rPr>
+        <w:t xml:space="preserve"> (varianti con prezzo/SKU, multi-partner PRODUCTS PARTNER, piattaforme, controlla stock, non modificabile, super provincia, nome alternativo); </w:t>
+      </w:r>
+      <w:r>
+        <w:rPr>
+          <w:b/>
+        </w:rPr>
+        <w:t xml:space="preserve">Partner</w:t>
+      </w:r>
+      <w:r>
+        <w:rPr>
+          <w:b/>
+        </w:rPr>
+        <w:t xml:space="preserve"> (PEC, promemoria attività, tipo codice consegna UNIQUE_PER_DELIVERY/CUSTOMER, KM inclusi/extra fuori città a livello partner); </w:t>
+      </w:r>
+      <w:r>
+        <w:rPr>
+          <w:b/>
+        </w:rPr>
+        <w:t xml:space="preserve">Consegna</w:t>
+      </w:r>
+      <w:r>
+        <w:rPr>
+          <w:b/>
+        </w:rPr>
+        <w:t xml:space="preserve"> (Vendita Deluxy, prezzo flessibile, Valet Servizio, toggle Da fatturare/Da pagare, n° telefono SMS, file DDT).</w:t>
       </w:r>
       <w:r>
         <w:rPr>

</xml_diff>

<commit_message>
Consegna: fasce orarie consegna/ritiro = dalle-alle solo se flessibile, altrimenti 1 ora
- Default (flag off): un solo orario -> fascia automatica di 1 ora (10:00 -> 10:00-11:00), con hint
- Flag flessibile (consegna e ritiro, indipendenti): compaiono i campi dalle/alle
- Schema+DTO: campo deliveryFlexible (simmetrico a pickupFlexible); migrazione delivery_flexible_windows
- Submit calcola il 'to' = orario + 1h quando non flessibile
- Verificato end-to-end: consegna creata con ritiro 10:00 -> pickupTimeTo 11:00
- Manuale (changelog) + Word aggiornati

Co-Authored-By: Claude Opus 4.8 <noreply@anthropic.com>
</commit_message>
<xml_diff>
--- a/deluxy-platform-next/docs/COME-FUNZIONA-APP-DELUXY.docx
+++ b/deluxy-platform-next/docs/COME-FUNZIONA-APP-DELUXY.docx
@@ -169,6 +169,48 @@
           <w:b/>
         </w:rPr>
         <w:t xml:space="preserve">Changelog</w:t>
+      </w:r>
+      <w:r>
+        <w:rPr>
+          <w:b/>
+        </w:rPr>
+        <w:t xml:space="preserve">15/07/2026 (3) — Form consegna: le fasce orarie di </w:t>
+      </w:r>
+      <w:r>
+        <w:rPr>
+          <w:b/>
+        </w:rPr>
+        <w:t xml:space="preserve">consegna e ritiro</w:t>
+      </w:r>
+      <w:r>
+        <w:rPr>
+          <w:b/>
+        </w:rPr>
+        <w:t xml:space="preserve"> mostrano i campi </w:t>
+      </w:r>
+      <w:r>
+        <w:rPr>
+          <w:b/>
+        </w:rPr>
+        <w:t xml:space="preserve">dalle–alle</w:t>
+      </w:r>
+      <w:r>
+        <w:rPr>
+          <w:b/>
+        </w:rPr>
+        <w:t xml:space="preserve"> solo se il flag "flessibile" è spuntato; altrimenti si sceglie un solo orario e la fascia è </w:t>
+      </w:r>
+      <w:r>
+        <w:rPr>
+          <w:b/>
+        </w:rPr>
+        <w:t xml:space="preserve">automaticamente di 1 ora</w:t>
+      </w:r>
+      <w:r>
+        <w:rPr>
+          <w:b/>
+        </w:rPr>
+        <w:t xml:space="preserve"> (es. 10:00 → 10:00–11:00).</w:t>
       </w:r>
       <w:r>
         <w:rPr>

</xml_diff>

<commit_message>
Consegna/Gestione ordine: prezzo prodotto mostrato + flag prezzo flessibile
- Ogni prodotto mostra il prezzo (base); flag 'Prezzo flessibile' -> prezzo modificabile (precompilato col prezzo base)
- Schema DeliveryProduct: campi price + flexiblePrice; migrazione delivery_product_price
- DTO + service mappano price/flexiblePrice; submit invia il prezzo override solo se flessibile
- Verificato end-to-end: consegna con prodotto prezzo 65, flexiblePrice true
- Manuale (changelog) + Word aggiornati

Co-Authored-By: Claude Opus 4.8 <noreply@anthropic.com>
</commit_message>
<xml_diff>
--- a/deluxy-platform-next/docs/COME-FUNZIONA-APP-DELUXY.docx
+++ b/deluxy-platform-next/docs/COME-FUNZIONA-APP-DELUXY.docx
@@ -169,6 +169,72 @@
           <w:b/>
         </w:rPr>
         <w:t xml:space="preserve">Changelog</w:t>
+      </w:r>
+      <w:r>
+        <w:rPr>
+          <w:b/>
+        </w:rPr>
+        <w:t xml:space="preserve">15/07/2026 (4) — Form consegna, sezione </w:t>
+      </w:r>
+      <w:r>
+        <w:rPr>
+          <w:b/>
+        </w:rPr>
+        <w:t xml:space="preserve">Gestione dell'ordine</w:t>
+      </w:r>
+      <w:r>
+        <w:rPr>
+          <w:b/>
+        </w:rPr>
+        <w:t xml:space="preserve">: ogni prodotto mostra il </w:t>
+      </w:r>
+      <w:r>
+        <w:rPr>
+          <w:b/>
+        </w:rPr>
+        <w:t xml:space="preserve">prezzo</w:t>
+      </w:r>
+      <w:r>
+        <w:rPr>
+          <w:b/>
+        </w:rPr>
+        <w:t xml:space="preserve"> e ha un flag </w:t>
+      </w:r>
+      <w:r>
+        <w:rPr>
+          <w:b/>
+        </w:rPr>
+        <w:t xml:space="preserve">Prezzo flessibile</w:t>
+      </w:r>
+      <w:r>
+        <w:rPr>
+          <w:b/>
+        </w:rPr>
+        <w:t xml:space="preserve"> che ne consente la modifica (precompilato col prezzo base). Il prezzo override è salvato sulla riga della consegna (</w:t>
+      </w:r>
+      <w:r>
+        <w:rPr>
+          <w:b/>
+        </w:rPr>
+        <w:t xml:space="preserve">DeliveryProduct.price</w:t>
+      </w:r>
+      <w:r>
+        <w:rPr>
+          <w:b/>
+        </w:rPr>
+        <w:t xml:space="preserve"> + </w:t>
+      </w:r>
+      <w:r>
+        <w:rPr>
+          <w:b/>
+        </w:rPr>
+        <w:t xml:space="preserve">flexiblePrice</w:t>
+      </w:r>
+      <w:r>
+        <w:rPr>
+          <w:b/>
+        </w:rPr>
+        <w:t xml:space="preserve">).</w:t>
       </w:r>
       <w:r>
         <w:rPr>

</xml_diff>

<commit_message>
Servizio: sezione Setup prenotazione (preavviso, fascia oraria, ora min/max inserimento)
- Form servizio: nuova sezione Setup con Giorni preavviso, Fascia oraria (1/2/4 ore), Ora minima e massima di inserimento giornaliero
- Schema ServiceType: noticeDays, slotHours, minOrderTime, maxOrderTime; migrazione service_booking_setup
- service-types create accetta e salva i campi
- Verificato via API: noticeDays 2, slotHours 2, min 08:00, max 18:00 persistiti
- Manuale (7-bis) + Word aggiornati

Nota: la fascia oraria 1/2/4 ore sara' resa variabile in seguito (come da richiesta).

Co-Authored-By: Claude Opus 4.8 <noreply@anthropic.com>
</commit_message>
<xml_diff>
--- a/deluxy-platform-next/docs/COME-FUNZIONA-APP-DELUXY.docx
+++ b/deluxy-platform-next/docs/COME-FUNZIONA-APP-DELUXY.docx
@@ -5370,6 +5370,107 @@
       <w:r>
         <w:rPr/>
         <w:t xml:space="preserve">).</w:t>
+      </w:r>
+    </w:p>
+    <w:p>
+      <w:pPr>
+        <w:spacing w:lineRule="auto"/>
+      </w:pPr>
+      <w:r>
+        <w:rPr>
+          <w:b/>
+        </w:rPr>
+        <w:t xml:space="preserve">Setup prenotazione del servizio</w:t>
+      </w:r>
+      <w:r>
+        <w:rPr/>
+        <w:t xml:space="preserve"> (usato al momento della richiesta): </w:t>
+      </w:r>
+      <w:r>
+        <w:rPr>
+          <w:b/>
+        </w:rPr>
+        <w:t xml:space="preserve">Giorni preavviso</w:t>
+      </w:r>
+      <w:r>
+        <w:rPr/>
+        <w:t xml:space="preserve">, </w:t>
+      </w:r>
+      <w:r>
+        <w:rPr>
+          <w:b/>
+        </w:rPr>
+        <w:t xml:space="preserve">Fascia oraria</w:t>
+      </w:r>
+      <w:r>
+        <w:rPr/>
+        <w:t xml:space="preserve"> (1 / 2 / 4 ore, da rendere variabile), </w:t>
+      </w:r>
+      <w:r>
+        <w:rPr>
+          <w:b/>
+        </w:rPr>
+        <w:t xml:space="preserve">Ora minima di inserimento</w:t>
+      </w:r>
+      <w:r>
+        <w:rPr/>
+        <w:t xml:space="preserve"> (da quale ora si può richiedere il servizio per la data scelta), </w:t>
+      </w:r>
+      <w:r>
+        <w:rPr>
+          <w:b/>
+        </w:rPr>
+        <w:t xml:space="preserve">Ora massima di inserimento</w:t>
+      </w:r>
+      <w:r>
+        <w:rPr/>
+        <w:t xml:space="preserve"> (dopo quella ora non è più possibile richiederlo per la data scelta). Campi </w:t>
+      </w:r>
+      <w:r>
+        <w:rPr/>
+        <w:t xml:space="preserve">noticeDays</w:t>
+      </w:r>
+      <w:r>
+        <w:rPr/>
+        <w:t xml:space="preserve">, </w:t>
+      </w:r>
+      <w:r>
+        <w:rPr/>
+        <w:t xml:space="preserve">slotHours</w:t>
+      </w:r>
+      <w:r>
+        <w:rPr/>
+        <w:t xml:space="preserve">, </w:t>
+      </w:r>
+      <w:r>
+        <w:rPr/>
+        <w:t xml:space="preserve">minOrderTime</w:t>
+      </w:r>
+      <w:r>
+        <w:rPr/>
+        <w:t xml:space="preserve">, </w:t>
+      </w:r>
+      <w:r>
+        <w:rPr/>
+        <w:t xml:space="preserve">maxOrderTime</w:t>
+      </w:r>
+      <w:r>
+        <w:rPr/>
+        <w:t xml:space="preserve"> su </w:t>
+      </w:r>
+      <w:r>
+        <w:rPr/>
+        <w:t xml:space="preserve">ServiceType</w:t>
+      </w:r>
+      <w:r>
+        <w:rPr/>
+        <w:t xml:space="preserve">. </w:t>
+      </w:r>
+      <w:r>
+        <w:rPr>
+          <w:b/>
+        </w:rPr>
+        <w:t xml:space="preserve">[NUOVO]</w:t>
       </w:r>
     </w:p>
     <w:p>

</xml_diff>

<commit_message>
Consegna: fascia consegna a tendina, ordine campi (servizio→indirizzo), filtro partner/valet per provincia e tipo servizio
- Servizio primo campo, Indirizzo secondo; Data min/default = oggi + giorni preavviso del servizio.
- Fascia consegna non-flessibile = tendina di fasce (min→max servizio, default 06:00-22:00, passo slotHours); flag flessibile consegna solo se il servizio ha allowFlexibleTime. Ritiro invariato.
- Dall'indirizzo si deduce la provincia: mostrati solo partner/valet con quella provincia; partner anche filtrati per tipo di servizio abilitato.
- Backend: nuovo campo ServiceType.allowFlexibleTime + migrazione; seed servizio demo con setup prenotazione.
- Doc COME-FUNZIONA + Word + HANDOFF aggiornati (nota worktree isolato).

Co-Authored-By: Claude Opus 4.8 <noreply@anthropic.com>
</commit_message>
<xml_diff>
--- a/deluxy-platform-next/docs/COME-FUNZIONA-APP-DELUXY.docx
+++ b/deluxy-platform-next/docs/COME-FUNZIONA-APP-DELUXY.docx
@@ -24,7 +24,7 @@
           <w:color w:val="86868b"/>
           <w:sz w:val="18"/>
         </w:rPr>
-        <w:t xml:space="preserve">Word generato automaticamente dal manuale Markdown — 15 luglio 2026</w:t>
+        <w:t xml:space="preserve">Word generato automaticamente dal manuale Markdown — 16 luglio 2026</w:t>
       </w:r>
     </w:p>
     <w:p>
@@ -169,6 +169,270 @@
           <w:b/>
         </w:rPr>
         <w:t xml:space="preserve">Changelog</w:t>
+      </w:r>
+      <w:r>
+        <w:rPr>
+          <w:b/>
+        </w:rPr>
+        <w:t xml:space="preserve">16/07/2026 (2) — Form consegna, </w:t>
+      </w:r>
+      <w:r>
+        <w:rPr>
+          <w:b/>
+        </w:rPr>
+        <w:t xml:space="preserve">ordine e dipendenze dei campi</w:t>
+      </w:r>
+      <w:r>
+        <w:rPr>
+          <w:b/>
+        </w:rPr>
+        <w:t xml:space="preserve">: 1) </w:t>
+      </w:r>
+      <w:r>
+        <w:rPr>
+          <w:b/>
+        </w:rPr>
+        <w:t xml:space="preserve">Servizio</w:t>
+      </w:r>
+      <w:r>
+        <w:rPr>
+          <w:b/>
+        </w:rPr>
+        <w:t xml:space="preserve"> è il primo campo; 2) </w:t>
+      </w:r>
+      <w:r>
+        <w:rPr>
+          <w:b/>
+        </w:rPr>
+        <w:t xml:space="preserve">Indirizzo destinatario</w:t>
+      </w:r>
+      <w:r>
+        <w:rPr>
+          <w:b/>
+        </w:rPr>
+        <w:t xml:space="preserve"> è il secondo; 3) la </w:t>
+      </w:r>
+      <w:r>
+        <w:rPr>
+          <w:b/>
+        </w:rPr>
+        <w:t xml:space="preserve">Data consegna</w:t>
+      </w:r>
+      <w:r>
+        <w:rPr>
+          <w:b/>
+        </w:rPr>
+        <w:t xml:space="preserve"> ha come minimo (e default) </w:t>
+      </w:r>
+      <w:r>
+        <w:rPr>
+          <w:b/>
+        </w:rPr>
+        <w:t xml:space="preserve">oggi + giorni di preavviso</w:t>
+      </w:r>
+      <w:r>
+        <w:rPr>
+          <w:b/>
+        </w:rPr>
+        <w:t xml:space="preserve"> del servizio. Inserito l'indirizzo, il sistema rileva la </w:t>
+      </w:r>
+      <w:r>
+        <w:rPr>
+          <w:b/>
+        </w:rPr>
+        <w:t xml:space="preserve">provincia</w:t>
+      </w:r>
+      <w:r>
+        <w:rPr>
+          <w:b/>
+        </w:rPr>
+        <w:t xml:space="preserve"> e mostra </w:t>
+      </w:r>
+      <w:r>
+        <w:rPr>
+          <w:b/>
+        </w:rPr>
+        <w:t xml:space="preserve">solo i partner e i valet con quella provincia abilitata</w:t>
+      </w:r>
+      <w:r>
+        <w:rPr>
+          <w:b/>
+        </w:rPr>
+        <w:t xml:space="preserve">; inoltre — </w:t>
+      </w:r>
+      <w:r>
+        <w:rPr>
+          <w:b/>
+        </w:rPr>
+        <w:t xml:space="preserve">novità di questo sviluppo</w:t>
+      </w:r>
+      <w:r>
+        <w:rPr>
+          <w:b/>
+        </w:rPr>
+        <w:t xml:space="preserve"> — mostra </w:t>
+      </w:r>
+      <w:r>
+        <w:rPr>
+          <w:b/>
+        </w:rPr>
+        <w:t xml:space="preserve">solo i partner che hanno abilitato quel tipo di servizio</w:t>
+      </w:r>
+      <w:r>
+        <w:rPr>
+          <w:b/>
+        </w:rPr>
+        <w:t xml:space="preserve">. (Nel nuovo ambiente la provincia è dedotta dal testo dell'indirizzo — codice tipo </w:t>
+      </w:r>
+      <w:r>
+        <w:rPr>
+          <w:b/>
+        </w:rPr>
+        <w:t xml:space="preserve">(MI)</w:t>
+      </w:r>
+      <w:r>
+        <w:rPr>
+          <w:b/>
+        </w:rPr>
+        <w:t xml:space="preserve">, nome provincia o città; nell'app reale è geocodificata via Google Maps.)</w:t>
+      </w:r>
+      <w:r>
+        <w:rPr>
+          <w:b/>
+        </w:rPr>
+        <w:t xml:space="preserve">16/07/2026 — Form consegna, </w:t>
+      </w:r>
+      <w:r>
+        <w:rPr>
+          <w:b/>
+        </w:rPr>
+        <w:t xml:space="preserve">fascia oraria di consegna a tendina</w:t>
+      </w:r>
+      <w:r>
+        <w:rPr>
+          <w:b/>
+        </w:rPr>
+        <w:t xml:space="preserve">: quando la consegna </w:t>
+      </w:r>
+      <w:r>
+        <w:rPr>
+          <w:b/>
+        </w:rPr>
+        <w:t xml:space="preserve">non</w:t>
+      </w:r>
+      <w:r>
+        <w:rPr>
+          <w:b/>
+        </w:rPr>
+        <w:t xml:space="preserve"> è flessibile si sceglie una </w:t>
+      </w:r>
+      <w:r>
+        <w:rPr>
+          <w:b/>
+        </w:rPr>
+        <w:t xml:space="preserve">fascia predefinita</w:t>
+      </w:r>
+      <w:r>
+        <w:rPr>
+          <w:b/>
+        </w:rPr>
+        <w:t xml:space="preserve"> da un menu a tendina invece di un orario libero. Le fasce vanno da </w:t>
+      </w:r>
+      <w:r>
+        <w:rPr>
+          <w:b/>
+        </w:rPr>
+        <w:t xml:space="preserve">Ora minima</w:t>
+      </w:r>
+      <w:r>
+        <w:rPr>
+          <w:b/>
+        </w:rPr>
+        <w:t xml:space="preserve"> a </w:t>
+      </w:r>
+      <w:r>
+        <w:rPr>
+          <w:b/>
+        </w:rPr>
+        <w:t xml:space="preserve">Ora massima</w:t>
+      </w:r>
+      <w:r>
+        <w:rPr>
+          <w:b/>
+        </w:rPr>
+        <w:t xml:space="preserve"> del servizio (default </w:t>
+      </w:r>
+      <w:r>
+        <w:rPr>
+          <w:b/>
+        </w:rPr>
+        <w:t xml:space="preserve">06:00–22:00</w:t>
+      </w:r>
+      <w:r>
+        <w:rPr>
+          <w:b/>
+        </w:rPr>
+        <w:t xml:space="preserve">) con durata = </w:t>
+      </w:r>
+      <w:r>
+        <w:rPr>
+          <w:b/>
+        </w:rPr>
+        <w:t xml:space="preserve">Fascia oraria</w:t>
+      </w:r>
+      <w:r>
+        <w:rPr>
+          <w:b/>
+        </w:rPr>
+        <w:t xml:space="preserve"> del servizio (</w:t>
+      </w:r>
+      <w:r>
+        <w:rPr>
+          <w:b/>
+        </w:rPr>
+        <w:t xml:space="preserve">slotHours</w:t>
+      </w:r>
+      <w:r>
+        <w:rPr>
+          <w:b/>
+        </w:rPr>
+        <w:t xml:space="preserve">, default 1 ora). La consegna mostra il flag "flessibile" </w:t>
+      </w:r>
+      <w:r>
+        <w:rPr>
+          <w:b/>
+        </w:rPr>
+        <w:t xml:space="preserve">solo se il servizio lo consente</w:t>
+      </w:r>
+      <w:r>
+        <w:rPr>
+          <w:b/>
+        </w:rPr>
+        <w:t xml:space="preserve"> (nuovo campo servizio </w:t>
+      </w:r>
+      <w:r>
+        <w:rPr>
+          <w:b/>
+        </w:rPr>
+        <w:t xml:space="preserve">allowFlexibleTime</w:t>
+      </w:r>
+      <w:r>
+        <w:rPr>
+          <w:b/>
+        </w:rPr>
+        <w:t xml:space="preserve">); il </w:t>
+      </w:r>
+      <w:r>
+        <w:rPr>
+          <w:b/>
+        </w:rPr>
+        <w:t xml:space="preserve">ritiro</w:t>
+      </w:r>
+      <w:r>
+        <w:rPr>
+          <w:b/>
+        </w:rPr>
+        <w:t xml:space="preserve"> resta sempre con orario flessibile opzionale e fascia automatica di 1 ora.</w:t>
       </w:r>
       <w:r>
         <w:rPr>
@@ -1676,11 +1940,247 @@
         <w:rPr>
           <w:b/>
         </w:rPr>
+        <w:t xml:space="preserve">Ordine e dipendenze dei primi campi (nuovo ambiente)</w:t>
+      </w:r>
+      <w:r>
+        <w:rPr/>
+        <w:t xml:space="preserve">: </w:t>
+      </w:r>
+      <w:r>
+        <w:rPr>
+          <w:b/>
+        </w:rPr>
+        <w:t xml:space="preserve">[NUOVO]</w:t>
+      </w:r>
+    </w:p>
+    <w:p>
+      <w:pPr>
+        <w:numPr>
+          <w:ilvl w:val="0"/>
+          <w:numId w:val="6"/>
+        </w:numPr>
+        <w:spacing w:lineRule="auto"/>
+      </w:pPr>
+      <w:r>
+        <w:rPr>
+          <w:b/>
+        </w:rPr>
+        <w:t xml:space="preserve">Servizio</w:t>
+      </w:r>
+      <w:r>
+        <w:rPr/>
+        <w:t xml:space="preserve"> è il primo campo: determina il preavviso e le fasce orarie di consegna.</w:t>
+      </w:r>
+    </w:p>
+    <w:p>
+      <w:pPr>
+        <w:numPr>
+          <w:ilvl w:val="0"/>
+          <w:numId w:val="6"/>
+        </w:numPr>
+        <w:spacing w:lineRule="auto"/>
+      </w:pPr>
+      <w:r>
+        <w:rPr>
+          <w:b/>
+        </w:rPr>
+        <w:t xml:space="preserve">Indirizzo destinatario</w:t>
+      </w:r>
+      <w:r>
+        <w:rPr/>
+        <w:t xml:space="preserve"> è il secondo campo (obbligatorio): da esso si deduce la </w:t>
+      </w:r>
+      <w:r>
+        <w:rPr>
+          <w:b/>
+        </w:rPr>
+        <w:t xml:space="preserve">provincia</w:t>
+      </w:r>
+      <w:r>
+        <w:rPr/>
+        <w:t xml:space="preserve">.</w:t>
+      </w:r>
+    </w:p>
+    <w:p>
+      <w:pPr>
+        <w:numPr>
+          <w:ilvl w:val="0"/>
+          <w:numId w:val="6"/>
+        </w:numPr>
+        <w:spacing w:lineRule="auto"/>
+      </w:pPr>
+      <w:r>
+        <w:rPr>
+          <w:b/>
+        </w:rPr>
+        <w:t xml:space="preserve">Data consegna</w:t>
+      </w:r>
+      <w:r>
+        <w:rPr/>
+        <w:t xml:space="preserve">: minimo e default = </w:t>
+      </w:r>
+      <w:r>
+        <w:rPr>
+          <w:b/>
+        </w:rPr>
+        <w:t xml:space="preserve">oggi + giorni di preavviso</w:t>
+      </w:r>
+      <w:r>
+        <w:rPr/>
+        <w:t xml:space="preserve"> (</w:t>
+      </w:r>
+      <w:r>
+        <w:rPr/>
+        <w:t xml:space="preserve">noticeDays</w:t>
+      </w:r>
+      <w:r>
+        <w:rPr/>
+        <w:t xml:space="preserve">) del servizio.</w:t>
+      </w:r>
+    </w:p>
+    <w:p>
+      <w:pPr>
+        <w:numPr>
+          <w:ilvl w:val="0"/>
+          <w:numId w:val="6"/>
+        </w:numPr>
+        <w:spacing w:lineRule="auto"/>
+      </w:pPr>
+      <w:r>
+        <w:rPr>
+          <w:b/>
+        </w:rPr>
+        <w:t xml:space="preserve">Partner</w:t>
+      </w:r>
+      <w:r>
+        <w:rPr/>
+        <w:t xml:space="preserve">: mostrati </w:t>
+      </w:r>
+      <w:r>
+        <w:rPr>
+          <w:b/>
+        </w:rPr>
+        <w:t xml:space="preserve">solo i partner con la provincia dell'indirizzo abilitata E che hanno abilitato il tipo di servizio scelto</w:t>
+      </w:r>
+      <w:r>
+        <w:rPr/>
+        <w:t xml:space="preserve"> (il filtro per tipo di servizio è una novità del nuovo ambiente). Il </w:t>
+      </w:r>
+      <w:r>
+        <w:rPr>
+          <w:b/>
+        </w:rPr>
+        <w:t xml:space="preserve">Valet</w:t>
+      </w:r>
+      <w:r>
+        <w:rPr/>
+        <w:t xml:space="preserve"> è filtrato per la sola provincia dell'indirizzo. Se la selezione precedente esce dal filtro, viene azzerata; se nessun partner soddisfa i criteri, un avviso lo segnala.</w:t>
+      </w:r>
+    </w:p>
+    <w:p>
+      <w:pPr>
+        <w:numPr>
+          <w:ilvl w:val="0"/>
+          <w:numId w:val="6"/>
+        </w:numPr>
+        <w:spacing w:lineRule="auto"/>
+      </w:pPr>
+      <w:r>
+        <w:rPr>
+          <w:b/>
+        </w:rPr>
+        <w:t xml:space="preserve">Fascia oraria di consegna</w:t>
+      </w:r>
+      <w:r>
+        <w:rPr/>
+        <w:t xml:space="preserve">: se il servizio </w:t>
+      </w:r>
+      <w:r>
+        <w:rPr>
+          <w:b/>
+        </w:rPr>
+        <w:t xml:space="preserve">non</w:t>
+      </w:r>
+      <w:r>
+        <w:rPr/>
+        <w:t xml:space="preserve"> consente l'orario flessibile (o il flag è disattivo) si sceglie una </w:t>
+      </w:r>
+      <w:r>
+        <w:rPr>
+          <w:b/>
+        </w:rPr>
+        <w:t xml:space="preserve">fascia predefinita a tendina</w:t>
+      </w:r>
+      <w:r>
+        <w:rPr/>
+        <w:t xml:space="preserve"> (da </w:t>
+      </w:r>
+      <w:r>
+        <w:rPr/>
+        <w:t xml:space="preserve">minOrderTime</w:t>
+      </w:r>
+      <w:r>
+        <w:rPr/>
+        <w:t xml:space="preserve"> a </w:t>
+      </w:r>
+      <w:r>
+        <w:rPr/>
+        <w:t xml:space="preserve">maxOrderTime</w:t>
+      </w:r>
+      <w:r>
+        <w:rPr/>
+        <w:t xml:space="preserve">, default 06:00–22:00, durata = </w:t>
+      </w:r>
+      <w:r>
+        <w:rPr/>
+        <w:t xml:space="preserve">slotHours</w:t>
+      </w:r>
+      <w:r>
+        <w:rPr/>
+        <w:t xml:space="preserve">); se consentito e attivo, si indica una fascia libera </w:t>
+      </w:r>
+      <w:r>
+        <w:rPr>
+          <w:b/>
+        </w:rPr>
+        <w:t xml:space="preserve">dalle–alle</w:t>
+      </w:r>
+      <w:r>
+        <w:rPr/>
+        <w:t xml:space="preserve">. Il </w:t>
+      </w:r>
+      <w:r>
+        <w:rPr>
+          <w:b/>
+        </w:rPr>
+        <w:t xml:space="preserve">ritiro</w:t>
+      </w:r>
+      <w:r>
+        <w:rPr/>
+        <w:t xml:space="preserve"> ha sempre il flag flessibile opzionale con fascia automatica di 1 ora.</w:t>
+      </w:r>
+    </w:p>
+    <w:p>
+      <w:pPr>
+        <w:spacing w:lineRule="auto"/>
+      </w:pPr>
+      <w:r>
+        <w:rPr>
+          <w:b/>
+        </w:rPr>
         <w:t xml:space="preserve">Regole</w:t>
       </w:r>
       <w:r>
         <w:rPr/>
-        <w:t xml:space="preserve">: obbligatori giorno, servizio, orario ritiro, nome e cognome destinatario, indirizzo, citofono, prodotto. In base all'indirizzo vengono proposti i partner della provincia. La fascia minima per servizi orari è 1 ora. Il sistema associa automaticamente il tipo servizio partner al salario valet (fisso↔fisso, ora↔ora, vendita↔fisso). Con SMS telefonici parte il messaggio secondo i Modelli SMS (creata/partita/arrivata). Prodotti del partner mostrati per primi in grassetto. Per prezzo fisso: calcolo automatico distanza ritiro→consegna con extra KM per il partner e rimborsi valet. Consegne con stesso DDT: più ritiri in Activities, una sola consegna. Note interne visibili solo ad Admin/Operation/Valet.</w:t>
+        <w:t xml:space="preserve">: obbligatori servizio, indirizzo, data (≥ oggi + preavviso), orario ritiro, nome e cognome destinatario, citofono, prodotto. In base all'indirizzo vengono proposti i partner della provincia (e del tipo di servizio); nell'app reale la provincia è geocodificata via Google Maps, nel nuovo ambiente è dedotta dal testo dell'indirizzo (codice tipo </w:t>
+      </w:r>
+      <w:r>
+        <w:rPr/>
+        <w:t xml:space="preserve">(MI)</w:t>
+      </w:r>
+      <w:r>
+        <w:rPr/>
+        <w:t xml:space="preserve">, nome provincia o città). La fascia minima per servizi orari è 1 ora. Il sistema associa automaticamente il tipo servizio partner al salario valet (fisso↔fisso, ora↔ora, vendita↔fisso). Con SMS telefonici parte il messaggio secondo i Modelli SMS (creata/partita/arrivata). Prodotti del partner mostrati per primi in grassetto. Per prezzo fisso: calcolo automatico distanza ritiro→consegna con extra KM per il partner e rimborsi valet. Consegne con stesso DDT: più ritiri in Activities, una sola consegna. Note interne visibili solo ad Admin/Operation/Valet.</w:t>
       </w:r>
     </w:p>
     <w:p>
@@ -1720,7 +2220,7 @@
       <w:pPr>
         <w:numPr>
           <w:ilvl w:val="0"/>
-          <w:numId w:val="6"/>
+          <w:numId w:val="7"/>
         </w:numPr>
         <w:spacing w:lineRule="auto"/>
       </w:pPr>
@@ -1733,7 +2233,7 @@
       <w:pPr>
         <w:numPr>
           <w:ilvl w:val="0"/>
-          <w:numId w:val="6"/>
+          <w:numId w:val="7"/>
         </w:numPr>
         <w:spacing w:lineRule="auto"/>
       </w:pPr>
@@ -1746,7 +2246,7 @@
       <w:pPr>
         <w:numPr>
           <w:ilvl w:val="0"/>
-          <w:numId w:val="6"/>
+          <w:numId w:val="7"/>
         </w:numPr>
         <w:spacing w:lineRule="auto"/>
       </w:pPr>
@@ -1888,7 +2388,7 @@
       <w:pPr>
         <w:numPr>
           <w:ilvl w:val="0"/>
-          <w:numId w:val="7"/>
+          <w:numId w:val="8"/>
         </w:numPr>
         <w:spacing w:lineRule="auto"/>
       </w:pPr>
@@ -1907,7 +2407,7 @@
       <w:pPr>
         <w:numPr>
           <w:ilvl w:val="0"/>
-          <w:numId w:val="7"/>
+          <w:numId w:val="8"/>
         </w:numPr>
         <w:spacing w:lineRule="auto"/>
       </w:pPr>
@@ -1926,7 +2426,7 @@
       <w:pPr>
         <w:numPr>
           <w:ilvl w:val="0"/>
-          <w:numId w:val="7"/>
+          <w:numId w:val="8"/>
         </w:numPr>
         <w:spacing w:lineRule="auto"/>
       </w:pPr>
@@ -1959,375 +2459,6 @@
       <w:r>
         <w:rPr/>
         <w:t xml:space="preserve">. Significato confermato: </w:t>
-      </w:r>
-      <w:r>
-        <w:rPr>
-          <w:b/>
-        </w:rPr>
-        <w:t xml:space="preserve">[NUOVO]</w:t>
-      </w:r>
-    </w:p>
-    <w:p>
-      <w:pPr>
-        <w:numPr>
-          <w:ilvl w:val="1"/>
-          <w:numId w:val="8"/>
-        </w:numPr>
-        <w:spacing w:lineRule="auto"/>
-      </w:pPr>
-      <w:r>
-        <w:rPr>
-          <w:b/>
-        </w:rPr>
-        <w:t xml:space="preserve">KM INCLUDED</w:t>
-      </w:r>
-      <w:r>
-        <w:rPr/>
-        <w:t xml:space="preserve"> → si applica alle consegne </w:t>
-      </w:r>
-      <w:r>
-        <w:rPr>
-          <w:b/>
-        </w:rPr>
-        <w:t xml:space="preserve">all'interno dello stesso comune</w:t>
-      </w:r>
-      <w:r>
-        <w:rPr/>
-        <w:t xml:space="preserve">: è la soglia di KM inclusi senza sovrapprezzo (per i servizi a prezzo fisso).</w:t>
-      </w:r>
-    </w:p>
-    <w:p>
-      <w:pPr>
-        <w:numPr>
-          <w:ilvl w:val="1"/>
-          <w:numId w:val="8"/>
-        </w:numPr>
-        <w:spacing w:lineRule="auto"/>
-      </w:pPr>
-      <w:r>
-        <w:rPr>
-          <w:b/>
-        </w:rPr>
-        <w:t xml:space="preserve">EXTRA FUORICITTÀ PREZZO</w:t>
-      </w:r>
-      <w:r>
-        <w:rPr/>
-        <w:t xml:space="preserve"> → è il </w:t>
-      </w:r>
-      <w:r>
-        <w:rPr>
-          <w:b/>
-        </w:rPr>
-        <w:t xml:space="preserve">costo per consegne fuori dal comune</w:t>
-      </w:r>
-      <w:r>
-        <w:rPr/>
-        <w:t xml:space="preserve">; il controllo comune/fuori-comune viene fatto </w:t>
-      </w:r>
-      <w:r>
-        <w:rPr>
-          <w:b/>
-        </w:rPr>
-        <w:t xml:space="preserve">all'inserimento di una nuova consegna</w:t>
-      </w:r>
-      <w:r>
-        <w:rPr/>
-        <w:t xml:space="preserve">.</w:t>
-      </w:r>
-    </w:p>
-    <w:p>
-      <w:pPr>
-        <w:numPr>
-          <w:ilvl w:val="0"/>
-          <w:numId w:val="7"/>
-        </w:numPr>
-        <w:spacing w:lineRule="auto"/>
-      </w:pPr>
-      <w:r>
-        <w:rPr>
-          <w:b/>
-        </w:rPr>
-        <w:t xml:space="preserve">Categorie di prodotti</w:t>
-      </w:r>
-      <w:r>
-        <w:rPr/>
-        <w:t xml:space="preserve"> venduti dal partner.</w:t>
-      </w:r>
-    </w:p>
-    <w:p>
-      <w:pPr>
-        <w:numPr>
-          <w:ilvl w:val="0"/>
-          <w:numId w:val="7"/>
-        </w:numPr>
-        <w:spacing w:lineRule="auto"/>
-      </w:pPr>
-      <w:r>
-        <w:rPr>
-          <w:b/>
-        </w:rPr>
-        <w:t xml:space="preserve">Notifiche</w:t>
-      </w:r>
-      <w:r>
-        <w:rPr/>
-        <w:t xml:space="preserve">: possibilità di inviare SMS, notifiche WhatsApp, notifiche mail.</w:t>
-      </w:r>
-    </w:p>
-    <w:p>
-      <w:pPr>
-        <w:numPr>
-          <w:ilvl w:val="0"/>
-          <w:numId w:val="7"/>
-        </w:numPr>
-        <w:spacing w:lineRule="auto"/>
-      </w:pPr>
-      <w:r>
-        <w:rPr>
-          <w:b/>
-        </w:rPr>
-        <w:t xml:space="preserve">Pagamenti e contratto</w:t>
-      </w:r>
-      <w:r>
-        <w:rPr/>
-        <w:t xml:space="preserve">: periodo di validità del contratto (</w:t>
-      </w:r>
-      <w:r>
-        <w:rPr/>
-        <w:t xml:space="preserve">startContractDate</w:t>
-      </w:r>
-      <w:r>
-        <w:rPr/>
-        <w:t xml:space="preserve">/</w:t>
-      </w:r>
-      <w:r>
-        <w:rPr/>
-        <w:t xml:space="preserve">endContractDate</w:t>
-      </w:r>
-      <w:r>
-        <w:rPr/>
-        <w:t xml:space="preserve">), metodo di pagamento (bonifico/carta/SDD), conto bancario (IBAN), nome del conto, CODICE SDI, stato del pagamento (Active/Inactive/Blocked). </w:t>
-      </w:r>
-      <w:r>
-        <w:rPr>
-          <w:b/>
-        </w:rPr>
-        <w:t xml:space="preserve">[NUOVO]</w:t>
-      </w:r>
-      <w:r>
-        <w:rPr/>
-        <w:t xml:space="preserve"> Le date contratto alimentano un job notturno (cron </w:t>
-      </w:r>
-      <w:r>
-        <w:rPr/>
-        <w:t xml:space="preserve">checkingPartnerContract</w:t>
-      </w:r>
-      <w:r>
-        <w:rPr/>
-        <w:t xml:space="preserve">, 03:00) che avvisa alla scadenza del contratto (flag </w:t>
-      </w:r>
-      <w:r>
-        <w:rPr/>
-        <w:t xml:space="preserve">contractExpiryNotificationSent</w:t>
-      </w:r>
-      <w:r>
-        <w:rPr/>
-        <w:t xml:space="preserve">). </w:t>
-      </w:r>
-      <w:r>
-        <w:rPr>
-          <w:b/>
-        </w:rPr>
-        <w:t xml:space="preserve">[NUOVO — da codice backend]</w:t>
-      </w:r>
-    </w:p>
-    <w:p>
-      <w:pPr>
-        <w:numPr>
-          <w:ilvl w:val="0"/>
-          <w:numId w:val="7"/>
-        </w:numPr>
-        <w:spacing w:lineRule="auto"/>
-      </w:pPr>
-      <w:r>
-        <w:rPr>
-          <w:b/>
-        </w:rPr>
-        <w:t xml:space="preserve">Fatturazione &amp; Actions</w:t>
-      </w:r>
-      <w:r>
-        <w:rPr/>
-        <w:t xml:space="preserve">: mail fatturazione (</w:t>
-      </w:r>
-      <w:r>
-        <w:rPr/>
-        <w:t xml:space="preserve">billingEmail</w:t>
-      </w:r>
-      <w:r>
-        <w:rPr/>
-        <w:t xml:space="preserve">) + flag ABILITA FATTURAZIONE (</w:t>
-      </w:r>
-      <w:r>
-        <w:rPr/>
-        <w:t xml:space="preserve">billingAccess</w:t>
-      </w:r>
-      <w:r>
-        <w:rPr/>
-        <w:t xml:space="preserve">).</w:t>
-      </w:r>
-    </w:p>
-    <w:p>
-      <w:pPr>
-        <w:numPr>
-          <w:ilvl w:val="0"/>
-          <w:numId w:val="7"/>
-        </w:numPr>
-        <w:spacing w:lineRule="auto"/>
-      </w:pPr>
-      <w:r>
-        <w:rPr>
-          <w:b/>
-        </w:rPr>
-        <w:t xml:space="preserve">Indirizzo di ritiro multiplo</w:t>
-      </w:r>
-      <w:r>
-        <w:rPr/>
-        <w:t xml:space="preserve">: flag </w:t>
-      </w:r>
-      <w:r>
-        <w:rPr/>
-        <w:t xml:space="preserve">isMultiplePickUpAddress</w:t>
-      </w:r>
-      <w:r>
-        <w:rPr/>
-        <w:t xml:space="preserve">; quando attivo il partner ha una </w:t>
-      </w:r>
-      <w:r>
-        <w:rPr>
-          <w:b/>
-        </w:rPr>
-        <w:t xml:space="preserve">lista di indirizzi di ritiro</w:t>
-      </w:r>
-      <w:r>
-        <w:rPr/>
-        <w:t xml:space="preserve"> (</w:t>
-      </w:r>
-      <w:r>
-        <w:rPr/>
-        <w:t xml:space="preserve">pickupAddresses</w:t>
-      </w:r>
-      <w:r>
-        <w:rPr/>
-        <w:t xml:space="preserve">, array) e </w:t>
-      </w:r>
-      <w:r>
-        <w:rPr>
-          <w:b/>
-        </w:rPr>
-        <w:t xml:space="preserve">al momento della creazione della consegna si sceglie da quale indirizzo ritirare</w:t>
-      </w:r>
-      <w:r>
-        <w:rPr/>
-        <w:t xml:space="preserve">. </w:t>
-      </w:r>
-      <w:r>
-        <w:rPr>
-          <w:b/>
-        </w:rPr>
-        <w:t xml:space="preserve">[NUOVO]</w:t>
-      </w:r>
-    </w:p>
-    <w:p>
-      <w:pPr>
-        <w:numPr>
-          <w:ilvl w:val="0"/>
-          <w:numId w:val="7"/>
-        </w:numPr>
-        <w:spacing w:lineRule="auto"/>
-      </w:pPr>
-      <w:r>
-        <w:rPr>
-          <w:b/>
-        </w:rPr>
-        <w:t xml:space="preserve">Campi di vendita</w:t>
-      </w:r>
-      <w:r>
-        <w:rPr/>
-        <w:t xml:space="preserve">: URL del negozio (</w:t>
-      </w:r>
-      <w:r>
-        <w:rPr/>
-        <w:t xml:space="preserve">partnerShopUrl</w:t>
-      </w:r>
-      <w:r>
-        <w:rPr/>
-        <w:t xml:space="preserve">) + immagine (</w:t>
-      </w:r>
-      <w:r>
-        <w:rPr/>
-        <w:t xml:space="preserve">saleImage</w:t>
-      </w:r>
-      <w:r>
-        <w:rPr/>
-        <w:t xml:space="preserve">), usati nella presentazione delle vendite. </w:t>
-      </w:r>
-      <w:r>
-        <w:rPr>
-          <w:b/>
-        </w:rPr>
-        <w:t xml:space="preserve">[NUOVO]</w:t>
-      </w:r>
-    </w:p>
-    <w:p>
-      <w:pPr>
-        <w:numPr>
-          <w:ilvl w:val="0"/>
-          <w:numId w:val="7"/>
-        </w:numPr>
-        <w:spacing w:lineRule="auto"/>
-      </w:pPr>
-      <w:r>
-        <w:rPr>
-          <w:b/>
-        </w:rPr>
-        <w:t xml:space="preserve">Sicurezza</w:t>
-      </w:r>
-      <w:r>
-        <w:rPr/>
-        <w:t xml:space="preserve">: VERIFICA DELL'IDENTITÀ VALET (</w:t>
-      </w:r>
-      <w:r>
-        <w:rPr/>
-        <w:t xml:space="preserve">checkExpertIndentity</w:t>
-      </w:r>
-      <w:r>
-        <w:rPr/>
-        <w:t xml:space="preserve">) e CODICE DI CONSEGNA RICHIESTO (</w:t>
-      </w:r>
-      <w:r>
-        <w:rPr/>
-        <w:t xml:space="preserve">deliveryCodeCheck</w:t>
-      </w:r>
-      <w:r>
-        <w:rPr/>
-        <w:t xml:space="preserve">) impostabili a livello partner. Il codice ha un </w:t>
-      </w:r>
-      <w:r>
-        <w:rPr>
-          <w:b/>
-        </w:rPr>
-        <w:t xml:space="preserve">tipo</w:t>
-      </w:r>
-      <w:r>
-        <w:rPr/>
-        <w:t xml:space="preserve"> (</w:t>
-      </w:r>
-      <w:r>
-        <w:rPr/>
-        <w:t xml:space="preserve">deliveryCodeCheckType</w:t>
-      </w:r>
-      <w:r>
-        <w:rPr/>
-        <w:t xml:space="preserve">): </w:t>
       </w:r>
       <w:r>
         <w:rPr>
@@ -2345,32 +2476,24 @@
         <w:spacing w:lineRule="auto"/>
       </w:pPr>
       <w:r>
-        <w:rPr/>
-        <w:t xml:space="preserve">UNIQUE_PER_DELIVERY</w:t>
-      </w:r>
-      <w:r>
-        <w:rPr/>
-        <w:t xml:space="preserve"> (default): un </w:t>
-      </w:r>
-      <w:r>
-        <w:rPr>
-          <w:b/>
-        </w:rPr>
-        <w:t xml:space="preserve">codice OTP diverso per ogni consegna</w:t>
-      </w:r>
-      <w:r>
-        <w:rPr/>
-        <w:t xml:space="preserve">, inviato al cliente alla creazione della consegna; il valet può </w:t>
-      </w:r>
-      <w:r>
-        <w:rPr>
-          <w:b/>
-        </w:rPr>
-        <w:t xml:space="preserve">reinviarlo</w:t>
-      </w:r>
-      <w:r>
-        <w:rPr/>
-        <w:t xml:space="preserve"> in fase di consegna.</w:t>
+        <w:rPr>
+          <w:b/>
+        </w:rPr>
+        <w:t xml:space="preserve">KM INCLUDED</w:t>
+      </w:r>
+      <w:r>
+        <w:rPr/>
+        <w:t xml:space="preserve"> → si applica alle consegne </w:t>
+      </w:r>
+      <w:r>
+        <w:rPr>
+          <w:b/>
+        </w:rPr>
+        <w:t xml:space="preserve">all'interno dello stesso comune</w:t>
+      </w:r>
+      <w:r>
+        <w:rPr/>
+        <w:t xml:space="preserve">: è la soglia di KM inclusi senza sovrapprezzo (per i servizi a prezzo fisso).</w:t>
       </w:r>
     </w:p>
     <w:p>
@@ -2382,6 +2505,383 @@
         <w:spacing w:lineRule="auto"/>
       </w:pPr>
       <w:r>
+        <w:rPr>
+          <w:b/>
+        </w:rPr>
+        <w:t xml:space="preserve">EXTRA FUORICITTÀ PREZZO</w:t>
+      </w:r>
+      <w:r>
+        <w:rPr/>
+        <w:t xml:space="preserve"> → è il </w:t>
+      </w:r>
+      <w:r>
+        <w:rPr>
+          <w:b/>
+        </w:rPr>
+        <w:t xml:space="preserve">costo per consegne fuori dal comune</w:t>
+      </w:r>
+      <w:r>
+        <w:rPr/>
+        <w:t xml:space="preserve">; il controllo comune/fuori-comune viene fatto </w:t>
+      </w:r>
+      <w:r>
+        <w:rPr>
+          <w:b/>
+        </w:rPr>
+        <w:t xml:space="preserve">all'inserimento di una nuova consegna</w:t>
+      </w:r>
+      <w:r>
+        <w:rPr/>
+        <w:t xml:space="preserve">.</w:t>
+      </w:r>
+    </w:p>
+    <w:p>
+      <w:pPr>
+        <w:numPr>
+          <w:ilvl w:val="0"/>
+          <w:numId w:val="8"/>
+        </w:numPr>
+        <w:spacing w:lineRule="auto"/>
+      </w:pPr>
+      <w:r>
+        <w:rPr>
+          <w:b/>
+        </w:rPr>
+        <w:t xml:space="preserve">Categorie di prodotti</w:t>
+      </w:r>
+      <w:r>
+        <w:rPr/>
+        <w:t xml:space="preserve"> venduti dal partner.</w:t>
+      </w:r>
+    </w:p>
+    <w:p>
+      <w:pPr>
+        <w:numPr>
+          <w:ilvl w:val="0"/>
+          <w:numId w:val="8"/>
+        </w:numPr>
+        <w:spacing w:lineRule="auto"/>
+      </w:pPr>
+      <w:r>
+        <w:rPr>
+          <w:b/>
+        </w:rPr>
+        <w:t xml:space="preserve">Notifiche</w:t>
+      </w:r>
+      <w:r>
+        <w:rPr/>
+        <w:t xml:space="preserve">: possibilità di inviare SMS, notifiche WhatsApp, notifiche mail.</w:t>
+      </w:r>
+    </w:p>
+    <w:p>
+      <w:pPr>
+        <w:numPr>
+          <w:ilvl w:val="0"/>
+          <w:numId w:val="8"/>
+        </w:numPr>
+        <w:spacing w:lineRule="auto"/>
+      </w:pPr>
+      <w:r>
+        <w:rPr>
+          <w:b/>
+        </w:rPr>
+        <w:t xml:space="preserve">Pagamenti e contratto</w:t>
+      </w:r>
+      <w:r>
+        <w:rPr/>
+        <w:t xml:space="preserve">: periodo di validità del contratto (</w:t>
+      </w:r>
+      <w:r>
+        <w:rPr/>
+        <w:t xml:space="preserve">startContractDate</w:t>
+      </w:r>
+      <w:r>
+        <w:rPr/>
+        <w:t xml:space="preserve">/</w:t>
+      </w:r>
+      <w:r>
+        <w:rPr/>
+        <w:t xml:space="preserve">endContractDate</w:t>
+      </w:r>
+      <w:r>
+        <w:rPr/>
+        <w:t xml:space="preserve">), metodo di pagamento (bonifico/carta/SDD), conto bancario (IBAN), nome del conto, CODICE SDI, stato del pagamento (Active/Inactive/Blocked). </w:t>
+      </w:r>
+      <w:r>
+        <w:rPr>
+          <w:b/>
+        </w:rPr>
+        <w:t xml:space="preserve">[NUOVO]</w:t>
+      </w:r>
+      <w:r>
+        <w:rPr/>
+        <w:t xml:space="preserve"> Le date contratto alimentano un job notturno (cron </w:t>
+      </w:r>
+      <w:r>
+        <w:rPr/>
+        <w:t xml:space="preserve">checkingPartnerContract</w:t>
+      </w:r>
+      <w:r>
+        <w:rPr/>
+        <w:t xml:space="preserve">, 03:00) che avvisa alla scadenza del contratto (flag </w:t>
+      </w:r>
+      <w:r>
+        <w:rPr/>
+        <w:t xml:space="preserve">contractExpiryNotificationSent</w:t>
+      </w:r>
+      <w:r>
+        <w:rPr/>
+        <w:t xml:space="preserve">). </w:t>
+      </w:r>
+      <w:r>
+        <w:rPr>
+          <w:b/>
+        </w:rPr>
+        <w:t xml:space="preserve">[NUOVO — da codice backend]</w:t>
+      </w:r>
+    </w:p>
+    <w:p>
+      <w:pPr>
+        <w:numPr>
+          <w:ilvl w:val="0"/>
+          <w:numId w:val="8"/>
+        </w:numPr>
+        <w:spacing w:lineRule="auto"/>
+      </w:pPr>
+      <w:r>
+        <w:rPr>
+          <w:b/>
+        </w:rPr>
+        <w:t xml:space="preserve">Fatturazione &amp; Actions</w:t>
+      </w:r>
+      <w:r>
+        <w:rPr/>
+        <w:t xml:space="preserve">: mail fatturazione (</w:t>
+      </w:r>
+      <w:r>
+        <w:rPr/>
+        <w:t xml:space="preserve">billingEmail</w:t>
+      </w:r>
+      <w:r>
+        <w:rPr/>
+        <w:t xml:space="preserve">) + flag ABILITA FATTURAZIONE (</w:t>
+      </w:r>
+      <w:r>
+        <w:rPr/>
+        <w:t xml:space="preserve">billingAccess</w:t>
+      </w:r>
+      <w:r>
+        <w:rPr/>
+        <w:t xml:space="preserve">).</w:t>
+      </w:r>
+    </w:p>
+    <w:p>
+      <w:pPr>
+        <w:numPr>
+          <w:ilvl w:val="0"/>
+          <w:numId w:val="8"/>
+        </w:numPr>
+        <w:spacing w:lineRule="auto"/>
+      </w:pPr>
+      <w:r>
+        <w:rPr>
+          <w:b/>
+        </w:rPr>
+        <w:t xml:space="preserve">Indirizzo di ritiro multiplo</w:t>
+      </w:r>
+      <w:r>
+        <w:rPr/>
+        <w:t xml:space="preserve">: flag </w:t>
+      </w:r>
+      <w:r>
+        <w:rPr/>
+        <w:t xml:space="preserve">isMultiplePickUpAddress</w:t>
+      </w:r>
+      <w:r>
+        <w:rPr/>
+        <w:t xml:space="preserve">; quando attivo il partner ha una </w:t>
+      </w:r>
+      <w:r>
+        <w:rPr>
+          <w:b/>
+        </w:rPr>
+        <w:t xml:space="preserve">lista di indirizzi di ritiro</w:t>
+      </w:r>
+      <w:r>
+        <w:rPr/>
+        <w:t xml:space="preserve"> (</w:t>
+      </w:r>
+      <w:r>
+        <w:rPr/>
+        <w:t xml:space="preserve">pickupAddresses</w:t>
+      </w:r>
+      <w:r>
+        <w:rPr/>
+        <w:t xml:space="preserve">, array) e </w:t>
+      </w:r>
+      <w:r>
+        <w:rPr>
+          <w:b/>
+        </w:rPr>
+        <w:t xml:space="preserve">al momento della creazione della consegna si sceglie da quale indirizzo ritirare</w:t>
+      </w:r>
+      <w:r>
+        <w:rPr/>
+        <w:t xml:space="preserve">. </w:t>
+      </w:r>
+      <w:r>
+        <w:rPr>
+          <w:b/>
+        </w:rPr>
+        <w:t xml:space="preserve">[NUOVO]</w:t>
+      </w:r>
+    </w:p>
+    <w:p>
+      <w:pPr>
+        <w:numPr>
+          <w:ilvl w:val="0"/>
+          <w:numId w:val="8"/>
+        </w:numPr>
+        <w:spacing w:lineRule="auto"/>
+      </w:pPr>
+      <w:r>
+        <w:rPr>
+          <w:b/>
+        </w:rPr>
+        <w:t xml:space="preserve">Campi di vendita</w:t>
+      </w:r>
+      <w:r>
+        <w:rPr/>
+        <w:t xml:space="preserve">: URL del negozio (</w:t>
+      </w:r>
+      <w:r>
+        <w:rPr/>
+        <w:t xml:space="preserve">partnerShopUrl</w:t>
+      </w:r>
+      <w:r>
+        <w:rPr/>
+        <w:t xml:space="preserve">) + immagine (</w:t>
+      </w:r>
+      <w:r>
+        <w:rPr/>
+        <w:t xml:space="preserve">saleImage</w:t>
+      </w:r>
+      <w:r>
+        <w:rPr/>
+        <w:t xml:space="preserve">), usati nella presentazione delle vendite. </w:t>
+      </w:r>
+      <w:r>
+        <w:rPr>
+          <w:b/>
+        </w:rPr>
+        <w:t xml:space="preserve">[NUOVO]</w:t>
+      </w:r>
+    </w:p>
+    <w:p>
+      <w:pPr>
+        <w:numPr>
+          <w:ilvl w:val="0"/>
+          <w:numId w:val="8"/>
+        </w:numPr>
+        <w:spacing w:lineRule="auto"/>
+      </w:pPr>
+      <w:r>
+        <w:rPr>
+          <w:b/>
+        </w:rPr>
+        <w:t xml:space="preserve">Sicurezza</w:t>
+      </w:r>
+      <w:r>
+        <w:rPr/>
+        <w:t xml:space="preserve">: VERIFICA DELL'IDENTITÀ VALET (</w:t>
+      </w:r>
+      <w:r>
+        <w:rPr/>
+        <w:t xml:space="preserve">checkExpertIndentity</w:t>
+      </w:r>
+      <w:r>
+        <w:rPr/>
+        <w:t xml:space="preserve">) e CODICE DI CONSEGNA RICHIESTO (</w:t>
+      </w:r>
+      <w:r>
+        <w:rPr/>
+        <w:t xml:space="preserve">deliveryCodeCheck</w:t>
+      </w:r>
+      <w:r>
+        <w:rPr/>
+        <w:t xml:space="preserve">) impostabili a livello partner. Il codice ha un </w:t>
+      </w:r>
+      <w:r>
+        <w:rPr>
+          <w:b/>
+        </w:rPr>
+        <w:t xml:space="preserve">tipo</w:t>
+      </w:r>
+      <w:r>
+        <w:rPr/>
+        <w:t xml:space="preserve"> (</w:t>
+      </w:r>
+      <w:r>
+        <w:rPr/>
+        <w:t xml:space="preserve">deliveryCodeCheckType</w:t>
+      </w:r>
+      <w:r>
+        <w:rPr/>
+        <w:t xml:space="preserve">): </w:t>
+      </w:r>
+      <w:r>
+        <w:rPr>
+          <w:b/>
+        </w:rPr>
+        <w:t xml:space="preserve">[NUOVO]</w:t>
+      </w:r>
+    </w:p>
+    <w:p>
+      <w:pPr>
+        <w:numPr>
+          <w:ilvl w:val="1"/>
+          <w:numId w:val="10"/>
+        </w:numPr>
+        <w:spacing w:lineRule="auto"/>
+      </w:pPr>
+      <w:r>
+        <w:rPr/>
+        <w:t xml:space="preserve">UNIQUE_PER_DELIVERY</w:t>
+      </w:r>
+      <w:r>
+        <w:rPr/>
+        <w:t xml:space="preserve"> (default): un </w:t>
+      </w:r>
+      <w:r>
+        <w:rPr>
+          <w:b/>
+        </w:rPr>
+        <w:t xml:space="preserve">codice OTP diverso per ogni consegna</w:t>
+      </w:r>
+      <w:r>
+        <w:rPr/>
+        <w:t xml:space="preserve">, inviato al cliente alla creazione della consegna; il valet può </w:t>
+      </w:r>
+      <w:r>
+        <w:rPr>
+          <w:b/>
+        </w:rPr>
+        <w:t xml:space="preserve">reinviarlo</w:t>
+      </w:r>
+      <w:r>
+        <w:rPr/>
+        <w:t xml:space="preserve"> in fase di consegna.</w:t>
+      </w:r>
+    </w:p>
+    <w:p>
+      <w:pPr>
+        <w:numPr>
+          <w:ilvl w:val="1"/>
+          <w:numId w:val="10"/>
+        </w:numPr>
+        <w:spacing w:lineRule="auto"/>
+      </w:pPr>
+      <w:r>
         <w:rPr/>
         <w:t xml:space="preserve">UNIQUE_PER_CUSTOMER</w:t>
       </w:r>
@@ -2414,7 +2914,7 @@
       <w:pPr>
         <w:numPr>
           <w:ilvl w:val="0"/>
-          <w:numId w:val="7"/>
+          <w:numId w:val="8"/>
         </w:numPr>
         <w:spacing w:lineRule="auto"/>
       </w:pPr>
@@ -2447,7 +2947,7 @@
       <w:pPr>
         <w:numPr>
           <w:ilvl w:val="0"/>
-          <w:numId w:val="7"/>
+          <w:numId w:val="8"/>
         </w:numPr>
         <w:spacing w:lineRule="auto"/>
       </w:pPr>
@@ -2466,7 +2966,7 @@
       <w:pPr>
         <w:numPr>
           <w:ilvl w:val="0"/>
-          <w:numId w:val="7"/>
+          <w:numId w:val="8"/>
         </w:numPr>
         <w:spacing w:lineRule="auto"/>
       </w:pPr>
@@ -2652,7 +3152,7 @@
       <w:pPr>
         <w:numPr>
           <w:ilvl w:val="0"/>
-          <w:numId w:val="10"/>
+          <w:numId w:val="11"/>
         </w:numPr>
         <w:spacing w:lineRule="auto"/>
       </w:pPr>
@@ -2679,7 +3179,7 @@
       <w:pPr>
         <w:numPr>
           <w:ilvl w:val="0"/>
-          <w:numId w:val="10"/>
+          <w:numId w:val="11"/>
         </w:numPr>
         <w:spacing w:lineRule="auto"/>
       </w:pPr>
@@ -2714,7 +3214,7 @@
       <w:pPr>
         <w:numPr>
           <w:ilvl w:val="0"/>
-          <w:numId w:val="10"/>
+          <w:numId w:val="11"/>
         </w:numPr>
         <w:spacing w:lineRule="auto"/>
       </w:pPr>
@@ -2741,7 +3241,7 @@
       <w:pPr>
         <w:numPr>
           <w:ilvl w:val="0"/>
-          <w:numId w:val="10"/>
+          <w:numId w:val="11"/>
         </w:numPr>
         <w:spacing w:lineRule="auto"/>
       </w:pPr>
@@ -2768,7 +3268,7 @@
       <w:pPr>
         <w:numPr>
           <w:ilvl w:val="0"/>
-          <w:numId w:val="10"/>
+          <w:numId w:val="11"/>
         </w:numPr>
         <w:spacing w:lineRule="auto"/>
       </w:pPr>
@@ -2801,7 +3301,7 @@
       <w:pPr>
         <w:numPr>
           <w:ilvl w:val="0"/>
-          <w:numId w:val="10"/>
+          <w:numId w:val="11"/>
         </w:numPr>
         <w:spacing w:lineRule="auto"/>
       </w:pPr>
@@ -2944,7 +3444,7 @@
       <w:pPr>
         <w:numPr>
           <w:ilvl w:val="0"/>
-          <w:numId w:val="11"/>
+          <w:numId w:val="12"/>
         </w:numPr>
         <w:spacing w:lineRule="auto"/>
       </w:pPr>
@@ -2999,7 +3499,7 @@
       <w:pPr>
         <w:numPr>
           <w:ilvl w:val="0"/>
-          <w:numId w:val="11"/>
+          <w:numId w:val="12"/>
         </w:numPr>
         <w:spacing w:lineRule="auto"/>
       </w:pPr>
@@ -3040,7 +3540,7 @@
       <w:pPr>
         <w:numPr>
           <w:ilvl w:val="0"/>
-          <w:numId w:val="11"/>
+          <w:numId w:val="12"/>
         </w:numPr>
         <w:spacing w:lineRule="auto"/>
       </w:pPr>
@@ -3087,7 +3587,7 @@
       <w:pPr>
         <w:numPr>
           <w:ilvl w:val="0"/>
-          <w:numId w:val="11"/>
+          <w:numId w:val="12"/>
         </w:numPr>
         <w:spacing w:lineRule="auto"/>
       </w:pPr>
@@ -3106,7 +3606,7 @@
       <w:pPr>
         <w:numPr>
           <w:ilvl w:val="0"/>
-          <w:numId w:val="11"/>
+          <w:numId w:val="12"/>
         </w:numPr>
         <w:spacing w:lineRule="auto"/>
       </w:pPr>
@@ -3191,7 +3691,7 @@
       <w:pPr>
         <w:numPr>
           <w:ilvl w:val="0"/>
-          <w:numId w:val="11"/>
+          <w:numId w:val="12"/>
         </w:numPr>
         <w:spacing w:lineRule="auto"/>
       </w:pPr>
@@ -3250,7 +3750,7 @@
       <w:pPr>
         <w:numPr>
           <w:ilvl w:val="0"/>
-          <w:numId w:val="11"/>
+          <w:numId w:val="12"/>
         </w:numPr>
         <w:spacing w:lineRule="auto"/>
       </w:pPr>
@@ -3359,7 +3859,7 @@
       <w:pPr>
         <w:numPr>
           <w:ilvl w:val="0"/>
-          <w:numId w:val="12"/>
+          <w:numId w:val="13"/>
         </w:numPr>
         <w:spacing w:lineRule="auto"/>
       </w:pPr>
@@ -3386,7 +3886,7 @@
       <w:pPr>
         <w:numPr>
           <w:ilvl w:val="0"/>
-          <w:numId w:val="12"/>
+          <w:numId w:val="13"/>
         </w:numPr>
         <w:spacing w:lineRule="auto"/>
       </w:pPr>
@@ -3413,7 +3913,7 @@
       <w:pPr>
         <w:numPr>
           <w:ilvl w:val="0"/>
-          <w:numId w:val="12"/>
+          <w:numId w:val="13"/>
         </w:numPr>
         <w:spacing w:lineRule="auto"/>
       </w:pPr>
@@ -3440,7 +3940,7 @@
       <w:pPr>
         <w:numPr>
           <w:ilvl w:val="0"/>
-          <w:numId w:val="12"/>
+          <w:numId w:val="13"/>
         </w:numPr>
         <w:spacing w:lineRule="auto"/>
       </w:pPr>
@@ -3467,7 +3967,7 @@
       <w:pPr>
         <w:numPr>
           <w:ilvl w:val="0"/>
-          <w:numId w:val="12"/>
+          <w:numId w:val="13"/>
         </w:numPr>
         <w:spacing w:lineRule="auto"/>
       </w:pPr>
@@ -3494,7 +3994,7 @@
       <w:pPr>
         <w:numPr>
           <w:ilvl w:val="0"/>
-          <w:numId w:val="12"/>
+          <w:numId w:val="13"/>
         </w:numPr>
         <w:spacing w:lineRule="auto"/>
       </w:pPr>
@@ -3527,7 +4027,7 @@
       <w:pPr>
         <w:numPr>
           <w:ilvl w:val="0"/>
-          <w:numId w:val="12"/>
+          <w:numId w:val="13"/>
         </w:numPr>
         <w:spacing w:lineRule="auto"/>
       </w:pPr>
@@ -3560,7 +4060,7 @@
       <w:pPr>
         <w:numPr>
           <w:ilvl w:val="0"/>
-          <w:numId w:val="12"/>
+          <w:numId w:val="13"/>
         </w:numPr>
         <w:spacing w:lineRule="auto"/>
       </w:pPr>
@@ -3597,7 +4097,7 @@
       <w:pPr>
         <w:numPr>
           <w:ilvl w:val="0"/>
-          <w:numId w:val="13"/>
+          <w:numId w:val="14"/>
         </w:numPr>
         <w:spacing w:lineRule="auto"/>
       </w:pPr>
@@ -3624,7 +4124,7 @@
       <w:pPr>
         <w:numPr>
           <w:ilvl w:val="0"/>
-          <w:numId w:val="13"/>
+          <w:numId w:val="14"/>
         </w:numPr>
         <w:spacing w:lineRule="auto"/>
       </w:pPr>
@@ -3677,6 +4177,149 @@
       <w:pPr>
         <w:numPr>
           <w:ilvl w:val="1"/>
+          <w:numId w:val="15"/>
+        </w:numPr>
+        <w:spacing w:lineRule="auto"/>
+      </w:pPr>
+      <w:r>
+        <w:rPr>
+          <w:b/>
+        </w:rPr>
+        <w:t xml:space="preserve">Ruolo operatore</w:t>
+      </w:r>
+      <w:r>
+        <w:rPr/>
+        <w:t xml:space="preserve"> (controlla la visibilità delle sezioni del menu): </w:t>
+      </w:r>
+      <w:r>
+        <w:rPr>
+          <w:b/>
+        </w:rPr>
+        <w:t xml:space="preserve">[NUOVO]</w:t>
+      </w:r>
+    </w:p>
+    <w:p>
+      <w:pPr>
+        <w:numPr>
+          <w:ilvl w:val="2"/>
+          <w:numId w:val="16"/>
+        </w:numPr>
+        <w:spacing w:lineRule="auto"/>
+      </w:pPr>
+      <w:r>
+        <w:rPr/>
+        <w:t xml:space="preserve">operation</w:t>
+      </w:r>
+      <w:r>
+        <w:rPr/>
+        <w:t xml:space="preserve"> (base): vede la sezione </w:t>
+      </w:r>
+      <w:r>
+        <w:rPr>
+          <w:b/>
+        </w:rPr>
+        <w:t xml:space="preserve">Operatività</w:t>
+      </w:r>
+      <w:r>
+        <w:rPr/>
+        <w:t xml:space="preserve">, non </w:t>
+      </w:r>
+      <w:r>
+        <w:rPr>
+          <w:b/>
+        </w:rPr>
+        <w:t xml:space="preserve">Amministrazione</w:t>
+      </w:r>
+      <w:r>
+        <w:rPr/>
+        <w:t xml:space="preserve">.</w:t>
+      </w:r>
+    </w:p>
+    <w:p>
+      <w:pPr>
+        <w:numPr>
+          <w:ilvl w:val="2"/>
+          <w:numId w:val="16"/>
+        </w:numPr>
+        <w:spacing w:lineRule="auto"/>
+      </w:pPr>
+      <w:r>
+        <w:rPr/>
+        <w:t xml:space="preserve">finance</w:t>
+      </w:r>
+      <w:r>
+        <w:rPr/>
+        <w:t xml:space="preserve">: vede </w:t>
+      </w:r>
+      <w:r>
+        <w:rPr>
+          <w:b/>
+        </w:rPr>
+        <w:t xml:space="preserve">anche la sezione Amministrazione</w:t>
+      </w:r>
+      <w:r>
+        <w:rPr/>
+        <w:t xml:space="preserve"> (Stipendi, Pagamenti, Regole, Finanza).</w:t>
+      </w:r>
+    </w:p>
+    <w:p>
+      <w:pPr>
+        <w:numPr>
+          <w:ilvl w:val="2"/>
+          <w:numId w:val="16"/>
+        </w:numPr>
+        <w:spacing w:lineRule="auto"/>
+      </w:pPr>
+      <w:r>
+        <w:rPr/>
+        <w:t xml:space="preserve">project_manager</w:t>
+      </w:r>
+      <w:r>
+        <w:rPr/>
+        <w:t xml:space="preserve">: </w:t>
+      </w:r>
+      <w:r>
+        <w:rPr>
+          <w:b/>
+        </w:rPr>
+        <w:t xml:space="preserve">non vede la sezione Operatività</w:t>
+      </w:r>
+      <w:r>
+        <w:rPr/>
+        <w:t xml:space="preserve"> (Consegne, Attività, Vendite).</w:t>
+      </w:r>
+    </w:p>
+    <w:p>
+      <w:pPr>
+        <w:numPr>
+          <w:ilvl w:val="2"/>
+          <w:numId w:val="16"/>
+        </w:numPr>
+        <w:spacing w:lineRule="auto"/>
+      </w:pPr>
+      <w:r>
+        <w:rPr/>
+        <w:t xml:space="preserve">customer_service</w:t>
+      </w:r>
+      <w:r>
+        <w:rPr/>
+        <w:t xml:space="preserve">: </w:t>
+      </w:r>
+      <w:r>
+        <w:rPr>
+          <w:b/>
+        </w:rPr>
+        <w:t xml:space="preserve">non vede la sezione Amministrazione</w:t>
+      </w:r>
+      <w:r>
+        <w:rPr/>
+        <w:t xml:space="preserve">.</w:t>
+      </w:r>
+    </w:p>
+    <w:p>
+      <w:pPr>
+        <w:numPr>
+          <w:ilvl w:val="0"/>
           <w:numId w:val="14"/>
         </w:numPr>
         <w:spacing w:lineRule="auto"/>
@@ -3685,11 +4328,37 @@
         <w:rPr>
           <w:b/>
         </w:rPr>
-        <w:t xml:space="preserve">Ruolo operatore</w:t>
-      </w:r>
-      <w:r>
-        <w:rPr/>
-        <w:t xml:space="preserve"> (controlla la visibilità delle sezioni del menu): </w:t>
+        <w:t xml:space="preserve">Customers</w:t>
+      </w:r>
+      <w:r>
+        <w:rPr/>
+        <w:t xml:space="preserve"> (</w:t>
+      </w:r>
+      <w:r>
+        <w:rPr/>
+        <w:t xml:space="preserve">/customers</w:t>
+      </w:r>
+      <w:r>
+        <w:rPr/>
+        <w:t xml:space="preserve">): 4.092 clienti; colonne: ID, Owner (Admin/Operation/Partner), Partner, Cognome, Nome, Email, Data nascita, Citofono, Telefono, Indirizzo, Note. Azioni: DELIVERY (crea consegna dal cliente), MODIFICA, ELIMINA; AGGIUNGI, ESPORTA, IMPORTARE, formato CSV. Da questa sezione la boutique può </w:t>
+      </w:r>
+      <w:r>
+        <w:rPr>
+          <w:b/>
+        </w:rPr>
+        <w:t xml:space="preserve">rigenerare il codice di consegna "fisso" del cliente</w:t>
+      </w:r>
+      <w:r>
+        <w:rPr/>
+        <w:t xml:space="preserve"> quando il partner usa </w:t>
+      </w:r>
+      <w:r>
+        <w:rPr/>
+        <w:t xml:space="preserve">deliveryCodeCheckType = UNIQUE_PER_CUSTOMER</w:t>
+      </w:r>
+      <w:r>
+        <w:rPr/>
+        <w:t xml:space="preserve"> (vedi 3.3 Sicurezza). </w:t>
       </w:r>
       <w:r>
         <w:rPr>
@@ -3700,135 +4369,258 @@
     </w:p>
     <w:p>
       <w:pPr>
-        <w:numPr>
-          <w:ilvl w:val="2"/>
-          <w:numId w:val="15"/>
-        </w:numPr>
-        <w:spacing w:lineRule="auto"/>
-      </w:pPr>
-      <w:r>
-        <w:rPr/>
-        <w:t xml:space="preserve">operation</w:t>
-      </w:r>
-      <w:r>
-        <w:rPr/>
-        <w:t xml:space="preserve"> (base): vede la sezione </w:t>
-      </w:r>
-      <w:r>
-        <w:rPr>
-          <w:b/>
-        </w:rPr>
-        <w:t xml:space="preserve">Operatività</w:t>
-      </w:r>
-      <w:r>
-        <w:rPr/>
-        <w:t xml:space="preserve">, non </w:t>
-      </w:r>
-      <w:r>
-        <w:rPr>
-          <w:b/>
-        </w:rPr>
-        <w:t xml:space="preserve">Amministrazione</w:t>
-      </w:r>
-      <w:r>
-        <w:rPr/>
-        <w:t xml:space="preserve">.</w:t>
-      </w:r>
-    </w:p>
-    <w:p>
-      <w:pPr>
-        <w:numPr>
-          <w:ilvl w:val="2"/>
-          <w:numId w:val="15"/>
-        </w:numPr>
-        <w:spacing w:lineRule="auto"/>
-      </w:pPr>
-      <w:r>
-        <w:rPr/>
-        <w:t xml:space="preserve">finance</w:t>
-      </w:r>
-      <w:r>
-        <w:rPr/>
-        <w:t xml:space="preserve">: vede </w:t>
-      </w:r>
-      <w:r>
-        <w:rPr>
-          <w:b/>
-        </w:rPr>
-        <w:t xml:space="preserve">anche la sezione Amministrazione</w:t>
-      </w:r>
-      <w:r>
-        <w:rPr/>
-        <w:t xml:space="preserve"> (Stipendi, Pagamenti, Regole, Finanza).</w:t>
-      </w:r>
-    </w:p>
-    <w:p>
-      <w:pPr>
-        <w:numPr>
-          <w:ilvl w:val="2"/>
-          <w:numId w:val="15"/>
-        </w:numPr>
-        <w:spacing w:lineRule="auto"/>
-      </w:pPr>
-      <w:r>
-        <w:rPr/>
-        <w:t xml:space="preserve">project_manager</w:t>
-      </w:r>
-      <w:r>
-        <w:rPr/>
-        <w:t xml:space="preserve">: </w:t>
-      </w:r>
-      <w:r>
-        <w:rPr>
-          <w:b/>
-        </w:rPr>
-        <w:t xml:space="preserve">non vede la sezione Operatività</w:t>
-      </w:r>
-      <w:r>
-        <w:rPr/>
-        <w:t xml:space="preserve"> (Consegne, Attività, Vendite).</w:t>
-      </w:r>
-    </w:p>
-    <w:p>
-      <w:pPr>
-        <w:numPr>
-          <w:ilvl w:val="2"/>
-          <w:numId w:val="15"/>
-        </w:numPr>
-        <w:spacing w:lineRule="auto"/>
-      </w:pPr>
-      <w:r>
-        <w:rPr/>
-        <w:t xml:space="preserve">customer_service</w:t>
-      </w:r>
-      <w:r>
-        <w:rPr/>
-        <w:t xml:space="preserve">: </w:t>
-      </w:r>
-      <w:r>
-        <w:rPr>
-          <w:b/>
-        </w:rPr>
-        <w:t xml:space="preserve">non vede la sezione Amministrazione</w:t>
-      </w:r>
-      <w:r>
-        <w:rPr/>
-        <w:t xml:space="preserve">.</w:t>
-      </w:r>
-    </w:p>
-    <w:p>
-      <w:pPr>
-        <w:numPr>
-          <w:ilvl w:val="0"/>
-          <w:numId w:val="13"/>
-        </w:numPr>
-        <w:spacing w:lineRule="auto"/>
-      </w:pPr>
-      <w:r>
-        <w:rPr>
-          <w:b/>
-        </w:rPr>
-        <w:t xml:space="preserve">Customers</w:t>
+        <w:pStyle w:val="Heading3"/>
+        <w:spacing w:lineRule="auto"/>
+      </w:pPr>
+      <w:r>
+        <w:rPr/>
+        <w:t xml:space="preserve">3.6 Prodotti (</w:t>
+      </w:r>
+      <w:r>
+        <w:rPr/>
+        <w:t xml:space="preserve">/prodotti</w:t>
+      </w:r>
+      <w:r>
+        <w:rPr/>
+        <w:t xml:space="preserve">)</w:t>
+      </w:r>
+    </w:p>
+    <w:p>
+      <w:pPr>
+        <w:numPr>
+          <w:ilvl w:val="0"/>
+          <w:numId w:val="17"/>
+        </w:numPr>
+        <w:spacing w:lineRule="auto"/>
+      </w:pPr>
+      <w:r>
+        <w:rPr/>
+        <w:t xml:space="preserve">Tab: ATTIVA PRODOTTI, ARCHIVIO PRODOTTI, </w:t>
+      </w:r>
+      <w:r>
+        <w:rPr>
+          <w:b/>
+        </w:rPr>
+        <w:t xml:space="preserve">SHOPIFY PRODOTTI</w:t>
+      </w:r>
+      <w:r>
+        <w:rPr/>
+        <w:t xml:space="preserve"> (sincronizzazione prodotti da Shopify). Viste TABELLA / GRIGLIA. 8.503 prodotti. </w:t>
+      </w:r>
+      <w:r>
+        <w:rPr>
+          <w:b/>
+        </w:rPr>
+        <w:t xml:space="preserve">[NUOVO]</w:t>
+      </w:r>
+    </w:p>
+    <w:p>
+      <w:pPr>
+        <w:numPr>
+          <w:ilvl w:val="0"/>
+          <w:numId w:val="17"/>
+        </w:numPr>
+        <w:spacing w:lineRule="auto"/>
+      </w:pPr>
+      <w:r>
+        <w:rPr/>
+        <w:t xml:space="preserve">Bottoni: AGGIUNGI, ESPORTA, IMPORTARE, SCARICA IL FORMATO CSV, ELIMINAZIONE MULTIPLA (+SELEZIONA TUTTI), selettore stato Attivo/Disattivo.</w:t>
+      </w:r>
+    </w:p>
+    <w:p>
+      <w:pPr>
+        <w:numPr>
+          <w:ilvl w:val="0"/>
+          <w:numId w:val="17"/>
+        </w:numPr>
+        <w:spacing w:lineRule="auto"/>
+      </w:pPr>
+      <w:r>
+        <w:rPr/>
+        <w:t xml:space="preserve">Colonne/filtri: ID, Foto, Nome, Variante SKU, Categoria, Prezzo, Prezzo Pubblico, Stock, Partner, SKU, Super Prodotto Sì/No, Super Provincia Sì/No, Prodotto Unico Sì/No, Approvato Sì/No, In Magazzino Sì/No, Attivo.</w:t>
+      </w:r>
+    </w:p>
+    <w:p>
+      <w:pPr>
+        <w:numPr>
+          <w:ilvl w:val="0"/>
+          <w:numId w:val="17"/>
+        </w:numPr>
+        <w:spacing w:lineRule="auto"/>
+      </w:pPr>
+      <w:r>
+        <w:rPr/>
+        <w:t xml:space="preserve">Tipi di prodotto: </w:t>
+      </w:r>
+      <w:r>
+        <w:rPr>
+          <w:b/>
+        </w:rPr>
+        <w:t xml:space="preserve">unici</w:t>
+      </w:r>
+      <w:r>
+        <w:rPr/>
+        <w:t xml:space="preserve"> (di un partner), </w:t>
+      </w:r>
+      <w:r>
+        <w:rPr>
+          <w:b/>
+        </w:rPr>
+        <w:t xml:space="preserve">non-unici</w:t>
+      </w:r>
+      <w:r>
+        <w:rPr/>
+        <w:t xml:space="preserve"> (es. fiori), </w:t>
+      </w:r>
+      <w:r>
+        <w:rPr>
+          <w:b/>
+        </w:rPr>
+        <w:t xml:space="preserve">superprodotti</w:t>
+      </w:r>
+      <w:r>
+        <w:rPr/>
+        <w:t xml:space="preserve"> (combinazioni di più prodotti). Flag "Visible to other partners" per rendere visibili i prodotti unici ad altri partner. Admin/Operation aggiungono qualsiasi prodotto; ogni partner carica i propri come unici.</w:t>
+      </w:r>
+    </w:p>
+    <w:p>
+      <w:pPr>
+        <w:numPr>
+          <w:ilvl w:val="0"/>
+          <w:numId w:val="17"/>
+        </w:numPr>
+        <w:spacing w:lineRule="auto"/>
+      </w:pPr>
+      <w:r>
+        <w:rPr>
+          <w:b/>
+        </w:rPr>
+        <w:t xml:space="preserve">Form "Nuovo prodotto"</w:t>
+      </w:r>
+      <w:r>
+        <w:rPr/>
+        <w:t xml:space="preserve"> (verificato campo-per-campo): sezioni </w:t>
+      </w:r>
+      <w:r>
+        <w:rPr>
+          <w:b/>
+        </w:rPr>
+        <w:t xml:space="preserve">DETTAGLI</w:t>
+      </w:r>
+      <w:r>
+        <w:rPr/>
+        <w:t xml:space="preserve"> (Nome*, Partner, Categoria*, SKU, Giorni Preparazione, </w:t>
+      </w:r>
+      <w:r>
+        <w:rPr>
+          <w:b/>
+        </w:rPr>
+        <w:t xml:space="preserve">Plus del prodotto</w:t>
+      </w:r>
+      <w:r>
+        <w:rPr/>
+        <w:t xml:space="preserve"> max 80*, Descrizione rich text, Prezzo, Prezzo pubblico, Linea, Immagine; flag Non modificabile, Prodotto unico), </w:t>
+      </w:r>
+      <w:r>
+        <w:rPr>
+          <w:b/>
+        </w:rPr>
+        <w:t xml:space="preserve">INVENTORY MANAGEMENT</w:t>
+      </w:r>
+      <w:r>
+        <w:rPr/>
+        <w:t xml:space="preserve"> (Controlla stock, Nome alternativo + Usa nome alternativo), </w:t>
+      </w:r>
+      <w:r>
+        <w:rPr>
+          <w:b/>
+        </w:rPr>
+        <w:t xml:space="preserve">SHOPIFY CONNECTION</w:t>
+      </w:r>
+      <w:r>
+        <w:rPr/>
+        <w:t xml:space="preserve"> (Approvato, Attivo, Not physical, </w:t>
+      </w:r>
+      <w:r>
+        <w:rPr>
+          <w:b/>
+        </w:rPr>
+        <w:t xml:space="preserve">SELECT PLATFORMS</w:t>
+      </w:r>
+      <w:r>
+        <w:rPr/>
+        <w:t xml:space="preserve">: Deluxy/Cakes/Flowers/Business/Experience/DotCom + descrizione per piattaforma, image manager), </w:t>
+      </w:r>
+      <w:r>
+        <w:rPr>
+          <w:b/>
+        </w:rPr>
+        <w:t xml:space="preserve">PRODUCTS PARTNER</w:t>
+      </w:r>
+      <w:r>
+        <w:rPr/>
+        <w:t xml:space="preserve"> (partner aggiuntivi che vendono il prodotto), </w:t>
+      </w:r>
+      <w:r>
+        <w:rPr>
+          <w:b/>
+        </w:rPr>
+        <w:t xml:space="preserve">SUPER PRODOTTO</w:t>
+      </w:r>
+      <w:r>
+        <w:rPr/>
+        <w:t xml:space="preserve"> (componenti), </w:t>
+      </w:r>
+      <w:r>
+        <w:rPr>
+          <w:b/>
+        </w:rPr>
+        <w:t xml:space="preserve">PRODOTTO VARIANTI</w:t>
+      </w:r>
+      <w:r>
+        <w:rPr/>
+        <w:t xml:space="preserve"> (flag ha varianti + titolo opzione + varianti con prezzo/SKU), </w:t>
+      </w:r>
+      <w:r>
+        <w:rPr>
+          <w:b/>
+        </w:rPr>
+        <w:t xml:space="preserve">CAMPI OBBLIGATORI</w:t>
+      </w:r>
+      <w:r>
+        <w:rPr/>
+        <w:t xml:space="preserve"> (campi testuali). </w:t>
+      </w:r>
+      <w:r>
+        <w:rPr>
+          <w:b/>
+        </w:rPr>
+        <w:t xml:space="preserve">[NUOVO — form prodotto completo, incl. varianti e multi-partner]</w:t>
+      </w:r>
+    </w:p>
+    <w:p>
+      <w:pPr>
+        <w:pStyle w:val="Heading4"/>
+        <w:spacing w:lineRule="auto"/>
+      </w:pPr>
+      <w:r>
+        <w:rPr/>
+        <w:t xml:space="preserve">Sottosezioni Prodotti</w:t>
+      </w:r>
+    </w:p>
+    <w:p>
+      <w:pPr>
+        <w:numPr>
+          <w:ilvl w:val="0"/>
+          <w:numId w:val="18"/>
+        </w:numPr>
+        <w:spacing w:lineRule="auto"/>
+      </w:pPr>
+      <w:r>
+        <w:rPr>
+          <w:b/>
+        </w:rPr>
+        <w:t xml:space="preserve">Categorie</w:t>
       </w:r>
       <w:r>
         <w:rPr/>
@@ -3836,29 +4628,92 @@
       </w:r>
       <w:r>
         <w:rPr/>
-        <w:t xml:space="preserve">/customers</w:t>
-      </w:r>
-      <w:r>
-        <w:rPr/>
-        <w:t xml:space="preserve">): 4.092 clienti; colonne: ID, Owner (Admin/Operation/Partner), Partner, Cognome, Nome, Email, Data nascita, Citofono, Telefono, Indirizzo, Note. Azioni: DELIVERY (crea consegna dal cliente), MODIFICA, ELIMINA; AGGIUNGI, ESPORTA, IMPORTARE, formato CSV. Da questa sezione la boutique può </w:t>
-      </w:r>
-      <w:r>
-        <w:rPr>
-          <w:b/>
-        </w:rPr>
-        <w:t xml:space="preserve">rigenerare il codice di consegna "fisso" del cliente</w:t>
-      </w:r>
-      <w:r>
-        <w:rPr/>
-        <w:t xml:space="preserve"> quando il partner usa </w:t>
-      </w:r>
-      <w:r>
-        <w:rPr/>
-        <w:t xml:space="preserve">deliveryCodeCheckType = UNIQUE_PER_CUSTOMER</w:t>
-      </w:r>
-      <w:r>
-        <w:rPr/>
-        <w:t xml:space="preserve"> (vedi 3.3 Sicurezza). </w:t>
+        <w:t xml:space="preserve">/product/categoria</w:t>
+      </w:r>
+      <w:r>
+        <w:rPr/>
+        <w:t xml:space="preserve">): 63 categorie (es. Fiori, Fiori Classici, Fiori d'Arte, Torte, Dolci, Box Regalo, Cappelliere, Palloncini, Accessori, B2B Colazione/Break/Lunch/Aperitivo, Ghirlande, Abbonamento Fiori, Regalistica Natale…). </w:t>
+      </w:r>
+      <w:r>
+        <w:rPr>
+          <w:b/>
+        </w:rPr>
+        <w:t xml:space="preserve">Form "Nuova categoria"</w:t>
+      </w:r>
+      <w:r>
+        <w:rPr/>
+        <w:t xml:space="preserve"> (verificato): Nome*, Note, </w:t>
+      </w:r>
+      <w:r>
+        <w:rPr>
+          <w:b/>
+        </w:rPr>
+        <w:t xml:space="preserve">AI Prompt</w:t>
+      </w:r>
+      <w:r>
+        <w:rPr/>
+        <w:t xml:space="preserve"> (per generazione AI, es. torte), </w:t>
+      </w:r>
+      <w:r>
+        <w:rPr>
+          <w:b/>
+        </w:rPr>
+        <w:t xml:space="preserve">Extra fields</w:t>
+      </w:r>
+      <w:r>
+        <w:rPr/>
+        <w:t xml:space="preserve"> (nome campo + tipo: Opzionale / Obbligatorio / solo Admin), </w:t>
+      </w:r>
+      <w:r>
+        <w:rPr>
+          <w:b/>
+        </w:rPr>
+        <w:t xml:space="preserve">Province discounts</w:t>
+      </w:r>
+      <w:r>
+        <w:rPr/>
+        <w:t xml:space="preserve"> (provincia + % di sconto → genera automaticamente prodotti scontati arrotondati a 0/5). </w:t>
+      </w:r>
+      <w:r>
+        <w:rPr>
+          <w:b/>
+        </w:rPr>
+        <w:t xml:space="preserve">[NUOVO — AI Prompt e Note sul form categoria]</w:t>
+      </w:r>
+    </w:p>
+    <w:p>
+      <w:pPr>
+        <w:numPr>
+          <w:ilvl w:val="0"/>
+          <w:numId w:val="18"/>
+        </w:numPr>
+        <w:spacing w:lineRule="auto"/>
+      </w:pPr>
+      <w:r>
+        <w:rPr>
+          <w:b/>
+        </w:rPr>
+        <w:t xml:space="preserve">Prodotto Collections</w:t>
+      </w:r>
+      <w:r>
+        <w:rPr/>
+        <w:t xml:space="preserve"> (</w:t>
+      </w:r>
+      <w:r>
+        <w:rPr/>
+        <w:t xml:space="preserve">/collections</w:t>
+      </w:r>
+      <w:r>
+        <w:rPr/>
+        <w:t xml:space="preserve">): collezioni shop per provincia: Collection Name, Handle (es. </w:t>
+      </w:r>
+      <w:r>
+        <w:rPr/>
+        <w:t xml:space="preserve">province-products/rm</w:t>
+      </w:r>
+      <w:r>
+        <w:rPr/>
+        <w:t xml:space="preserve">), Descrizione, Provincia, Codice provincia, Categoria prodotto. </w:t>
       </w:r>
       <w:r>
         <w:rPr>
@@ -3869,16 +4724,43 @@
     </w:p>
     <w:p>
       <w:pPr>
+        <w:numPr>
+          <w:ilvl w:val="0"/>
+          <w:numId w:val="18"/>
+        </w:numPr>
+        <w:spacing w:lineRule="auto"/>
+      </w:pPr>
+      <w:r>
+        <w:rPr>
+          <w:b/>
+        </w:rPr>
+        <w:t xml:space="preserve">Cakes Order Product</w:t>
+      </w:r>
+      <w:r>
+        <w:rPr/>
+        <w:t xml:space="preserve"> (</w:t>
+      </w:r>
+      <w:r>
+        <w:rPr/>
+        <w:t xml:space="preserve">/cake/orders</w:t>
+      </w:r>
+      <w:r>
+        <w:rPr/>
+        <w:t xml:space="preserve">): torte acquistate e realizzate con l'AI (8 presenti) con foto.</w:t>
+      </w:r>
+    </w:p>
+    <w:p>
+      <w:pPr>
         <w:pStyle w:val="Heading3"/>
         <w:spacing w:lineRule="auto"/>
       </w:pPr>
       <w:r>
         <w:rPr/>
-        <w:t xml:space="preserve">3.6 Prodotti (</w:t>
-      </w:r>
-      <w:r>
-        <w:rPr/>
-        <w:t xml:space="preserve">/prodotti</w:t>
+        <w:t xml:space="preserve">3.7 Vendite (</w:t>
+      </w:r>
+      <w:r>
+        <w:rPr/>
+        <w:t xml:space="preserve">/all/vendita</w:t>
       </w:r>
       <w:r>
         <w:rPr/>
@@ -3889,23 +4771,107 @@
       <w:pPr>
         <w:numPr>
           <w:ilvl w:val="0"/>
-          <w:numId w:val="16"/>
-        </w:numPr>
-        <w:spacing w:lineRule="auto"/>
-      </w:pPr>
-      <w:r>
-        <w:rPr/>
-        <w:t xml:space="preserve">Tab: ATTIVA PRODOTTI, ARCHIVIO PRODOTTI, </w:t>
-      </w:r>
-      <w:r>
-        <w:rPr>
-          <w:b/>
-        </w:rPr>
-        <w:t xml:space="preserve">SHOPIFY PRODOTTI</w:t>
-      </w:r>
-      <w:r>
-        <w:rPr/>
-        <w:t xml:space="preserve"> (sincronizzazione prodotti da Shopify). Viste TABELLA / GRIGLIA. 8.503 prodotti. </w:t>
+          <w:numId w:val="19"/>
+        </w:numPr>
+        <w:spacing w:lineRule="auto"/>
+      </w:pPr>
+      <w:r>
+        <w:rPr/>
+        <w:t xml:space="preserve">Viste per piattaforma: All Vendite + Deluxy (</w:t>
+      </w:r>
+      <w:r>
+        <w:rPr/>
+        <w:t xml:space="preserve">/vendita</w:t>
+      </w:r>
+      <w:r>
+        <w:rPr/>
+        <w:t xml:space="preserve">), Cakes (</w:t>
+      </w:r>
+      <w:r>
+        <w:rPr/>
+        <w:t xml:space="preserve">/cakes/vendita</w:t>
+      </w:r>
+      <w:r>
+        <w:rPr/>
+        <w:t xml:space="preserve">), Business (</w:t>
+      </w:r>
+      <w:r>
+        <w:rPr/>
+        <w:t xml:space="preserve">/business/vendita</w:t>
+      </w:r>
+      <w:r>
+        <w:rPr/>
+        <w:t xml:space="preserve">), Deluxy Flowers (</w:t>
+      </w:r>
+      <w:r>
+        <w:rPr/>
+        <w:t xml:space="preserve">/flowers/vendita</w:t>
+      </w:r>
+      <w:r>
+        <w:rPr/>
+        <w:t xml:space="preserve">), Deluxy Experience (</w:t>
+      </w:r>
+      <w:r>
+        <w:rPr/>
+        <w:t xml:space="preserve">/experience/vendita</w:t>
+      </w:r>
+      <w:r>
+        <w:rPr/>
+        <w:t xml:space="preserve">), Deluxy.Com (</w:t>
+      </w:r>
+      <w:r>
+        <w:rPr/>
+        <w:t xml:space="preserve">/deluxydotcom/vendita</w:t>
+      </w:r>
+      <w:r>
+        <w:rPr/>
+        <w:t xml:space="preserve">).</w:t>
+      </w:r>
+    </w:p>
+    <w:p>
+      <w:pPr>
+        <w:numPr>
+          <w:ilvl w:val="0"/>
+          <w:numId w:val="19"/>
+        </w:numPr>
+        <w:spacing w:lineRule="auto"/>
+      </w:pPr>
+      <w:r>
+        <w:rPr/>
+        <w:t xml:space="preserve">Colonne: Platform, System ID, ID ordine effettivo, Ordine, Data, Cliente, Indirizzo, Telefono, Canale (es. Online Store), Totale, Costo consegna, Stato del pagamento (paid…), Stato di adempimento (Unfulfilled…), Elementi, SKU, Metodo di consegna, Vendor, Stato (es. Da Gestire).</w:t>
+      </w:r>
+    </w:p>
+    <w:p>
+      <w:pPr>
+        <w:numPr>
+          <w:ilvl w:val="0"/>
+          <w:numId w:val="19"/>
+        </w:numPr>
+        <w:spacing w:lineRule="auto"/>
+      </w:pPr>
+      <w:r>
+        <w:rPr/>
+        <w:t xml:space="preserve">Azioni per vendita: </w:t>
+      </w:r>
+      <w:r>
+        <w:rPr>
+          <w:b/>
+        </w:rPr>
+        <w:t xml:space="preserve">GENERATE LINK, SEND EMAIL, CONFERMA, MODIFICA, RIFIUTA</w:t>
+      </w:r>
+      <w:r>
+        <w:rPr/>
+        <w:t xml:space="preserve">. In alto: AGGIUNGI, ESPORTA, </w:t>
+      </w:r>
+      <w:r>
+        <w:rPr>
+          <w:b/>
+        </w:rPr>
+        <w:t xml:space="preserve">PAGAMENTI DELLE VENDITE</w:t>
+      </w:r>
+      <w:r>
+        <w:rPr/>
+        <w:t xml:space="preserve">, STORICO. </w:t>
       </w:r>
       <w:r>
         <w:rPr>
@@ -3918,184 +4884,13 @@
       <w:pPr>
         <w:numPr>
           <w:ilvl w:val="0"/>
-          <w:numId w:val="16"/>
-        </w:numPr>
-        <w:spacing w:lineRule="auto"/>
-      </w:pPr>
-      <w:r>
-        <w:rPr/>
-        <w:t xml:space="preserve">Bottoni: AGGIUNGI, ESPORTA, IMPORTARE, SCARICA IL FORMATO CSV, ELIMINAZIONE MULTIPLA (+SELEZIONA TUTTI), selettore stato Attivo/Disattivo.</w:t>
-      </w:r>
-    </w:p>
-    <w:p>
-      <w:pPr>
-        <w:numPr>
-          <w:ilvl w:val="0"/>
-          <w:numId w:val="16"/>
-        </w:numPr>
-        <w:spacing w:lineRule="auto"/>
-      </w:pPr>
-      <w:r>
-        <w:rPr/>
-        <w:t xml:space="preserve">Colonne/filtri: ID, Foto, Nome, Variante SKU, Categoria, Prezzo, Prezzo Pubblico, Stock, Partner, SKU, Super Prodotto Sì/No, Super Provincia Sì/No, Prodotto Unico Sì/No, Approvato Sì/No, In Magazzino Sì/No, Attivo.</w:t>
-      </w:r>
-    </w:p>
-    <w:p>
-      <w:pPr>
-        <w:numPr>
-          <w:ilvl w:val="0"/>
-          <w:numId w:val="16"/>
-        </w:numPr>
-        <w:spacing w:lineRule="auto"/>
-      </w:pPr>
-      <w:r>
-        <w:rPr/>
-        <w:t xml:space="preserve">Tipi di prodotto: </w:t>
-      </w:r>
-      <w:r>
-        <w:rPr>
-          <w:b/>
-        </w:rPr>
-        <w:t xml:space="preserve">unici</w:t>
-      </w:r>
-      <w:r>
-        <w:rPr/>
-        <w:t xml:space="preserve"> (di un partner), </w:t>
-      </w:r>
-      <w:r>
-        <w:rPr>
-          <w:b/>
-        </w:rPr>
-        <w:t xml:space="preserve">non-unici</w:t>
-      </w:r>
-      <w:r>
-        <w:rPr/>
-        <w:t xml:space="preserve"> (es. fiori), </w:t>
-      </w:r>
-      <w:r>
-        <w:rPr>
-          <w:b/>
-        </w:rPr>
-        <w:t xml:space="preserve">superprodotti</w:t>
-      </w:r>
-      <w:r>
-        <w:rPr/>
-        <w:t xml:space="preserve"> (combinazioni di più prodotti). Flag "Visible to other partners" per rendere visibili i prodotti unici ad altri partner. Admin/Operation aggiungono qualsiasi prodotto; ogni partner carica i propri come unici.</w:t>
-      </w:r>
-    </w:p>
-    <w:p>
-      <w:pPr>
-        <w:numPr>
-          <w:ilvl w:val="0"/>
-          <w:numId w:val="16"/>
-        </w:numPr>
-        <w:spacing w:lineRule="auto"/>
-      </w:pPr>
-      <w:r>
-        <w:rPr>
-          <w:b/>
-        </w:rPr>
-        <w:t xml:space="preserve">Form "Nuovo prodotto"</w:t>
-      </w:r>
-      <w:r>
-        <w:rPr/>
-        <w:t xml:space="preserve"> (verificato campo-per-campo): sezioni </w:t>
-      </w:r>
-      <w:r>
-        <w:rPr>
-          <w:b/>
-        </w:rPr>
-        <w:t xml:space="preserve">DETTAGLI</w:t>
-      </w:r>
-      <w:r>
-        <w:rPr/>
-        <w:t xml:space="preserve"> (Nome*, Partner, Categoria*, SKU, Giorni Preparazione, </w:t>
-      </w:r>
-      <w:r>
-        <w:rPr>
-          <w:b/>
-        </w:rPr>
-        <w:t xml:space="preserve">Plus del prodotto</w:t>
-      </w:r>
-      <w:r>
-        <w:rPr/>
-        <w:t xml:space="preserve"> max 80*, Descrizione rich text, Prezzo, Prezzo pubblico, Linea, Immagine; flag Non modificabile, Prodotto unico), </w:t>
-      </w:r>
-      <w:r>
-        <w:rPr>
-          <w:b/>
-        </w:rPr>
-        <w:t xml:space="preserve">INVENTORY MANAGEMENT</w:t>
-      </w:r>
-      <w:r>
-        <w:rPr/>
-        <w:t xml:space="preserve"> (Controlla stock, Nome alternativo + Usa nome alternativo), </w:t>
-      </w:r>
-      <w:r>
-        <w:rPr>
-          <w:b/>
-        </w:rPr>
-        <w:t xml:space="preserve">SHOPIFY CONNECTION</w:t>
-      </w:r>
-      <w:r>
-        <w:rPr/>
-        <w:t xml:space="preserve"> (Approvato, Attivo, Not physical, </w:t>
-      </w:r>
-      <w:r>
-        <w:rPr>
-          <w:b/>
-        </w:rPr>
-        <w:t xml:space="preserve">SELECT PLATFORMS</w:t>
-      </w:r>
-      <w:r>
-        <w:rPr/>
-        <w:t xml:space="preserve">: Deluxy/Cakes/Flowers/Business/Experience/DotCom + descrizione per piattaforma, image manager), </w:t>
-      </w:r>
-      <w:r>
-        <w:rPr>
-          <w:b/>
-        </w:rPr>
-        <w:t xml:space="preserve">PRODUCTS PARTNER</w:t>
-      </w:r>
-      <w:r>
-        <w:rPr/>
-        <w:t xml:space="preserve"> (partner aggiuntivi che vendono il prodotto), </w:t>
-      </w:r>
-      <w:r>
-        <w:rPr>
-          <w:b/>
-        </w:rPr>
-        <w:t xml:space="preserve">SUPER PRODOTTO</w:t>
-      </w:r>
-      <w:r>
-        <w:rPr/>
-        <w:t xml:space="preserve"> (componenti), </w:t>
-      </w:r>
-      <w:r>
-        <w:rPr>
-          <w:b/>
-        </w:rPr>
-        <w:t xml:space="preserve">PRODOTTO VARIANTI</w:t>
-      </w:r>
-      <w:r>
-        <w:rPr/>
-        <w:t xml:space="preserve"> (flag ha varianti + titolo opzione + varianti con prezzo/SKU), </w:t>
-      </w:r>
-      <w:r>
-        <w:rPr>
-          <w:b/>
-        </w:rPr>
-        <w:t xml:space="preserve">CAMPI OBBLIGATORI</w:t>
-      </w:r>
-      <w:r>
-        <w:rPr/>
-        <w:t xml:space="preserve"> (campi testuali). </w:t>
-      </w:r>
-      <w:r>
-        <w:rPr>
-          <w:b/>
-        </w:rPr>
-        <w:t xml:space="preserve">[NUOVO — form prodotto completo, incl. varianti e multi-partner]</w:t>
+          <w:numId w:val="19"/>
+        </w:numPr>
+        <w:spacing w:lineRule="auto"/>
+      </w:pPr>
+      <w:r>
+        <w:rPr/>
+        <w:t xml:space="preserve">Il popup "Seleziona Piattaforma di vendita" (Shopify / Cake / Business / Flowers) compare per aggiungere una vendita manuale.</w:t>
       </w:r>
     </w:p>
     <w:p>
@@ -4105,22 +4900,169 @@
       </w:pPr>
       <w:r>
         <w:rPr/>
-        <w:t xml:space="preserve">Sottosezioni Prodotti</w:t>
-      </w:r>
-    </w:p>
-    <w:p>
-      <w:pPr>
-        <w:numPr>
-          <w:ilvl w:val="0"/>
-          <w:numId w:val="17"/>
-        </w:numPr>
-        <w:spacing w:lineRule="auto"/>
-      </w:pPr>
-      <w:r>
-        <w:rPr>
-          <w:b/>
-        </w:rPr>
-        <w:t xml:space="preserve">Categorie</w:t>
+        <w:t xml:space="preserve">Logica di smistamento vendite (invariata)</w:t>
+      </w:r>
+    </w:p>
+    <w:p>
+      <w:pPr>
+        <w:numPr>
+          <w:ilvl w:val="0"/>
+          <w:numId w:val="20"/>
+        </w:numPr>
+        <w:spacing w:lineRule="auto"/>
+      </w:pPr>
+      <w:r>
+        <w:rPr>
+          <w:b/>
+        </w:rPr>
+        <w:t xml:space="preserve">Prodotto unico</w:t>
+      </w:r>
+      <w:r>
+        <w:rPr/>
+        <w:t xml:space="preserve">: se la provincia è servita da un partner aperto → la consegna viene creata e proposta al partner; se chiuso o provincia non servita → vendita "da gestire".</w:t>
+      </w:r>
+    </w:p>
+    <w:p>
+      <w:pPr>
+        <w:numPr>
+          <w:ilvl w:val="0"/>
+          <w:numId w:val="20"/>
+        </w:numPr>
+        <w:spacing w:lineRule="auto"/>
+      </w:pPr>
+      <w:r>
+        <w:rPr>
+          <w:b/>
+        </w:rPr>
+        <w:t xml:space="preserve">Prodotto non unico</w:t>
+      </w:r>
+      <w:r>
+        <w:rPr/>
+        <w:t xml:space="preserve">: se esiste lista priorità per provincia → invio ai partner prioritari aperti (con eventuale sconto categoria arrotondato a 0 o 5), altrimenti agli altri partner; senza lista priorità → vendita "da gestire".</w:t>
+      </w:r>
+    </w:p>
+    <w:p>
+      <w:pPr>
+        <w:numPr>
+          <w:ilvl w:val="0"/>
+          <w:numId w:val="20"/>
+        </w:numPr>
+        <w:spacing w:lineRule="auto"/>
+      </w:pPr>
+      <w:r>
+        <w:rPr/>
+        <w:t xml:space="preserve">Stati vendita/consegna collegati: Accettata (il partner accetta la vendita), Richiedi Annullamento (se ancora "da gestire" si annulla automaticamente), Non Accettata (grigio), Non Consegnata (blu, con motivo nelle note), Consegnata, Annullata (solo Admin/Operation).</w:t>
+      </w:r>
+    </w:p>
+    <w:p>
+      <w:pPr>
+        <w:numPr>
+          <w:ilvl w:val="0"/>
+          <w:numId w:val="20"/>
+        </w:numPr>
+        <w:spacing w:lineRule="auto"/>
+      </w:pPr>
+      <w:r>
+        <w:rPr/>
+        <w:t xml:space="preserve">Servizi orari in storico: CONSEGNATO CON ORARIO DA APPROVARE / CONSEGNATO CON ORARIO NON APPROVATO (verificare l'orario del valet prima di procedere).</w:t>
+      </w:r>
+    </w:p>
+    <w:p>
+      <w:pPr>
+        <w:pStyle w:val="Heading3"/>
+        <w:spacing w:lineRule="auto"/>
+      </w:pPr>
+      <w:r>
+        <w:rPr/>
+        <w:t xml:space="preserve">3.8 Finanza (</w:t>
+      </w:r>
+      <w:r>
+        <w:rPr/>
+        <w:t xml:space="preserve">/finanza</w:t>
+      </w:r>
+      <w:r>
+        <w:rPr/>
+        <w:t xml:space="preserve">)</w:t>
+      </w:r>
+    </w:p>
+    <w:p>
+      <w:pPr>
+        <w:spacing w:lineRule="auto"/>
+      </w:pPr>
+      <w:r>
+        <w:rPr/>
+        <w:t xml:space="preserve">Visibile solo agli admin abilitati (es. utente "support").</w:t>
+      </w:r>
+    </w:p>
+    <w:p>
+      <w:pPr>
+        <w:numPr>
+          <w:ilvl w:val="0"/>
+          <w:numId w:val="21"/>
+        </w:numPr>
+        <w:spacing w:lineRule="auto"/>
+      </w:pPr>
+      <w:r>
+        <w:rPr/>
+        <w:t xml:space="preserve">Tab </w:t>
+      </w:r>
+      <w:r>
+        <w:rPr>
+          <w:b/>
+        </w:rPr>
+        <w:t xml:space="preserve">CORRISPETTIVI</w:t>
+      </w:r>
+      <w:r>
+        <w:rPr/>
+        <w:t xml:space="preserve">: per ogni vendita: Stato, ID Vendita, ID Consegna, Data consegna, Prodotto, Categoria, Valore vendite, Prezzo pubblico, Prezzo consegna, Partner, Prezzo partner, Fee %, Fee value, Fee+IVA, Costo consegna, Primo margine, Primo margine %. Con ESPORTA.</w:t>
+      </w:r>
+    </w:p>
+    <w:p>
+      <w:pPr>
+        <w:numPr>
+          <w:ilvl w:val="0"/>
+          <w:numId w:val="21"/>
+        </w:numPr>
+        <w:spacing w:lineRule="auto"/>
+      </w:pPr>
+      <w:r>
+        <w:rPr/>
+        <w:t xml:space="preserve">Tab </w:t>
+      </w:r>
+      <w:r>
+        <w:rPr>
+          <w:b/>
+        </w:rPr>
+        <w:t xml:space="preserve">MARGINI</w:t>
+      </w:r>
+      <w:r>
+        <w:rPr/>
+        <w:t xml:space="preserve">: margini totali dell'azienda.</w:t>
+      </w:r>
+    </w:p>
+    <w:p>
+      <w:pPr>
+        <w:pStyle w:val="Heading3"/>
+        <w:spacing w:lineRule="auto"/>
+      </w:pPr>
+      <w:r>
+        <w:rPr/>
+        <w:t xml:space="preserve">3.9 Setup</w:t>
+      </w:r>
+    </w:p>
+    <w:p>
+      <w:pPr>
+        <w:numPr>
+          <w:ilvl w:val="0"/>
+          <w:numId w:val="22"/>
+        </w:numPr>
+        <w:spacing w:lineRule="auto"/>
+      </w:pPr>
+      <w:r>
+        <w:rPr>
+          <w:b/>
+        </w:rPr>
+        <w:t xml:space="preserve">Modelli SMS</w:t>
       </w:r>
       <w:r>
         <w:rPr/>
@@ -4128,72 +5070,50 @@
       </w:r>
       <w:r>
         <w:rPr/>
-        <w:t xml:space="preserve">/product/categoria</w:t>
-      </w:r>
-      <w:r>
-        <w:rPr/>
-        <w:t xml:space="preserve">): 63 categorie (es. Fiori, Fiori Classici, Fiori d'Arte, Torte, Dolci, Box Regalo, Cappelliere, Palloncini, Accessori, B2B Colazione/Break/Lunch/Aperitivo, Ghirlande, Abbonamento Fiori, Regalistica Natale…). </w:t>
-      </w:r>
-      <w:r>
-        <w:rPr>
-          <w:b/>
-        </w:rPr>
-        <w:t xml:space="preserve">Form "Nuova categoria"</w:t>
-      </w:r>
-      <w:r>
-        <w:rPr/>
-        <w:t xml:space="preserve"> (verificato): Nome*, Note, </w:t>
-      </w:r>
-      <w:r>
-        <w:rPr>
-          <w:b/>
-        </w:rPr>
-        <w:t xml:space="preserve">AI Prompt</w:t>
-      </w:r>
-      <w:r>
-        <w:rPr/>
-        <w:t xml:space="preserve"> (per generazione AI, es. torte), </w:t>
-      </w:r>
-      <w:r>
-        <w:rPr>
-          <w:b/>
-        </w:rPr>
-        <w:t xml:space="preserve">Extra fields</w:t>
-      </w:r>
-      <w:r>
-        <w:rPr/>
-        <w:t xml:space="preserve"> (nome campo + tipo: Opzionale / Obbligatorio / solo Admin), </w:t>
-      </w:r>
-      <w:r>
-        <w:rPr>
-          <w:b/>
-        </w:rPr>
-        <w:t xml:space="preserve">Province discounts</w:t>
-      </w:r>
-      <w:r>
-        <w:rPr/>
-        <w:t xml:space="preserve"> (provincia + % di sconto → genera automaticamente prodotti scontati arrotondati a 0/5). </w:t>
-      </w:r>
-      <w:r>
-        <w:rPr>
-          <w:b/>
-        </w:rPr>
-        <w:t xml:space="preserve">[NUOVO — AI Prompt e Note sul form categoria]</w:t>
-      </w:r>
-    </w:p>
-    <w:p>
-      <w:pPr>
-        <w:numPr>
-          <w:ilvl w:val="0"/>
-          <w:numId w:val="17"/>
-        </w:numPr>
-        <w:spacing w:lineRule="auto"/>
-      </w:pPr>
-      <w:r>
-        <w:rPr>
-          <w:b/>
-        </w:rPr>
-        <w:t xml:space="preserve">Prodotto Collections</w:t>
+        <w:t xml:space="preserve">/admin/smstemplates</w:t>
+      </w:r>
+      <w:r>
+        <w:rPr/>
+        <w:t xml:space="preserve">): 31 modelli; tipi Created / Departed / Arrived; assegnati ad Admin o a partner specifici (es. Boutique Chanel); placeholder disponibili: </w:t>
+      </w:r>
+      <w:r>
+        <w:rPr/>
+        <w:t xml:space="preserve">[name]</w:t>
+      </w:r>
+      <w:r>
+        <w:rPr/>
+        <w:t xml:space="preserve">, </w:t>
+      </w:r>
+      <w:r>
+        <w:rPr/>
+        <w:t xml:space="preserve">[day]</w:t>
+      </w:r>
+      <w:r>
+        <w:rPr/>
+        <w:t xml:space="preserve">, </w:t>
+      </w:r>
+      <w:r>
+        <w:rPr/>
+        <w:t xml:space="preserve">[between_time]</w:t>
+      </w:r>
+      <w:r>
+        <w:rPr/>
+        <w:t xml:space="preserve">. Brand: Deluxy, DeluxyFlowers, CakeDesign.Me, BusinessDeluxy, Deluxy Experience, Deluxy Dot Com.</w:t>
+      </w:r>
+    </w:p>
+    <w:p>
+      <w:pPr>
+        <w:numPr>
+          <w:ilvl w:val="0"/>
+          <w:numId w:val="22"/>
+        </w:numPr>
+        <w:spacing w:lineRule="auto"/>
+      </w:pPr>
+      <w:r>
+        <w:rPr>
+          <w:b/>
+        </w:rPr>
+        <w:t xml:space="preserve">Provinces &amp; Cities</w:t>
       </w:r>
       <w:r>
         <w:rPr/>
@@ -4201,19 +5121,113 @@
       </w:r>
       <w:r>
         <w:rPr/>
-        <w:t xml:space="preserve">/collections</w:t>
-      </w:r>
-      <w:r>
-        <w:rPr/>
-        <w:t xml:space="preserve">): collezioni shop per provincia: Collection Name, Handle (es. </w:t>
-      </w:r>
-      <w:r>
-        <w:rPr/>
-        <w:t xml:space="preserve">province-products/rm</w:t>
-      </w:r>
-      <w:r>
-        <w:rPr/>
-        <w:t xml:space="preserve">), Descrizione, Provincia, Codice provincia, Categoria prodotto. </w:t>
+        <w:t xml:space="preserve">/provinces/cities</w:t>
+      </w:r>
+      <w:r>
+        <w:rPr/>
+        <w:t xml:space="preserve">): 108 province italiane con codice e numero di città abilitate alle consegne in guanti bianchi; IMPORTARE + formato CSV.</w:t>
+      </w:r>
+    </w:p>
+    <w:p>
+      <w:pPr>
+        <w:numPr>
+          <w:ilvl w:val="0"/>
+          <w:numId w:val="22"/>
+        </w:numPr>
+        <w:spacing w:lineRule="auto"/>
+      </w:pPr>
+      <w:r>
+        <w:rPr>
+          <w:b/>
+        </w:rPr>
+        <w:t xml:space="preserve">Servizi Partner</w:t>
+      </w:r>
+      <w:r>
+        <w:rPr/>
+        <w:t xml:space="preserve"> (</w:t>
+      </w:r>
+      <w:r>
+        <w:rPr/>
+        <w:t xml:space="preserve">/servizi</w:t>
+      </w:r>
+      <w:r>
+        <w:rPr/>
+        <w:t xml:space="preserve">): 32 servizi; tipi: Prezzo Fisso, a Ora (min 1h), Vendita, Aziendale (Corporate), Magazzino. Esempi magazzino: Ricezione pallet, Ordine Ecommerce, Picking &amp; Packing a pezzo/a collo, Picking e Preparazione con consegna/spedizione; consegna taglie S/M e L/XL. Il valore del servizio si imposta nella scheda del singolo partner.</w:t>
+      </w:r>
+    </w:p>
+    <w:p>
+      <w:pPr>
+        <w:numPr>
+          <w:ilvl w:val="1"/>
+          <w:numId w:val="23"/>
+        </w:numPr>
+        <w:spacing w:lineRule="auto"/>
+      </w:pPr>
+      <w:r>
+        <w:rPr>
+          <w:b/>
+        </w:rPr>
+        <w:t xml:space="preserve">Corporate Service</w:t>
+      </w:r>
+      <w:r>
+        <w:rPr/>
+        <w:t xml:space="preserve">: un cliente aziendale ordina prodotti di proprietà di un altro partner; si tramuta in servizio vendita per il proprietario dei prodotti.</w:t>
+      </w:r>
+    </w:p>
+    <w:p>
+      <w:pPr>
+        <w:numPr>
+          <w:ilvl w:val="1"/>
+          <w:numId w:val="23"/>
+        </w:numPr>
+        <w:spacing w:lineRule="auto"/>
+      </w:pPr>
+      <w:r>
+        <w:rPr>
+          <w:b/>
+        </w:rPr>
+        <w:t xml:space="preserve">Servizio Magazzino</w:t>
+      </w:r>
+      <w:r>
+        <w:rPr/>
+        <w:t xml:space="preserve">: Prezzo Base + A Pezzo (per quantità) + Trasporto (base + extra distanza).</w:t>
+      </w:r>
+    </w:p>
+    <w:p>
+      <w:pPr>
+        <w:pStyle w:val="Heading3"/>
+        <w:spacing w:lineRule="auto"/>
+      </w:pPr>
+      <w:r>
+        <w:rPr/>
+        <w:t xml:space="preserve">3.10 Profilo (</w:t>
+      </w:r>
+      <w:r>
+        <w:rPr/>
+        <w:t xml:space="preserve">/profilo</w:t>
+      </w:r>
+      <w:r>
+        <w:rPr/>
+        <w:t xml:space="preserve">)</w:t>
+      </w:r>
+    </w:p>
+    <w:p>
+      <w:pPr>
+        <w:numPr>
+          <w:ilvl w:val="0"/>
+          <w:numId w:val="24"/>
+        </w:numPr>
+        <w:spacing w:lineRule="auto"/>
+      </w:pPr>
+      <w:r>
+        <w:rPr>
+          <w:b/>
+        </w:rPr>
+        <w:t xml:space="preserve">QONTO CONNECTION</w:t>
+      </w:r>
+      <w:r>
+        <w:rPr/>
+        <w:t xml:space="preserve">: collegamento del conto Qonto (CONNECT WITH QONTO). </w:t>
       </w:r>
       <w:r>
         <w:rPr>
@@ -4226,521 +5240,7 @@
       <w:pPr>
         <w:numPr>
           <w:ilvl w:val="0"/>
-          <w:numId w:val="17"/>
-        </w:numPr>
-        <w:spacing w:lineRule="auto"/>
-      </w:pPr>
-      <w:r>
-        <w:rPr>
-          <w:b/>
-        </w:rPr>
-        <w:t xml:space="preserve">Cakes Order Product</w:t>
-      </w:r>
-      <w:r>
-        <w:rPr/>
-        <w:t xml:space="preserve"> (</w:t>
-      </w:r>
-      <w:r>
-        <w:rPr/>
-        <w:t xml:space="preserve">/cake/orders</w:t>
-      </w:r>
-      <w:r>
-        <w:rPr/>
-        <w:t xml:space="preserve">): torte acquistate e realizzate con l'AI (8 presenti) con foto.</w:t>
-      </w:r>
-    </w:p>
-    <w:p>
-      <w:pPr>
-        <w:pStyle w:val="Heading3"/>
-        <w:spacing w:lineRule="auto"/>
-      </w:pPr>
-      <w:r>
-        <w:rPr/>
-        <w:t xml:space="preserve">3.7 Vendite (</w:t>
-      </w:r>
-      <w:r>
-        <w:rPr/>
-        <w:t xml:space="preserve">/all/vendita</w:t>
-      </w:r>
-      <w:r>
-        <w:rPr/>
-        <w:t xml:space="preserve">)</w:t>
-      </w:r>
-    </w:p>
-    <w:p>
-      <w:pPr>
-        <w:numPr>
-          <w:ilvl w:val="0"/>
-          <w:numId w:val="18"/>
-        </w:numPr>
-        <w:spacing w:lineRule="auto"/>
-      </w:pPr>
-      <w:r>
-        <w:rPr/>
-        <w:t xml:space="preserve">Viste per piattaforma: All Vendite + Deluxy (</w:t>
-      </w:r>
-      <w:r>
-        <w:rPr/>
-        <w:t xml:space="preserve">/vendita</w:t>
-      </w:r>
-      <w:r>
-        <w:rPr/>
-        <w:t xml:space="preserve">), Cakes (</w:t>
-      </w:r>
-      <w:r>
-        <w:rPr/>
-        <w:t xml:space="preserve">/cakes/vendita</w:t>
-      </w:r>
-      <w:r>
-        <w:rPr/>
-        <w:t xml:space="preserve">), Business (</w:t>
-      </w:r>
-      <w:r>
-        <w:rPr/>
-        <w:t xml:space="preserve">/business/vendita</w:t>
-      </w:r>
-      <w:r>
-        <w:rPr/>
-        <w:t xml:space="preserve">), Deluxy Flowers (</w:t>
-      </w:r>
-      <w:r>
-        <w:rPr/>
-        <w:t xml:space="preserve">/flowers/vendita</w:t>
-      </w:r>
-      <w:r>
-        <w:rPr/>
-        <w:t xml:space="preserve">), Deluxy Experience (</w:t>
-      </w:r>
-      <w:r>
-        <w:rPr/>
-        <w:t xml:space="preserve">/experience/vendita</w:t>
-      </w:r>
-      <w:r>
-        <w:rPr/>
-        <w:t xml:space="preserve">), Deluxy.Com (</w:t>
-      </w:r>
-      <w:r>
-        <w:rPr/>
-        <w:t xml:space="preserve">/deluxydotcom/vendita</w:t>
-      </w:r>
-      <w:r>
-        <w:rPr/>
-        <w:t xml:space="preserve">).</w:t>
-      </w:r>
-    </w:p>
-    <w:p>
-      <w:pPr>
-        <w:numPr>
-          <w:ilvl w:val="0"/>
-          <w:numId w:val="18"/>
-        </w:numPr>
-        <w:spacing w:lineRule="auto"/>
-      </w:pPr>
-      <w:r>
-        <w:rPr/>
-        <w:t xml:space="preserve">Colonne: Platform, System ID, ID ordine effettivo, Ordine, Data, Cliente, Indirizzo, Telefono, Canale (es. Online Store), Totale, Costo consegna, Stato del pagamento (paid…), Stato di adempimento (Unfulfilled…), Elementi, SKU, Metodo di consegna, Vendor, Stato (es. Da Gestire).</w:t>
-      </w:r>
-    </w:p>
-    <w:p>
-      <w:pPr>
-        <w:numPr>
-          <w:ilvl w:val="0"/>
-          <w:numId w:val="18"/>
-        </w:numPr>
-        <w:spacing w:lineRule="auto"/>
-      </w:pPr>
-      <w:r>
-        <w:rPr/>
-        <w:t xml:space="preserve">Azioni per vendita: </w:t>
-      </w:r>
-      <w:r>
-        <w:rPr>
-          <w:b/>
-        </w:rPr>
-        <w:t xml:space="preserve">GENERATE LINK, SEND EMAIL, CONFERMA, MODIFICA, RIFIUTA</w:t>
-      </w:r>
-      <w:r>
-        <w:rPr/>
-        <w:t xml:space="preserve">. In alto: AGGIUNGI, ESPORTA, </w:t>
-      </w:r>
-      <w:r>
-        <w:rPr>
-          <w:b/>
-        </w:rPr>
-        <w:t xml:space="preserve">PAGAMENTI DELLE VENDITE</w:t>
-      </w:r>
-      <w:r>
-        <w:rPr/>
-        <w:t xml:space="preserve">, STORICO. </w:t>
-      </w:r>
-      <w:r>
-        <w:rPr>
-          <w:b/>
-        </w:rPr>
-        <w:t xml:space="preserve">[NUOVO]</w:t>
-      </w:r>
-    </w:p>
-    <w:p>
-      <w:pPr>
-        <w:numPr>
-          <w:ilvl w:val="0"/>
-          <w:numId w:val="18"/>
-        </w:numPr>
-        <w:spacing w:lineRule="auto"/>
-      </w:pPr>
-      <w:r>
-        <w:rPr/>
-        <w:t xml:space="preserve">Il popup "Seleziona Piattaforma di vendita" (Shopify / Cake / Business / Flowers) compare per aggiungere una vendita manuale.</w:t>
-      </w:r>
-    </w:p>
-    <w:p>
-      <w:pPr>
-        <w:pStyle w:val="Heading4"/>
-        <w:spacing w:lineRule="auto"/>
-      </w:pPr>
-      <w:r>
-        <w:rPr/>
-        <w:t xml:space="preserve">Logica di smistamento vendite (invariata)</w:t>
-      </w:r>
-    </w:p>
-    <w:p>
-      <w:pPr>
-        <w:numPr>
-          <w:ilvl w:val="0"/>
-          <w:numId w:val="19"/>
-        </w:numPr>
-        <w:spacing w:lineRule="auto"/>
-      </w:pPr>
-      <w:r>
-        <w:rPr>
-          <w:b/>
-        </w:rPr>
-        <w:t xml:space="preserve">Prodotto unico</w:t>
-      </w:r>
-      <w:r>
-        <w:rPr/>
-        <w:t xml:space="preserve">: se la provincia è servita da un partner aperto → la consegna viene creata e proposta al partner; se chiuso o provincia non servita → vendita "da gestire".</w:t>
-      </w:r>
-    </w:p>
-    <w:p>
-      <w:pPr>
-        <w:numPr>
-          <w:ilvl w:val="0"/>
-          <w:numId w:val="19"/>
-        </w:numPr>
-        <w:spacing w:lineRule="auto"/>
-      </w:pPr>
-      <w:r>
-        <w:rPr>
-          <w:b/>
-        </w:rPr>
-        <w:t xml:space="preserve">Prodotto non unico</w:t>
-      </w:r>
-      <w:r>
-        <w:rPr/>
-        <w:t xml:space="preserve">: se esiste lista priorità per provincia → invio ai partner prioritari aperti (con eventuale sconto categoria arrotondato a 0 o 5), altrimenti agli altri partner; senza lista priorità → vendita "da gestire".</w:t>
-      </w:r>
-    </w:p>
-    <w:p>
-      <w:pPr>
-        <w:numPr>
-          <w:ilvl w:val="0"/>
-          <w:numId w:val="19"/>
-        </w:numPr>
-        <w:spacing w:lineRule="auto"/>
-      </w:pPr>
-      <w:r>
-        <w:rPr/>
-        <w:t xml:space="preserve">Stati vendita/consegna collegati: Accettata (il partner accetta la vendita), Richiedi Annullamento (se ancora "da gestire" si annulla automaticamente), Non Accettata (grigio), Non Consegnata (blu, con motivo nelle note), Consegnata, Annullata (solo Admin/Operation).</w:t>
-      </w:r>
-    </w:p>
-    <w:p>
-      <w:pPr>
-        <w:numPr>
-          <w:ilvl w:val="0"/>
-          <w:numId w:val="19"/>
-        </w:numPr>
-        <w:spacing w:lineRule="auto"/>
-      </w:pPr>
-      <w:r>
-        <w:rPr/>
-        <w:t xml:space="preserve">Servizi orari in storico: CONSEGNATO CON ORARIO DA APPROVARE / CONSEGNATO CON ORARIO NON APPROVATO (verificare l'orario del valet prima di procedere).</w:t>
-      </w:r>
-    </w:p>
-    <w:p>
-      <w:pPr>
-        <w:pStyle w:val="Heading3"/>
-        <w:spacing w:lineRule="auto"/>
-      </w:pPr>
-      <w:r>
-        <w:rPr/>
-        <w:t xml:space="preserve">3.8 Finanza (</w:t>
-      </w:r>
-      <w:r>
-        <w:rPr/>
-        <w:t xml:space="preserve">/finanza</w:t>
-      </w:r>
-      <w:r>
-        <w:rPr/>
-        <w:t xml:space="preserve">)</w:t>
-      </w:r>
-    </w:p>
-    <w:p>
-      <w:pPr>
-        <w:spacing w:lineRule="auto"/>
-      </w:pPr>
-      <w:r>
-        <w:rPr/>
-        <w:t xml:space="preserve">Visibile solo agli admin abilitati (es. utente "support").</w:t>
-      </w:r>
-    </w:p>
-    <w:p>
-      <w:pPr>
-        <w:numPr>
-          <w:ilvl w:val="0"/>
-          <w:numId w:val="20"/>
-        </w:numPr>
-        <w:spacing w:lineRule="auto"/>
-      </w:pPr>
-      <w:r>
-        <w:rPr/>
-        <w:t xml:space="preserve">Tab </w:t>
-      </w:r>
-      <w:r>
-        <w:rPr>
-          <w:b/>
-        </w:rPr>
-        <w:t xml:space="preserve">CORRISPETTIVI</w:t>
-      </w:r>
-      <w:r>
-        <w:rPr/>
-        <w:t xml:space="preserve">: per ogni vendita: Stato, ID Vendita, ID Consegna, Data consegna, Prodotto, Categoria, Valore vendite, Prezzo pubblico, Prezzo consegna, Partner, Prezzo partner, Fee %, Fee value, Fee+IVA, Costo consegna, Primo margine, Primo margine %. Con ESPORTA.</w:t>
-      </w:r>
-    </w:p>
-    <w:p>
-      <w:pPr>
-        <w:numPr>
-          <w:ilvl w:val="0"/>
-          <w:numId w:val="20"/>
-        </w:numPr>
-        <w:spacing w:lineRule="auto"/>
-      </w:pPr>
-      <w:r>
-        <w:rPr/>
-        <w:t xml:space="preserve">Tab </w:t>
-      </w:r>
-      <w:r>
-        <w:rPr>
-          <w:b/>
-        </w:rPr>
-        <w:t xml:space="preserve">MARGINI</w:t>
-      </w:r>
-      <w:r>
-        <w:rPr/>
-        <w:t xml:space="preserve">: margini totali dell'azienda.</w:t>
-      </w:r>
-    </w:p>
-    <w:p>
-      <w:pPr>
-        <w:pStyle w:val="Heading3"/>
-        <w:spacing w:lineRule="auto"/>
-      </w:pPr>
-      <w:r>
-        <w:rPr/>
-        <w:t xml:space="preserve">3.9 Setup</w:t>
-      </w:r>
-    </w:p>
-    <w:p>
-      <w:pPr>
-        <w:numPr>
-          <w:ilvl w:val="0"/>
-          <w:numId w:val="21"/>
-        </w:numPr>
-        <w:spacing w:lineRule="auto"/>
-      </w:pPr>
-      <w:r>
-        <w:rPr>
-          <w:b/>
-        </w:rPr>
-        <w:t xml:space="preserve">Modelli SMS</w:t>
-      </w:r>
-      <w:r>
-        <w:rPr/>
-        <w:t xml:space="preserve"> (</w:t>
-      </w:r>
-      <w:r>
-        <w:rPr/>
-        <w:t xml:space="preserve">/admin/smstemplates</w:t>
-      </w:r>
-      <w:r>
-        <w:rPr/>
-        <w:t xml:space="preserve">): 31 modelli; tipi Created / Departed / Arrived; assegnati ad Admin o a partner specifici (es. Boutique Chanel); placeholder disponibili: </w:t>
-      </w:r>
-      <w:r>
-        <w:rPr/>
-        <w:t xml:space="preserve">[name]</w:t>
-      </w:r>
-      <w:r>
-        <w:rPr/>
-        <w:t xml:space="preserve">, </w:t>
-      </w:r>
-      <w:r>
-        <w:rPr/>
-        <w:t xml:space="preserve">[day]</w:t>
-      </w:r>
-      <w:r>
-        <w:rPr/>
-        <w:t xml:space="preserve">, </w:t>
-      </w:r>
-      <w:r>
-        <w:rPr/>
-        <w:t xml:space="preserve">[between_time]</w:t>
-      </w:r>
-      <w:r>
-        <w:rPr/>
-        <w:t xml:space="preserve">. Brand: Deluxy, DeluxyFlowers, CakeDesign.Me, BusinessDeluxy, Deluxy Experience, Deluxy Dot Com.</w:t>
-      </w:r>
-    </w:p>
-    <w:p>
-      <w:pPr>
-        <w:numPr>
-          <w:ilvl w:val="0"/>
-          <w:numId w:val="21"/>
-        </w:numPr>
-        <w:spacing w:lineRule="auto"/>
-      </w:pPr>
-      <w:r>
-        <w:rPr>
-          <w:b/>
-        </w:rPr>
-        <w:t xml:space="preserve">Provinces &amp; Cities</w:t>
-      </w:r>
-      <w:r>
-        <w:rPr/>
-        <w:t xml:space="preserve"> (</w:t>
-      </w:r>
-      <w:r>
-        <w:rPr/>
-        <w:t xml:space="preserve">/provinces/cities</w:t>
-      </w:r>
-      <w:r>
-        <w:rPr/>
-        <w:t xml:space="preserve">): 108 province italiane con codice e numero di città abilitate alle consegne in guanti bianchi; IMPORTARE + formato CSV.</w:t>
-      </w:r>
-    </w:p>
-    <w:p>
-      <w:pPr>
-        <w:numPr>
-          <w:ilvl w:val="0"/>
-          <w:numId w:val="21"/>
-        </w:numPr>
-        <w:spacing w:lineRule="auto"/>
-      </w:pPr>
-      <w:r>
-        <w:rPr>
-          <w:b/>
-        </w:rPr>
-        <w:t xml:space="preserve">Servizi Partner</w:t>
-      </w:r>
-      <w:r>
-        <w:rPr/>
-        <w:t xml:space="preserve"> (</w:t>
-      </w:r>
-      <w:r>
-        <w:rPr/>
-        <w:t xml:space="preserve">/servizi</w:t>
-      </w:r>
-      <w:r>
-        <w:rPr/>
-        <w:t xml:space="preserve">): 32 servizi; tipi: Prezzo Fisso, a Ora (min 1h), Vendita, Aziendale (Corporate), Magazzino. Esempi magazzino: Ricezione pallet, Ordine Ecommerce, Picking &amp; Packing a pezzo/a collo, Picking e Preparazione con consegna/spedizione; consegna taglie S/M e L/XL. Il valore del servizio si imposta nella scheda del singolo partner.</w:t>
-      </w:r>
-    </w:p>
-    <w:p>
-      <w:pPr>
-        <w:numPr>
-          <w:ilvl w:val="1"/>
-          <w:numId w:val="22"/>
-        </w:numPr>
-        <w:spacing w:lineRule="auto"/>
-      </w:pPr>
-      <w:r>
-        <w:rPr>
-          <w:b/>
-        </w:rPr>
-        <w:t xml:space="preserve">Corporate Service</w:t>
-      </w:r>
-      <w:r>
-        <w:rPr/>
-        <w:t xml:space="preserve">: un cliente aziendale ordina prodotti di proprietà di un altro partner; si tramuta in servizio vendita per il proprietario dei prodotti.</w:t>
-      </w:r>
-    </w:p>
-    <w:p>
-      <w:pPr>
-        <w:numPr>
-          <w:ilvl w:val="1"/>
-          <w:numId w:val="22"/>
-        </w:numPr>
-        <w:spacing w:lineRule="auto"/>
-      </w:pPr>
-      <w:r>
-        <w:rPr>
-          <w:b/>
-        </w:rPr>
-        <w:t xml:space="preserve">Servizio Magazzino</w:t>
-      </w:r>
-      <w:r>
-        <w:rPr/>
-        <w:t xml:space="preserve">: Prezzo Base + A Pezzo (per quantità) + Trasporto (base + extra distanza).</w:t>
-      </w:r>
-    </w:p>
-    <w:p>
-      <w:pPr>
-        <w:pStyle w:val="Heading3"/>
-        <w:spacing w:lineRule="auto"/>
-      </w:pPr>
-      <w:r>
-        <w:rPr/>
-        <w:t xml:space="preserve">3.10 Profilo (</w:t>
-      </w:r>
-      <w:r>
-        <w:rPr/>
-        <w:t xml:space="preserve">/profilo</w:t>
-      </w:r>
-      <w:r>
-        <w:rPr/>
-        <w:t xml:space="preserve">)</w:t>
-      </w:r>
-    </w:p>
-    <w:p>
-      <w:pPr>
-        <w:numPr>
-          <w:ilvl w:val="0"/>
-          <w:numId w:val="23"/>
-        </w:numPr>
-        <w:spacing w:lineRule="auto"/>
-      </w:pPr>
-      <w:r>
-        <w:rPr>
-          <w:b/>
-        </w:rPr>
-        <w:t xml:space="preserve">QONTO CONNECTION</w:t>
-      </w:r>
-      <w:r>
-        <w:rPr/>
-        <w:t xml:space="preserve">: collegamento del conto Qonto (CONNECT WITH QONTO). </w:t>
-      </w:r>
-      <w:r>
-        <w:rPr>
-          <w:b/>
-        </w:rPr>
-        <w:t xml:space="preserve">[NUOVO]</w:t>
-      </w:r>
-    </w:p>
-    <w:p>
-      <w:pPr>
-        <w:numPr>
-          <w:ilvl w:val="0"/>
-          <w:numId w:val="23"/>
+          <w:numId w:val="24"/>
         </w:numPr>
         <w:spacing w:lineRule="auto"/>
       </w:pPr>
@@ -4772,7 +5272,7 @@
       <w:pPr>
         <w:numPr>
           <w:ilvl w:val="0"/>
-          <w:numId w:val="24"/>
+          <w:numId w:val="25"/>
         </w:numPr>
         <w:spacing w:lineRule="auto"/>
       </w:pPr>
@@ -4791,7 +5291,7 @@
       <w:pPr>
         <w:numPr>
           <w:ilvl w:val="0"/>
-          <w:numId w:val="24"/>
+          <w:numId w:val="25"/>
         </w:numPr>
         <w:spacing w:lineRule="auto"/>
       </w:pPr>
@@ -4810,7 +5310,7 @@
       <w:pPr>
         <w:numPr>
           <w:ilvl w:val="0"/>
-          <w:numId w:val="24"/>
+          <w:numId w:val="25"/>
         </w:numPr>
         <w:spacing w:lineRule="auto"/>
       </w:pPr>
@@ -4829,7 +5329,7 @@
       <w:pPr>
         <w:numPr>
           <w:ilvl w:val="0"/>
-          <w:numId w:val="24"/>
+          <w:numId w:val="25"/>
         </w:numPr>
         <w:spacing w:lineRule="auto"/>
       </w:pPr>
@@ -4863,7 +5363,7 @@
       <w:pPr>
         <w:numPr>
           <w:ilvl w:val="0"/>
-          <w:numId w:val="25"/>
+          <w:numId w:val="26"/>
         </w:numPr>
         <w:spacing w:lineRule="auto"/>
       </w:pPr>
@@ -4876,7 +5376,7 @@
       <w:pPr>
         <w:numPr>
           <w:ilvl w:val="0"/>
-          <w:numId w:val="25"/>
+          <w:numId w:val="26"/>
         </w:numPr>
         <w:spacing w:lineRule="auto"/>
       </w:pPr>
@@ -4889,7 +5389,7 @@
       <w:pPr>
         <w:numPr>
           <w:ilvl w:val="0"/>
-          <w:numId w:val="25"/>
+          <w:numId w:val="26"/>
         </w:numPr>
         <w:spacing w:lineRule="auto"/>
       </w:pPr>
@@ -4912,7 +5412,7 @@
       <w:pPr>
         <w:numPr>
           <w:ilvl w:val="0"/>
-          <w:numId w:val="26"/>
+          <w:numId w:val="27"/>
         </w:numPr>
         <w:spacing w:lineRule="auto"/>
       </w:pPr>
@@ -4931,7 +5431,7 @@
       <w:pPr>
         <w:numPr>
           <w:ilvl w:val="0"/>
-          <w:numId w:val="26"/>
+          <w:numId w:val="27"/>
         </w:numPr>
         <w:spacing w:lineRule="auto"/>
       </w:pPr>
@@ -4950,7 +5450,7 @@
       <w:pPr>
         <w:numPr>
           <w:ilvl w:val="0"/>
-          <w:numId w:val="26"/>
+          <w:numId w:val="27"/>
         </w:numPr>
         <w:spacing w:lineRule="auto"/>
       </w:pPr>
@@ -5149,7 +5649,7 @@
       <w:pPr>
         <w:numPr>
           <w:ilvl w:val="0"/>
-          <w:numId w:val="27"/>
+          <w:numId w:val="28"/>
         </w:numPr>
         <w:spacing w:lineRule="auto"/>
       </w:pPr>
@@ -5170,7 +5670,7 @@
       <w:pPr>
         <w:numPr>
           <w:ilvl w:val="0"/>
-          <w:numId w:val="27"/>
+          <w:numId w:val="28"/>
         </w:numPr>
         <w:spacing w:lineRule="auto"/>
       </w:pPr>
@@ -5183,7 +5683,7 @@
       <w:pPr>
         <w:numPr>
           <w:ilvl w:val="0"/>
-          <w:numId w:val="27"/>
+          <w:numId w:val="28"/>
         </w:numPr>
         <w:spacing w:lineRule="auto"/>
       </w:pPr>
@@ -5220,7 +5720,7 @@
       <w:pPr>
         <w:numPr>
           <w:ilvl w:val="0"/>
-          <w:numId w:val="27"/>
+          <w:numId w:val="28"/>
         </w:numPr>
         <w:spacing w:lineRule="auto"/>
       </w:pPr>
@@ -5394,41 +5894,127 @@
       </w:r>
       <w:r>
         <w:rPr/>
+        <w:t xml:space="preserve"> (</w:t>
+      </w:r>
+      <w:r>
+        <w:rPr/>
+        <w:t xml:space="preserve">noticeDays</w:t>
+      </w:r>
+      <w:r>
+        <w:rPr/>
+        <w:t xml:space="preserve">, alimenta la data minima consegna = oggi + preavviso), </w:t>
+      </w:r>
+      <w:r>
+        <w:rPr>
+          <w:b/>
+        </w:rPr>
+        <w:t xml:space="preserve">Fascia oraria</w:t>
+      </w:r>
+      <w:r>
+        <w:rPr/>
+        <w:t xml:space="preserve"> (</w:t>
+      </w:r>
+      <w:r>
+        <w:rPr/>
+        <w:t xml:space="preserve">slotHours</w:t>
+      </w:r>
+      <w:r>
+        <w:rPr/>
+        <w:t xml:space="preserve">: 1 / 2 / 4 ore — durata delle fasce di consegna a tendina), </w:t>
+      </w:r>
+      <w:r>
+        <w:rPr>
+          <w:b/>
+        </w:rPr>
+        <w:t xml:space="preserve">Ora minima di inserimento</w:t>
+      </w:r>
+      <w:r>
+        <w:rPr/>
+        <w:t xml:space="preserve"> (</w:t>
+      </w:r>
+      <w:r>
+        <w:rPr/>
+        <w:t xml:space="preserve">minOrderTime</w:t>
+      </w:r>
+      <w:r>
+        <w:rPr/>
+        <w:t xml:space="preserve">) e </w:t>
+      </w:r>
+      <w:r>
+        <w:rPr>
+          <w:b/>
+        </w:rPr>
+        <w:t xml:space="preserve">Ora massima di inserimento</w:t>
+      </w:r>
+      <w:r>
+        <w:rPr/>
+        <w:t xml:space="preserve"> (</w:t>
+      </w:r>
+      <w:r>
+        <w:rPr/>
+        <w:t xml:space="preserve">maxOrderTime</w:t>
+      </w:r>
+      <w:r>
+        <w:rPr/>
+        <w:t xml:space="preserve">). Le due ore delimitano anche la </w:t>
+      </w:r>
+      <w:r>
+        <w:rPr>
+          <w:b/>
+        </w:rPr>
+        <w:t xml:space="preserve">generazione delle fasce di consegna a tendina</w:t>
+      </w:r>
+      <w:r>
+        <w:rPr/>
+        <w:t xml:space="preserve"> nel form (da min a max, default </w:t>
+      </w:r>
+      <w:r>
+        <w:rPr>
+          <w:b/>
+        </w:rPr>
+        <w:t xml:space="preserve">06:00–22:00</w:t>
+      </w:r>
+      <w:r>
+        <w:rPr/>
+        <w:t xml:space="preserve">, passo = fascia oraria). Nuovo flag </w:t>
+      </w:r>
+      <w:r>
+        <w:rPr>
+          <w:b/>
+        </w:rPr>
+        <w:t xml:space="preserve">Consenti orario di consegna flessibile</w:t>
+      </w:r>
+      <w:r>
+        <w:rPr/>
+        <w:t xml:space="preserve"> (</w:t>
+      </w:r>
+      <w:r>
+        <w:rPr/>
+        <w:t xml:space="preserve">allowFlexibleTime</w:t>
+      </w:r>
+      <w:r>
+        <w:rPr/>
+        <w:t xml:space="preserve">): se attivo, nel form consegna compare l'opzione per una fascia libera dalle–alle; se disattivo si può scegliere solo una fascia predefinita. Campi su </w:t>
+      </w:r>
+      <w:r>
+        <w:rPr/>
+        <w:t xml:space="preserve">ServiceType</w:t>
+      </w:r>
+      <w:r>
+        <w:rPr/>
+        <w:t xml:space="preserve">: </w:t>
+      </w:r>
+      <w:r>
+        <w:rPr/>
+        <w:t xml:space="preserve">noticeDays</w:t>
+      </w:r>
+      <w:r>
+        <w:rPr/>
         <w:t xml:space="preserve">, </w:t>
       </w:r>
       <w:r>
-        <w:rPr>
-          <w:b/>
-        </w:rPr>
-        <w:t xml:space="preserve">Fascia oraria</w:t>
-      </w:r>
-      <w:r>
-        <w:rPr/>
-        <w:t xml:space="preserve"> (1 / 2 / 4 ore, da rendere variabile), </w:t>
-      </w:r>
-      <w:r>
-        <w:rPr>
-          <w:b/>
-        </w:rPr>
-        <w:t xml:space="preserve">Ora minima di inserimento</w:t>
-      </w:r>
-      <w:r>
-        <w:rPr/>
-        <w:t xml:space="preserve"> (da quale ora si può richiedere il servizio per la data scelta), </w:t>
-      </w:r>
-      <w:r>
-        <w:rPr>
-          <w:b/>
-        </w:rPr>
-        <w:t xml:space="preserve">Ora massima di inserimento</w:t>
-      </w:r>
-      <w:r>
-        <w:rPr/>
-        <w:t xml:space="preserve"> (dopo quella ora non è più possibile richiederlo per la data scelta). Campi </w:t>
-      </w:r>
-      <w:r>
-        <w:rPr/>
-        <w:t xml:space="preserve">noticeDays</w:t>
+        <w:rPr/>
+        <w:t xml:space="preserve">slotHours</w:t>
       </w:r>
       <w:r>
         <w:rPr/>
@@ -5436,7 +6022,7 @@
       </w:r>
       <w:r>
         <w:rPr/>
-        <w:t xml:space="preserve">slotHours</w:t>
+        <w:t xml:space="preserve">minOrderTime</w:t>
       </w:r>
       <w:r>
         <w:rPr/>
@@ -5444,7 +6030,7 @@
       </w:r>
       <w:r>
         <w:rPr/>
-        <w:t xml:space="preserve">minOrderTime</w:t>
+        <w:t xml:space="preserve">maxOrderTime</w:t>
       </w:r>
       <w:r>
         <w:rPr/>
@@ -5452,15 +6038,7 @@
       </w:r>
       <w:r>
         <w:rPr/>
-        <w:t xml:space="preserve">maxOrderTime</w:t>
-      </w:r>
-      <w:r>
-        <w:rPr/>
-        <w:t xml:space="preserve"> su </w:t>
-      </w:r>
-      <w:r>
-        <w:rPr/>
-        <w:t xml:space="preserve">ServiceType</w:t>
+        <w:t xml:space="preserve">allowFlexibleTime</w:t>
       </w:r>
       <w:r>
         <w:rPr/>
@@ -6119,7 +6697,7 @@
       <w:pPr>
         <w:numPr>
           <w:ilvl w:val="0"/>
-          <w:numId w:val="28"/>
+          <w:numId w:val="29"/>
         </w:numPr>
         <w:spacing w:lineRule="auto"/>
       </w:pPr>
@@ -6146,7 +6724,7 @@
       <w:pPr>
         <w:numPr>
           <w:ilvl w:val="0"/>
-          <w:numId w:val="28"/>
+          <w:numId w:val="29"/>
         </w:numPr>
         <w:spacing w:lineRule="auto"/>
       </w:pPr>
@@ -6173,7 +6751,7 @@
       <w:pPr>
         <w:numPr>
           <w:ilvl w:val="0"/>
-          <w:numId w:val="28"/>
+          <w:numId w:val="29"/>
         </w:numPr>
         <w:spacing w:lineRule="auto"/>
       </w:pPr>
@@ -6360,7 +6938,7 @@
       <w:pPr>
         <w:numPr>
           <w:ilvl w:val="0"/>
-          <w:numId w:val="28"/>
+          <w:numId w:val="29"/>
         </w:numPr>
         <w:spacing w:lineRule="auto"/>
       </w:pPr>
@@ -6389,7 +6967,7 @@
       <w:pPr>
         <w:numPr>
           <w:ilvl w:val="0"/>
-          <w:numId w:val="29"/>
+          <w:numId w:val="30"/>
         </w:numPr>
         <w:spacing w:lineRule="auto"/>
       </w:pPr>
@@ -6408,7 +6986,7 @@
       <w:pPr>
         <w:numPr>
           <w:ilvl w:val="0"/>
-          <w:numId w:val="29"/>
+          <w:numId w:val="30"/>
         </w:numPr>
         <w:spacing w:lineRule="auto"/>
       </w:pPr>
@@ -6427,7 +7005,7 @@
       <w:pPr>
         <w:numPr>
           <w:ilvl w:val="0"/>
-          <w:numId w:val="29"/>
+          <w:numId w:val="30"/>
         </w:numPr>
         <w:spacing w:lineRule="auto"/>
       </w:pPr>
@@ -6462,7 +7040,7 @@
       <w:pPr>
         <w:numPr>
           <w:ilvl w:val="0"/>
-          <w:numId w:val="29"/>
+          <w:numId w:val="30"/>
         </w:numPr>
         <w:spacing w:lineRule="auto"/>
       </w:pPr>
@@ -7096,8 +7674,8 @@
   <w:abstractNum w:abstractNumId="6">
     <w:lvl w:ilvl="0">
       <w:start w:val="1"/>
-      <w:numFmt w:val="bullet"/>
-      <w:lvlText w:val=""/>
+      <w:numFmt w:val="decimal"/>
+      <w:lvlText w:val="%1."/>
       <w:lvlJc w:val="left"/>
       <w:pPr>
         <w:tabs>
@@ -7105,14 +7683,11 @@
         </w:tabs>
         <w:ind w:left="720" w:hanging="360"/>
       </w:pPr>
-      <w:rPr>
-        <w:rFonts w:ascii="Symbol" w:hAnsi="Symbol" w:hint="default"/>
-      </w:rPr>
     </w:lvl>
     <w:lvl w:ilvl="1">
       <w:start w:val="1"/>
-      <w:numFmt w:val="bullet"/>
-      <w:lvlText w:val=""/>
+      <w:numFmt w:val="decimal"/>
+      <w:lvlText w:val="%2."/>
       <w:lvlJc w:val="left"/>
       <w:pPr>
         <w:tabs>
@@ -7120,14 +7695,11 @@
         </w:tabs>
         <w:ind w:left="1440" w:hanging="360"/>
       </w:pPr>
-      <w:rPr>
-        <w:rFonts w:ascii="Symbol" w:hAnsi="Symbol" w:hint="default"/>
-      </w:rPr>
     </w:lvl>
     <w:lvl w:ilvl="2">
       <w:start w:val="1"/>
-      <w:numFmt w:val="bullet"/>
-      <w:lvlText w:val=""/>
+      <w:numFmt w:val="decimal"/>
+      <w:lvlText w:val="%3."/>
       <w:lvlJc w:val="left"/>
       <w:pPr>
         <w:tabs>
@@ -7135,14 +7707,11 @@
         </w:tabs>
         <w:ind w:left="2160" w:hanging="360"/>
       </w:pPr>
-      <w:rPr>
-        <w:rFonts w:ascii="Symbol" w:hAnsi="Symbol" w:hint="default"/>
-      </w:rPr>
     </w:lvl>
     <w:lvl w:ilvl="3">
       <w:start w:val="1"/>
-      <w:numFmt w:val="bullet"/>
-      <w:lvlText w:val=""/>
+      <w:numFmt w:val="decimal"/>
+      <w:lvlText w:val="%4."/>
       <w:lvlJc w:val="left"/>
       <w:pPr>
         <w:tabs>
@@ -7150,14 +7719,11 @@
         </w:tabs>
         <w:ind w:left="2880" w:hanging="360"/>
       </w:pPr>
-      <w:rPr>
-        <w:rFonts w:ascii="Symbol" w:hAnsi="Symbol" w:hint="default"/>
-      </w:rPr>
     </w:lvl>
     <w:lvl w:ilvl="4">
       <w:start w:val="1"/>
-      <w:numFmt w:val="bullet"/>
-      <w:lvlText w:val=""/>
+      <w:numFmt w:val="decimal"/>
+      <w:lvlText w:val="%5."/>
       <w:lvlJc w:val="left"/>
       <w:pPr>
         <w:tabs>
@@ -7165,14 +7731,11 @@
         </w:tabs>
         <w:ind w:left="3600" w:hanging="360"/>
       </w:pPr>
-      <w:rPr>
-        <w:rFonts w:ascii="Symbol" w:hAnsi="Symbol" w:hint="default"/>
-      </w:rPr>
     </w:lvl>
     <w:lvl w:ilvl="5">
       <w:start w:val="1"/>
-      <w:numFmt w:val="bullet"/>
-      <w:lvlText w:val=""/>
+      <w:numFmt w:val="decimal"/>
+      <w:lvlText w:val="%6."/>
       <w:lvlJc w:val="left"/>
       <w:pPr>
         <w:tabs>
@@ -7180,14 +7743,11 @@
         </w:tabs>
         <w:ind w:left="4320" w:hanging="360"/>
       </w:pPr>
-      <w:rPr>
-        <w:rFonts w:ascii="Symbol" w:hAnsi="Symbol" w:hint="default"/>
-      </w:rPr>
     </w:lvl>
     <w:lvl w:ilvl="6">
       <w:start w:val="1"/>
-      <w:numFmt w:val="bullet"/>
-      <w:lvlText w:val=""/>
+      <w:numFmt w:val="decimal"/>
+      <w:lvlText w:val="%7."/>
       <w:lvlJc w:val="left"/>
       <w:pPr>
         <w:tabs>
@@ -7195,14 +7755,11 @@
         </w:tabs>
         <w:ind w:left="5040" w:hanging="360"/>
       </w:pPr>
-      <w:rPr>
-        <w:rFonts w:ascii="Symbol" w:hAnsi="Symbol" w:hint="default"/>
-      </w:rPr>
     </w:lvl>
     <w:lvl w:ilvl="7">
       <w:start w:val="1"/>
-      <w:numFmt w:val="bullet"/>
-      <w:lvlText w:val=""/>
+      <w:numFmt w:val="decimal"/>
+      <w:lvlText w:val="%8."/>
       <w:lvlJc w:val="left"/>
       <w:pPr>
         <w:tabs>
@@ -7210,9 +7767,6 @@
         </w:tabs>
         <w:ind w:left="5760" w:hanging="360"/>
       </w:pPr>
-      <w:rPr>
-        <w:rFonts w:ascii="Symbol" w:hAnsi="Symbol" w:hint="default"/>
-      </w:rPr>
     </w:lvl>
   </w:abstractNum>
   <w:abstractNum w:abstractNumId="7">
@@ -9536,8 +10090,8 @@
   <w:abstractNum w:abstractNumId="26">
     <w:lvl w:ilvl="0">
       <w:start w:val="1"/>
-      <w:numFmt w:val="decimal"/>
-      <w:lvlText w:val="%1."/>
+      <w:numFmt w:val="bullet"/>
+      <w:lvlText w:val=""/>
       <w:lvlJc w:val="left"/>
       <w:pPr>
         <w:tabs>
@@ -9545,11 +10099,14 @@
         </w:tabs>
         <w:ind w:left="720" w:hanging="360"/>
       </w:pPr>
+      <w:rPr>
+        <w:rFonts w:ascii="Symbol" w:hAnsi="Symbol" w:hint="default"/>
+      </w:rPr>
     </w:lvl>
     <w:lvl w:ilvl="1">
       <w:start w:val="1"/>
-      <w:numFmt w:val="decimal"/>
-      <w:lvlText w:val="%2."/>
+      <w:numFmt w:val="bullet"/>
+      <w:lvlText w:val=""/>
       <w:lvlJc w:val="left"/>
       <w:pPr>
         <w:tabs>
@@ -9557,11 +10114,14 @@
         </w:tabs>
         <w:ind w:left="1440" w:hanging="360"/>
       </w:pPr>
+      <w:rPr>
+        <w:rFonts w:ascii="Symbol" w:hAnsi="Symbol" w:hint="default"/>
+      </w:rPr>
     </w:lvl>
     <w:lvl w:ilvl="2">
       <w:start w:val="1"/>
-      <w:numFmt w:val="decimal"/>
-      <w:lvlText w:val="%3."/>
+      <w:numFmt w:val="bullet"/>
+      <w:lvlText w:val=""/>
       <w:lvlJc w:val="left"/>
       <w:pPr>
         <w:tabs>
@@ -9569,11 +10129,14 @@
         </w:tabs>
         <w:ind w:left="2160" w:hanging="360"/>
       </w:pPr>
+      <w:rPr>
+        <w:rFonts w:ascii="Symbol" w:hAnsi="Symbol" w:hint="default"/>
+      </w:rPr>
     </w:lvl>
     <w:lvl w:ilvl="3">
       <w:start w:val="1"/>
-      <w:numFmt w:val="decimal"/>
-      <w:lvlText w:val="%4."/>
+      <w:numFmt w:val="bullet"/>
+      <w:lvlText w:val=""/>
       <w:lvlJc w:val="left"/>
       <w:pPr>
         <w:tabs>
@@ -9581,11 +10144,14 @@
         </w:tabs>
         <w:ind w:left="2880" w:hanging="360"/>
       </w:pPr>
+      <w:rPr>
+        <w:rFonts w:ascii="Symbol" w:hAnsi="Symbol" w:hint="default"/>
+      </w:rPr>
     </w:lvl>
     <w:lvl w:ilvl="4">
       <w:start w:val="1"/>
-      <w:numFmt w:val="decimal"/>
-      <w:lvlText w:val="%5."/>
+      <w:numFmt w:val="bullet"/>
+      <w:lvlText w:val=""/>
       <w:lvlJc w:val="left"/>
       <w:pPr>
         <w:tabs>
@@ -9593,11 +10159,14 @@
         </w:tabs>
         <w:ind w:left="3600" w:hanging="360"/>
       </w:pPr>
+      <w:rPr>
+        <w:rFonts w:ascii="Symbol" w:hAnsi="Symbol" w:hint="default"/>
+      </w:rPr>
     </w:lvl>
     <w:lvl w:ilvl="5">
       <w:start w:val="1"/>
-      <w:numFmt w:val="decimal"/>
-      <w:lvlText w:val="%6."/>
+      <w:numFmt w:val="bullet"/>
+      <w:lvlText w:val=""/>
       <w:lvlJc w:val="left"/>
       <w:pPr>
         <w:tabs>
@@ -9605,11 +10174,14 @@
         </w:tabs>
         <w:ind w:left="4320" w:hanging="360"/>
       </w:pPr>
+      <w:rPr>
+        <w:rFonts w:ascii="Symbol" w:hAnsi="Symbol" w:hint="default"/>
+      </w:rPr>
     </w:lvl>
     <w:lvl w:ilvl="6">
       <w:start w:val="1"/>
-      <w:numFmt w:val="decimal"/>
-      <w:lvlText w:val="%7."/>
+      <w:numFmt w:val="bullet"/>
+      <w:lvlText w:val=""/>
       <w:lvlJc w:val="left"/>
       <w:pPr>
         <w:tabs>
@@ -9617,11 +10189,14 @@
         </w:tabs>
         <w:ind w:left="5040" w:hanging="360"/>
       </w:pPr>
+      <w:rPr>
+        <w:rFonts w:ascii="Symbol" w:hAnsi="Symbol" w:hint="default"/>
+      </w:rPr>
     </w:lvl>
     <w:lvl w:ilvl="7">
       <w:start w:val="1"/>
-      <w:numFmt w:val="decimal"/>
-      <w:lvlText w:val="%8."/>
+      <w:numFmt w:val="bullet"/>
+      <w:lvlText w:val=""/>
       <w:lvlJc w:val="left"/>
       <w:pPr>
         <w:tabs>
@@ -9629,13 +10204,16 @@
         </w:tabs>
         <w:ind w:left="5760" w:hanging="360"/>
       </w:pPr>
+      <w:rPr>
+        <w:rFonts w:ascii="Symbol" w:hAnsi="Symbol" w:hint="default"/>
+      </w:rPr>
     </w:lvl>
   </w:abstractNum>
   <w:abstractNum w:abstractNumId="27">
     <w:lvl w:ilvl="0">
       <w:start w:val="1"/>
-      <w:numFmt w:val="bullet"/>
-      <w:lvlText w:val=""/>
+      <w:numFmt w:val="decimal"/>
+      <w:lvlText w:val="%1."/>
       <w:lvlJc w:val="left"/>
       <w:pPr>
         <w:tabs>
@@ -9643,14 +10221,11 @@
         </w:tabs>
         <w:ind w:left="720" w:hanging="360"/>
       </w:pPr>
-      <w:rPr>
-        <w:rFonts w:ascii="Symbol" w:hAnsi="Symbol" w:hint="default"/>
-      </w:rPr>
     </w:lvl>
     <w:lvl w:ilvl="1">
       <w:start w:val="1"/>
-      <w:numFmt w:val="bullet"/>
-      <w:lvlText w:val=""/>
+      <w:numFmt w:val="decimal"/>
+      <w:lvlText w:val="%2."/>
       <w:lvlJc w:val="left"/>
       <w:pPr>
         <w:tabs>
@@ -9658,14 +10233,11 @@
         </w:tabs>
         <w:ind w:left="1440" w:hanging="360"/>
       </w:pPr>
-      <w:rPr>
-        <w:rFonts w:ascii="Symbol" w:hAnsi="Symbol" w:hint="default"/>
-      </w:rPr>
     </w:lvl>
     <w:lvl w:ilvl="2">
       <w:start w:val="1"/>
-      <w:numFmt w:val="bullet"/>
-      <w:lvlText w:val=""/>
+      <w:numFmt w:val="decimal"/>
+      <w:lvlText w:val="%3."/>
       <w:lvlJc w:val="left"/>
       <w:pPr>
         <w:tabs>
@@ -9673,14 +10245,11 @@
         </w:tabs>
         <w:ind w:left="2160" w:hanging="360"/>
       </w:pPr>
-      <w:rPr>
-        <w:rFonts w:ascii="Symbol" w:hAnsi="Symbol" w:hint="default"/>
-      </w:rPr>
     </w:lvl>
     <w:lvl w:ilvl="3">
       <w:start w:val="1"/>
-      <w:numFmt w:val="bullet"/>
-      <w:lvlText w:val=""/>
+      <w:numFmt w:val="decimal"/>
+      <w:lvlText w:val="%4."/>
       <w:lvlJc w:val="left"/>
       <w:pPr>
         <w:tabs>
@@ -9688,14 +10257,11 @@
         </w:tabs>
         <w:ind w:left="2880" w:hanging="360"/>
       </w:pPr>
-      <w:rPr>
-        <w:rFonts w:ascii="Symbol" w:hAnsi="Symbol" w:hint="default"/>
-      </w:rPr>
     </w:lvl>
     <w:lvl w:ilvl="4">
       <w:start w:val="1"/>
-      <w:numFmt w:val="bullet"/>
-      <w:lvlText w:val=""/>
+      <w:numFmt w:val="decimal"/>
+      <w:lvlText w:val="%5."/>
       <w:lvlJc w:val="left"/>
       <w:pPr>
         <w:tabs>
@@ -9703,14 +10269,11 @@
         </w:tabs>
         <w:ind w:left="3600" w:hanging="360"/>
       </w:pPr>
-      <w:rPr>
-        <w:rFonts w:ascii="Symbol" w:hAnsi="Symbol" w:hint="default"/>
-      </w:rPr>
     </w:lvl>
     <w:lvl w:ilvl="5">
       <w:start w:val="1"/>
-      <w:numFmt w:val="bullet"/>
-      <w:lvlText w:val=""/>
+      <w:numFmt w:val="decimal"/>
+      <w:lvlText w:val="%6."/>
       <w:lvlJc w:val="left"/>
       <w:pPr>
         <w:tabs>
@@ -9718,14 +10281,11 @@
         </w:tabs>
         <w:ind w:left="4320" w:hanging="360"/>
       </w:pPr>
-      <w:rPr>
-        <w:rFonts w:ascii="Symbol" w:hAnsi="Symbol" w:hint="default"/>
-      </w:rPr>
     </w:lvl>
     <w:lvl w:ilvl="6">
       <w:start w:val="1"/>
-      <w:numFmt w:val="bullet"/>
-      <w:lvlText w:val=""/>
+      <w:numFmt w:val="decimal"/>
+      <w:lvlText w:val="%7."/>
       <w:lvlJc w:val="left"/>
       <w:pPr>
         <w:tabs>
@@ -9733,14 +10293,11 @@
         </w:tabs>
         <w:ind w:left="5040" w:hanging="360"/>
       </w:pPr>
-      <w:rPr>
-        <w:rFonts w:ascii="Symbol" w:hAnsi="Symbol" w:hint="default"/>
-      </w:rPr>
     </w:lvl>
     <w:lvl w:ilvl="7">
       <w:start w:val="1"/>
-      <w:numFmt w:val="bullet"/>
-      <w:lvlText w:val=""/>
+      <w:numFmt w:val="decimal"/>
+      <w:lvlText w:val="%8."/>
       <w:lvlJc w:val="left"/>
       <w:pPr>
         <w:tabs>
@@ -9748,9 +10305,6 @@
         </w:tabs>
         <w:ind w:left="5760" w:hanging="360"/>
       </w:pPr>
-      <w:rPr>
-        <w:rFonts w:ascii="Symbol" w:hAnsi="Symbol" w:hint="default"/>
-      </w:rPr>
     </w:lvl>
   </w:abstractNum>
   <w:abstractNum w:abstractNumId="28">
@@ -9876,6 +10430,128 @@
     </w:lvl>
   </w:abstractNum>
   <w:abstractNum w:abstractNumId="29">
+    <w:lvl w:ilvl="0">
+      <w:start w:val="1"/>
+      <w:numFmt w:val="bullet"/>
+      <w:lvlText w:val=""/>
+      <w:lvlJc w:val="left"/>
+      <w:pPr>
+        <w:tabs>
+          <w:tab w:val="num" w:pos="720"/>
+        </w:tabs>
+        <w:ind w:left="720" w:hanging="360"/>
+      </w:pPr>
+      <w:rPr>
+        <w:rFonts w:ascii="Symbol" w:hAnsi="Symbol" w:hint="default"/>
+      </w:rPr>
+    </w:lvl>
+    <w:lvl w:ilvl="1">
+      <w:start w:val="1"/>
+      <w:numFmt w:val="bullet"/>
+      <w:lvlText w:val=""/>
+      <w:lvlJc w:val="left"/>
+      <w:pPr>
+        <w:tabs>
+          <w:tab w:val="num" w:pos="1440"/>
+        </w:tabs>
+        <w:ind w:left="1440" w:hanging="360"/>
+      </w:pPr>
+      <w:rPr>
+        <w:rFonts w:ascii="Symbol" w:hAnsi="Symbol" w:hint="default"/>
+      </w:rPr>
+    </w:lvl>
+    <w:lvl w:ilvl="2">
+      <w:start w:val="1"/>
+      <w:numFmt w:val="bullet"/>
+      <w:lvlText w:val=""/>
+      <w:lvlJc w:val="left"/>
+      <w:pPr>
+        <w:tabs>
+          <w:tab w:val="num" w:pos="2160"/>
+        </w:tabs>
+        <w:ind w:left="2160" w:hanging="360"/>
+      </w:pPr>
+      <w:rPr>
+        <w:rFonts w:ascii="Symbol" w:hAnsi="Symbol" w:hint="default"/>
+      </w:rPr>
+    </w:lvl>
+    <w:lvl w:ilvl="3">
+      <w:start w:val="1"/>
+      <w:numFmt w:val="bullet"/>
+      <w:lvlText w:val=""/>
+      <w:lvlJc w:val="left"/>
+      <w:pPr>
+        <w:tabs>
+          <w:tab w:val="num" w:pos="2880"/>
+        </w:tabs>
+        <w:ind w:left="2880" w:hanging="360"/>
+      </w:pPr>
+      <w:rPr>
+        <w:rFonts w:ascii="Symbol" w:hAnsi="Symbol" w:hint="default"/>
+      </w:rPr>
+    </w:lvl>
+    <w:lvl w:ilvl="4">
+      <w:start w:val="1"/>
+      <w:numFmt w:val="bullet"/>
+      <w:lvlText w:val=""/>
+      <w:lvlJc w:val="left"/>
+      <w:pPr>
+        <w:tabs>
+          <w:tab w:val="num" w:pos="3600"/>
+        </w:tabs>
+        <w:ind w:left="3600" w:hanging="360"/>
+      </w:pPr>
+      <w:rPr>
+        <w:rFonts w:ascii="Symbol" w:hAnsi="Symbol" w:hint="default"/>
+      </w:rPr>
+    </w:lvl>
+    <w:lvl w:ilvl="5">
+      <w:start w:val="1"/>
+      <w:numFmt w:val="bullet"/>
+      <w:lvlText w:val=""/>
+      <w:lvlJc w:val="left"/>
+      <w:pPr>
+        <w:tabs>
+          <w:tab w:val="num" w:pos="4320"/>
+        </w:tabs>
+        <w:ind w:left="4320" w:hanging="360"/>
+      </w:pPr>
+      <w:rPr>
+        <w:rFonts w:ascii="Symbol" w:hAnsi="Symbol" w:hint="default"/>
+      </w:rPr>
+    </w:lvl>
+    <w:lvl w:ilvl="6">
+      <w:start w:val="1"/>
+      <w:numFmt w:val="bullet"/>
+      <w:lvlText w:val=""/>
+      <w:lvlJc w:val="left"/>
+      <w:pPr>
+        <w:tabs>
+          <w:tab w:val="num" w:pos="5040"/>
+        </w:tabs>
+        <w:ind w:left="5040" w:hanging="360"/>
+      </w:pPr>
+      <w:rPr>
+        <w:rFonts w:ascii="Symbol" w:hAnsi="Symbol" w:hint="default"/>
+      </w:rPr>
+    </w:lvl>
+    <w:lvl w:ilvl="7">
+      <w:start w:val="1"/>
+      <w:numFmt w:val="bullet"/>
+      <w:lvlText w:val=""/>
+      <w:lvlJc w:val="left"/>
+      <w:pPr>
+        <w:tabs>
+          <w:tab w:val="num" w:pos="5760"/>
+        </w:tabs>
+        <w:ind w:left="5760" w:hanging="360"/>
+      </w:pPr>
+      <w:rPr>
+        <w:rFonts w:ascii="Symbol" w:hAnsi="Symbol" w:hint="default"/>
+      </w:rPr>
+    </w:lvl>
+  </w:abstractNum>
+  <w:abstractNum w:abstractNumId="30">
     <w:lvl w:ilvl="0">
       <w:start w:val="1"/>
       <w:numFmt w:val="bullet"/>
@@ -10083,6 +10759,9 @@
   </w:num>
   <w:num w:numId="29">
     <w:abstractNumId w:val="29"/>
+  </w:num>
+  <w:num w:numId="30">
+    <w:abstractNumId w:val="30"/>
   </w:num>
 </w:numbering>
 </file>

</xml_diff>

<commit_message>
Servizio: ore min/max a tendina (24h). Valet: P.IVA nasconde CF/ritenuta, nascita sempre visibile, IBAN in Stipendio. Doc: magazzino, % ritenuta
Co-Authored-By: Claude Opus 4.8 <noreply@anthropic.com>
</commit_message>
<xml_diff>
--- a/deluxy-platform-next/docs/COME-FUNZIONA-APP-DELUXY.docx
+++ b/deluxy-platform-next/docs/COME-FUNZIONA-APP-DELUXY.docx
@@ -169,6 +169,192 @@
           <w:b/>
         </w:rPr>
         <w:t xml:space="preserve">Changelog</w:t>
+      </w:r>
+      <w:r>
+        <w:rPr>
+          <w:b/>
+        </w:rPr>
+        <w:t xml:space="preserve">16/07/2026 (3) — Form </w:t>
+      </w:r>
+      <w:r>
+        <w:rPr>
+          <w:b/>
+        </w:rPr>
+        <w:t xml:space="preserve">Servizio</w:t>
+      </w:r>
+      <w:r>
+        <w:rPr>
+          <w:b/>
+        </w:rPr>
+        <w:t xml:space="preserve"> e </w:t>
+      </w:r>
+      <w:r>
+        <w:rPr>
+          <w:b/>
+        </w:rPr>
+        <w:t xml:space="preserve">Valet</w:t>
+      </w:r>
+      <w:r>
+        <w:rPr>
+          <w:b/>
+        </w:rPr>
+        <w:t xml:space="preserve">: nel Servizio, </w:t>
+      </w:r>
+      <w:r>
+        <w:rPr>
+          <w:b/>
+        </w:rPr>
+        <w:t xml:space="preserve">Ora minima/massima di inserimento</w:t>
+      </w:r>
+      <w:r>
+        <w:rPr>
+          <w:b/>
+        </w:rPr>
+        <w:t xml:space="preserve"> sono ora </w:t>
+      </w:r>
+      <w:r>
+        <w:rPr>
+          <w:b/>
+        </w:rPr>
+        <w:t xml:space="preserve">tendine (00:00–23:00)</w:t>
+      </w:r>
+      <w:r>
+        <w:rPr>
+          <w:b/>
+        </w:rPr>
+        <w:t xml:space="preserve">. Nel Valet: </w:t>
+      </w:r>
+      <w:r>
+        <w:rPr>
+          <w:b/>
+        </w:rPr>
+        <w:t xml:space="preserve">Luogo e Data di nascita sempre visibili</w:t>
+      </w:r>
+      <w:r>
+        <w:rPr>
+          <w:b/>
+        </w:rPr>
+        <w:t xml:space="preserve">; con </w:t>
+      </w:r>
+      <w:r>
+        <w:rPr>
+          <w:b/>
+        </w:rPr>
+        <w:t xml:space="preserve">Partita IVA</w:t>
+      </w:r>
+      <w:r>
+        <w:rPr>
+          <w:b/>
+        </w:rPr>
+        <w:t xml:space="preserve"> attiva compare </w:t>
+      </w:r>
+      <w:r>
+        <w:rPr>
+          <w:b/>
+        </w:rPr>
+        <w:t xml:space="preserve">solo la P.IVA</w:t>
+      </w:r>
+      <w:r>
+        <w:rPr>
+          <w:b/>
+        </w:rPr>
+        <w:t xml:space="preserve"> (spariscono CF e % ritenuta); </w:t>
+      </w:r>
+      <w:r>
+        <w:rPr>
+          <w:b/>
+        </w:rPr>
+        <w:t xml:space="preserve">senza</w:t>
+      </w:r>
+      <w:r>
+        <w:rPr>
+          <w:b/>
+        </w:rPr>
+        <w:t xml:space="preserve"> P.IVA compaiono </w:t>
+      </w:r>
+      <w:r>
+        <w:rPr>
+          <w:b/>
+        </w:rPr>
+        <w:t xml:space="preserve">CF*</w:t>
+      </w:r>
+      <w:r>
+        <w:rPr>
+          <w:b/>
+        </w:rPr>
+        <w:t xml:space="preserve"> e </w:t>
+      </w:r>
+      <w:r>
+        <w:rPr>
+          <w:b/>
+        </w:rPr>
+        <w:t xml:space="preserve">% ritenuta</w:t>
+      </w:r>
+      <w:r>
+        <w:rPr>
+          <w:b/>
+        </w:rPr>
+        <w:t xml:space="preserve">; l'</w:t>
+      </w:r>
+      <w:r>
+        <w:rPr>
+          <w:b/>
+        </w:rPr>
+        <w:t xml:space="preserve">IBAN</w:t>
+      </w:r>
+      <w:r>
+        <w:rPr>
+          <w:b/>
+        </w:rPr>
+        <w:t xml:space="preserve"> è spostato nella sezione </w:t>
+      </w:r>
+      <w:r>
+        <w:rPr>
+          <w:b/>
+        </w:rPr>
+        <w:t xml:space="preserve">Stipendio</w:t>
+      </w:r>
+      <w:r>
+        <w:rPr>
+          <w:b/>
+        </w:rPr>
+        <w:t xml:space="preserve">. Documentati: </w:t>
+      </w:r>
+      <w:r>
+        <w:rPr>
+          <w:b/>
+        </w:rPr>
+        <w:t xml:space="preserve">Partner magazzino</w:t>
+      </w:r>
+      <w:r>
+        <w:rPr>
+          <w:b/>
+        </w:rPr>
+        <w:t xml:space="preserve"> = il cliente ha lo stock dei propri prodotti monitorato; </w:t>
+      </w:r>
+      <w:r>
+        <w:rPr>
+          <w:b/>
+        </w:rPr>
+        <w:t xml:space="preserve">% ritenuta</w:t>
+      </w:r>
+      <w:r>
+        <w:rPr>
+          <w:b/>
+        </w:rPr>
+        <w:t xml:space="preserve"> = % di rimborso spese per ricevuta fiscale sul totale dei servizi effettuati. (Categorie partner e province partner/valet sono già a </w:t>
+      </w:r>
+      <w:r>
+        <w:rPr>
+          <w:b/>
+        </w:rPr>
+        <w:t xml:space="preserve">selezione multipla</w:t>
+      </w:r>
+      <w:r>
+        <w:rPr>
+          <w:b/>
+        </w:rPr>
+        <w:t xml:space="preserve"> a chip.)</w:t>
       </w:r>
       <w:r>
         <w:rPr>
@@ -2940,6 +3126,16 @@
         <w:rPr>
           <w:b/>
         </w:rPr>
+        <w:t xml:space="preserve">Significa che il cliente ha lo stock dei propri prodotti monitorato</w:t>
+      </w:r>
+      <w:r>
+        <w:rPr/>
+        <w:t xml:space="preserve"> (gestione delle giacenze dei suoi prodotti in magazzino). </w:t>
+      </w:r>
+      <w:r>
+        <w:rPr>
+          <w:b/>
+        </w:rPr>
         <w:t xml:space="preserve">[NUOVO]</w:t>
       </w:r>
     </w:p>
@@ -3462,11 +3658,99 @@
         <w:rPr>
           <w:b/>
         </w:rPr>
+        <w:t xml:space="preserve">Luogo di nascita (e provincia)</w:t>
+      </w:r>
+      <w:r>
+        <w:rPr/>
+        <w:t xml:space="preserve"> e </w:t>
+      </w:r>
+      <w:r>
+        <w:rPr>
+          <w:b/>
+        </w:rPr>
+        <w:t xml:space="preserve">Data di nascita</w:t>
+      </w:r>
+      <w:r>
+        <w:rPr/>
+        <w:t xml:space="preserve"> (sempre visibili), flag </w:t>
+      </w:r>
+      <w:r>
+        <w:rPr>
+          <w:b/>
+        </w:rPr>
         <w:t xml:space="preserve">Partita IVA</w:t>
       </w:r>
       <w:r>
         <w:rPr/>
-        <w:t xml:space="preserve"> (opzionale), </w:t>
+        <w:t xml:space="preserve">. </w:t>
+      </w:r>
+      <w:r>
+        <w:rPr>
+          <w:b/>
+        </w:rPr>
+        <w:t xml:space="preserve">Regola form nuovo ambiente</w:t>
+      </w:r>
+      <w:r>
+        <w:rPr/>
+        <w:t xml:space="preserve">: </w:t>
+      </w:r>
+      <w:r>
+        <w:rPr>
+          <w:b/>
+        </w:rPr>
+        <w:t xml:space="preserve">[NUOVO]</w:t>
+      </w:r>
+    </w:p>
+    <w:p>
+      <w:pPr>
+        <w:numPr>
+          <w:ilvl w:val="1"/>
+          <w:numId w:val="13"/>
+        </w:numPr>
+        <w:spacing w:lineRule="auto"/>
+      </w:pPr>
+      <w:r>
+        <w:rPr/>
+        <w:t xml:space="preserve">con </w:t>
+      </w:r>
+      <w:r>
+        <w:rPr>
+          <w:b/>
+        </w:rPr>
+        <w:t xml:space="preserve">Partita IVA</w:t>
+      </w:r>
+      <w:r>
+        <w:rPr/>
+        <w:t xml:space="preserve"> attiva si mostra </w:t>
+      </w:r>
+      <w:r>
+        <w:rPr>
+          <w:b/>
+        </w:rPr>
+        <w:t xml:space="preserve">solo il campo P.IVA*</w:t>
+      </w:r>
+      <w:r>
+        <w:rPr/>
+        <w:t xml:space="preserve"> (il valet fattura: niente CF né ritenuta in questa sezione);</w:t>
+      </w:r>
+    </w:p>
+    <w:p>
+      <w:pPr>
+        <w:numPr>
+          <w:ilvl w:val="1"/>
+          <w:numId w:val="13"/>
+        </w:numPr>
+        <w:spacing w:lineRule="auto"/>
+      </w:pPr>
+      <w:r>
+        <w:rPr>
+          <w:b/>
+        </w:rPr>
+        <w:t xml:space="preserve">senza Partita IVA</w:t>
+      </w:r>
+      <w:r>
+        <w:rPr/>
+        <w:t xml:space="preserve"> si mostrano </w:t>
       </w:r>
       <w:r>
         <w:rPr>
@@ -3476,23 +3760,83 @@
       </w:r>
       <w:r>
         <w:rPr/>
-        <w:t xml:space="preserve"> (obbligatorio), </w:t>
-      </w:r>
-      <w:r>
-        <w:rPr>
-          <w:b/>
-        </w:rPr>
-        <w:t xml:space="preserve">Luogo di nascita (e provincia)</w:t>
-      </w:r>
-      <w:r>
-        <w:rPr/>
-        <w:t xml:space="preserve">, Data di nascita, coordinate bancarie (IBAN), Percentuale Ritenuta. </w:t>
-      </w:r>
-      <w:r>
-        <w:rPr>
-          <w:b/>
-        </w:rPr>
-        <w:t xml:space="preserve">[NUOVO — nel form reale il CF è obbligatorio, la P.IVA no]</w:t>
+        <w:t xml:space="preserve"> e </w:t>
+      </w:r>
+      <w:r>
+        <w:rPr>
+          <w:b/>
+        </w:rPr>
+        <w:t xml:space="preserve">Percentuale Ritenuta (%)</w:t>
+      </w:r>
+      <w:r>
+        <w:rPr/>
+        <w:t xml:space="preserve"> (ricevuta con ritenuta d'acconto).</w:t>
+      </w:r>
+    </w:p>
+    <w:p>
+      <w:pPr>
+        <w:numPr>
+          <w:ilvl w:val="1"/>
+          <w:numId w:val="13"/>
+        </w:numPr>
+        <w:spacing w:lineRule="auto"/>
+      </w:pPr>
+      <w:r>
+        <w:rPr/>
+        <w:t xml:space="preserve">Le </w:t>
+      </w:r>
+      <w:r>
+        <w:rPr>
+          <w:b/>
+        </w:rPr>
+        <w:t xml:space="preserve">coordinate bancarie (IBAN)</w:t>
+      </w:r>
+      <w:r>
+        <w:rPr/>
+        <w:t xml:space="preserve"> stanno nella sezione </w:t>
+      </w:r>
+      <w:r>
+        <w:rPr>
+          <w:b/>
+        </w:rPr>
+        <w:t xml:space="preserve">Stipendio</w:t>
+      </w:r>
+      <w:r>
+        <w:rPr/>
+        <w:t xml:space="preserve"> (non più tra i dati fiscali).</w:t>
+      </w:r>
+    </w:p>
+    <w:p>
+      <w:pPr>
+        <w:numPr>
+          <w:ilvl w:val="1"/>
+          <w:numId w:val="13"/>
+        </w:numPr>
+        <w:spacing w:lineRule="auto"/>
+      </w:pPr>
+      <w:r>
+        <w:rPr/>
+        <w:t xml:space="preserve">% Ritenuta</w:t>
+      </w:r>
+      <w:r>
+        <w:rPr/>
+        <w:t xml:space="preserve"> = </w:t>
+      </w:r>
+      <w:r>
+        <w:rPr>
+          <w:b/>
+        </w:rPr>
+        <w:t xml:space="preserve">percentuale di rimborso spese per la ricevuta fiscale sul totale dei servizi effettuati</w:t>
+      </w:r>
+      <w:r>
+        <w:rPr/>
+        <w:t xml:space="preserve"> dal valet. </w:t>
+      </w:r>
+      <w:r>
+        <w:rPr>
+          <w:b/>
+        </w:rPr>
+        <w:t xml:space="preserve">[NUOVO — chiarimento utente]</w:t>
       </w:r>
     </w:p>
     <w:p>
@@ -3859,7 +4203,7 @@
       <w:pPr>
         <w:numPr>
           <w:ilvl w:val="0"/>
-          <w:numId w:val="13"/>
+          <w:numId w:val="14"/>
         </w:numPr>
         <w:spacing w:lineRule="auto"/>
       </w:pPr>
@@ -3880,217 +4224,6 @@
       <w:r>
         <w:rPr/>
         <w:t xml:space="preserve">): 8 servizi. Tipi: Servizi a Prezzo Fisso, Servizi in Ora, Servizi Magazzino (es. SERVIZIO MAGAZZINO SWISS/CAPJARI/ECI, Servizio Incluso, Trasporto catering). Il valore è impostato per singolo valet nella sua scheda. Solo i prezzi fissi calcolano extra KM / fuoricittà.</w:t>
-      </w:r>
-    </w:p>
-    <w:p>
-      <w:pPr>
-        <w:numPr>
-          <w:ilvl w:val="0"/>
-          <w:numId w:val="13"/>
-        </w:numPr>
-        <w:spacing w:lineRule="auto"/>
-      </w:pPr>
-      <w:r>
-        <w:rPr>
-          <w:b/>
-        </w:rPr>
-        <w:t xml:space="preserve">Stipendi</w:t>
-      </w:r>
-      <w:r>
-        <w:rPr/>
-        <w:t xml:space="preserve"> (</w:t>
-      </w:r>
-      <w:r>
-        <w:rPr/>
-        <w:t xml:space="preserve">/valet/stipendi</w:t>
-      </w:r>
-      <w:r>
-        <w:rPr/>
-        <w:t xml:space="preserve">): filtro per valet + STORICO, GENERA STIPENDI, ESPORTA. Genera pro-forma fattura (valet con P.IVA) o ricevuta ritenuta (senza P.IVA). Invio stipendio → righe in storico → ricevuta generata in RICEVUTE da firmare → approvazione → pagamento. Il valet può aprire un RECLAMO su ogni riga (es. rimborso Area C).</w:t>
-      </w:r>
-    </w:p>
-    <w:p>
-      <w:pPr>
-        <w:numPr>
-          <w:ilvl w:val="0"/>
-          <w:numId w:val="13"/>
-        </w:numPr>
-        <w:spacing w:lineRule="auto"/>
-      </w:pPr>
-      <w:r>
-        <w:rPr>
-          <w:b/>
-        </w:rPr>
-        <w:t xml:space="preserve">Ricevute</w:t>
-      </w:r>
-      <w:r>
-        <w:rPr/>
-        <w:t xml:space="preserve"> (</w:t>
-      </w:r>
-      <w:r>
-        <w:rPr/>
-        <w:t xml:space="preserve">/expert/receipts</w:t>
-      </w:r>
-      <w:r>
-        <w:rPr/>
-        <w:t xml:space="preserve">): ricevute generate automaticamente dall'invio stipendi; il valet le ricarica firmate per l'approvazione e il pagamento.</w:t>
-      </w:r>
-    </w:p>
-    <w:p>
-      <w:pPr>
-        <w:numPr>
-          <w:ilvl w:val="0"/>
-          <w:numId w:val="13"/>
-        </w:numPr>
-        <w:spacing w:lineRule="auto"/>
-      </w:pPr>
-      <w:r>
-        <w:rPr>
-          <w:b/>
-        </w:rPr>
-        <w:t xml:space="preserve">Regole Valet</w:t>
-      </w:r>
-      <w:r>
-        <w:rPr/>
-        <w:t xml:space="preserve"> (</w:t>
-      </w:r>
-      <w:r>
-        <w:rPr/>
-        <w:t xml:space="preserve">/expert/rules</w:t>
-      </w:r>
-      <w:r>
-        <w:rPr/>
-        <w:t xml:space="preserve">): regole per valet per definire i rimborsi per consegne con 2+ ritiri (lista per valet con edit/delete/expand).</w:t>
-      </w:r>
-    </w:p>
-    <w:p>
-      <w:pPr>
-        <w:numPr>
-          <w:ilvl w:val="0"/>
-          <w:numId w:val="13"/>
-        </w:numPr>
-        <w:spacing w:lineRule="auto"/>
-      </w:pPr>
-      <w:r>
-        <w:rPr>
-          <w:b/>
-        </w:rPr>
-        <w:t xml:space="preserve">Pagamenti</w:t>
-      </w:r>
-      <w:r>
-        <w:rPr/>
-        <w:t xml:space="preserve"> (</w:t>
-      </w:r>
-      <w:r>
-        <w:rPr/>
-        <w:t xml:space="preserve">/expert/payments</w:t>
-      </w:r>
-      <w:r>
-        <w:rPr/>
-        <w:t xml:space="preserve">): richieste di rimborso dei valet per servizi specifici. Stati: CREATA / APPROVATA + STORICO; filtro per valet.</w:t>
-      </w:r>
-    </w:p>
-    <w:p>
-      <w:pPr>
-        <w:numPr>
-          <w:ilvl w:val="0"/>
-          <w:numId w:val="13"/>
-        </w:numPr>
-        <w:spacing w:lineRule="auto"/>
-      </w:pPr>
-      <w:r>
-        <w:rPr>
-          <w:b/>
-        </w:rPr>
-        <w:t xml:space="preserve">Transazioni</w:t>
-      </w:r>
-      <w:r>
-        <w:rPr/>
-        <w:t xml:space="preserve"> (</w:t>
-      </w:r>
-      <w:r>
-        <w:rPr/>
-        <w:t xml:space="preserve">/transzioni</w:t>
-      </w:r>
-      <w:r>
-        <w:rPr/>
-        <w:t xml:space="preserve">): sezione transazioni valet (movimenti economici). </w:t>
-      </w:r>
-      <w:r>
-        <w:rPr>
-          <w:b/>
-        </w:rPr>
-        <w:t xml:space="preserve">[NUOVO]</w:t>
-      </w:r>
-    </w:p>
-    <w:p>
-      <w:pPr>
-        <w:numPr>
-          <w:ilvl w:val="0"/>
-          <w:numId w:val="13"/>
-        </w:numPr>
-        <w:spacing w:lineRule="auto"/>
-      </w:pPr>
-      <w:r>
-        <w:rPr>
-          <w:b/>
-        </w:rPr>
-        <w:t xml:space="preserve">Valet Contratti</w:t>
-      </w:r>
-      <w:r>
-        <w:rPr/>
-        <w:t xml:space="preserve"> (</w:t>
-      </w:r>
-      <w:r>
-        <w:rPr/>
-        <w:t xml:space="preserve">/expert/contracts</w:t>
-      </w:r>
-      <w:r>
-        <w:rPr/>
-        <w:t xml:space="preserve">): gestione contratti valet con colonne: ID, Valet, CONTRATTO GENERATO, CONTRATTO FIRMATO. </w:t>
-      </w:r>
-      <w:r>
-        <w:rPr>
-          <w:b/>
-        </w:rPr>
-        <w:t xml:space="preserve">[NUOVO]</w:t>
-      </w:r>
-    </w:p>
-    <w:p>
-      <w:pPr>
-        <w:numPr>
-          <w:ilvl w:val="0"/>
-          <w:numId w:val="13"/>
-        </w:numPr>
-        <w:spacing w:lineRule="auto"/>
-      </w:pPr>
-      <w:r>
-        <w:rPr>
-          <w:b/>
-        </w:rPr>
-        <w:t xml:space="preserve">Orari Apertura</w:t>
-      </w:r>
-      <w:r>
-        <w:rPr/>
-        <w:t xml:space="preserve"> (</w:t>
-      </w:r>
-      <w:r>
-        <w:rPr/>
-        <w:t xml:space="preserve">/expert/availability/list</w:t>
-      </w:r>
-      <w:r>
-        <w:rPr/>
-        <w:t xml:space="preserve">): disponibilità dei valet per data e fascia oraria.</w:t>
-      </w:r>
-    </w:p>
-    <w:p>
-      <w:pPr>
-        <w:pStyle w:val="Heading3"/>
-        <w:spacing w:lineRule="auto"/>
-      </w:pPr>
-      <w:r>
-        <w:rPr/>
-        <w:t xml:space="preserve">3.5 Utenti / Operation / Customers</w:t>
       </w:r>
     </w:p>
     <w:p>
@@ -4105,7 +4238,7 @@
         <w:rPr>
           <w:b/>
         </w:rPr>
-        <w:t xml:space="preserve">Utenti</w:t>
+        <w:t xml:space="preserve">Stipendi</w:t>
       </w:r>
       <w:r>
         <w:rPr/>
@@ -4113,11 +4246,11 @@
       </w:r>
       <w:r>
         <w:rPr/>
-        <w:t xml:space="preserve">/utenti</w:t>
-      </w:r>
-      <w:r>
-        <w:rPr/>
-        <w:t xml:space="preserve">): 550 utenti; colonne ID, Email, Cognome, Nome, Ruolo (nessuno/admin/expert/partner/operation, modificabile in linea), Attivo (Attivo/Disattivo/Da convalidare/Sconosciuto), Elimina. Visibile solo ad Admin. Qui si attivano gli utenti appena registrati e si trasformano in Admin.</w:t>
+        <w:t xml:space="preserve">/valet/stipendi</w:t>
+      </w:r>
+      <w:r>
+        <w:rPr/>
+        <w:t xml:space="preserve">): filtro per valet + STORICO, GENERA STIPENDI, ESPORTA. Genera pro-forma fattura (valet con P.IVA) o ricevuta ritenuta (senza P.IVA). Invio stipendio → righe in storico → ricevuta generata in RICEVUTE da firmare → approvazione → pagamento. Il valet può aprire un RECLAMO su ogni riga (es. rimborso Area C).</w:t>
       </w:r>
     </w:p>
     <w:p>
@@ -4132,7 +4265,7 @@
         <w:rPr>
           <w:b/>
         </w:rPr>
-        <w:t xml:space="preserve">Operation</w:t>
+        <w:t xml:space="preserve">Ricevute</w:t>
       </w:r>
       <w:r>
         <w:rPr/>
@@ -4140,180 +4273,11 @@
       </w:r>
       <w:r>
         <w:rPr/>
-        <w:t xml:space="preserve">/operation</w:t>
-      </w:r>
-      <w:r>
-        <w:rPr/>
-        <w:t xml:space="preserve">): staff d'ufficio (14 persone): Cognome, Nome, Email, Telefono, Attivo + AGGIUNGI. </w:t>
-      </w:r>
-      <w:r>
-        <w:rPr>
-          <w:b/>
-        </w:rPr>
-        <w:t xml:space="preserve">Form "Nuovo Operation"</w:t>
-      </w:r>
-      <w:r>
-        <w:rPr/>
-        <w:t xml:space="preserve">: Cognome*, Nome*, E-mail*, Telefono*, Indirizzo*; notifiche WhatsApp/Mail; </w:t>
-      </w:r>
-      <w:r>
-        <w:rPr>
-          <w:b/>
-        </w:rPr>
-        <w:t xml:space="preserve">Ruolo operatore</w:t>
-      </w:r>
-      <w:r>
-        <w:rPr/>
-        <w:t xml:space="preserve">; Note. </w:t>
-      </w:r>
-      <w:r>
-        <w:rPr>
-          <w:b/>
-        </w:rPr>
-        <w:t xml:space="preserve">[NUOVO]</w:t>
-      </w:r>
-    </w:p>
-    <w:p>
-      <w:pPr>
-        <w:numPr>
-          <w:ilvl w:val="1"/>
-          <w:numId w:val="15"/>
-        </w:numPr>
-        <w:spacing w:lineRule="auto"/>
-      </w:pPr>
-      <w:r>
-        <w:rPr>
-          <w:b/>
-        </w:rPr>
-        <w:t xml:space="preserve">Ruolo operatore</w:t>
-      </w:r>
-      <w:r>
-        <w:rPr/>
-        <w:t xml:space="preserve"> (controlla la visibilità delle sezioni del menu): </w:t>
-      </w:r>
-      <w:r>
-        <w:rPr>
-          <w:b/>
-        </w:rPr>
-        <w:t xml:space="preserve">[NUOVO]</w:t>
-      </w:r>
-    </w:p>
-    <w:p>
-      <w:pPr>
-        <w:numPr>
-          <w:ilvl w:val="2"/>
-          <w:numId w:val="16"/>
-        </w:numPr>
-        <w:spacing w:lineRule="auto"/>
-      </w:pPr>
-      <w:r>
-        <w:rPr/>
-        <w:t xml:space="preserve">operation</w:t>
-      </w:r>
-      <w:r>
-        <w:rPr/>
-        <w:t xml:space="preserve"> (base): vede la sezione </w:t>
-      </w:r>
-      <w:r>
-        <w:rPr>
-          <w:b/>
-        </w:rPr>
-        <w:t xml:space="preserve">Operatività</w:t>
-      </w:r>
-      <w:r>
-        <w:rPr/>
-        <w:t xml:space="preserve">, non </w:t>
-      </w:r>
-      <w:r>
-        <w:rPr>
-          <w:b/>
-        </w:rPr>
-        <w:t xml:space="preserve">Amministrazione</w:t>
-      </w:r>
-      <w:r>
-        <w:rPr/>
-        <w:t xml:space="preserve">.</w:t>
-      </w:r>
-    </w:p>
-    <w:p>
-      <w:pPr>
-        <w:numPr>
-          <w:ilvl w:val="2"/>
-          <w:numId w:val="16"/>
-        </w:numPr>
-        <w:spacing w:lineRule="auto"/>
-      </w:pPr>
-      <w:r>
-        <w:rPr/>
-        <w:t xml:space="preserve">finance</w:t>
-      </w:r>
-      <w:r>
-        <w:rPr/>
-        <w:t xml:space="preserve">: vede </w:t>
-      </w:r>
-      <w:r>
-        <w:rPr>
-          <w:b/>
-        </w:rPr>
-        <w:t xml:space="preserve">anche la sezione Amministrazione</w:t>
-      </w:r>
-      <w:r>
-        <w:rPr/>
-        <w:t xml:space="preserve"> (Stipendi, Pagamenti, Regole, Finanza).</w:t>
-      </w:r>
-    </w:p>
-    <w:p>
-      <w:pPr>
-        <w:numPr>
-          <w:ilvl w:val="2"/>
-          <w:numId w:val="16"/>
-        </w:numPr>
-        <w:spacing w:lineRule="auto"/>
-      </w:pPr>
-      <w:r>
-        <w:rPr/>
-        <w:t xml:space="preserve">project_manager</w:t>
-      </w:r>
-      <w:r>
-        <w:rPr/>
-        <w:t xml:space="preserve">: </w:t>
-      </w:r>
-      <w:r>
-        <w:rPr>
-          <w:b/>
-        </w:rPr>
-        <w:t xml:space="preserve">non vede la sezione Operatività</w:t>
-      </w:r>
-      <w:r>
-        <w:rPr/>
-        <w:t xml:space="preserve"> (Consegne, Attività, Vendite).</w:t>
-      </w:r>
-    </w:p>
-    <w:p>
-      <w:pPr>
-        <w:numPr>
-          <w:ilvl w:val="2"/>
-          <w:numId w:val="16"/>
-        </w:numPr>
-        <w:spacing w:lineRule="auto"/>
-      </w:pPr>
-      <w:r>
-        <w:rPr/>
-        <w:t xml:space="preserve">customer_service</w:t>
-      </w:r>
-      <w:r>
-        <w:rPr/>
-        <w:t xml:space="preserve">: </w:t>
-      </w:r>
-      <w:r>
-        <w:rPr>
-          <w:b/>
-        </w:rPr>
-        <w:t xml:space="preserve">non vede la sezione Amministrazione</w:t>
-      </w:r>
-      <w:r>
-        <w:rPr/>
-        <w:t xml:space="preserve">.</w:t>
+        <w:t xml:space="preserve">/expert/receipts</w:t>
+      </w:r>
+      <w:r>
+        <w:rPr/>
+        <w:t xml:space="preserve">): ricevute generate automaticamente dall'invio stipendi; il valet le ricarica firmate per l'approvazione e il pagamento.</w:t>
       </w:r>
     </w:p>
     <w:p>
@@ -4328,6 +4292,386 @@
         <w:rPr>
           <w:b/>
         </w:rPr>
+        <w:t xml:space="preserve">Regole Valet</w:t>
+      </w:r>
+      <w:r>
+        <w:rPr/>
+        <w:t xml:space="preserve"> (</w:t>
+      </w:r>
+      <w:r>
+        <w:rPr/>
+        <w:t xml:space="preserve">/expert/rules</w:t>
+      </w:r>
+      <w:r>
+        <w:rPr/>
+        <w:t xml:space="preserve">): regole per valet per definire i rimborsi per consegne con 2+ ritiri (lista per valet con edit/delete/expand).</w:t>
+      </w:r>
+    </w:p>
+    <w:p>
+      <w:pPr>
+        <w:numPr>
+          <w:ilvl w:val="0"/>
+          <w:numId w:val="14"/>
+        </w:numPr>
+        <w:spacing w:lineRule="auto"/>
+      </w:pPr>
+      <w:r>
+        <w:rPr>
+          <w:b/>
+        </w:rPr>
+        <w:t xml:space="preserve">Pagamenti</w:t>
+      </w:r>
+      <w:r>
+        <w:rPr/>
+        <w:t xml:space="preserve"> (</w:t>
+      </w:r>
+      <w:r>
+        <w:rPr/>
+        <w:t xml:space="preserve">/expert/payments</w:t>
+      </w:r>
+      <w:r>
+        <w:rPr/>
+        <w:t xml:space="preserve">): richieste di rimborso dei valet per servizi specifici. Stati: CREATA / APPROVATA + STORICO; filtro per valet.</w:t>
+      </w:r>
+    </w:p>
+    <w:p>
+      <w:pPr>
+        <w:numPr>
+          <w:ilvl w:val="0"/>
+          <w:numId w:val="14"/>
+        </w:numPr>
+        <w:spacing w:lineRule="auto"/>
+      </w:pPr>
+      <w:r>
+        <w:rPr>
+          <w:b/>
+        </w:rPr>
+        <w:t xml:space="preserve">Transazioni</w:t>
+      </w:r>
+      <w:r>
+        <w:rPr/>
+        <w:t xml:space="preserve"> (</w:t>
+      </w:r>
+      <w:r>
+        <w:rPr/>
+        <w:t xml:space="preserve">/transzioni</w:t>
+      </w:r>
+      <w:r>
+        <w:rPr/>
+        <w:t xml:space="preserve">): sezione transazioni valet (movimenti economici). </w:t>
+      </w:r>
+      <w:r>
+        <w:rPr>
+          <w:b/>
+        </w:rPr>
+        <w:t xml:space="preserve">[NUOVO]</w:t>
+      </w:r>
+    </w:p>
+    <w:p>
+      <w:pPr>
+        <w:numPr>
+          <w:ilvl w:val="0"/>
+          <w:numId w:val="14"/>
+        </w:numPr>
+        <w:spacing w:lineRule="auto"/>
+      </w:pPr>
+      <w:r>
+        <w:rPr>
+          <w:b/>
+        </w:rPr>
+        <w:t xml:space="preserve">Valet Contratti</w:t>
+      </w:r>
+      <w:r>
+        <w:rPr/>
+        <w:t xml:space="preserve"> (</w:t>
+      </w:r>
+      <w:r>
+        <w:rPr/>
+        <w:t xml:space="preserve">/expert/contracts</w:t>
+      </w:r>
+      <w:r>
+        <w:rPr/>
+        <w:t xml:space="preserve">): gestione contratti valet con colonne: ID, Valet, CONTRATTO GENERATO, CONTRATTO FIRMATO. </w:t>
+      </w:r>
+      <w:r>
+        <w:rPr>
+          <w:b/>
+        </w:rPr>
+        <w:t xml:space="preserve">[NUOVO]</w:t>
+      </w:r>
+    </w:p>
+    <w:p>
+      <w:pPr>
+        <w:numPr>
+          <w:ilvl w:val="0"/>
+          <w:numId w:val="14"/>
+        </w:numPr>
+        <w:spacing w:lineRule="auto"/>
+      </w:pPr>
+      <w:r>
+        <w:rPr>
+          <w:b/>
+        </w:rPr>
+        <w:t xml:space="preserve">Orari Apertura</w:t>
+      </w:r>
+      <w:r>
+        <w:rPr/>
+        <w:t xml:space="preserve"> (</w:t>
+      </w:r>
+      <w:r>
+        <w:rPr/>
+        <w:t xml:space="preserve">/expert/availability/list</w:t>
+      </w:r>
+      <w:r>
+        <w:rPr/>
+        <w:t xml:space="preserve">): disponibilità dei valet per data e fascia oraria.</w:t>
+      </w:r>
+    </w:p>
+    <w:p>
+      <w:pPr>
+        <w:pStyle w:val="Heading3"/>
+        <w:spacing w:lineRule="auto"/>
+      </w:pPr>
+      <w:r>
+        <w:rPr/>
+        <w:t xml:space="preserve">3.5 Utenti / Operation / Customers</w:t>
+      </w:r>
+    </w:p>
+    <w:p>
+      <w:pPr>
+        <w:numPr>
+          <w:ilvl w:val="0"/>
+          <w:numId w:val="15"/>
+        </w:numPr>
+        <w:spacing w:lineRule="auto"/>
+      </w:pPr>
+      <w:r>
+        <w:rPr>
+          <w:b/>
+        </w:rPr>
+        <w:t xml:space="preserve">Utenti</w:t>
+      </w:r>
+      <w:r>
+        <w:rPr/>
+        <w:t xml:space="preserve"> (</w:t>
+      </w:r>
+      <w:r>
+        <w:rPr/>
+        <w:t xml:space="preserve">/utenti</w:t>
+      </w:r>
+      <w:r>
+        <w:rPr/>
+        <w:t xml:space="preserve">): 550 utenti; colonne ID, Email, Cognome, Nome, Ruolo (nessuno/admin/expert/partner/operation, modificabile in linea), Attivo (Attivo/Disattivo/Da convalidare/Sconosciuto), Elimina. Visibile solo ad Admin. Qui si attivano gli utenti appena registrati e si trasformano in Admin.</w:t>
+      </w:r>
+    </w:p>
+    <w:p>
+      <w:pPr>
+        <w:numPr>
+          <w:ilvl w:val="0"/>
+          <w:numId w:val="15"/>
+        </w:numPr>
+        <w:spacing w:lineRule="auto"/>
+      </w:pPr>
+      <w:r>
+        <w:rPr>
+          <w:b/>
+        </w:rPr>
+        <w:t xml:space="preserve">Operation</w:t>
+      </w:r>
+      <w:r>
+        <w:rPr/>
+        <w:t xml:space="preserve"> (</w:t>
+      </w:r>
+      <w:r>
+        <w:rPr/>
+        <w:t xml:space="preserve">/operation</w:t>
+      </w:r>
+      <w:r>
+        <w:rPr/>
+        <w:t xml:space="preserve">): staff d'ufficio (14 persone): Cognome, Nome, Email, Telefono, Attivo + AGGIUNGI. </w:t>
+      </w:r>
+      <w:r>
+        <w:rPr>
+          <w:b/>
+        </w:rPr>
+        <w:t xml:space="preserve">Form "Nuovo Operation"</w:t>
+      </w:r>
+      <w:r>
+        <w:rPr/>
+        <w:t xml:space="preserve">: Cognome*, Nome*, E-mail*, Telefono*, Indirizzo*; notifiche WhatsApp/Mail; </w:t>
+      </w:r>
+      <w:r>
+        <w:rPr>
+          <w:b/>
+        </w:rPr>
+        <w:t xml:space="preserve">Ruolo operatore</w:t>
+      </w:r>
+      <w:r>
+        <w:rPr/>
+        <w:t xml:space="preserve">; Note. </w:t>
+      </w:r>
+      <w:r>
+        <w:rPr>
+          <w:b/>
+        </w:rPr>
+        <w:t xml:space="preserve">[NUOVO]</w:t>
+      </w:r>
+    </w:p>
+    <w:p>
+      <w:pPr>
+        <w:numPr>
+          <w:ilvl w:val="1"/>
+          <w:numId w:val="16"/>
+        </w:numPr>
+        <w:spacing w:lineRule="auto"/>
+      </w:pPr>
+      <w:r>
+        <w:rPr>
+          <w:b/>
+        </w:rPr>
+        <w:t xml:space="preserve">Ruolo operatore</w:t>
+      </w:r>
+      <w:r>
+        <w:rPr/>
+        <w:t xml:space="preserve"> (controlla la visibilità delle sezioni del menu): </w:t>
+      </w:r>
+      <w:r>
+        <w:rPr>
+          <w:b/>
+        </w:rPr>
+        <w:t xml:space="preserve">[NUOVO]</w:t>
+      </w:r>
+    </w:p>
+    <w:p>
+      <w:pPr>
+        <w:numPr>
+          <w:ilvl w:val="2"/>
+          <w:numId w:val="17"/>
+        </w:numPr>
+        <w:spacing w:lineRule="auto"/>
+      </w:pPr>
+      <w:r>
+        <w:rPr/>
+        <w:t xml:space="preserve">operation</w:t>
+      </w:r>
+      <w:r>
+        <w:rPr/>
+        <w:t xml:space="preserve"> (base): vede la sezione </w:t>
+      </w:r>
+      <w:r>
+        <w:rPr>
+          <w:b/>
+        </w:rPr>
+        <w:t xml:space="preserve">Operatività</w:t>
+      </w:r>
+      <w:r>
+        <w:rPr/>
+        <w:t xml:space="preserve">, non </w:t>
+      </w:r>
+      <w:r>
+        <w:rPr>
+          <w:b/>
+        </w:rPr>
+        <w:t xml:space="preserve">Amministrazione</w:t>
+      </w:r>
+      <w:r>
+        <w:rPr/>
+        <w:t xml:space="preserve">.</w:t>
+      </w:r>
+    </w:p>
+    <w:p>
+      <w:pPr>
+        <w:numPr>
+          <w:ilvl w:val="2"/>
+          <w:numId w:val="17"/>
+        </w:numPr>
+        <w:spacing w:lineRule="auto"/>
+      </w:pPr>
+      <w:r>
+        <w:rPr/>
+        <w:t xml:space="preserve">finance</w:t>
+      </w:r>
+      <w:r>
+        <w:rPr/>
+        <w:t xml:space="preserve">: vede </w:t>
+      </w:r>
+      <w:r>
+        <w:rPr>
+          <w:b/>
+        </w:rPr>
+        <w:t xml:space="preserve">anche la sezione Amministrazione</w:t>
+      </w:r>
+      <w:r>
+        <w:rPr/>
+        <w:t xml:space="preserve"> (Stipendi, Pagamenti, Regole, Finanza).</w:t>
+      </w:r>
+    </w:p>
+    <w:p>
+      <w:pPr>
+        <w:numPr>
+          <w:ilvl w:val="2"/>
+          <w:numId w:val="17"/>
+        </w:numPr>
+        <w:spacing w:lineRule="auto"/>
+      </w:pPr>
+      <w:r>
+        <w:rPr/>
+        <w:t xml:space="preserve">project_manager</w:t>
+      </w:r>
+      <w:r>
+        <w:rPr/>
+        <w:t xml:space="preserve">: </w:t>
+      </w:r>
+      <w:r>
+        <w:rPr>
+          <w:b/>
+        </w:rPr>
+        <w:t xml:space="preserve">non vede la sezione Operatività</w:t>
+      </w:r>
+      <w:r>
+        <w:rPr/>
+        <w:t xml:space="preserve"> (Consegne, Attività, Vendite).</w:t>
+      </w:r>
+    </w:p>
+    <w:p>
+      <w:pPr>
+        <w:numPr>
+          <w:ilvl w:val="2"/>
+          <w:numId w:val="17"/>
+        </w:numPr>
+        <w:spacing w:lineRule="auto"/>
+      </w:pPr>
+      <w:r>
+        <w:rPr/>
+        <w:t xml:space="preserve">customer_service</w:t>
+      </w:r>
+      <w:r>
+        <w:rPr/>
+        <w:t xml:space="preserve">: </w:t>
+      </w:r>
+      <w:r>
+        <w:rPr>
+          <w:b/>
+        </w:rPr>
+        <w:t xml:space="preserve">non vede la sezione Amministrazione</w:t>
+      </w:r>
+      <w:r>
+        <w:rPr/>
+        <w:t xml:space="preserve">.</w:t>
+      </w:r>
+    </w:p>
+    <w:p>
+      <w:pPr>
+        <w:numPr>
+          <w:ilvl w:val="0"/>
+          <w:numId w:val="15"/>
+        </w:numPr>
+        <w:spacing w:lineRule="auto"/>
+      </w:pPr>
+      <w:r>
+        <w:rPr>
+          <w:b/>
+        </w:rPr>
         <w:t xml:space="preserve">Customers</w:t>
       </w:r>
       <w:r>
@@ -4383,229 +4727,6 @@
       <w:r>
         <w:rPr/>
         <w:t xml:space="preserve">)</w:t>
-      </w:r>
-    </w:p>
-    <w:p>
-      <w:pPr>
-        <w:numPr>
-          <w:ilvl w:val="0"/>
-          <w:numId w:val="17"/>
-        </w:numPr>
-        <w:spacing w:lineRule="auto"/>
-      </w:pPr>
-      <w:r>
-        <w:rPr/>
-        <w:t xml:space="preserve">Tab: ATTIVA PRODOTTI, ARCHIVIO PRODOTTI, </w:t>
-      </w:r>
-      <w:r>
-        <w:rPr>
-          <w:b/>
-        </w:rPr>
-        <w:t xml:space="preserve">SHOPIFY PRODOTTI</w:t>
-      </w:r>
-      <w:r>
-        <w:rPr/>
-        <w:t xml:space="preserve"> (sincronizzazione prodotti da Shopify). Viste TABELLA / GRIGLIA. 8.503 prodotti. </w:t>
-      </w:r>
-      <w:r>
-        <w:rPr>
-          <w:b/>
-        </w:rPr>
-        <w:t xml:space="preserve">[NUOVO]</w:t>
-      </w:r>
-    </w:p>
-    <w:p>
-      <w:pPr>
-        <w:numPr>
-          <w:ilvl w:val="0"/>
-          <w:numId w:val="17"/>
-        </w:numPr>
-        <w:spacing w:lineRule="auto"/>
-      </w:pPr>
-      <w:r>
-        <w:rPr/>
-        <w:t xml:space="preserve">Bottoni: AGGIUNGI, ESPORTA, IMPORTARE, SCARICA IL FORMATO CSV, ELIMINAZIONE MULTIPLA (+SELEZIONA TUTTI), selettore stato Attivo/Disattivo.</w:t>
-      </w:r>
-    </w:p>
-    <w:p>
-      <w:pPr>
-        <w:numPr>
-          <w:ilvl w:val="0"/>
-          <w:numId w:val="17"/>
-        </w:numPr>
-        <w:spacing w:lineRule="auto"/>
-      </w:pPr>
-      <w:r>
-        <w:rPr/>
-        <w:t xml:space="preserve">Colonne/filtri: ID, Foto, Nome, Variante SKU, Categoria, Prezzo, Prezzo Pubblico, Stock, Partner, SKU, Super Prodotto Sì/No, Super Provincia Sì/No, Prodotto Unico Sì/No, Approvato Sì/No, In Magazzino Sì/No, Attivo.</w:t>
-      </w:r>
-    </w:p>
-    <w:p>
-      <w:pPr>
-        <w:numPr>
-          <w:ilvl w:val="0"/>
-          <w:numId w:val="17"/>
-        </w:numPr>
-        <w:spacing w:lineRule="auto"/>
-      </w:pPr>
-      <w:r>
-        <w:rPr/>
-        <w:t xml:space="preserve">Tipi di prodotto: </w:t>
-      </w:r>
-      <w:r>
-        <w:rPr>
-          <w:b/>
-        </w:rPr>
-        <w:t xml:space="preserve">unici</w:t>
-      </w:r>
-      <w:r>
-        <w:rPr/>
-        <w:t xml:space="preserve"> (di un partner), </w:t>
-      </w:r>
-      <w:r>
-        <w:rPr>
-          <w:b/>
-        </w:rPr>
-        <w:t xml:space="preserve">non-unici</w:t>
-      </w:r>
-      <w:r>
-        <w:rPr/>
-        <w:t xml:space="preserve"> (es. fiori), </w:t>
-      </w:r>
-      <w:r>
-        <w:rPr>
-          <w:b/>
-        </w:rPr>
-        <w:t xml:space="preserve">superprodotti</w:t>
-      </w:r>
-      <w:r>
-        <w:rPr/>
-        <w:t xml:space="preserve"> (combinazioni di più prodotti). Flag "Visible to other partners" per rendere visibili i prodotti unici ad altri partner. Admin/Operation aggiungono qualsiasi prodotto; ogni partner carica i propri come unici.</w:t>
-      </w:r>
-    </w:p>
-    <w:p>
-      <w:pPr>
-        <w:numPr>
-          <w:ilvl w:val="0"/>
-          <w:numId w:val="17"/>
-        </w:numPr>
-        <w:spacing w:lineRule="auto"/>
-      </w:pPr>
-      <w:r>
-        <w:rPr>
-          <w:b/>
-        </w:rPr>
-        <w:t xml:space="preserve">Form "Nuovo prodotto"</w:t>
-      </w:r>
-      <w:r>
-        <w:rPr/>
-        <w:t xml:space="preserve"> (verificato campo-per-campo): sezioni </w:t>
-      </w:r>
-      <w:r>
-        <w:rPr>
-          <w:b/>
-        </w:rPr>
-        <w:t xml:space="preserve">DETTAGLI</w:t>
-      </w:r>
-      <w:r>
-        <w:rPr/>
-        <w:t xml:space="preserve"> (Nome*, Partner, Categoria*, SKU, Giorni Preparazione, </w:t>
-      </w:r>
-      <w:r>
-        <w:rPr>
-          <w:b/>
-        </w:rPr>
-        <w:t xml:space="preserve">Plus del prodotto</w:t>
-      </w:r>
-      <w:r>
-        <w:rPr/>
-        <w:t xml:space="preserve"> max 80*, Descrizione rich text, Prezzo, Prezzo pubblico, Linea, Immagine; flag Non modificabile, Prodotto unico), </w:t>
-      </w:r>
-      <w:r>
-        <w:rPr>
-          <w:b/>
-        </w:rPr>
-        <w:t xml:space="preserve">INVENTORY MANAGEMENT</w:t>
-      </w:r>
-      <w:r>
-        <w:rPr/>
-        <w:t xml:space="preserve"> (Controlla stock, Nome alternativo + Usa nome alternativo), </w:t>
-      </w:r>
-      <w:r>
-        <w:rPr>
-          <w:b/>
-        </w:rPr>
-        <w:t xml:space="preserve">SHOPIFY CONNECTION</w:t>
-      </w:r>
-      <w:r>
-        <w:rPr/>
-        <w:t xml:space="preserve"> (Approvato, Attivo, Not physical, </w:t>
-      </w:r>
-      <w:r>
-        <w:rPr>
-          <w:b/>
-        </w:rPr>
-        <w:t xml:space="preserve">SELECT PLATFORMS</w:t>
-      </w:r>
-      <w:r>
-        <w:rPr/>
-        <w:t xml:space="preserve">: Deluxy/Cakes/Flowers/Business/Experience/DotCom + descrizione per piattaforma, image manager), </w:t>
-      </w:r>
-      <w:r>
-        <w:rPr>
-          <w:b/>
-        </w:rPr>
-        <w:t xml:space="preserve">PRODUCTS PARTNER</w:t>
-      </w:r>
-      <w:r>
-        <w:rPr/>
-        <w:t xml:space="preserve"> (partner aggiuntivi che vendono il prodotto), </w:t>
-      </w:r>
-      <w:r>
-        <w:rPr>
-          <w:b/>
-        </w:rPr>
-        <w:t xml:space="preserve">SUPER PRODOTTO</w:t>
-      </w:r>
-      <w:r>
-        <w:rPr/>
-        <w:t xml:space="preserve"> (componenti), </w:t>
-      </w:r>
-      <w:r>
-        <w:rPr>
-          <w:b/>
-        </w:rPr>
-        <w:t xml:space="preserve">PRODOTTO VARIANTI</w:t>
-      </w:r>
-      <w:r>
-        <w:rPr/>
-        <w:t xml:space="preserve"> (flag ha varianti + titolo opzione + varianti con prezzo/SKU), </w:t>
-      </w:r>
-      <w:r>
-        <w:rPr>
-          <w:b/>
-        </w:rPr>
-        <w:t xml:space="preserve">CAMPI OBBLIGATORI</w:t>
-      </w:r>
-      <w:r>
-        <w:rPr/>
-        <w:t xml:space="preserve"> (campi testuali). </w:t>
-      </w:r>
-      <w:r>
-        <w:rPr>
-          <w:b/>
-        </w:rPr>
-        <w:t xml:space="preserve">[NUOVO — form prodotto completo, incl. varianti e multi-partner]</w:t>
-      </w:r>
-    </w:p>
-    <w:p>
-      <w:pPr>
-        <w:pStyle w:val="Heading4"/>
-        <w:spacing w:lineRule="auto"/>
-      </w:pPr>
-      <w:r>
-        <w:rPr/>
-        <w:t xml:space="preserve">Sottosezioni Prodotti</w:t>
       </w:r>
     </w:p>
     <w:p>
@@ -4617,68 +4738,24 @@
         <w:spacing w:lineRule="auto"/>
       </w:pPr>
       <w:r>
-        <w:rPr>
-          <w:b/>
-        </w:rPr>
-        <w:t xml:space="preserve">Categorie</w:t>
-      </w:r>
-      <w:r>
-        <w:rPr/>
-        <w:t xml:space="preserve"> (</w:t>
-      </w:r>
-      <w:r>
-        <w:rPr/>
-        <w:t xml:space="preserve">/product/categoria</w:t>
-      </w:r>
-      <w:r>
-        <w:rPr/>
-        <w:t xml:space="preserve">): 63 categorie (es. Fiori, Fiori Classici, Fiori d'Arte, Torte, Dolci, Box Regalo, Cappelliere, Palloncini, Accessori, B2B Colazione/Break/Lunch/Aperitivo, Ghirlande, Abbonamento Fiori, Regalistica Natale…). </w:t>
-      </w:r>
-      <w:r>
-        <w:rPr>
-          <w:b/>
-        </w:rPr>
-        <w:t xml:space="preserve">Form "Nuova categoria"</w:t>
-      </w:r>
-      <w:r>
-        <w:rPr/>
-        <w:t xml:space="preserve"> (verificato): Nome*, Note, </w:t>
-      </w:r>
-      <w:r>
-        <w:rPr>
-          <w:b/>
-        </w:rPr>
-        <w:t xml:space="preserve">AI Prompt</w:t>
-      </w:r>
-      <w:r>
-        <w:rPr/>
-        <w:t xml:space="preserve"> (per generazione AI, es. torte), </w:t>
-      </w:r>
-      <w:r>
-        <w:rPr>
-          <w:b/>
-        </w:rPr>
-        <w:t xml:space="preserve">Extra fields</w:t>
-      </w:r>
-      <w:r>
-        <w:rPr/>
-        <w:t xml:space="preserve"> (nome campo + tipo: Opzionale / Obbligatorio / solo Admin), </w:t>
-      </w:r>
-      <w:r>
-        <w:rPr>
-          <w:b/>
-        </w:rPr>
-        <w:t xml:space="preserve">Province discounts</w:t>
-      </w:r>
-      <w:r>
-        <w:rPr/>
-        <w:t xml:space="preserve"> (provincia + % di sconto → genera automaticamente prodotti scontati arrotondati a 0/5). </w:t>
-      </w:r>
-      <w:r>
-        <w:rPr>
-          <w:b/>
-        </w:rPr>
-        <w:t xml:space="preserve">[NUOVO — AI Prompt e Note sul form categoria]</w:t>
+        <w:rPr/>
+        <w:t xml:space="preserve">Tab: ATTIVA PRODOTTI, ARCHIVIO PRODOTTI, </w:t>
+      </w:r>
+      <w:r>
+        <w:rPr>
+          <w:b/>
+        </w:rPr>
+        <w:t xml:space="preserve">SHOPIFY PRODOTTI</w:t>
+      </w:r>
+      <w:r>
+        <w:rPr/>
+        <w:t xml:space="preserve"> (sincronizzazione prodotti da Shopify). Viste TABELLA / GRIGLIA. 8.503 prodotti. </w:t>
+      </w:r>
+      <w:r>
+        <w:rPr>
+          <w:b/>
+        </w:rPr>
+        <w:t xml:space="preserve">[NUOVO]</w:t>
       </w:r>
     </w:p>
     <w:p>
@@ -4690,36 +4767,8 @@
         <w:spacing w:lineRule="auto"/>
       </w:pPr>
       <w:r>
-        <w:rPr>
-          <w:b/>
-        </w:rPr>
-        <w:t xml:space="preserve">Prodotto Collections</w:t>
-      </w:r>
-      <w:r>
-        <w:rPr/>
-        <w:t xml:space="preserve"> (</w:t>
-      </w:r>
-      <w:r>
-        <w:rPr/>
-        <w:t xml:space="preserve">/collections</w:t>
-      </w:r>
-      <w:r>
-        <w:rPr/>
-        <w:t xml:space="preserve">): collezioni shop per provincia: Collection Name, Handle (es. </w:t>
-      </w:r>
-      <w:r>
-        <w:rPr/>
-        <w:t xml:space="preserve">province-products/rm</w:t>
-      </w:r>
-      <w:r>
-        <w:rPr/>
-        <w:t xml:space="preserve">), Descrizione, Provincia, Codice provincia, Categoria prodotto. </w:t>
-      </w:r>
-      <w:r>
-        <w:rPr>
-          <w:b/>
-        </w:rPr>
-        <w:t xml:space="preserve">[NUOVO]</w:t>
+        <w:rPr/>
+        <w:t xml:space="preserve">Bottoni: AGGIUNGI, ESPORTA, IMPORTARE, SCARICA IL FORMATO CSV, ELIMINAZIONE MULTIPLA (+SELEZIONA TUTTI), selettore stato Attivo/Disattivo.</w:t>
       </w:r>
     </w:p>
     <w:p>
@@ -4731,40 +4780,176 @@
         <w:spacing w:lineRule="auto"/>
       </w:pPr>
       <w:r>
-        <w:rPr>
-          <w:b/>
-        </w:rPr>
-        <w:t xml:space="preserve">Cakes Order Product</w:t>
-      </w:r>
-      <w:r>
-        <w:rPr/>
-        <w:t xml:space="preserve"> (</w:t>
-      </w:r>
-      <w:r>
-        <w:rPr/>
-        <w:t xml:space="preserve">/cake/orders</w:t>
-      </w:r>
-      <w:r>
-        <w:rPr/>
-        <w:t xml:space="preserve">): torte acquistate e realizzate con l'AI (8 presenti) con foto.</w:t>
-      </w:r>
-    </w:p>
-    <w:p>
-      <w:pPr>
-        <w:pStyle w:val="Heading3"/>
-        <w:spacing w:lineRule="auto"/>
-      </w:pPr>
-      <w:r>
-        <w:rPr/>
-        <w:t xml:space="preserve">3.7 Vendite (</w:t>
-      </w:r>
-      <w:r>
-        <w:rPr/>
-        <w:t xml:space="preserve">/all/vendita</w:t>
-      </w:r>
-      <w:r>
-        <w:rPr/>
-        <w:t xml:space="preserve">)</w:t>
+        <w:rPr/>
+        <w:t xml:space="preserve">Colonne/filtri: ID, Foto, Nome, Variante SKU, Categoria, Prezzo, Prezzo Pubblico, Stock, Partner, SKU, Super Prodotto Sì/No, Super Provincia Sì/No, Prodotto Unico Sì/No, Approvato Sì/No, In Magazzino Sì/No, Attivo.</w:t>
+      </w:r>
+    </w:p>
+    <w:p>
+      <w:pPr>
+        <w:numPr>
+          <w:ilvl w:val="0"/>
+          <w:numId w:val="18"/>
+        </w:numPr>
+        <w:spacing w:lineRule="auto"/>
+      </w:pPr>
+      <w:r>
+        <w:rPr/>
+        <w:t xml:space="preserve">Tipi di prodotto: </w:t>
+      </w:r>
+      <w:r>
+        <w:rPr>
+          <w:b/>
+        </w:rPr>
+        <w:t xml:space="preserve">unici</w:t>
+      </w:r>
+      <w:r>
+        <w:rPr/>
+        <w:t xml:space="preserve"> (di un partner), </w:t>
+      </w:r>
+      <w:r>
+        <w:rPr>
+          <w:b/>
+        </w:rPr>
+        <w:t xml:space="preserve">non-unici</w:t>
+      </w:r>
+      <w:r>
+        <w:rPr/>
+        <w:t xml:space="preserve"> (es. fiori), </w:t>
+      </w:r>
+      <w:r>
+        <w:rPr>
+          <w:b/>
+        </w:rPr>
+        <w:t xml:space="preserve">superprodotti</w:t>
+      </w:r>
+      <w:r>
+        <w:rPr/>
+        <w:t xml:space="preserve"> (combinazioni di più prodotti). Flag "Visible to other partners" per rendere visibili i prodotti unici ad altri partner. Admin/Operation aggiungono qualsiasi prodotto; ogni partner carica i propri come unici.</w:t>
+      </w:r>
+    </w:p>
+    <w:p>
+      <w:pPr>
+        <w:numPr>
+          <w:ilvl w:val="0"/>
+          <w:numId w:val="18"/>
+        </w:numPr>
+        <w:spacing w:lineRule="auto"/>
+      </w:pPr>
+      <w:r>
+        <w:rPr>
+          <w:b/>
+        </w:rPr>
+        <w:t xml:space="preserve">Form "Nuovo prodotto"</w:t>
+      </w:r>
+      <w:r>
+        <w:rPr/>
+        <w:t xml:space="preserve"> (verificato campo-per-campo): sezioni </w:t>
+      </w:r>
+      <w:r>
+        <w:rPr>
+          <w:b/>
+        </w:rPr>
+        <w:t xml:space="preserve">DETTAGLI</w:t>
+      </w:r>
+      <w:r>
+        <w:rPr/>
+        <w:t xml:space="preserve"> (Nome*, Partner, Categoria*, SKU, Giorni Preparazione, </w:t>
+      </w:r>
+      <w:r>
+        <w:rPr>
+          <w:b/>
+        </w:rPr>
+        <w:t xml:space="preserve">Plus del prodotto</w:t>
+      </w:r>
+      <w:r>
+        <w:rPr/>
+        <w:t xml:space="preserve"> max 80*, Descrizione rich text, Prezzo, Prezzo pubblico, Linea, Immagine; flag Non modificabile, Prodotto unico), </w:t>
+      </w:r>
+      <w:r>
+        <w:rPr>
+          <w:b/>
+        </w:rPr>
+        <w:t xml:space="preserve">INVENTORY MANAGEMENT</w:t>
+      </w:r>
+      <w:r>
+        <w:rPr/>
+        <w:t xml:space="preserve"> (Controlla stock, Nome alternativo + Usa nome alternativo), </w:t>
+      </w:r>
+      <w:r>
+        <w:rPr>
+          <w:b/>
+        </w:rPr>
+        <w:t xml:space="preserve">SHOPIFY CONNECTION</w:t>
+      </w:r>
+      <w:r>
+        <w:rPr/>
+        <w:t xml:space="preserve"> (Approvato, Attivo, Not physical, </w:t>
+      </w:r>
+      <w:r>
+        <w:rPr>
+          <w:b/>
+        </w:rPr>
+        <w:t xml:space="preserve">SELECT PLATFORMS</w:t>
+      </w:r>
+      <w:r>
+        <w:rPr/>
+        <w:t xml:space="preserve">: Deluxy/Cakes/Flowers/Business/Experience/DotCom + descrizione per piattaforma, image manager), </w:t>
+      </w:r>
+      <w:r>
+        <w:rPr>
+          <w:b/>
+        </w:rPr>
+        <w:t xml:space="preserve">PRODUCTS PARTNER</w:t>
+      </w:r>
+      <w:r>
+        <w:rPr/>
+        <w:t xml:space="preserve"> (partner aggiuntivi che vendono il prodotto), </w:t>
+      </w:r>
+      <w:r>
+        <w:rPr>
+          <w:b/>
+        </w:rPr>
+        <w:t xml:space="preserve">SUPER PRODOTTO</w:t>
+      </w:r>
+      <w:r>
+        <w:rPr/>
+        <w:t xml:space="preserve"> (componenti), </w:t>
+      </w:r>
+      <w:r>
+        <w:rPr>
+          <w:b/>
+        </w:rPr>
+        <w:t xml:space="preserve">PRODOTTO VARIANTI</w:t>
+      </w:r>
+      <w:r>
+        <w:rPr/>
+        <w:t xml:space="preserve"> (flag ha varianti + titolo opzione + varianti con prezzo/SKU), </w:t>
+      </w:r>
+      <w:r>
+        <w:rPr>
+          <w:b/>
+        </w:rPr>
+        <w:t xml:space="preserve">CAMPI OBBLIGATORI</w:t>
+      </w:r>
+      <w:r>
+        <w:rPr/>
+        <w:t xml:space="preserve"> (campi testuali). </w:t>
+      </w:r>
+      <w:r>
+        <w:rPr>
+          <w:b/>
+        </w:rPr>
+        <w:t xml:space="preserve">[NUOVO — form prodotto completo, incl. varianti e multi-partner]</w:t>
+      </w:r>
+    </w:p>
+    <w:p>
+      <w:pPr>
+        <w:pStyle w:val="Heading4"/>
+        <w:spacing w:lineRule="auto"/>
+      </w:pPr>
+      <w:r>
+        <w:rPr/>
+        <w:t xml:space="preserve">Sottosezioni Prodotti</w:t>
       </w:r>
     </w:p>
     <w:p>
@@ -4776,56 +4961,68 @@
         <w:spacing w:lineRule="auto"/>
       </w:pPr>
       <w:r>
-        <w:rPr/>
-        <w:t xml:space="preserve">Viste per piattaforma: All Vendite + Deluxy (</w:t>
-      </w:r>
-      <w:r>
-        <w:rPr/>
-        <w:t xml:space="preserve">/vendita</w:t>
-      </w:r>
-      <w:r>
-        <w:rPr/>
-        <w:t xml:space="preserve">), Cakes (</w:t>
-      </w:r>
-      <w:r>
-        <w:rPr/>
-        <w:t xml:space="preserve">/cakes/vendita</w:t>
-      </w:r>
-      <w:r>
-        <w:rPr/>
-        <w:t xml:space="preserve">), Business (</w:t>
-      </w:r>
-      <w:r>
-        <w:rPr/>
-        <w:t xml:space="preserve">/business/vendita</w:t>
-      </w:r>
-      <w:r>
-        <w:rPr/>
-        <w:t xml:space="preserve">), Deluxy Flowers (</w:t>
-      </w:r>
-      <w:r>
-        <w:rPr/>
-        <w:t xml:space="preserve">/flowers/vendita</w:t>
-      </w:r>
-      <w:r>
-        <w:rPr/>
-        <w:t xml:space="preserve">), Deluxy Experience (</w:t>
-      </w:r>
-      <w:r>
-        <w:rPr/>
-        <w:t xml:space="preserve">/experience/vendita</w:t>
-      </w:r>
-      <w:r>
-        <w:rPr/>
-        <w:t xml:space="preserve">), Deluxy.Com (</w:t>
-      </w:r>
-      <w:r>
-        <w:rPr/>
-        <w:t xml:space="preserve">/deluxydotcom/vendita</w:t>
-      </w:r>
-      <w:r>
-        <w:rPr/>
-        <w:t xml:space="preserve">).</w:t>
+        <w:rPr>
+          <w:b/>
+        </w:rPr>
+        <w:t xml:space="preserve">Categorie</w:t>
+      </w:r>
+      <w:r>
+        <w:rPr/>
+        <w:t xml:space="preserve"> (</w:t>
+      </w:r>
+      <w:r>
+        <w:rPr/>
+        <w:t xml:space="preserve">/product/categoria</w:t>
+      </w:r>
+      <w:r>
+        <w:rPr/>
+        <w:t xml:space="preserve">): 63 categorie (es. Fiori, Fiori Classici, Fiori d'Arte, Torte, Dolci, Box Regalo, Cappelliere, Palloncini, Accessori, B2B Colazione/Break/Lunch/Aperitivo, Ghirlande, Abbonamento Fiori, Regalistica Natale…). </w:t>
+      </w:r>
+      <w:r>
+        <w:rPr>
+          <w:b/>
+        </w:rPr>
+        <w:t xml:space="preserve">Form "Nuova categoria"</w:t>
+      </w:r>
+      <w:r>
+        <w:rPr/>
+        <w:t xml:space="preserve"> (verificato): Nome*, Note, </w:t>
+      </w:r>
+      <w:r>
+        <w:rPr>
+          <w:b/>
+        </w:rPr>
+        <w:t xml:space="preserve">AI Prompt</w:t>
+      </w:r>
+      <w:r>
+        <w:rPr/>
+        <w:t xml:space="preserve"> (per generazione AI, es. torte), </w:t>
+      </w:r>
+      <w:r>
+        <w:rPr>
+          <w:b/>
+        </w:rPr>
+        <w:t xml:space="preserve">Extra fields</w:t>
+      </w:r>
+      <w:r>
+        <w:rPr/>
+        <w:t xml:space="preserve"> (nome campo + tipo: Opzionale / Obbligatorio / solo Admin), </w:t>
+      </w:r>
+      <w:r>
+        <w:rPr>
+          <w:b/>
+        </w:rPr>
+        <w:t xml:space="preserve">Province discounts</w:t>
+      </w:r>
+      <w:r>
+        <w:rPr/>
+        <w:t xml:space="preserve"> (provincia + % di sconto → genera automaticamente prodotti scontati arrotondati a 0/5). </w:t>
+      </w:r>
+      <w:r>
+        <w:rPr>
+          <w:b/>
+        </w:rPr>
+        <w:t xml:space="preserve">[NUOVO — AI Prompt e Note sul form categoria]</w:t>
       </w:r>
     </w:p>
     <w:p>
@@ -4837,8 +5034,36 @@
         <w:spacing w:lineRule="auto"/>
       </w:pPr>
       <w:r>
-        <w:rPr/>
-        <w:t xml:space="preserve">Colonne: Platform, System ID, ID ordine effettivo, Ordine, Data, Cliente, Indirizzo, Telefono, Canale (es. Online Store), Totale, Costo consegna, Stato del pagamento (paid…), Stato di adempimento (Unfulfilled…), Elementi, SKU, Metodo di consegna, Vendor, Stato (es. Da Gestire).</w:t>
+        <w:rPr>
+          <w:b/>
+        </w:rPr>
+        <w:t xml:space="preserve">Prodotto Collections</w:t>
+      </w:r>
+      <w:r>
+        <w:rPr/>
+        <w:t xml:space="preserve"> (</w:t>
+      </w:r>
+      <w:r>
+        <w:rPr/>
+        <w:t xml:space="preserve">/collections</w:t>
+      </w:r>
+      <w:r>
+        <w:rPr/>
+        <w:t xml:space="preserve">): collezioni shop per provincia: Collection Name, Handle (es. </w:t>
+      </w:r>
+      <w:r>
+        <w:rPr/>
+        <w:t xml:space="preserve">province-products/rm</w:t>
+      </w:r>
+      <w:r>
+        <w:rPr/>
+        <w:t xml:space="preserve">), Descrizione, Provincia, Codice provincia, Categoria prodotto. </w:t>
+      </w:r>
+      <w:r>
+        <w:rPr>
+          <w:b/>
+        </w:rPr>
+        <w:t xml:space="preserve">[NUOVO]</w:t>
       </w:r>
     </w:p>
     <w:p>
@@ -4850,57 +5075,40 @@
         <w:spacing w:lineRule="auto"/>
       </w:pPr>
       <w:r>
-        <w:rPr/>
-        <w:t xml:space="preserve">Azioni per vendita: </w:t>
-      </w:r>
-      <w:r>
-        <w:rPr>
-          <w:b/>
-        </w:rPr>
-        <w:t xml:space="preserve">GENERATE LINK, SEND EMAIL, CONFERMA, MODIFICA, RIFIUTA</w:t>
-      </w:r>
-      <w:r>
-        <w:rPr/>
-        <w:t xml:space="preserve">. In alto: AGGIUNGI, ESPORTA, </w:t>
-      </w:r>
-      <w:r>
-        <w:rPr>
-          <w:b/>
-        </w:rPr>
-        <w:t xml:space="preserve">PAGAMENTI DELLE VENDITE</w:t>
-      </w:r>
-      <w:r>
-        <w:rPr/>
-        <w:t xml:space="preserve">, STORICO. </w:t>
-      </w:r>
-      <w:r>
-        <w:rPr>
-          <w:b/>
-        </w:rPr>
-        <w:t xml:space="preserve">[NUOVO]</w:t>
-      </w:r>
-    </w:p>
-    <w:p>
-      <w:pPr>
-        <w:numPr>
-          <w:ilvl w:val="0"/>
-          <w:numId w:val="19"/>
-        </w:numPr>
-        <w:spacing w:lineRule="auto"/>
-      </w:pPr>
-      <w:r>
-        <w:rPr/>
-        <w:t xml:space="preserve">Il popup "Seleziona Piattaforma di vendita" (Shopify / Cake / Business / Flowers) compare per aggiungere una vendita manuale.</w:t>
-      </w:r>
-    </w:p>
-    <w:p>
-      <w:pPr>
-        <w:pStyle w:val="Heading4"/>
-        <w:spacing w:lineRule="auto"/>
-      </w:pPr>
-      <w:r>
-        <w:rPr/>
-        <w:t xml:space="preserve">Logica di smistamento vendite (invariata)</w:t>
+        <w:rPr>
+          <w:b/>
+        </w:rPr>
+        <w:t xml:space="preserve">Cakes Order Product</w:t>
+      </w:r>
+      <w:r>
+        <w:rPr/>
+        <w:t xml:space="preserve"> (</w:t>
+      </w:r>
+      <w:r>
+        <w:rPr/>
+        <w:t xml:space="preserve">/cake/orders</w:t>
+      </w:r>
+      <w:r>
+        <w:rPr/>
+        <w:t xml:space="preserve">): torte acquistate e realizzate con l'AI (8 presenti) con foto.</w:t>
+      </w:r>
+    </w:p>
+    <w:p>
+      <w:pPr>
+        <w:pStyle w:val="Heading3"/>
+        <w:spacing w:lineRule="auto"/>
+      </w:pPr>
+      <w:r>
+        <w:rPr/>
+        <w:t xml:space="preserve">3.7 Vendite (</w:t>
+      </w:r>
+      <w:r>
+        <w:rPr/>
+        <w:t xml:space="preserve">/all/vendita</w:t>
+      </w:r>
+      <w:r>
+        <w:rPr/>
+        <w:t xml:space="preserve">)</w:t>
       </w:r>
     </w:p>
     <w:p>
@@ -4912,14 +5120,56 @@
         <w:spacing w:lineRule="auto"/>
       </w:pPr>
       <w:r>
-        <w:rPr>
-          <w:b/>
-        </w:rPr>
-        <w:t xml:space="preserve">Prodotto unico</w:t>
-      </w:r>
-      <w:r>
-        <w:rPr/>
-        <w:t xml:space="preserve">: se la provincia è servita da un partner aperto → la consegna viene creata e proposta al partner; se chiuso o provincia non servita → vendita "da gestire".</w:t>
+        <w:rPr/>
+        <w:t xml:space="preserve">Viste per piattaforma: All Vendite + Deluxy (</w:t>
+      </w:r>
+      <w:r>
+        <w:rPr/>
+        <w:t xml:space="preserve">/vendita</w:t>
+      </w:r>
+      <w:r>
+        <w:rPr/>
+        <w:t xml:space="preserve">), Cakes (</w:t>
+      </w:r>
+      <w:r>
+        <w:rPr/>
+        <w:t xml:space="preserve">/cakes/vendita</w:t>
+      </w:r>
+      <w:r>
+        <w:rPr/>
+        <w:t xml:space="preserve">), Business (</w:t>
+      </w:r>
+      <w:r>
+        <w:rPr/>
+        <w:t xml:space="preserve">/business/vendita</w:t>
+      </w:r>
+      <w:r>
+        <w:rPr/>
+        <w:t xml:space="preserve">), Deluxy Flowers (</w:t>
+      </w:r>
+      <w:r>
+        <w:rPr/>
+        <w:t xml:space="preserve">/flowers/vendita</w:t>
+      </w:r>
+      <w:r>
+        <w:rPr/>
+        <w:t xml:space="preserve">), Deluxy Experience (</w:t>
+      </w:r>
+      <w:r>
+        <w:rPr/>
+        <w:t xml:space="preserve">/experience/vendita</w:t>
+      </w:r>
+      <w:r>
+        <w:rPr/>
+        <w:t xml:space="preserve">), Deluxy.Com (</w:t>
+      </w:r>
+      <w:r>
+        <w:rPr/>
+        <w:t xml:space="preserve">/deluxydotcom/vendita</w:t>
+      </w:r>
+      <w:r>
+        <w:rPr/>
+        <w:t xml:space="preserve">).</w:t>
       </w:r>
     </w:p>
     <w:p>
@@ -4931,14 +5181,8 @@
         <w:spacing w:lineRule="auto"/>
       </w:pPr>
       <w:r>
-        <w:rPr>
-          <w:b/>
-        </w:rPr>
-        <w:t xml:space="preserve">Prodotto non unico</w:t>
-      </w:r>
-      <w:r>
-        <w:rPr/>
-        <w:t xml:space="preserve">: se esiste lista priorità per provincia → invio ai partner prioritari aperti (con eventuale sconto categoria arrotondato a 0 o 5), altrimenti agli altri partner; senza lista priorità → vendita "da gestire".</w:t>
+        <w:rPr/>
+        <w:t xml:space="preserve">Colonne: Platform, System ID, ID ordine effettivo, Ordine, Data, Cliente, Indirizzo, Telefono, Canale (es. Online Store), Totale, Costo consegna, Stato del pagamento (paid…), Stato di adempimento (Unfulfilled…), Elementi, SKU, Metodo di consegna, Vendor, Stato (es. Da Gestire).</w:t>
       </w:r>
     </w:p>
     <w:p>
@@ -4951,7 +5195,33 @@
       </w:pPr>
       <w:r>
         <w:rPr/>
-        <w:t xml:space="preserve">Stati vendita/consegna collegati: Accettata (il partner accetta la vendita), Richiedi Annullamento (se ancora "da gestire" si annulla automaticamente), Non Accettata (grigio), Non Consegnata (blu, con motivo nelle note), Consegnata, Annullata (solo Admin/Operation).</w:t>
+        <w:t xml:space="preserve">Azioni per vendita: </w:t>
+      </w:r>
+      <w:r>
+        <w:rPr>
+          <w:b/>
+        </w:rPr>
+        <w:t xml:space="preserve">GENERATE LINK, SEND EMAIL, CONFERMA, MODIFICA, RIFIUTA</w:t>
+      </w:r>
+      <w:r>
+        <w:rPr/>
+        <w:t xml:space="preserve">. In alto: AGGIUNGI, ESPORTA, </w:t>
+      </w:r>
+      <w:r>
+        <w:rPr>
+          <w:b/>
+        </w:rPr>
+        <w:t xml:space="preserve">PAGAMENTI DELLE VENDITE</w:t>
+      </w:r>
+      <w:r>
+        <w:rPr/>
+        <w:t xml:space="preserve">, STORICO. </w:t>
+      </w:r>
+      <w:r>
+        <w:rPr>
+          <w:b/>
+        </w:rPr>
+        <w:t xml:space="preserve">[NUOVO]</w:t>
       </w:r>
     </w:p>
     <w:p>
@@ -4964,34 +5234,17 @@
       </w:pPr>
       <w:r>
         <w:rPr/>
-        <w:t xml:space="preserve">Servizi orari in storico: CONSEGNATO CON ORARIO DA APPROVARE / CONSEGNATO CON ORARIO NON APPROVATO (verificare l'orario del valet prima di procedere).</w:t>
-      </w:r>
-    </w:p>
-    <w:p>
-      <w:pPr>
-        <w:pStyle w:val="Heading3"/>
-        <w:spacing w:lineRule="auto"/>
-      </w:pPr>
-      <w:r>
-        <w:rPr/>
-        <w:t xml:space="preserve">3.8 Finanza (</w:t>
-      </w:r>
-      <w:r>
-        <w:rPr/>
-        <w:t xml:space="preserve">/finanza</w:t>
-      </w:r>
-      <w:r>
-        <w:rPr/>
-        <w:t xml:space="preserve">)</w:t>
-      </w:r>
-    </w:p>
-    <w:p>
-      <w:pPr>
-        <w:spacing w:lineRule="auto"/>
-      </w:pPr>
-      <w:r>
-        <w:rPr/>
-        <w:t xml:space="preserve">Visibile solo agli admin abilitati (es. utente "support").</w:t>
+        <w:t xml:space="preserve">Il popup "Seleziona Piattaforma di vendita" (Shopify / Cake / Business / Flowers) compare per aggiungere una vendita manuale.</w:t>
+      </w:r>
+    </w:p>
+    <w:p>
+      <w:pPr>
+        <w:pStyle w:val="Heading4"/>
+        <w:spacing w:lineRule="auto"/>
+      </w:pPr>
+      <w:r>
+        <w:rPr/>
+        <w:t xml:space="preserve">Logica di smistamento vendite (invariata)</w:t>
       </w:r>
     </w:p>
     <w:p>
@@ -5003,18 +5256,14 @@
         <w:spacing w:lineRule="auto"/>
       </w:pPr>
       <w:r>
-        <w:rPr/>
-        <w:t xml:space="preserve">Tab </w:t>
-      </w:r>
-      <w:r>
-        <w:rPr>
-          <w:b/>
-        </w:rPr>
-        <w:t xml:space="preserve">CORRISPETTIVI</w:t>
-      </w:r>
-      <w:r>
-        <w:rPr/>
-        <w:t xml:space="preserve">: per ogni vendita: Stato, ID Vendita, ID Consegna, Data consegna, Prodotto, Categoria, Valore vendite, Prezzo pubblico, Prezzo consegna, Partner, Prezzo partner, Fee %, Fee value, Fee+IVA, Costo consegna, Primo margine, Primo margine %. Con ESPORTA.</w:t>
+        <w:rPr>
+          <w:b/>
+        </w:rPr>
+        <w:t xml:space="preserve">Prodotto unico</w:t>
+      </w:r>
+      <w:r>
+        <w:rPr/>
+        <w:t xml:space="preserve">: se la provincia è servita da un partner aperto → la consegna viene creata e proposta al partner; se chiuso o provincia non servita → vendita "da gestire".</w:t>
       </w:r>
     </w:p>
     <w:p>
@@ -5026,18 +5275,40 @@
         <w:spacing w:lineRule="auto"/>
       </w:pPr>
       <w:r>
-        <w:rPr/>
-        <w:t xml:space="preserve">Tab </w:t>
-      </w:r>
-      <w:r>
-        <w:rPr>
-          <w:b/>
-        </w:rPr>
-        <w:t xml:space="preserve">MARGINI</w:t>
-      </w:r>
-      <w:r>
-        <w:rPr/>
-        <w:t xml:space="preserve">: margini totali dell'azienda.</w:t>
+        <w:rPr>
+          <w:b/>
+        </w:rPr>
+        <w:t xml:space="preserve">Prodotto non unico</w:t>
+      </w:r>
+      <w:r>
+        <w:rPr/>
+        <w:t xml:space="preserve">: se esiste lista priorità per provincia → invio ai partner prioritari aperti (con eventuale sconto categoria arrotondato a 0 o 5), altrimenti agli altri partner; senza lista priorità → vendita "da gestire".</w:t>
+      </w:r>
+    </w:p>
+    <w:p>
+      <w:pPr>
+        <w:numPr>
+          <w:ilvl w:val="0"/>
+          <w:numId w:val="21"/>
+        </w:numPr>
+        <w:spacing w:lineRule="auto"/>
+      </w:pPr>
+      <w:r>
+        <w:rPr/>
+        <w:t xml:space="preserve">Stati vendita/consegna collegati: Accettata (il partner accetta la vendita), Richiedi Annullamento (se ancora "da gestire" si annulla automaticamente), Non Accettata (grigio), Non Consegnata (blu, con motivo nelle note), Consegnata, Annullata (solo Admin/Operation).</w:t>
+      </w:r>
+    </w:p>
+    <w:p>
+      <w:pPr>
+        <w:numPr>
+          <w:ilvl w:val="0"/>
+          <w:numId w:val="21"/>
+        </w:numPr>
+        <w:spacing w:lineRule="auto"/>
+      </w:pPr>
+      <w:r>
+        <w:rPr/>
+        <w:t xml:space="preserve">Servizi orari in storico: CONSEGNATO CON ORARIO DA APPROVARE / CONSEGNATO CON ORARIO NON APPROVATO (verificare l'orario del valet prima di procedere).</w:t>
       </w:r>
     </w:p>
     <w:p>
@@ -5047,7 +5318,24 @@
       </w:pPr>
       <w:r>
         <w:rPr/>
-        <w:t xml:space="preserve">3.9 Setup</w:t>
+        <w:t xml:space="preserve">3.8 Finanza (</w:t>
+      </w:r>
+      <w:r>
+        <w:rPr/>
+        <w:t xml:space="preserve">/finanza</w:t>
+      </w:r>
+      <w:r>
+        <w:rPr/>
+        <w:t xml:space="preserve">)</w:t>
+      </w:r>
+    </w:p>
+    <w:p>
+      <w:pPr>
+        <w:spacing w:lineRule="auto"/>
+      </w:pPr>
+      <w:r>
+        <w:rPr/>
+        <w:t xml:space="preserve">Visibile solo agli admin abilitati (es. utente "support").</w:t>
       </w:r>
     </w:p>
     <w:p>
@@ -5059,46 +5347,18 @@
         <w:spacing w:lineRule="auto"/>
       </w:pPr>
       <w:r>
-        <w:rPr>
-          <w:b/>
-        </w:rPr>
-        <w:t xml:space="preserve">Modelli SMS</w:t>
-      </w:r>
-      <w:r>
-        <w:rPr/>
-        <w:t xml:space="preserve"> (</w:t>
-      </w:r>
-      <w:r>
-        <w:rPr/>
-        <w:t xml:space="preserve">/admin/smstemplates</w:t>
-      </w:r>
-      <w:r>
-        <w:rPr/>
-        <w:t xml:space="preserve">): 31 modelli; tipi Created / Departed / Arrived; assegnati ad Admin o a partner specifici (es. Boutique Chanel); placeholder disponibili: </w:t>
-      </w:r>
-      <w:r>
-        <w:rPr/>
-        <w:t xml:space="preserve">[name]</w:t>
-      </w:r>
-      <w:r>
-        <w:rPr/>
-        <w:t xml:space="preserve">, </w:t>
-      </w:r>
-      <w:r>
-        <w:rPr/>
-        <w:t xml:space="preserve">[day]</w:t>
-      </w:r>
-      <w:r>
-        <w:rPr/>
-        <w:t xml:space="preserve">, </w:t>
-      </w:r>
-      <w:r>
-        <w:rPr/>
-        <w:t xml:space="preserve">[between_time]</w:t>
-      </w:r>
-      <w:r>
-        <w:rPr/>
-        <w:t xml:space="preserve">. Brand: Deluxy, DeluxyFlowers, CakeDesign.Me, BusinessDeluxy, Deluxy Experience, Deluxy Dot Com.</w:t>
+        <w:rPr/>
+        <w:t xml:space="preserve">Tab </w:t>
+      </w:r>
+      <w:r>
+        <w:rPr>
+          <w:b/>
+        </w:rPr>
+        <w:t xml:space="preserve">CORRISPETTIVI</w:t>
+      </w:r>
+      <w:r>
+        <w:rPr/>
+        <w:t xml:space="preserve">: per ogni vendita: Stato, ID Vendita, ID Consegna, Data consegna, Prodotto, Categoria, Valore vendite, Prezzo pubblico, Prezzo consegna, Partner, Prezzo partner, Fee %, Fee value, Fee+IVA, Costo consegna, Primo margine, Primo margine %. Con ESPORTA.</w:t>
       </w:r>
     </w:p>
     <w:p>
@@ -5110,6 +5370,90 @@
         <w:spacing w:lineRule="auto"/>
       </w:pPr>
       <w:r>
+        <w:rPr/>
+        <w:t xml:space="preserve">Tab </w:t>
+      </w:r>
+      <w:r>
+        <w:rPr>
+          <w:b/>
+        </w:rPr>
+        <w:t xml:space="preserve">MARGINI</w:t>
+      </w:r>
+      <w:r>
+        <w:rPr/>
+        <w:t xml:space="preserve">: margini totali dell'azienda.</w:t>
+      </w:r>
+    </w:p>
+    <w:p>
+      <w:pPr>
+        <w:pStyle w:val="Heading3"/>
+        <w:spacing w:lineRule="auto"/>
+      </w:pPr>
+      <w:r>
+        <w:rPr/>
+        <w:t xml:space="preserve">3.9 Setup</w:t>
+      </w:r>
+    </w:p>
+    <w:p>
+      <w:pPr>
+        <w:numPr>
+          <w:ilvl w:val="0"/>
+          <w:numId w:val="23"/>
+        </w:numPr>
+        <w:spacing w:lineRule="auto"/>
+      </w:pPr>
+      <w:r>
+        <w:rPr>
+          <w:b/>
+        </w:rPr>
+        <w:t xml:space="preserve">Modelli SMS</w:t>
+      </w:r>
+      <w:r>
+        <w:rPr/>
+        <w:t xml:space="preserve"> (</w:t>
+      </w:r>
+      <w:r>
+        <w:rPr/>
+        <w:t xml:space="preserve">/admin/smstemplates</w:t>
+      </w:r>
+      <w:r>
+        <w:rPr/>
+        <w:t xml:space="preserve">): 31 modelli; tipi Created / Departed / Arrived; assegnati ad Admin o a partner specifici (es. Boutique Chanel); placeholder disponibili: </w:t>
+      </w:r>
+      <w:r>
+        <w:rPr/>
+        <w:t xml:space="preserve">[name]</w:t>
+      </w:r>
+      <w:r>
+        <w:rPr/>
+        <w:t xml:space="preserve">, </w:t>
+      </w:r>
+      <w:r>
+        <w:rPr/>
+        <w:t xml:space="preserve">[day]</w:t>
+      </w:r>
+      <w:r>
+        <w:rPr/>
+        <w:t xml:space="preserve">, </w:t>
+      </w:r>
+      <w:r>
+        <w:rPr/>
+        <w:t xml:space="preserve">[between_time]</w:t>
+      </w:r>
+      <w:r>
+        <w:rPr/>
+        <w:t xml:space="preserve">. Brand: Deluxy, DeluxyFlowers, CakeDesign.Me, BusinessDeluxy, Deluxy Experience, Deluxy Dot Com.</w:t>
+      </w:r>
+    </w:p>
+    <w:p>
+      <w:pPr>
+        <w:numPr>
+          <w:ilvl w:val="0"/>
+          <w:numId w:val="23"/>
+        </w:numPr>
+        <w:spacing w:lineRule="auto"/>
+      </w:pPr>
+      <w:r>
         <w:rPr>
           <w:b/>
         </w:rPr>
@@ -5132,7 +5476,7 @@
       <w:pPr>
         <w:numPr>
           <w:ilvl w:val="0"/>
-          <w:numId w:val="22"/>
+          <w:numId w:val="23"/>
         </w:numPr>
         <w:spacing w:lineRule="auto"/>
       </w:pPr>
@@ -5159,7 +5503,7 @@
       <w:pPr>
         <w:numPr>
           <w:ilvl w:val="1"/>
-          <w:numId w:val="23"/>
+          <w:numId w:val="24"/>
         </w:numPr>
         <w:spacing w:lineRule="auto"/>
       </w:pPr>
@@ -5178,7 +5522,7 @@
       <w:pPr>
         <w:numPr>
           <w:ilvl w:val="1"/>
-          <w:numId w:val="23"/>
+          <w:numId w:val="24"/>
         </w:numPr>
         <w:spacing w:lineRule="auto"/>
       </w:pPr>
@@ -5209,63 +5553,6 @@
       <w:r>
         <w:rPr/>
         <w:t xml:space="preserve">)</w:t>
-      </w:r>
-    </w:p>
-    <w:p>
-      <w:pPr>
-        <w:numPr>
-          <w:ilvl w:val="0"/>
-          <w:numId w:val="24"/>
-        </w:numPr>
-        <w:spacing w:lineRule="auto"/>
-      </w:pPr>
-      <w:r>
-        <w:rPr>
-          <w:b/>
-        </w:rPr>
-        <w:t xml:space="preserve">QONTO CONNECTION</w:t>
-      </w:r>
-      <w:r>
-        <w:rPr/>
-        <w:t xml:space="preserve">: collegamento del conto Qonto (CONNECT WITH QONTO). </w:t>
-      </w:r>
-      <w:r>
-        <w:rPr>
-          <w:b/>
-        </w:rPr>
-        <w:t xml:space="preserve">[NUOVO]</w:t>
-      </w:r>
-    </w:p>
-    <w:p>
-      <w:pPr>
-        <w:numPr>
-          <w:ilvl w:val="0"/>
-          <w:numId w:val="24"/>
-        </w:numPr>
-        <w:spacing w:lineRule="auto"/>
-      </w:pPr>
-      <w:r>
-        <w:rPr/>
-        <w:t xml:space="preserve">Personal information: e-mail*, RECLAMA MAIL VALET, RECLAMA MAIL PARTNERS (indirizzi per i reclami), cognome*, nome*, password + ripeti password, SALVA.</w:t>
-      </w:r>
-    </w:p>
-    <w:p>
-      <w:pPr>
-        <w:pStyle w:val="Heading2"/>
-        <w:spacing w:lineRule="auto"/>
-      </w:pPr>
-      <w:r>
-        <w:rPr/>
-        <w:t xml:space="preserve">4. Registrazione</w:t>
-      </w:r>
-    </w:p>
-    <w:p>
-      <w:pPr>
-        <w:spacing w:lineRule="auto"/>
-      </w:pPr>
-      <w:r>
-        <w:rPr/>
-        <w:t xml:space="preserve">La registrazione avviene obbligatoriamente da parte dell'Admin per qualsiasi utente. Utenti creabili: Admin, Operation, Partner, Valet.</w:t>
       </w:r>
     </w:p>
     <w:p>
@@ -5280,11 +5567,17 @@
         <w:rPr>
           <w:b/>
         </w:rPr>
-        <w:t xml:space="preserve">Admin</w:t>
-      </w:r>
-      <w:r>
-        <w:rPr/>
-        <w:t xml:space="preserve">: si crea come Valet/Partner/Operation e poi si trasforma in Admin dalla pagina Utenti.</w:t>
+        <w:t xml:space="preserve">QONTO CONNECTION</w:t>
+      </w:r>
+      <w:r>
+        <w:rPr/>
+        <w:t xml:space="preserve">: collegamento del conto Qonto (CONNECT WITH QONTO). </w:t>
+      </w:r>
+      <w:r>
+        <w:rPr>
+          <w:b/>
+        </w:rPr>
+        <w:t xml:space="preserve">[NUOVO]</w:t>
       </w:r>
     </w:p>
     <w:p>
@@ -5296,67 +5589,27 @@
         <w:spacing w:lineRule="auto"/>
       </w:pPr>
       <w:r>
-        <w:rPr>
-          <w:b/>
-        </w:rPr>
-        <w:t xml:space="preserve">Operation</w:t>
-      </w:r>
-      <w:r>
-        <w:rPr/>
-        <w:t xml:space="preserve">: nome, cognome, mail, telefono, indirizzo, note.</w:t>
-      </w:r>
-    </w:p>
-    <w:p>
-      <w:pPr>
-        <w:numPr>
-          <w:ilvl w:val="0"/>
-          <w:numId w:val="25"/>
-        </w:numPr>
-        <w:spacing w:lineRule="auto"/>
-      </w:pPr>
-      <w:r>
-        <w:rPr>
-          <w:b/>
-        </w:rPr>
-        <w:t xml:space="preserve">Partner</w:t>
-      </w:r>
-      <w:r>
-        <w:rPr/>
-        <w:t xml:space="preserve">: insegna, email, P.IVA/CF, indirizzo, telefono, referente, ragione sociale, province, servizi (KM included, extra fuoricittà), categorie, notifiche, fatturazione &amp; actions, documentazione e note.</w:t>
-      </w:r>
-    </w:p>
-    <w:p>
-      <w:pPr>
-        <w:numPr>
-          <w:ilvl w:val="0"/>
-          <w:numId w:val="25"/>
-        </w:numPr>
-        <w:spacing w:lineRule="auto"/>
-      </w:pPr>
-      <w:r>
-        <w:rPr>
-          <w:b/>
-        </w:rPr>
-        <w:t xml:space="preserve">Valet</w:t>
-      </w:r>
-      <w:r>
-        <w:rPr/>
-        <w:t xml:space="preserve">: anagrafica completa, flag P.IVA (P.IVA + CF, luogo/data di nascita, IBAN), team leader, province, servizi con salario, notifiche (mail o WhatsApp), mezzo, note.</w:t>
-      </w:r>
-    </w:p>
-    <w:p>
-      <w:pPr>
-        <w:spacing w:lineRule="auto"/>
-      </w:pPr>
-      <w:r>
-        <w:rPr>
-          <w:b/>
-        </w:rPr>
-        <w:t xml:space="preserve">Step successivi alla registrazione</w:t>
-      </w:r>
-      <w:r>
-        <w:rPr/>
-        <w:t xml:space="preserve">:</w:t>
+        <w:rPr/>
+        <w:t xml:space="preserve">Personal information: e-mail*, RECLAMA MAIL VALET, RECLAMA MAIL PARTNERS (indirizzi per i reclami), cognome*, nome*, password + ripeti password, SALVA.</w:t>
+      </w:r>
+    </w:p>
+    <w:p>
+      <w:pPr>
+        <w:pStyle w:val="Heading2"/>
+        <w:spacing w:lineRule="auto"/>
+      </w:pPr>
+      <w:r>
+        <w:rPr/>
+        <w:t xml:space="preserve">4. Registrazione</w:t>
+      </w:r>
+    </w:p>
+    <w:p>
+      <w:pPr>
+        <w:spacing w:lineRule="auto"/>
+      </w:pPr>
+      <w:r>
+        <w:rPr/>
+        <w:t xml:space="preserve">La registrazione avviene obbligatoriamente da parte dell'Admin per qualsiasi utente. Utenti creabili: Admin, Operation, Partner, Valet.</w:t>
       </w:r>
     </w:p>
     <w:p>
@@ -5368,8 +5621,14 @@
         <w:spacing w:lineRule="auto"/>
       </w:pPr>
       <w:r>
-        <w:rPr/>
-        <w:t xml:space="preserve">Admin: impostare l'utente come "Attivo" nella pagina Utenti.</w:t>
+        <w:rPr>
+          <w:b/>
+        </w:rPr>
+        <w:t xml:space="preserve">Admin</w:t>
+      </w:r>
+      <w:r>
+        <w:rPr/>
+        <w:t xml:space="preserve">: si crea come Valet/Partner/Operation e poi si trasforma in Admin dalla pagina Utenti.</w:t>
       </w:r>
     </w:p>
     <w:p>
@@ -5381,8 +5640,14 @@
         <w:spacing w:lineRule="auto"/>
       </w:pPr>
       <w:r>
-        <w:rPr/>
-        <w:t xml:space="preserve">Partner: inserire subito i campi richiesti e impostare gli orari di apertura; Admin abilita le categorie di vendita.</w:t>
+        <w:rPr>
+          <w:b/>
+        </w:rPr>
+        <w:t xml:space="preserve">Operation</w:t>
+      </w:r>
+      <w:r>
+        <w:rPr/>
+        <w:t xml:space="preserve">: nome, cognome, mail, telefono, indirizzo, note.</w:t>
       </w:r>
     </w:p>
     <w:p>
@@ -5394,18 +5659,48 @@
         <w:spacing w:lineRule="auto"/>
       </w:pPr>
       <w:r>
-        <w:rPr/>
-        <w:t xml:space="preserve">Valet: specificare subito le disponibilità; Admin indica la % di rimborso nella ritenuta.</w:t>
-      </w:r>
-    </w:p>
-    <w:p>
-      <w:pPr>
-        <w:pStyle w:val="Heading2"/>
-        <w:spacing w:lineRule="auto"/>
-      </w:pPr>
-      <w:r>
-        <w:rPr/>
-        <w:t xml:space="preserve">5. Processo di consegna (Valet)</w:t>
+        <w:rPr>
+          <w:b/>
+        </w:rPr>
+        <w:t xml:space="preserve">Partner</w:t>
+      </w:r>
+      <w:r>
+        <w:rPr/>
+        <w:t xml:space="preserve">: insegna, email, P.IVA/CF, indirizzo, telefono, referente, ragione sociale, province, servizi (KM included, extra fuoricittà), categorie, notifiche, fatturazione &amp; actions, documentazione e note.</w:t>
+      </w:r>
+    </w:p>
+    <w:p>
+      <w:pPr>
+        <w:numPr>
+          <w:ilvl w:val="0"/>
+          <w:numId w:val="26"/>
+        </w:numPr>
+        <w:spacing w:lineRule="auto"/>
+      </w:pPr>
+      <w:r>
+        <w:rPr>
+          <w:b/>
+        </w:rPr>
+        <w:t xml:space="preserve">Valet</w:t>
+      </w:r>
+      <w:r>
+        <w:rPr/>
+        <w:t xml:space="preserve">: anagrafica completa, flag P.IVA (P.IVA + CF, luogo/data di nascita, IBAN), team leader, province, servizi con salario, notifiche (mail o WhatsApp), mezzo, note.</w:t>
+      </w:r>
+    </w:p>
+    <w:p>
+      <w:pPr>
+        <w:spacing w:lineRule="auto"/>
+      </w:pPr>
+      <w:r>
+        <w:rPr>
+          <w:b/>
+        </w:rPr>
+        <w:t xml:space="preserve">Step successivi alla registrazione</w:t>
+      </w:r>
+      <w:r>
+        <w:rPr/>
+        <w:t xml:space="preserve">:</w:t>
       </w:r>
     </w:p>
     <w:p>
@@ -5417,14 +5712,8 @@
         <w:spacing w:lineRule="auto"/>
       </w:pPr>
       <w:r>
-        <w:rPr>
-          <w:b/>
-        </w:rPr>
-        <w:t xml:space="preserve">RITIRO</w:t>
-      </w:r>
-      <w:r>
-        <w:rPr/>
-        <w:t xml:space="preserve">: il valet imposta "in consegna" (furgoncino giallo); la consegna lampeggia per partner/admin/operation; notifica ad Admin e Operation.</w:t>
+        <w:rPr/>
+        <w:t xml:space="preserve">Admin: impostare l'utente come "Attivo" nella pagina Utenti.</w:t>
       </w:r>
     </w:p>
     <w:p>
@@ -5436,14 +5725,8 @@
         <w:spacing w:lineRule="auto"/>
       </w:pPr>
       <w:r>
-        <w:rPr>
-          <w:b/>
-        </w:rPr>
-        <w:t xml:space="preserve">CONSEGNATO</w:t>
-      </w:r>
-      <w:r>
-        <w:rPr/>
-        <w:t xml:space="preserve">: popup che chiede chi ha ritirato il prodotto + caricamento foto della ricevuta; notifica ad Admin e Operation.</w:t>
+        <w:rPr/>
+        <w:t xml:space="preserve">Partner: inserire subito i campi richiesti e impostare gli orari di apertura; Admin abilita le categorie di vendita.</w:t>
       </w:r>
     </w:p>
     <w:p>
@@ -5451,6 +5734,67 @@
         <w:numPr>
           <w:ilvl w:val="0"/>
           <w:numId w:val="27"/>
+        </w:numPr>
+        <w:spacing w:lineRule="auto"/>
+      </w:pPr>
+      <w:r>
+        <w:rPr/>
+        <w:t xml:space="preserve">Valet: specificare subito le disponibilità; Admin indica la % di rimborso nella ritenuta.</w:t>
+      </w:r>
+    </w:p>
+    <w:p>
+      <w:pPr>
+        <w:pStyle w:val="Heading2"/>
+        <w:spacing w:lineRule="auto"/>
+      </w:pPr>
+      <w:r>
+        <w:rPr/>
+        <w:t xml:space="preserve">5. Processo di consegna (Valet)</w:t>
+      </w:r>
+    </w:p>
+    <w:p>
+      <w:pPr>
+        <w:numPr>
+          <w:ilvl w:val="0"/>
+          <w:numId w:val="28"/>
+        </w:numPr>
+        <w:spacing w:lineRule="auto"/>
+      </w:pPr>
+      <w:r>
+        <w:rPr>
+          <w:b/>
+        </w:rPr>
+        <w:t xml:space="preserve">RITIRO</w:t>
+      </w:r>
+      <w:r>
+        <w:rPr/>
+        <w:t xml:space="preserve">: il valet imposta "in consegna" (furgoncino giallo); la consegna lampeggia per partner/admin/operation; notifica ad Admin e Operation.</w:t>
+      </w:r>
+    </w:p>
+    <w:p>
+      <w:pPr>
+        <w:numPr>
+          <w:ilvl w:val="0"/>
+          <w:numId w:val="28"/>
+        </w:numPr>
+        <w:spacing w:lineRule="auto"/>
+      </w:pPr>
+      <w:r>
+        <w:rPr>
+          <w:b/>
+        </w:rPr>
+        <w:t xml:space="preserve">CONSEGNATO</w:t>
+      </w:r>
+      <w:r>
+        <w:rPr/>
+        <w:t xml:space="preserve">: popup che chiede chi ha ritirato il prodotto + caricamento foto della ricevuta; notifica ad Admin e Operation.</w:t>
+      </w:r>
+    </w:p>
+    <w:p>
+      <w:pPr>
+        <w:numPr>
+          <w:ilvl w:val="0"/>
+          <w:numId w:val="28"/>
         </w:numPr>
         <w:spacing w:lineRule="auto"/>
       </w:pPr>
@@ -5649,7 +5993,7 @@
       <w:pPr>
         <w:numPr>
           <w:ilvl w:val="0"/>
-          <w:numId w:val="28"/>
+          <w:numId w:val="29"/>
         </w:numPr>
         <w:spacing w:lineRule="auto"/>
       </w:pPr>
@@ -5670,7 +6014,7 @@
       <w:pPr>
         <w:numPr>
           <w:ilvl w:val="0"/>
-          <w:numId w:val="28"/>
+          <w:numId w:val="29"/>
         </w:numPr>
         <w:spacing w:lineRule="auto"/>
       </w:pPr>
@@ -5683,7 +6027,7 @@
       <w:pPr>
         <w:numPr>
           <w:ilvl w:val="0"/>
-          <w:numId w:val="28"/>
+          <w:numId w:val="29"/>
         </w:numPr>
         <w:spacing w:lineRule="auto"/>
       </w:pPr>
@@ -5720,7 +6064,7 @@
       <w:pPr>
         <w:numPr>
           <w:ilvl w:val="0"/>
-          <w:numId w:val="28"/>
+          <w:numId w:val="29"/>
         </w:numPr>
         <w:spacing w:lineRule="auto"/>
       </w:pPr>
@@ -6697,7 +7041,7 @@
       <w:pPr>
         <w:numPr>
           <w:ilvl w:val="0"/>
-          <w:numId w:val="29"/>
+          <w:numId w:val="30"/>
         </w:numPr>
         <w:spacing w:lineRule="auto"/>
       </w:pPr>
@@ -6718,249 +7062,6 @@
       <w:r>
         <w:rPr/>
         <w:t xml:space="preserve"> (ambiente sandbox: dev.deluxy.it).</w:t>
-      </w:r>
-    </w:p>
-    <w:p>
-      <w:pPr>
-        <w:numPr>
-          <w:ilvl w:val="0"/>
-          <w:numId w:val="29"/>
-        </w:numPr>
-        <w:spacing w:lineRule="auto"/>
-      </w:pPr>
-      <w:r>
-        <w:rPr>
-          <w:b/>
-        </w:rPr>
-        <w:t xml:space="preserve">Autenticazione JWT</w:t>
-      </w:r>
-      <w:r>
-        <w:rPr/>
-        <w:t xml:space="preserve">: login → access token con ruoli (admin/expert/partner/operation); </w:t>
-      </w:r>
-      <w:r>
-        <w:rPr/>
-        <w:t xml:space="preserve">/api/users/me</w:t>
-      </w:r>
-      <w:r>
-        <w:rPr/>
-        <w:t xml:space="preserve"> restituisce l'utente corrente.</w:t>
-      </w:r>
-    </w:p>
-    <w:p>
-      <w:pPr>
-        <w:numPr>
-          <w:ilvl w:val="0"/>
-          <w:numId w:val="29"/>
-        </w:numPr>
-        <w:spacing w:lineRule="auto"/>
-      </w:pPr>
-      <w:r>
-        <w:rPr>
-          <w:b/>
-        </w:rPr>
-        <w:t xml:space="preserve">Convenzioni note</w:t>
-      </w:r>
-      <w:r>
-        <w:rPr/>
-        <w:t xml:space="preserve">: il valet è "expert" (es. </w:t>
-      </w:r>
-      <w:r>
-        <w:rPr/>
-        <w:t xml:space="preserve">/api/experts/delivery/experts</w:t>
-      </w:r>
-      <w:r>
-        <w:rPr/>
-        <w:t xml:space="preserve">); i codici piattaforma vendita sono </w:t>
-      </w:r>
-      <w:r>
-        <w:rPr/>
-        <w:t xml:space="preserve">shopifysale</w:t>
-      </w:r>
-      <w:r>
-        <w:rPr/>
-        <w:t xml:space="preserve">, </w:t>
-      </w:r>
-      <w:r>
-        <w:rPr/>
-        <w:t xml:space="preserve">cakesales</w:t>
-      </w:r>
-      <w:r>
-        <w:rPr/>
-        <w:t xml:space="preserve">, </w:t>
-      </w:r>
-      <w:r>
-        <w:rPr/>
-        <w:t xml:space="preserve">businesssales</w:t>
-      </w:r>
-      <w:r>
-        <w:rPr/>
-        <w:t xml:space="preserve">, </w:t>
-      </w:r>
-      <w:r>
-        <w:rPr/>
-        <w:t xml:space="preserve">flowerssales</w:t>
-      </w:r>
-      <w:r>
-        <w:rPr/>
-        <w:t xml:space="preserve">, </w:t>
-      </w:r>
-      <w:r>
-        <w:rPr/>
-        <w:t xml:space="preserve">deluxyexperiencesales</w:t>
-      </w:r>
-      <w:r>
-        <w:rPr/>
-        <w:t xml:space="preserve">, </w:t>
-      </w:r>
-      <w:r>
-        <w:rPr/>
-        <w:t xml:space="preserve">deluxydotcomsales</w:t>
-      </w:r>
-      <w:r>
-        <w:rPr/>
-        <w:t xml:space="preserve">; gli stati consegna sono </w:t>
-      </w:r>
-      <w:r>
-        <w:rPr/>
-        <w:t xml:space="preserve">created</w:t>
-      </w:r>
-      <w:r>
-        <w:rPr/>
-        <w:t xml:space="preserve">, </w:t>
-      </w:r>
-      <w:r>
-        <w:rPr/>
-        <w:t xml:space="preserve">assigned</w:t>
-      </w:r>
-      <w:r>
-        <w:rPr/>
-        <w:t xml:space="preserve">, </w:t>
-      </w:r>
-      <w:r>
-        <w:rPr/>
-        <w:t xml:space="preserve">delivering</w:t>
-      </w:r>
-      <w:r>
-        <w:rPr/>
-        <w:t xml:space="preserve">, </w:t>
-      </w:r>
-      <w:r>
-        <w:rPr/>
-        <w:t xml:space="preserve">inPreparation</w:t>
-      </w:r>
-      <w:r>
-        <w:rPr/>
-        <w:t xml:space="preserve">, </w:t>
-      </w:r>
-      <w:r>
-        <w:rPr/>
-        <w:t xml:space="preserve">accepted</w:t>
-      </w:r>
-      <w:r>
-        <w:rPr/>
-        <w:t xml:space="preserve">, </w:t>
-      </w:r>
-      <w:r>
-        <w:rPr/>
-        <w:t xml:space="preserve">requestCancellation</w:t>
-      </w:r>
-      <w:r>
-        <w:rPr/>
-        <w:t xml:space="preserve"> (+</w:t>
-      </w:r>
-      <w:r>
-        <w:rPr/>
-        <w:t xml:space="preserve">delivered</w:t>
-      </w:r>
-      <w:r>
-        <w:rPr/>
-        <w:t xml:space="preserve">, </w:t>
-      </w:r>
-      <w:r>
-        <w:rPr/>
-        <w:t xml:space="preserve">notDelivered</w:t>
-      </w:r>
-      <w:r>
-        <w:rPr/>
-        <w:t xml:space="preserve">, </w:t>
-      </w:r>
-      <w:r>
-        <w:rPr/>
-        <w:t xml:space="preserve">cancelled</w:t>
-      </w:r>
-      <w:r>
-        <w:rPr/>
-        <w:t xml:space="preserve"> in storico); i tipi servizio sono </w:t>
-      </w:r>
-      <w:r>
-        <w:rPr/>
-        <w:t xml:space="preserve">sales</w:t>
-      </w:r>
-      <w:r>
-        <w:rPr/>
-        <w:t xml:space="preserve">, </w:t>
-      </w:r>
-      <w:r>
-        <w:rPr/>
-        <w:t xml:space="preserve">hourlyrate</w:t>
-      </w:r>
-      <w:r>
-        <w:rPr/>
-        <w:t xml:space="preserve">, </w:t>
-      </w:r>
-      <w:r>
-        <w:rPr/>
-        <w:t xml:space="preserve">fixedprice</w:t>
-      </w:r>
-      <w:r>
-        <w:rPr/>
-        <w:t xml:space="preserve">, </w:t>
-      </w:r>
-      <w:r>
-        <w:rPr/>
-        <w:t xml:space="preserve">corporate</w:t>
-      </w:r>
-      <w:r>
-        <w:rPr/>
-        <w:t xml:space="preserve">, </w:t>
-      </w:r>
-      <w:r>
-        <w:rPr/>
-        <w:t xml:space="preserve">warehouseservice</w:t>
-      </w:r>
-      <w:r>
-        <w:rPr/>
-        <w:t xml:space="preserve">.</w:t>
-      </w:r>
-    </w:p>
-    <w:p>
-      <w:pPr>
-        <w:numPr>
-          <w:ilvl w:val="0"/>
-          <w:numId w:val="29"/>
-        </w:numPr>
-        <w:spacing w:lineRule="auto"/>
-      </w:pPr>
-      <w:r>
-        <w:rPr>
-          <w:b/>
-        </w:rPr>
-        <w:t xml:space="preserve">API key partner</w:t>
-      </w:r>
-      <w:r>
-        <w:rPr/>
-        <w:t xml:space="preserve"> (WooCommerce) generabile in autonomia dalla scheda partner; garantisce l'accesso alle API di invio ordini.</w:t>
-      </w:r>
-    </w:p>
-    <w:p>
-      <w:pPr>
-        <w:pStyle w:val="Heading2"/>
-        <w:spacing w:lineRule="auto"/>
-      </w:pPr>
-      <w:r>
-        <w:rPr/>
-        <w:t xml:space="preserve">9. Piano di modernizzazione (staging)</w:t>
       </w:r>
     </w:p>
     <w:p>
@@ -6975,11 +7076,19 @@
         <w:rPr>
           <w:b/>
         </w:rPr>
-        <w:t xml:space="preserve">Problema</w:t>
-      </w:r>
-      <w:r>
-        <w:rPr/>
-        <w:t xml:space="preserve">: Node.js v12 e Angular datati — dipendenze deprecate, difficoltà a integrare strumenti moderni, manutenzione rischiosa.</w:t>
+        <w:t xml:space="preserve">Autenticazione JWT</w:t>
+      </w:r>
+      <w:r>
+        <w:rPr/>
+        <w:t xml:space="preserve">: login → access token con ruoli (admin/expert/partner/operation); </w:t>
+      </w:r>
+      <w:r>
+        <w:rPr/>
+        <w:t xml:space="preserve">/api/users/me</w:t>
+      </w:r>
+      <w:r>
+        <w:rPr/>
+        <w:t xml:space="preserve"> restituisce l'utente corrente.</w:t>
       </w:r>
     </w:p>
     <w:p>
@@ -6994,11 +7103,179 @@
         <w:rPr>
           <w:b/>
         </w:rPr>
-        <w:t xml:space="preserve">Approccio</w:t>
-      </w:r>
-      <w:r>
-        <w:rPr/>
-        <w:t xml:space="preserve">: la produzione resta stabile; in parallelo un ambiente di staging con stack aggiornato replica il dominio (utenti/ruoli, consegne, activities, partner, valet, prodotti, vendite, stipendi, regole, finanza) e si migra gradualmente.</w:t>
+        <w:t xml:space="preserve">Convenzioni note</w:t>
+      </w:r>
+      <w:r>
+        <w:rPr/>
+        <w:t xml:space="preserve">: il valet è "expert" (es. </w:t>
+      </w:r>
+      <w:r>
+        <w:rPr/>
+        <w:t xml:space="preserve">/api/experts/delivery/experts</w:t>
+      </w:r>
+      <w:r>
+        <w:rPr/>
+        <w:t xml:space="preserve">); i codici piattaforma vendita sono </w:t>
+      </w:r>
+      <w:r>
+        <w:rPr/>
+        <w:t xml:space="preserve">shopifysale</w:t>
+      </w:r>
+      <w:r>
+        <w:rPr/>
+        <w:t xml:space="preserve">, </w:t>
+      </w:r>
+      <w:r>
+        <w:rPr/>
+        <w:t xml:space="preserve">cakesales</w:t>
+      </w:r>
+      <w:r>
+        <w:rPr/>
+        <w:t xml:space="preserve">, </w:t>
+      </w:r>
+      <w:r>
+        <w:rPr/>
+        <w:t xml:space="preserve">businesssales</w:t>
+      </w:r>
+      <w:r>
+        <w:rPr/>
+        <w:t xml:space="preserve">, </w:t>
+      </w:r>
+      <w:r>
+        <w:rPr/>
+        <w:t xml:space="preserve">flowerssales</w:t>
+      </w:r>
+      <w:r>
+        <w:rPr/>
+        <w:t xml:space="preserve">, </w:t>
+      </w:r>
+      <w:r>
+        <w:rPr/>
+        <w:t xml:space="preserve">deluxyexperiencesales</w:t>
+      </w:r>
+      <w:r>
+        <w:rPr/>
+        <w:t xml:space="preserve">, </w:t>
+      </w:r>
+      <w:r>
+        <w:rPr/>
+        <w:t xml:space="preserve">deluxydotcomsales</w:t>
+      </w:r>
+      <w:r>
+        <w:rPr/>
+        <w:t xml:space="preserve">; gli stati consegna sono </w:t>
+      </w:r>
+      <w:r>
+        <w:rPr/>
+        <w:t xml:space="preserve">created</w:t>
+      </w:r>
+      <w:r>
+        <w:rPr/>
+        <w:t xml:space="preserve">, </w:t>
+      </w:r>
+      <w:r>
+        <w:rPr/>
+        <w:t xml:space="preserve">assigned</w:t>
+      </w:r>
+      <w:r>
+        <w:rPr/>
+        <w:t xml:space="preserve">, </w:t>
+      </w:r>
+      <w:r>
+        <w:rPr/>
+        <w:t xml:space="preserve">delivering</w:t>
+      </w:r>
+      <w:r>
+        <w:rPr/>
+        <w:t xml:space="preserve">, </w:t>
+      </w:r>
+      <w:r>
+        <w:rPr/>
+        <w:t xml:space="preserve">inPreparation</w:t>
+      </w:r>
+      <w:r>
+        <w:rPr/>
+        <w:t xml:space="preserve">, </w:t>
+      </w:r>
+      <w:r>
+        <w:rPr/>
+        <w:t xml:space="preserve">accepted</w:t>
+      </w:r>
+      <w:r>
+        <w:rPr/>
+        <w:t xml:space="preserve">, </w:t>
+      </w:r>
+      <w:r>
+        <w:rPr/>
+        <w:t xml:space="preserve">requestCancellation</w:t>
+      </w:r>
+      <w:r>
+        <w:rPr/>
+        <w:t xml:space="preserve"> (+</w:t>
+      </w:r>
+      <w:r>
+        <w:rPr/>
+        <w:t xml:space="preserve">delivered</w:t>
+      </w:r>
+      <w:r>
+        <w:rPr/>
+        <w:t xml:space="preserve">, </w:t>
+      </w:r>
+      <w:r>
+        <w:rPr/>
+        <w:t xml:space="preserve">notDelivered</w:t>
+      </w:r>
+      <w:r>
+        <w:rPr/>
+        <w:t xml:space="preserve">, </w:t>
+      </w:r>
+      <w:r>
+        <w:rPr/>
+        <w:t xml:space="preserve">cancelled</w:t>
+      </w:r>
+      <w:r>
+        <w:rPr/>
+        <w:t xml:space="preserve"> in storico); i tipi servizio sono </w:t>
+      </w:r>
+      <w:r>
+        <w:rPr/>
+        <w:t xml:space="preserve">sales</w:t>
+      </w:r>
+      <w:r>
+        <w:rPr/>
+        <w:t xml:space="preserve">, </w:t>
+      </w:r>
+      <w:r>
+        <w:rPr/>
+        <w:t xml:space="preserve">hourlyrate</w:t>
+      </w:r>
+      <w:r>
+        <w:rPr/>
+        <w:t xml:space="preserve">, </w:t>
+      </w:r>
+      <w:r>
+        <w:rPr/>
+        <w:t xml:space="preserve">fixedprice</w:t>
+      </w:r>
+      <w:r>
+        <w:rPr/>
+        <w:t xml:space="preserve">, </w:t>
+      </w:r>
+      <w:r>
+        <w:rPr/>
+        <w:t xml:space="preserve">corporate</w:t>
+      </w:r>
+      <w:r>
+        <w:rPr/>
+        <w:t xml:space="preserve">, </w:t>
+      </w:r>
+      <w:r>
+        <w:rPr/>
+        <w:t xml:space="preserve">warehouseservice</w:t>
+      </w:r>
+      <w:r>
+        <w:rPr/>
+        <w:t xml:space="preserve">.</w:t>
       </w:r>
     </w:p>
     <w:p>
@@ -7013,6 +7290,73 @@
         <w:rPr>
           <w:b/>
         </w:rPr>
+        <w:t xml:space="preserve">API key partner</w:t>
+      </w:r>
+      <w:r>
+        <w:rPr/>
+        <w:t xml:space="preserve"> (WooCommerce) generabile in autonomia dalla scheda partner; garantisce l'accesso alle API di invio ordini.</w:t>
+      </w:r>
+    </w:p>
+    <w:p>
+      <w:pPr>
+        <w:pStyle w:val="Heading2"/>
+        <w:spacing w:lineRule="auto"/>
+      </w:pPr>
+      <w:r>
+        <w:rPr/>
+        <w:t xml:space="preserve">9. Piano di modernizzazione (staging)</w:t>
+      </w:r>
+    </w:p>
+    <w:p>
+      <w:pPr>
+        <w:numPr>
+          <w:ilvl w:val="0"/>
+          <w:numId w:val="31"/>
+        </w:numPr>
+        <w:spacing w:lineRule="auto"/>
+      </w:pPr>
+      <w:r>
+        <w:rPr>
+          <w:b/>
+        </w:rPr>
+        <w:t xml:space="preserve">Problema</w:t>
+      </w:r>
+      <w:r>
+        <w:rPr/>
+        <w:t xml:space="preserve">: Node.js v12 e Angular datati — dipendenze deprecate, difficoltà a integrare strumenti moderni, manutenzione rischiosa.</w:t>
+      </w:r>
+    </w:p>
+    <w:p>
+      <w:pPr>
+        <w:numPr>
+          <w:ilvl w:val="0"/>
+          <w:numId w:val="31"/>
+        </w:numPr>
+        <w:spacing w:lineRule="auto"/>
+      </w:pPr>
+      <w:r>
+        <w:rPr>
+          <w:b/>
+        </w:rPr>
+        <w:t xml:space="preserve">Approccio</w:t>
+      </w:r>
+      <w:r>
+        <w:rPr/>
+        <w:t xml:space="preserve">: la produzione resta stabile; in parallelo un ambiente di staging con stack aggiornato replica il dominio (utenti/ruoli, consegne, activities, partner, valet, prodotti, vendite, stipendi, regole, finanza) e si migra gradualmente.</w:t>
+      </w:r>
+    </w:p>
+    <w:p>
+      <w:pPr>
+        <w:numPr>
+          <w:ilvl w:val="0"/>
+          <w:numId w:val="31"/>
+        </w:numPr>
+        <w:spacing w:lineRule="auto"/>
+      </w:pPr>
+      <w:r>
+        <w:rPr>
+          <w:b/>
+        </w:rPr>
         <w:t xml:space="preserve">Nuovo ambiente creato</w:t>
       </w:r>
       <w:r>
@@ -7040,7 +7384,7 @@
       <w:pPr>
         <w:numPr>
           <w:ilvl w:val="0"/>
-          <w:numId w:val="30"/>
+          <w:numId w:val="31"/>
         </w:numPr>
         <w:spacing w:lineRule="auto"/>
       </w:pPr>
@@ -10212,8 +10556,8 @@
   <w:abstractNum w:abstractNumId="27">
     <w:lvl w:ilvl="0">
       <w:start w:val="1"/>
-      <w:numFmt w:val="decimal"/>
-      <w:lvlText w:val="%1."/>
+      <w:numFmt w:val="bullet"/>
+      <w:lvlText w:val=""/>
       <w:lvlJc w:val="left"/>
       <w:pPr>
         <w:tabs>
@@ -10221,11 +10565,14 @@
         </w:tabs>
         <w:ind w:left="720" w:hanging="360"/>
       </w:pPr>
+      <w:rPr>
+        <w:rFonts w:ascii="Symbol" w:hAnsi="Symbol" w:hint="default"/>
+      </w:rPr>
     </w:lvl>
     <w:lvl w:ilvl="1">
       <w:start w:val="1"/>
-      <w:numFmt w:val="decimal"/>
-      <w:lvlText w:val="%2."/>
+      <w:numFmt w:val="bullet"/>
+      <w:lvlText w:val=""/>
       <w:lvlJc w:val="left"/>
       <w:pPr>
         <w:tabs>
@@ -10233,11 +10580,14 @@
         </w:tabs>
         <w:ind w:left="1440" w:hanging="360"/>
       </w:pPr>
+      <w:rPr>
+        <w:rFonts w:ascii="Symbol" w:hAnsi="Symbol" w:hint="default"/>
+      </w:rPr>
     </w:lvl>
     <w:lvl w:ilvl="2">
       <w:start w:val="1"/>
-      <w:numFmt w:val="decimal"/>
-      <w:lvlText w:val="%3."/>
+      <w:numFmt w:val="bullet"/>
+      <w:lvlText w:val=""/>
       <w:lvlJc w:val="left"/>
       <w:pPr>
         <w:tabs>
@@ -10245,11 +10595,14 @@
         </w:tabs>
         <w:ind w:left="2160" w:hanging="360"/>
       </w:pPr>
+      <w:rPr>
+        <w:rFonts w:ascii="Symbol" w:hAnsi="Symbol" w:hint="default"/>
+      </w:rPr>
     </w:lvl>
     <w:lvl w:ilvl="3">
       <w:start w:val="1"/>
-      <w:numFmt w:val="decimal"/>
-      <w:lvlText w:val="%4."/>
+      <w:numFmt w:val="bullet"/>
+      <w:lvlText w:val=""/>
       <w:lvlJc w:val="left"/>
       <w:pPr>
         <w:tabs>
@@ -10257,11 +10610,14 @@
         </w:tabs>
         <w:ind w:left="2880" w:hanging="360"/>
       </w:pPr>
+      <w:rPr>
+        <w:rFonts w:ascii="Symbol" w:hAnsi="Symbol" w:hint="default"/>
+      </w:rPr>
     </w:lvl>
     <w:lvl w:ilvl="4">
       <w:start w:val="1"/>
-      <w:numFmt w:val="decimal"/>
-      <w:lvlText w:val="%5."/>
+      <w:numFmt w:val="bullet"/>
+      <w:lvlText w:val=""/>
       <w:lvlJc w:val="left"/>
       <w:pPr>
         <w:tabs>
@@ -10269,11 +10625,14 @@
         </w:tabs>
         <w:ind w:left="3600" w:hanging="360"/>
       </w:pPr>
+      <w:rPr>
+        <w:rFonts w:ascii="Symbol" w:hAnsi="Symbol" w:hint="default"/>
+      </w:rPr>
     </w:lvl>
     <w:lvl w:ilvl="5">
       <w:start w:val="1"/>
-      <w:numFmt w:val="decimal"/>
-      <w:lvlText w:val="%6."/>
+      <w:numFmt w:val="bullet"/>
+      <w:lvlText w:val=""/>
       <w:lvlJc w:val="left"/>
       <w:pPr>
         <w:tabs>
@@ -10281,11 +10640,14 @@
         </w:tabs>
         <w:ind w:left="4320" w:hanging="360"/>
       </w:pPr>
+      <w:rPr>
+        <w:rFonts w:ascii="Symbol" w:hAnsi="Symbol" w:hint="default"/>
+      </w:rPr>
     </w:lvl>
     <w:lvl w:ilvl="6">
       <w:start w:val="1"/>
-      <w:numFmt w:val="decimal"/>
-      <w:lvlText w:val="%7."/>
+      <w:numFmt w:val="bullet"/>
+      <w:lvlText w:val=""/>
       <w:lvlJc w:val="left"/>
       <w:pPr>
         <w:tabs>
@@ -10293,11 +10655,14 @@
         </w:tabs>
         <w:ind w:left="5040" w:hanging="360"/>
       </w:pPr>
+      <w:rPr>
+        <w:rFonts w:ascii="Symbol" w:hAnsi="Symbol" w:hint="default"/>
+      </w:rPr>
     </w:lvl>
     <w:lvl w:ilvl="7">
       <w:start w:val="1"/>
-      <w:numFmt w:val="decimal"/>
-      <w:lvlText w:val="%8."/>
+      <w:numFmt w:val="bullet"/>
+      <w:lvlText w:val=""/>
       <w:lvlJc w:val="left"/>
       <w:pPr>
         <w:tabs>
@@ -10305,13 +10670,16 @@
         </w:tabs>
         <w:ind w:left="5760" w:hanging="360"/>
       </w:pPr>
+      <w:rPr>
+        <w:rFonts w:ascii="Symbol" w:hAnsi="Symbol" w:hint="default"/>
+      </w:rPr>
     </w:lvl>
   </w:abstractNum>
   <w:abstractNum w:abstractNumId="28">
     <w:lvl w:ilvl="0">
       <w:start w:val="1"/>
-      <w:numFmt w:val="bullet"/>
-      <w:lvlText w:val=""/>
+      <w:numFmt w:val="decimal"/>
+      <w:lvlText w:val="%1."/>
       <w:lvlJc w:val="left"/>
       <w:pPr>
         <w:tabs>
@@ -10319,14 +10687,11 @@
         </w:tabs>
         <w:ind w:left="720" w:hanging="360"/>
       </w:pPr>
-      <w:rPr>
-        <w:rFonts w:ascii="Symbol" w:hAnsi="Symbol" w:hint="default"/>
-      </w:rPr>
     </w:lvl>
     <w:lvl w:ilvl="1">
       <w:start w:val="1"/>
-      <w:numFmt w:val="bullet"/>
-      <w:lvlText w:val=""/>
+      <w:numFmt w:val="decimal"/>
+      <w:lvlText w:val="%2."/>
       <w:lvlJc w:val="left"/>
       <w:pPr>
         <w:tabs>
@@ -10334,14 +10699,11 @@
         </w:tabs>
         <w:ind w:left="1440" w:hanging="360"/>
       </w:pPr>
-      <w:rPr>
-        <w:rFonts w:ascii="Symbol" w:hAnsi="Symbol" w:hint="default"/>
-      </w:rPr>
     </w:lvl>
     <w:lvl w:ilvl="2">
       <w:start w:val="1"/>
-      <w:numFmt w:val="bullet"/>
-      <w:lvlText w:val=""/>
+      <w:numFmt w:val="decimal"/>
+      <w:lvlText w:val="%3."/>
       <w:lvlJc w:val="left"/>
       <w:pPr>
         <w:tabs>
@@ -10349,14 +10711,11 @@
         </w:tabs>
         <w:ind w:left="2160" w:hanging="360"/>
       </w:pPr>
-      <w:rPr>
-        <w:rFonts w:ascii="Symbol" w:hAnsi="Symbol" w:hint="default"/>
-      </w:rPr>
     </w:lvl>
     <w:lvl w:ilvl="3">
       <w:start w:val="1"/>
-      <w:numFmt w:val="bullet"/>
-      <w:lvlText w:val=""/>
+      <w:numFmt w:val="decimal"/>
+      <w:lvlText w:val="%4."/>
       <w:lvlJc w:val="left"/>
       <w:pPr>
         <w:tabs>
@@ -10364,14 +10723,11 @@
         </w:tabs>
         <w:ind w:left="2880" w:hanging="360"/>
       </w:pPr>
-      <w:rPr>
-        <w:rFonts w:ascii="Symbol" w:hAnsi="Symbol" w:hint="default"/>
-      </w:rPr>
     </w:lvl>
     <w:lvl w:ilvl="4">
       <w:start w:val="1"/>
-      <w:numFmt w:val="bullet"/>
-      <w:lvlText w:val=""/>
+      <w:numFmt w:val="decimal"/>
+      <w:lvlText w:val="%5."/>
       <w:lvlJc w:val="left"/>
       <w:pPr>
         <w:tabs>
@@ -10379,14 +10735,11 @@
         </w:tabs>
         <w:ind w:left="3600" w:hanging="360"/>
       </w:pPr>
-      <w:rPr>
-        <w:rFonts w:ascii="Symbol" w:hAnsi="Symbol" w:hint="default"/>
-      </w:rPr>
     </w:lvl>
     <w:lvl w:ilvl="5">
       <w:start w:val="1"/>
-      <w:numFmt w:val="bullet"/>
-      <w:lvlText w:val=""/>
+      <w:numFmt w:val="decimal"/>
+      <w:lvlText w:val="%6."/>
       <w:lvlJc w:val="left"/>
       <w:pPr>
         <w:tabs>
@@ -10394,14 +10747,11 @@
         </w:tabs>
         <w:ind w:left="4320" w:hanging="360"/>
       </w:pPr>
-      <w:rPr>
-        <w:rFonts w:ascii="Symbol" w:hAnsi="Symbol" w:hint="default"/>
-      </w:rPr>
     </w:lvl>
     <w:lvl w:ilvl="6">
       <w:start w:val="1"/>
-      <w:numFmt w:val="bullet"/>
-      <w:lvlText w:val=""/>
+      <w:numFmt w:val="decimal"/>
+      <w:lvlText w:val="%7."/>
       <w:lvlJc w:val="left"/>
       <w:pPr>
         <w:tabs>
@@ -10409,14 +10759,11 @@
         </w:tabs>
         <w:ind w:left="5040" w:hanging="360"/>
       </w:pPr>
-      <w:rPr>
-        <w:rFonts w:ascii="Symbol" w:hAnsi="Symbol" w:hint="default"/>
-      </w:rPr>
     </w:lvl>
     <w:lvl w:ilvl="7">
       <w:start w:val="1"/>
-      <w:numFmt w:val="bullet"/>
-      <w:lvlText w:val=""/>
+      <w:numFmt w:val="decimal"/>
+      <w:lvlText w:val="%8."/>
       <w:lvlJc w:val="left"/>
       <w:pPr>
         <w:tabs>
@@ -10424,9 +10771,6 @@
         </w:tabs>
         <w:ind w:left="5760" w:hanging="360"/>
       </w:pPr>
-      <w:rPr>
-        <w:rFonts w:ascii="Symbol" w:hAnsi="Symbol" w:hint="default"/>
-      </w:rPr>
     </w:lvl>
   </w:abstractNum>
   <w:abstractNum w:abstractNumId="29">
@@ -10552,6 +10896,128 @@
     </w:lvl>
   </w:abstractNum>
   <w:abstractNum w:abstractNumId="30">
+    <w:lvl w:ilvl="0">
+      <w:start w:val="1"/>
+      <w:numFmt w:val="bullet"/>
+      <w:lvlText w:val=""/>
+      <w:lvlJc w:val="left"/>
+      <w:pPr>
+        <w:tabs>
+          <w:tab w:val="num" w:pos="720"/>
+        </w:tabs>
+        <w:ind w:left="720" w:hanging="360"/>
+      </w:pPr>
+      <w:rPr>
+        <w:rFonts w:ascii="Symbol" w:hAnsi="Symbol" w:hint="default"/>
+      </w:rPr>
+    </w:lvl>
+    <w:lvl w:ilvl="1">
+      <w:start w:val="1"/>
+      <w:numFmt w:val="bullet"/>
+      <w:lvlText w:val=""/>
+      <w:lvlJc w:val="left"/>
+      <w:pPr>
+        <w:tabs>
+          <w:tab w:val="num" w:pos="1440"/>
+        </w:tabs>
+        <w:ind w:left="1440" w:hanging="360"/>
+      </w:pPr>
+      <w:rPr>
+        <w:rFonts w:ascii="Symbol" w:hAnsi="Symbol" w:hint="default"/>
+      </w:rPr>
+    </w:lvl>
+    <w:lvl w:ilvl="2">
+      <w:start w:val="1"/>
+      <w:numFmt w:val="bullet"/>
+      <w:lvlText w:val=""/>
+      <w:lvlJc w:val="left"/>
+      <w:pPr>
+        <w:tabs>
+          <w:tab w:val="num" w:pos="2160"/>
+        </w:tabs>
+        <w:ind w:left="2160" w:hanging="360"/>
+      </w:pPr>
+      <w:rPr>
+        <w:rFonts w:ascii="Symbol" w:hAnsi="Symbol" w:hint="default"/>
+      </w:rPr>
+    </w:lvl>
+    <w:lvl w:ilvl="3">
+      <w:start w:val="1"/>
+      <w:numFmt w:val="bullet"/>
+      <w:lvlText w:val=""/>
+      <w:lvlJc w:val="left"/>
+      <w:pPr>
+        <w:tabs>
+          <w:tab w:val="num" w:pos="2880"/>
+        </w:tabs>
+        <w:ind w:left="2880" w:hanging="360"/>
+      </w:pPr>
+      <w:rPr>
+        <w:rFonts w:ascii="Symbol" w:hAnsi="Symbol" w:hint="default"/>
+      </w:rPr>
+    </w:lvl>
+    <w:lvl w:ilvl="4">
+      <w:start w:val="1"/>
+      <w:numFmt w:val="bullet"/>
+      <w:lvlText w:val=""/>
+      <w:lvlJc w:val="left"/>
+      <w:pPr>
+        <w:tabs>
+          <w:tab w:val="num" w:pos="3600"/>
+        </w:tabs>
+        <w:ind w:left="3600" w:hanging="360"/>
+      </w:pPr>
+      <w:rPr>
+        <w:rFonts w:ascii="Symbol" w:hAnsi="Symbol" w:hint="default"/>
+      </w:rPr>
+    </w:lvl>
+    <w:lvl w:ilvl="5">
+      <w:start w:val="1"/>
+      <w:numFmt w:val="bullet"/>
+      <w:lvlText w:val=""/>
+      <w:lvlJc w:val="left"/>
+      <w:pPr>
+        <w:tabs>
+          <w:tab w:val="num" w:pos="4320"/>
+        </w:tabs>
+        <w:ind w:left="4320" w:hanging="360"/>
+      </w:pPr>
+      <w:rPr>
+        <w:rFonts w:ascii="Symbol" w:hAnsi="Symbol" w:hint="default"/>
+      </w:rPr>
+    </w:lvl>
+    <w:lvl w:ilvl="6">
+      <w:start w:val="1"/>
+      <w:numFmt w:val="bullet"/>
+      <w:lvlText w:val=""/>
+      <w:lvlJc w:val="left"/>
+      <w:pPr>
+        <w:tabs>
+          <w:tab w:val="num" w:pos="5040"/>
+        </w:tabs>
+        <w:ind w:left="5040" w:hanging="360"/>
+      </w:pPr>
+      <w:rPr>
+        <w:rFonts w:ascii="Symbol" w:hAnsi="Symbol" w:hint="default"/>
+      </w:rPr>
+    </w:lvl>
+    <w:lvl w:ilvl="7">
+      <w:start w:val="1"/>
+      <w:numFmt w:val="bullet"/>
+      <w:lvlText w:val=""/>
+      <w:lvlJc w:val="left"/>
+      <w:pPr>
+        <w:tabs>
+          <w:tab w:val="num" w:pos="5760"/>
+        </w:tabs>
+        <w:ind w:left="5760" w:hanging="360"/>
+      </w:pPr>
+      <w:rPr>
+        <w:rFonts w:ascii="Symbol" w:hAnsi="Symbol" w:hint="default"/>
+      </w:rPr>
+    </w:lvl>
+  </w:abstractNum>
+  <w:abstractNum w:abstractNumId="31">
     <w:lvl w:ilvl="0">
       <w:start w:val="1"/>
       <w:numFmt w:val="bullet"/>
@@ -10762,6 +11228,9 @@
   </w:num>
   <w:num w:numId="30">
     <w:abstractNumId w:val="30"/>
+  </w:num>
+  <w:num w:numId="31">
+    <w:abstractNumId w:val="31"/>
   </w:num>
 </w:numbering>
 </file>

</xml_diff>

<commit_message>
Valet: selettori province/partner a tendina+aggiungi con chip rimovibili; team leader con lista partner esclusi (nuovo campo + migrazione)
Co-Authored-By: Claude Opus 4.8 <noreply@anthropic.com>
</commit_message>
<xml_diff>
--- a/deluxy-platform-next/docs/COME-FUNZIONA-APP-DELUXY.docx
+++ b/deluxy-platform-next/docs/COME-FUNZIONA-APP-DELUXY.docx
@@ -169,6 +169,84 @@
           <w:b/>
         </w:rPr>
         <w:t xml:space="preserve">Changelog</w:t>
+      </w:r>
+      <w:r>
+        <w:rPr>
+          <w:b/>
+        </w:rPr>
+        <w:t xml:space="preserve">16/07/2026 (4) — Form </w:t>
+      </w:r>
+      <w:r>
+        <w:rPr>
+          <w:b/>
+        </w:rPr>
+        <w:t xml:space="preserve">Valet</w:t>
+      </w:r>
+      <w:r>
+        <w:rPr>
+          <w:b/>
+        </w:rPr>
+        <w:t xml:space="preserve">: province di competenza e sezione </w:t>
+      </w:r>
+      <w:r>
+        <w:rPr>
+          <w:b/>
+        </w:rPr>
+        <w:t xml:space="preserve">Team leader</w:t>
+      </w:r>
+      <w:r>
+        <w:rPr>
+          <w:b/>
+        </w:rPr>
+        <w:t xml:space="preserve"> ora usano un </w:t>
+      </w:r>
+      <w:r>
+        <w:rPr>
+          <w:b/>
+        </w:rPr>
+        <w:t xml:space="preserve">menu a tendina "aggiungi"</w:t>
+      </w:r>
+      <w:r>
+        <w:rPr>
+          <w:b/>
+        </w:rPr>
+        <w:t xml:space="preserve"> (fra tutte le province/partner) con </w:t>
+      </w:r>
+      <w:r>
+        <w:rPr>
+          <w:b/>
+        </w:rPr>
+        <w:t xml:space="preserve">chip rimovibili</w:t>
+      </w:r>
+      <w:r>
+        <w:rPr>
+          <w:b/>
+        </w:rPr>
+        <w:t xml:space="preserve"> invece della griglia di chip; aggiunta la lista </w:t>
+      </w:r>
+      <w:r>
+        <w:rPr>
+          <w:b/>
+        </w:rPr>
+        <w:t xml:space="preserve">Partner esclusi</w:t>
+      </w:r>
+      <w:r>
+        <w:rPr>
+          <w:b/>
+        </w:rPr>
+        <w:t xml:space="preserve"> dallo scope del team leader (nuovo campo </w:t>
+      </w:r>
+      <w:r>
+        <w:rPr>
+          <w:b/>
+        </w:rPr>
+        <w:t xml:space="preserve">teamLeaderExcludedPartners</w:t>
+      </w:r>
+      <w:r>
+        <w:rPr>
+          <w:b/>
+        </w:rPr>
+        <w:t xml:space="preserve">, con migrazione). Un partner non può essere insieme associato ed escluso.</w:t>
       </w:r>
       <w:r>
         <w:rPr>
@@ -3914,17 +3992,55 @@
       </w:r>
       <w:r>
         <w:rPr/>
-        <w:t xml:space="preserve"> in cui il team leader può vedere/assegnare consegne in autonomia e i </w:t>
-      </w:r>
-      <w:r>
-        <w:rPr>
-          <w:b/>
-        </w:rPr>
-        <w:t xml:space="preserve">PARTNERS</w:t>
-      </w:r>
-      <w:r>
-        <w:rPr/>
-        <w:t xml:space="preserve"> associati (es. SWISS FOOD, ECI).</w:t>
+        <w:t xml:space="preserve"> in cui il team leader può vedere/assegnare consegne in autonomia, i </w:t>
+      </w:r>
+      <w:r>
+        <w:rPr>
+          <w:b/>
+        </w:rPr>
+        <w:t xml:space="preserve">PARTNERS associati</w:t>
+      </w:r>
+      <w:r>
+        <w:rPr/>
+        <w:t xml:space="preserve"> e — </w:t>
+      </w:r>
+      <w:r>
+        <w:rPr>
+          <w:b/>
+        </w:rPr>
+        <w:t xml:space="preserve">[NUOVO]</w:t>
+      </w:r>
+      <w:r>
+        <w:rPr/>
+        <w:t xml:space="preserve"> — i </w:t>
+      </w:r>
+      <w:r>
+        <w:rPr>
+          <w:b/>
+        </w:rPr>
+        <w:t xml:space="preserve">PARTNER ESCLUSI</w:t>
+      </w:r>
+      <w:r>
+        <w:rPr/>
+        <w:t xml:space="preserve"> dal suo scope (</w:t>
+      </w:r>
+      <w:r>
+        <w:rPr/>
+        <w:t xml:space="preserve">teamLeaderExcludedPartners</w:t>
+      </w:r>
+      <w:r>
+        <w:rPr/>
+        <w:t xml:space="preserve">): il team leader gestisce i partner delle sue province </w:t>
+      </w:r>
+      <w:r>
+        <w:rPr>
+          <w:b/>
+        </w:rPr>
+        <w:t xml:space="preserve">tranne</w:t>
+      </w:r>
+      <w:r>
+        <w:rPr/>
+        <w:t xml:space="preserve"> quelli esclusi. Un partner non può essere insieme associato ed escluso.</w:t>
       </w:r>
     </w:p>
     <w:p>
@@ -3944,6 +4060,61 @@
       <w:r>
         <w:rPr/>
         <w:t xml:space="preserve">: province in cui il valet opera (distinte da quelle del team leader).</w:t>
+      </w:r>
+    </w:p>
+    <w:p>
+      <w:pPr>
+        <w:numPr>
+          <w:ilvl w:val="0"/>
+          <w:numId w:val="12"/>
+        </w:numPr>
+        <w:spacing w:lineRule="auto"/>
+      </w:pPr>
+      <w:r>
+        <w:rPr>
+          <w:b/>
+        </w:rPr>
+        <w:t xml:space="preserve">Selezione province/partner (nuovo ambiente)</w:t>
+      </w:r>
+      <w:r>
+        <w:rPr/>
+        <w:t xml:space="preserve">: province di competenza, province e partner del team leader (inclusi/esclusi) si scelgono da un </w:t>
+      </w:r>
+      <w:r>
+        <w:rPr>
+          <w:b/>
+        </w:rPr>
+        <w:t xml:space="preserve">menu a tendina "aggiungi"</w:t>
+      </w:r>
+      <w:r>
+        <w:rPr/>
+        <w:t xml:space="preserve"> tra </w:t>
+      </w:r>
+      <w:r>
+        <w:rPr>
+          <w:b/>
+        </w:rPr>
+        <w:t xml:space="preserve">tutte</w:t>
+      </w:r>
+      <w:r>
+        <w:rPr/>
+        <w:t xml:space="preserve"> le voci disponibili; le voci scelte restano come </w:t>
+      </w:r>
+      <w:r>
+        <w:rPr>
+          <w:b/>
+        </w:rPr>
+        <w:t xml:space="preserve">chip rimovibili</w:t>
+      </w:r>
+      <w:r>
+        <w:rPr/>
+        <w:t xml:space="preserve"> (scala con 108 province / 243 partner). </w:t>
+      </w:r>
+      <w:r>
+        <w:rPr>
+          <w:b/>
+        </w:rPr>
+        <w:t xml:space="preserve">[NUOVO]</w:t>
       </w:r>
     </w:p>
     <w:p>

</xml_diff>

<commit_message>
Multilingua IT/EN (ngx-translate) con selettore a bandierine + flag 'salva cliente' nel form consegna
- ngx-translate: lingua EN oltre a IT, switcher SVG in alto a destra (anche login), scelta persistita in localStorage; tradotti shell/menu + login (resto incrementale).
- Form consegna: flag 'Salva come nuovo cliente in Clienti' (crea il cliente e poi la consegna). Verificato end-to-end.
- Doc COME-FUNZIONA + Word + HANDOFF aggiornati.

Co-Authored-By: Claude Opus 4.8 <noreply@anthropic.com>
</commit_message>
<xml_diff>
--- a/deluxy-platform-next/docs/COME-FUNZIONA-APP-DELUXY.docx
+++ b/deluxy-platform-next/docs/COME-FUNZIONA-APP-DELUXY.docx
@@ -174,6 +174,120 @@
         <w:rPr>
           <w:b/>
         </w:rPr>
+        <w:t xml:space="preserve">16/07/2026 (5) — </w:t>
+      </w:r>
+      <w:r>
+        <w:rPr>
+          <w:b/>
+        </w:rPr>
+        <w:t xml:space="preserve">Multilingua</w:t>
+      </w:r>
+      <w:r>
+        <w:rPr>
+          <w:b/>
+        </w:rPr>
+        <w:t xml:space="preserve">: la piattaforma è ora multilingua (ngx-translate). Aggiunta la lingua </w:t>
+      </w:r>
+      <w:r>
+        <w:rPr>
+          <w:b/>
+        </w:rPr>
+        <w:t xml:space="preserve">Inglese</w:t>
+      </w:r>
+      <w:r>
+        <w:rPr>
+          <w:b/>
+        </w:rPr>
+        <w:t xml:space="preserve"> oltre all'Italiano; </w:t>
+      </w:r>
+      <w:r>
+        <w:rPr>
+          <w:b/>
+        </w:rPr>
+        <w:t xml:space="preserve">selettore lingua con bandierine</w:t>
+      </w:r>
+      <w:r>
+        <w:rPr>
+          <w:b/>
+        </w:rPr>
+        <w:t xml:space="preserve"> (SVG) fisso </w:t>
+      </w:r>
+      <w:r>
+        <w:rPr>
+          <w:b/>
+        </w:rPr>
+        <w:t xml:space="preserve">in alto a destra</w:t>
+      </w:r>
+      <w:r>
+        <w:rPr>
+          <w:b/>
+        </w:rPr>
+        <w:t xml:space="preserve">, disponibile anche nella pagina di login; la scelta è persistita (</w:t>
+      </w:r>
+      <w:r>
+        <w:rPr>
+          <w:b/>
+        </w:rPr>
+        <w:t xml:space="preserve">localStorage</w:t>
+      </w:r>
+      <w:r>
+        <w:rPr>
+          <w:b/>
+        </w:rPr>
+        <w:t xml:space="preserve">, default Italiano). Tradotti al momento shell/menu e login; le altre schermate si traducono in modo incrementale (chiavi in </w:t>
+      </w:r>
+      <w:r>
+        <w:rPr>
+          <w:b/>
+        </w:rPr>
+        <w:t xml:space="preserve">web/public/i18n/it.json</w:t>
+      </w:r>
+      <w:r>
+        <w:rPr>
+          <w:b/>
+        </w:rPr>
+        <w:t xml:space="preserve"> + </w:t>
+      </w:r>
+      <w:r>
+        <w:rPr>
+          <w:b/>
+        </w:rPr>
+        <w:t xml:space="preserve">en.json</w:t>
+      </w:r>
+      <w:r>
+        <w:rPr>
+          <w:b/>
+        </w:rPr>
+        <w:t xml:space="preserve">). Inoltre nel </w:t>
+      </w:r>
+      <w:r>
+        <w:rPr>
+          <w:b/>
+        </w:rPr>
+        <w:t xml:space="preserve">form consegna</w:t>
+      </w:r>
+      <w:r>
+        <w:rPr>
+          <w:b/>
+        </w:rPr>
+        <w:t xml:space="preserve"> nuovo flag </w:t>
+      </w:r>
+      <w:r>
+        <w:rPr>
+          <w:b/>
+        </w:rPr>
+        <w:t xml:space="preserve">"Salva come nuovo cliente in Clienti"</w:t>
+      </w:r>
+      <w:r>
+        <w:rPr>
+          <w:b/>
+        </w:rPr>
+        <w:t xml:space="preserve">: alla creazione, se il destinatario è nuovo, viene prima salvato in Clienti e poi creata la consegna collegata.</w:t>
+      </w:r>
+      <w:r>
+        <w:rPr>
+          <w:b/>
+        </w:rPr>
         <w:t xml:space="preserve">16/07/2026 (4) — Form </w:t>
       </w:r>
       <w:r>
@@ -1168,6 +1282,71 @@
       <w:r>
         <w:rPr/>
         <w:t xml:space="preserve">.</w:t>
+      </w:r>
+    </w:p>
+    <w:p>
+      <w:pPr>
+        <w:numPr>
+          <w:ilvl w:val="0"/>
+          <w:numId w:val="1"/>
+        </w:numPr>
+        <w:spacing w:lineRule="auto"/>
+      </w:pPr>
+      <w:r>
+        <w:rPr>
+          <w:b/>
+        </w:rPr>
+        <w:t xml:space="preserve">[NUOVO — nuovo ambiente] Multilingua</w:t>
+      </w:r>
+      <w:r>
+        <w:rPr/>
+        <w:t xml:space="preserve">: il nuovo frontend è internazionalizzato con </w:t>
+      </w:r>
+      <w:r>
+        <w:rPr>
+          <w:b/>
+        </w:rPr>
+        <w:t xml:space="preserve">ngx-translate</w:t>
+      </w:r>
+      <w:r>
+        <w:rPr/>
+        <w:t xml:space="preserve">. Lingue attive: </w:t>
+      </w:r>
+      <w:r>
+        <w:rPr>
+          <w:b/>
+        </w:rPr>
+        <w:t xml:space="preserve">Italiano</w:t>
+      </w:r>
+      <w:r>
+        <w:rPr/>
+        <w:t xml:space="preserve"> (default) e </w:t>
+      </w:r>
+      <w:r>
+        <w:rPr>
+          <w:b/>
+        </w:rPr>
+        <w:t xml:space="preserve">Inglese</w:t>
+      </w:r>
+      <w:r>
+        <w:rPr/>
+        <w:t xml:space="preserve">. Selettore a bandierine in alto a destra, scelta persistita in </w:t>
+      </w:r>
+      <w:r>
+        <w:rPr/>
+        <w:t xml:space="preserve">localStorage</w:t>
+      </w:r>
+      <w:r>
+        <w:rPr/>
+        <w:t xml:space="preserve">. File di traduzione: </w:t>
+      </w:r>
+      <w:r>
+        <w:rPr/>
+        <w:t xml:space="preserve">web/public/i18n/{it,en}.json</w:t>
+      </w:r>
+      <w:r>
+        <w:rPr/>
+        <w:t xml:space="preserve">. Le stringhe si migrano alle chiavi in modo incrementale.</w:t>
       </w:r>
     </w:p>
     <w:p>

</xml_diff>

<commit_message>
Servizio: fascia flessibile consentita dal servizio + fasce di consegna generate
- ServiceType.allowFlexibleTime (migrazione service_allow_flexible_time, gia' preparata il 15/07) esposto su GET/POST /service-types
- Form Servizio: toggle "Consenti fascia oraria flessibile" nel Setup prenotazione
- Form Consegna: flag flessibile visibile solo se il servizio lo consente; fascia automatica = slotHours del servizio (default 1 ora); con min+max+fascia compilati le fasce sono proposte come elenco generato (es. 08-10 ... 18-20); ritiro invariato a 1 ora
- Seed: setup prenotazione demo su CONSEGNA_FISSA applicato anche a DB gia' popolati
- Manuale + Word rigenerato + handoff aggiornati

Co-Authored-By: Claude Fable 5 <noreply@anthropic.com>
</commit_message>
<xml_diff>
--- a/deluxy-platform-next/docs/COME-FUNZIONA-APP-DELUXY.docx
+++ b/deluxy-platform-next/docs/COME-FUNZIONA-APP-DELUXY.docx
@@ -24,7 +24,7 @@
           <w:color w:val="86868b"/>
           <w:sz w:val="18"/>
         </w:rPr>
-        <w:t xml:space="preserve">Word generato automaticamente dal manuale Markdown — 15 luglio 2026</w:t>
+        <w:t xml:space="preserve">Word generato automaticamente dal manuale Markdown — 17 luglio 2026</w:t>
       </w:r>
     </w:p>
     <w:p>
@@ -169,6 +169,96 @@
           <w:b/>
         </w:rPr>
         <w:t xml:space="preserve">Changelog</w:t>
+      </w:r>
+      <w:r>
+        <w:rPr>
+          <w:b/>
+        </w:rPr>
+        <w:t xml:space="preserve">17/07/2026 — </w:t>
+      </w:r>
+      <w:r>
+        <w:rPr>
+          <w:b/>
+        </w:rPr>
+        <w:t xml:space="preserve">Setup servizio → fasce di consegna</w:t>
+      </w:r>
+      <w:r>
+        <w:rPr>
+          <w:b/>
+        </w:rPr>
+        <w:t xml:space="preserve">: nuovo flag </w:t>
+      </w:r>
+      <w:r>
+        <w:rPr>
+          <w:b/>
+        </w:rPr>
+        <w:t xml:space="preserve">Consenti fascia oraria flessibile</w:t>
+      </w:r>
+      <w:r>
+        <w:rPr>
+          <w:b/>
+        </w:rPr>
+        <w:t xml:space="preserve"> sul servizio (</w:t>
+      </w:r>
+      <w:r>
+        <w:rPr>
+          <w:b/>
+        </w:rPr>
+        <w:t xml:space="preserve">ServiceType.allowFlexibleTime</w:t>
+      </w:r>
+      <w:r>
+        <w:rPr>
+          <w:b/>
+        </w:rPr>
+        <w:t xml:space="preserve">). Nel form consegna il flag "Fascia oraria consegna flessibile" appare </w:t>
+      </w:r>
+      <w:r>
+        <w:rPr>
+          <w:b/>
+        </w:rPr>
+        <w:t xml:space="preserve">solo se il servizio lo consente</w:t>
+      </w:r>
+      <w:r>
+        <w:rPr>
+          <w:b/>
+        </w:rPr>
+        <w:t xml:space="preserve">; la fascia automatica non è più fissa a 1 ora ma usa la </w:t>
+      </w:r>
+      <w:r>
+        <w:rPr>
+          <w:b/>
+        </w:rPr>
+        <w:t xml:space="preserve">Fascia oraria del servizio</w:t>
+      </w:r>
+      <w:r>
+        <w:rPr>
+          <w:b/>
+        </w:rPr>
+        <w:t xml:space="preserve"> (</w:t>
+      </w:r>
+      <w:r>
+        <w:rPr>
+          <w:b/>
+        </w:rPr>
+        <w:t xml:space="preserve">slotHours</w:t>
+      </w:r>
+      <w:r>
+        <w:rPr>
+          <w:b/>
+        </w:rPr>
+        <w:t xml:space="preserve">, default 1 ora); se il servizio ha ora minima+massima+fascia compilate, le fasce di consegna sono </w:t>
+      </w:r>
+      <w:r>
+        <w:rPr>
+          <w:b/>
+        </w:rPr>
+        <w:t xml:space="preserve">proposte come elenco generato</w:t>
+      </w:r>
+      <w:r>
+        <w:rPr>
+          <w:b/>
+        </w:rPr>
+        <w:t xml:space="preserve"> (es. 08–10, 10–12… fino alle 20). Il ritiro resta a fascia di 1 ora.</w:t>
       </w:r>
       <w:r>
         <w:rPr>
@@ -5404,7 +5494,7 @@
       </w:r>
       <w:r>
         <w:rPr/>
-        <w:t xml:space="preserve"> (1 / 2 / 4 ore, da rendere variabile), </w:t>
+        <w:t xml:space="preserve"> (1 / 2 / 4 ore), </w:t>
       </w:r>
       <w:r>
         <w:rPr>
@@ -5414,7 +5504,7 @@
       </w:r>
       <w:r>
         <w:rPr/>
-        <w:t xml:space="preserve"> (da quale ora si può richiedere il servizio per la data scelta), </w:t>
+        <w:t xml:space="preserve">, </w:t>
       </w:r>
       <w:r>
         <w:rPr>
@@ -5424,7 +5514,17 @@
       </w:r>
       <w:r>
         <w:rPr/>
-        <w:t xml:space="preserve"> (dopo quella ora non è più possibile richiederlo per la data scelta). Campi </w:t>
+        <w:t xml:space="preserve">, </w:t>
+      </w:r>
+      <w:r>
+        <w:rPr>
+          <w:b/>
+        </w:rPr>
+        <w:t xml:space="preserve">Consenti fascia oraria flessibile (dalle–alle)</w:t>
+      </w:r>
+      <w:r>
+        <w:rPr/>
+        <w:t xml:space="preserve">. Campi </w:t>
       </w:r>
       <w:r>
         <w:rPr/>
@@ -5456,6 +5556,14 @@
       </w:r>
       <w:r>
         <w:rPr/>
+        <w:t xml:space="preserve">, </w:t>
+      </w:r>
+      <w:r>
+        <w:rPr/>
+        <w:t xml:space="preserve">allowFlexibleTime</w:t>
+      </w:r>
+      <w:r>
+        <w:rPr/>
         <w:t xml:space="preserve"> su </w:t>
       </w:r>
       <w:r>
@@ -5465,6 +5573,63 @@
       <w:r>
         <w:rPr/>
         <w:t xml:space="preserve">. </w:t>
+      </w:r>
+      <w:r>
+        <w:rPr>
+          <w:b/>
+        </w:rPr>
+        <w:t xml:space="preserve">[NUOVO]</w:t>
+      </w:r>
+    </w:p>
+    <w:p>
+      <w:pPr>
+        <w:spacing w:lineRule="auto"/>
+      </w:pPr>
+      <w:r>
+        <w:rPr>
+          <w:b/>
+        </w:rPr>
+        <w:t xml:space="preserve">Effetto sul form Nuova consegna</w:t>
+      </w:r>
+      <w:r>
+        <w:rPr/>
+        <w:t xml:space="preserve"> (nuovo ambiente): la fascia di consegna automatica dura </w:t>
+      </w:r>
+      <w:r>
+        <w:rPr/>
+        <w:t xml:space="preserve">slotHours</w:t>
+      </w:r>
+      <w:r>
+        <w:rPr/>
+        <w:t xml:space="preserve"> ore (default 1); se ora minima+massima+fascia sono compilate, le fasce vengono </w:t>
+      </w:r>
+      <w:r>
+        <w:rPr>
+          <w:b/>
+        </w:rPr>
+        <w:t xml:space="preserve">proposte come elenco generato</w:t>
+      </w:r>
+      <w:r>
+        <w:rPr/>
+        <w:t xml:space="preserve"> da min a max a passi di </w:t>
+      </w:r>
+      <w:r>
+        <w:rPr/>
+        <w:t xml:space="preserve">slotHours</w:t>
+      </w:r>
+      <w:r>
+        <w:rPr/>
+        <w:t xml:space="preserve"> (es. 08:00–10:00 … 18:00–20:00); il flag "Fascia oraria consegna flessibile" (dalle–alle libero) appare </w:t>
+      </w:r>
+      <w:r>
+        <w:rPr>
+          <w:b/>
+        </w:rPr>
+        <w:t xml:space="preserve">solo se il servizio lo consente</w:t>
+      </w:r>
+      <w:r>
+        <w:rPr/>
+        <w:t xml:space="preserve">. Il ritiro resta a fascia fissa di 1 ora. </w:t>
       </w:r>
       <w:r>
         <w:rPr>

</xml_diff>

<commit_message>
Doc: rimosso marker di conflitto residuo dal manuale + Word rigenerato
</commit_message>
<xml_diff>
--- a/deluxy-platform-next/docs/COME-FUNZIONA-APP-DELUXY.docx
+++ b/deluxy-platform-next/docs/COME-FUNZIONA-APP-DELUXY.docx
@@ -2263,12 +2263,6 @@
           <w:b/>
         </w:rPr>
         <w:t xml:space="preserve"> resta sempre con orario flessibile opzionale e fascia automatica di 1 ora.</w:t>
-      </w:r>
-      <w:r>
-        <w:rPr>
-          <w:b/>
-        </w:rPr>
-        <w:t xml:space="preserve">origin/platform-delivery-slots</w:t>
       </w:r>
       <w:r>
         <w:rPr>

</xml_diff>

<commit_message>
Impostazioni admin (chiavi API nel DB) + geocodifica Google + ora ritiro a tendina
- Nuova sezione Configurazione > Impostazioni (/settings, solo ADMIN): chiavi API salvate solo nel database (AppSetting, migrazione app_settings; GET/PUT /settings). Prima chiave: Google Maps, campo mascherato + tester "Prova geocodifica"
- GET /settings/geocode?address= : provincia via Google Geocoding (administrative_area_level_2) con la chiave salvata; senza chiave risponde provinceCode null
- Form consegna: geocodifica con debounce 700ms dopo la digitazione dell'indirizzo; se trova la provincia vince sul riconoscimento testuale (che resta il fallback)
- Ora ritiro: tendina di orari 00:00-23:30 a passi di 30 minuti (orari fuori griglia preservati in modifica)
- i18n IT/EN per Impostazioni e nuovi placeholder; icona "gear" in sidebar
- Manuale + Word + handoff aggiornati

Co-Authored-By: Claude Fable 5 <noreply@anthropic.com>
</commit_message>
<xml_diff>
--- a/deluxy-platform-next/docs/COME-FUNZIONA-APP-DELUXY.docx
+++ b/deluxy-platform-next/docs/COME-FUNZIONA-APP-DELUXY.docx
@@ -169,6 +169,144 @@
           <w:b/>
         </w:rPr>
         <w:t xml:space="preserve">Changelog</w:t>
+      </w:r>
+      <w:r>
+        <w:rPr>
+          <w:b/>
+        </w:rPr>
+        <w:t xml:space="preserve">17/07/2026 (6) — </w:t>
+      </w:r>
+      <w:r>
+        <w:rPr>
+          <w:b/>
+        </w:rPr>
+        <w:t xml:space="preserve">Nuova sezione Configurazione → Impostazioni (solo admin)</w:t>
+      </w:r>
+      <w:r>
+        <w:rPr>
+          <w:b/>
+        </w:rPr>
+        <w:t xml:space="preserve">: chiavi API dei servizi esterni salvate </w:t>
+      </w:r>
+      <w:r>
+        <w:rPr>
+          <w:b/>
+        </w:rPr>
+        <w:t xml:space="preserve">solo nel database</w:t>
+      </w:r>
+      <w:r>
+        <w:rPr>
+          <w:b/>
+        </w:rPr>
+        <w:t xml:space="preserve"> (</w:t>
+      </w:r>
+      <w:r>
+        <w:rPr>
+          <w:b/>
+        </w:rPr>
+        <w:t xml:space="preserve">AppSetting</w:t>
+      </w:r>
+      <w:r>
+        <w:rPr>
+          <w:b/>
+        </w:rPr>
+        <w:t xml:space="preserve">, migrazione </w:t>
+      </w:r>
+      <w:r>
+        <w:rPr>
+          <w:b/>
+        </w:rPr>
+        <w:t xml:space="preserve">app_settings</w:t>
+      </w:r>
+      <w:r>
+        <w:rPr>
+          <w:b/>
+        </w:rPr>
+        <w:t xml:space="preserve">; endpoint </w:t>
+      </w:r>
+      <w:r>
+        <w:rPr>
+          <w:b/>
+        </w:rPr>
+        <w:t xml:space="preserve">GET/PUT /settings</w:t>
+      </w:r>
+      <w:r>
+        <w:rPr>
+          <w:b/>
+        </w:rPr>
+        <w:t xml:space="preserve">, admin). Prima chiave: </w:t>
+      </w:r>
+      <w:r>
+        <w:rPr>
+          <w:b/>
+        </w:rPr>
+        <w:t xml:space="preserve">Google Maps</w:t>
+      </w:r>
+      <w:r>
+        <w:rPr>
+          <w:b/>
+        </w:rPr>
+        <w:t xml:space="preserve"> — usata da </w:t>
+      </w:r>
+      <w:r>
+        <w:rPr>
+          <w:b/>
+        </w:rPr>
+        <w:t xml:space="preserve">GET /settings/geocode</w:t>
+      </w:r>
+      <w:r>
+        <w:rPr>
+          <w:b/>
+        </w:rPr>
+        <w:t xml:space="preserve"> per geocodificare l'indirizzo della consegna e ricavarne la </w:t>
+      </w:r>
+      <w:r>
+        <w:rPr>
+          <w:b/>
+        </w:rPr>
+        <w:t xml:space="preserve">provincia</w:t>
+      </w:r>
+      <w:r>
+        <w:rPr>
+          <w:b/>
+        </w:rPr>
+        <w:t xml:space="preserve"> (come l'app reale); la pagina ha un tester ("Prova geocodifica"). Nel form consegna la geocodifica parte con debounce dopo la digitazione dell'indirizzo e, se trova la provincia, </w:t>
+      </w:r>
+      <w:r>
+        <w:rPr>
+          <w:b/>
+        </w:rPr>
+        <w:t xml:space="preserve">vince sul riconoscimento testuale</w:t>
+      </w:r>
+      <w:r>
+        <w:rPr>
+          <w:b/>
+        </w:rPr>
+        <w:t xml:space="preserve"> (che resta il fallback senza chiave). Inoltre </w:t>
+      </w:r>
+      <w:r>
+        <w:rPr>
+          <w:b/>
+        </w:rPr>
+        <w:t xml:space="preserve">Ora ritiro</w:t>
+      </w:r>
+      <w:r>
+        <w:rPr>
+          <w:b/>
+        </w:rPr>
+        <w:t xml:space="preserve"> è ora una </w:t>
+      </w:r>
+      <w:r>
+        <w:rPr>
+          <w:b/>
+        </w:rPr>
+        <w:t xml:space="preserve">tendina di orari</w:t>
+      </w:r>
+      <w:r>
+        <w:rPr>
+          <w:b/>
+        </w:rPr>
+        <w:t xml:space="preserve"> (00:00–23:30 a passi di 30 minuti) invece del campo orario libero.</w:t>
       </w:r>
       <w:r>
         <w:rPr>

</xml_diff>

<commit_message>
Stati modificabili in linea dalle liste (partner, valet, operatori)
- StatusSelectComponent riutilizzabile: la pillola di stato apre un menu al clic e cambia lo stato senza aprire Modifica (aggiornamento ottimistico + rollback)
- Partner: Pagamento (active/inactive/blocked) e Stato (attivo/disattivo); Valet e Operatori: attivo/disattivo
- Backend: aggiunto active ai DTO Create di Partner/Valet/Operazione (prima scartato dal ValidationPipe whitelist -> PUT/PATCH no-op); update parziale non tocca le relazioni
- Verificato E2E nel browser (partner) e via API (valet PUT, operatore PATCH; province valet intatte); manuale + Word + handoff aggiornati

Co-Authored-By: Claude Fable 5 <noreply@anthropic.com>
</commit_message>
<xml_diff>
--- a/deluxy-platform-next/docs/COME-FUNZIONA-APP-DELUXY.docx
+++ b/deluxy-platform-next/docs/COME-FUNZIONA-APP-DELUXY.docx
@@ -169,6 +169,96 @@
           <w:b/>
         </w:rPr>
         <w:t xml:space="preserve">Changelog</w:t>
+      </w:r>
+      <w:r>
+        <w:rPr>
+          <w:b/>
+        </w:rPr>
+        <w:t xml:space="preserve">17/07/2026 (8) — </w:t>
+      </w:r>
+      <w:r>
+        <w:rPr>
+          <w:b/>
+        </w:rPr>
+        <w:t xml:space="preserve">Stati modificabili in linea dalle liste</w:t>
+      </w:r>
+      <w:r>
+        <w:rPr>
+          <w:b/>
+        </w:rPr>
+        <w:t xml:space="preserve">: nelle liste </w:t>
+      </w:r>
+      <w:r>
+        <w:rPr>
+          <w:b/>
+        </w:rPr>
+        <w:t xml:space="preserve">Partner</w:t>
+      </w:r>
+      <w:r>
+        <w:rPr>
+          <w:b/>
+        </w:rPr>
+        <w:t xml:space="preserve"> (Pagamento + Stato), </w:t>
+      </w:r>
+      <w:r>
+        <w:rPr>
+          <w:b/>
+        </w:rPr>
+        <w:t xml:space="preserve">Valet</w:t>
+      </w:r>
+      <w:r>
+        <w:rPr>
+          <w:b/>
+        </w:rPr>
+        <w:t xml:space="preserve"> e </w:t>
+      </w:r>
+      <w:r>
+        <w:rPr>
+          <w:b/>
+        </w:rPr>
+        <w:t xml:space="preserve">Operatori</w:t>
+      </w:r>
+      <w:r>
+        <w:rPr>
+          <w:b/>
+        </w:rPr>
+        <w:t xml:space="preserve"> la pillola di stato è ora un menu a clic (componente </w:t>
+      </w:r>
+      <w:r>
+        <w:rPr>
+          <w:b/>
+        </w:rPr>
+        <w:t xml:space="preserve">StatusSelectComponent</w:t>
+      </w:r>
+      <w:r>
+        <w:rPr>
+          <w:b/>
+        </w:rPr>
+        <w:t xml:space="preserve">): si cambia lo stato senza aprire "Modifica" (aggiornamento ottimistico con rollback in caso di errore). Backend: aggiunto </w:t>
+      </w:r>
+      <w:r>
+        <w:rPr>
+          <w:b/>
+        </w:rPr>
+        <w:t xml:space="preserve">active</w:t>
+      </w:r>
+      <w:r>
+        <w:rPr>
+          <w:b/>
+        </w:rPr>
+        <w:t xml:space="preserve"> ai DTO di Partner/Valet/Operazione (prima veniva scartato dal ValidationPipe </w:t>
+      </w:r>
+      <w:r>
+        <w:rPr>
+          <w:b/>
+        </w:rPr>
+        <w:t xml:space="preserve">whitelist</w:t>
+      </w:r>
+      <w:r>
+        <w:rPr>
+          <w:b/>
+        </w:rPr>
+        <w:t xml:space="preserve">); l'update parziale non tocca le relazioni.</w:t>
       </w:r>
       <w:r>
         <w:rPr>

</xml_diff>

<commit_message>
Utenti: ricerca globale + rimosso "Nuovo utente"
- Aggiunta la casella di ricerca (ClientTable) su email, nome, ruolo, stato e anagrafica collegata
- Rimosso il pulsante e il form "Nuovo utente": gli utenti nascono con l'anagrafica (Partner/Valet/Operatore), non si creano dalla pagina Utenti
- Manuale + Word aggiornati

Co-Authored-By: Claude Fable 5 <noreply@anthropic.com>
</commit_message>
<xml_diff>
--- a/deluxy-platform-next/docs/COME-FUNZIONA-APP-DELUXY.docx
+++ b/deluxy-platform-next/docs/COME-FUNZIONA-APP-DELUXY.docx
@@ -169,6 +169,48 @@
           <w:b/>
         </w:rPr>
         <w:t xml:space="preserve">Changelog</w:t>
+      </w:r>
+      <w:r>
+        <w:rPr>
+          <w:b/>
+        </w:rPr>
+        <w:t xml:space="preserve">17/07/2026 (9) — Pagina </w:t>
+      </w:r>
+      <w:r>
+        <w:rPr>
+          <w:b/>
+        </w:rPr>
+        <w:t xml:space="preserve">Utenti</w:t>
+      </w:r>
+      <w:r>
+        <w:rPr>
+          <w:b/>
+        </w:rPr>
+        <w:t xml:space="preserve">: aggiunta la </w:t>
+      </w:r>
+      <w:r>
+        <w:rPr>
+          <w:b/>
+        </w:rPr>
+        <w:t xml:space="preserve">ricerca globale</w:t>
+      </w:r>
+      <w:r>
+        <w:rPr>
+          <w:b/>
+        </w:rPr>
+        <w:t xml:space="preserve"> (email, nome, ruolo, stato, anagrafica collegata) e </w:t>
+      </w:r>
+      <w:r>
+        <w:rPr>
+          <w:b/>
+        </w:rPr>
+        <w:t xml:space="preserve">rimosso il pulsante "Nuovo utente"</w:t>
+      </w:r>
+      <w:r>
+        <w:rPr>
+          <w:b/>
+        </w:rPr>
+        <w:t xml:space="preserve"> — gli utenti nascono con l'anagrafica (Partner/Valet/Operatore), non si creano da qui.</w:t>
       </w:r>
       <w:r>
         <w:rPr>

</xml_diff>

<commit_message>
Form consegna: autocomplete indirizzi Google Places
- Campo Indirizzo destinatario: menu a tendina dei suggerimenti Google (google.maps.places.Autocomplete, ristretto Italia); alla selezione compila l'indirizzo e ricava la provincia (filtra partner/valet). Evento riportato nella zona Angular
- Usa la chiave browser (GET /settings/public); serve anche l'API Places abilitata. Senza chiave: campo normale + geocodifica server. autocomplete="off" sopprime l'autofill di Chrome
- Helper condiviso core/google-maps.ts: script Google caricato una sola volta con libraries=places (mappa + autocomplete); rimosso il loader locale della mappa
- Stile globale .pac-container. Verificato il fallback senza chiave (nessun errore); manuale + Word + handoff aggiornati

Co-Authored-By: Claude Fable 5 <noreply@anthropic.com>
</commit_message>
<xml_diff>
--- a/deluxy-platform-next/docs/COME-FUNZIONA-APP-DELUXY.docx
+++ b/deluxy-platform-next/docs/COME-FUNZIONA-APP-DELUXY.docx
@@ -169,6 +169,72 @@
           <w:b/>
         </w:rPr>
         <w:t xml:space="preserve">Changelog</w:t>
+      </w:r>
+      <w:r>
+        <w:rPr>
+          <w:b/>
+        </w:rPr>
+        <w:t xml:space="preserve">17/07/2026 (11) — </w:t>
+      </w:r>
+      <w:r>
+        <w:rPr>
+          <w:b/>
+        </w:rPr>
+        <w:t xml:space="preserve">Autocompletamento indirizzi Google Places</w:t>
+      </w:r>
+      <w:r>
+        <w:rPr>
+          <w:b/>
+        </w:rPr>
+        <w:t xml:space="preserve"> nel form Consegna: sul campo </w:t>
+      </w:r>
+      <w:r>
+        <w:rPr>
+          <w:b/>
+        </w:rPr>
+        <w:t xml:space="preserve">Indirizzo destinatario</w:t>
+      </w:r>
+      <w:r>
+        <w:rPr>
+          <w:b/>
+        </w:rPr>
+        <w:t xml:space="preserve"> compare il menu a tendina dei suggerimenti Google (indirizzi in Italia); selezionandone uno l'indirizzo si compila e la </w:t>
+      </w:r>
+      <w:r>
+        <w:rPr>
+          <w:b/>
+        </w:rPr>
+        <w:t xml:space="preserve">provincia</w:t>
+      </w:r>
+      <w:r>
+        <w:rPr>
+          <w:b/>
+        </w:rPr>
+        <w:t xml:space="preserve"> viene ricavata dai dati Google (che filtra partner/valet). Usa la </w:t>
+      </w:r>
+      <w:r>
+        <w:rPr>
+          <w:b/>
+        </w:rPr>
+        <w:t xml:space="preserve">chiave browser</w:t>
+      </w:r>
+      <w:r>
+        <w:rPr>
+          <w:b/>
+        </w:rPr>
+        <w:t xml:space="preserve"> delle Impostazioni (serve anche l'API "Places" abilitata, oltre a "Maps JavaScript"); senza chiave il campo resta normale con la geocodifica server come prima. Soppresso anche l'autofill di Chrome sul campo. Lo script Google Maps ora si carica una sola volta (helper condiviso con la mappa, con libreria </w:t>
+      </w:r>
+      <w:r>
+        <w:rPr>
+          <w:b/>
+        </w:rPr>
+        <w:t xml:space="preserve">places</w:t>
+      </w:r>
+      <w:r>
+        <w:rPr>
+          <w:b/>
+        </w:rPr>
+        <w:t xml:space="preserve">).</w:t>
       </w:r>
       <w:r>
         <w:rPr>

</xml_diff>

<commit_message>
Partner: sezione Orari di apertura (settimanali)
- Form Partner: griglia settimanale lun->dom, ogni giorno con "Chiuso" e orario dalle-alle; pulsante "copia il lunedi su tutti"; prefill in modifica; invio openingHours nel payload (in edit sempre, anche vuoto)
- Scheda Partner: nuova sezione che mostra gli orari settimanali (giorni non impostati omessi)
- Usa il modello OpeningHour gia' presente (dayOfWeek DB 0=dom..6=sab, ordine visualizzato lun->dom); i18n IT/EN
- Verificato: round-trip API (Lun/Mar 09:00-19:30, Dom chiuso), dettaglio + form prefill nel browser. Manuale + Word + handoff aggiornati
- Nota: l'app reale ha anche la disponibilita' per data (/partner/availability/list); qui e' l'orario settimanale ricorrente, base naturale. Availability per data = passo successivo

Co-Authored-By: Claude Fable 5 <noreply@anthropic.com>
</commit_message>
<xml_diff>
--- a/deluxy-platform-next/docs/COME-FUNZIONA-APP-DELUXY.docx
+++ b/deluxy-platform-next/docs/COME-FUNZIONA-APP-DELUXY.docx
@@ -169,6 +169,132 @@
           <w:b/>
         </w:rPr>
         <w:t xml:space="preserve">Changelog</w:t>
+      </w:r>
+      <w:r>
+        <w:rPr>
+          <w:b/>
+        </w:rPr>
+        <w:t xml:space="preserve">17/07/2026 (12) — </w:t>
+      </w:r>
+      <w:r>
+        <w:rPr>
+          <w:b/>
+        </w:rPr>
+        <w:t xml:space="preserve">Orari di apertura del partner</w:t>
+      </w:r>
+      <w:r>
+        <w:rPr>
+          <w:b/>
+        </w:rPr>
+        <w:t xml:space="preserve"> (nuovo ambiente): sezione </w:t>
+      </w:r>
+      <w:r>
+        <w:rPr>
+          <w:b/>
+        </w:rPr>
+        <w:t xml:space="preserve">Orari di apertura</w:t>
+      </w:r>
+      <w:r>
+        <w:rPr>
+          <w:b/>
+        </w:rPr>
+        <w:t xml:space="preserve"> nel form Partner — griglia settimanale (lun→dom) con "Chiuso" e orario </w:t>
+      </w:r>
+      <w:r>
+        <w:rPr>
+          <w:b/>
+        </w:rPr>
+        <w:t xml:space="preserve">dalle–alle</w:t>
+      </w:r>
+      <w:r>
+        <w:rPr>
+          <w:b/>
+        </w:rPr>
+        <w:t xml:space="preserve"> per ogni giorno, più "copia il lunedì su tutti"; mostrati anche nella </w:t>
+      </w:r>
+      <w:r>
+        <w:rPr>
+          <w:b/>
+        </w:rPr>
+        <w:t xml:space="preserve">scheda partner</w:t>
+      </w:r>
+      <w:r>
+        <w:rPr>
+          <w:b/>
+        </w:rPr>
+        <w:t xml:space="preserve">. Usa il modello </w:t>
+      </w:r>
+      <w:r>
+        <w:rPr>
+          <w:b/>
+        </w:rPr>
+        <w:t xml:space="preserve">OpeningHour</w:t>
+      </w:r>
+      <w:r>
+        <w:rPr>
+          <w:b/>
+        </w:rPr>
+        <w:t xml:space="preserve"> (già presente) via il campo </w:t>
+      </w:r>
+      <w:r>
+        <w:rPr>
+          <w:b/>
+        </w:rPr>
+        <w:t xml:space="preserve">openingHours</w:t>
+      </w:r>
+      <w:r>
+        <w:rPr>
+          <w:b/>
+        </w:rPr>
+        <w:t xml:space="preserve"> del partner (salvato con deleteMany+create). ⚠️ </w:t>
+      </w:r>
+      <w:r>
+        <w:rPr>
+          <w:b/>
+        </w:rPr>
+        <w:t xml:space="preserve">Nota</w:t>
+      </w:r>
+      <w:r>
+        <w:rPr>
+          <w:b/>
+        </w:rPr>
+        <w:t xml:space="preserve">: nell'app reale "Orari Apertura" (</w:t>
+      </w:r>
+      <w:r>
+        <w:rPr>
+          <w:b/>
+        </w:rPr>
+        <w:t xml:space="preserve">/partner/availability/list</w:t>
+      </w:r>
+      <w:r>
+        <w:rPr>
+          <w:b/>
+        </w:rPr>
+        <w:t xml:space="preserve">) è la </w:t>
+      </w:r>
+      <w:r>
+        <w:rPr>
+          <w:b/>
+        </w:rPr>
+        <w:t xml:space="preserve">disponibilità per data</w:t>
+      </w:r>
+      <w:r>
+        <w:rPr>
+          <w:b/>
+        </w:rPr>
+        <w:t xml:space="preserve"> (con link pubblico per partner) — concetto più avanzato; qui è stato realizzato prima l'</w:t>
+      </w:r>
+      <w:r>
+        <w:rPr>
+          <w:b/>
+        </w:rPr>
+        <w:t xml:space="preserve">orario settimanale ricorrente</w:t>
+      </w:r>
+      <w:r>
+        <w:rPr>
+          <w:b/>
+        </w:rPr>
+        <w:t xml:space="preserve"> (base naturale). La disponibilità per data resta un possibile passo successivo.</w:t>
       </w:r>
       <w:r>
         <w:rPr>

</xml_diff>

<commit_message>
Calendario consegne (anche per il partner)
- GET /deliveries/calendar?from=&to=: conteggio consegne per giorno (+ per stato), filtrato per ruolo (il partner vede i suoi). Dichiarato prima di :id nel controller
- Pagina /calendar (CalendarComponent): vista mensile che marca i giorni con ordini (badge conteggio); click su un giorno apre l'elenco delle consegne con link alla scheda. Calcolo celle in UTC. Voce menu Calendario per admin/operation/partner/valet
- i18n IT/EN (calendar.*, nav.calendario). Fix: translate.currentLang e' un signal in questa versione (currentLang())
- Verificato: endpoint role-scoped (admin 5 giorni, fioraio 2), pagina come partner (luglio 2026, giorni 14 e 20), click giorno -> elenco. Manuale + Word + handoff aggiornati

Co-Authored-By: Claude Fable 5 <noreply@anthropic.com>
</commit_message>
<xml_diff>
--- a/deluxy-platform-next/docs/COME-FUNZIONA-APP-DELUXY.docx
+++ b/deluxy-platform-next/docs/COME-FUNZIONA-APP-DELUXY.docx
@@ -24,7 +24,7 @@
           <w:color w:val="86868b"/>
           <w:sz w:val="18"/>
         </w:rPr>
-        <w:t xml:space="preserve">Word generato automaticamente dal manuale Markdown — 17 luglio 2026</w:t>
+        <w:t xml:space="preserve">Word generato automaticamente dal manuale Markdown — 18 luglio 2026</w:t>
       </w:r>
     </w:p>
     <w:p>
@@ -169,6 +169,84 @@
           <w:b/>
         </w:rPr>
         <w:t xml:space="preserve">Changelog</w:t>
+      </w:r>
+      <w:r>
+        <w:rPr>
+          <w:b/>
+        </w:rPr>
+        <w:t xml:space="preserve">18/07/2026 — </w:t>
+      </w:r>
+      <w:r>
+        <w:rPr>
+          <w:b/>
+        </w:rPr>
+        <w:t xml:space="preserve">Calendario consegne</w:t>
+      </w:r>
+      <w:r>
+        <w:rPr>
+          <w:b/>
+        </w:rPr>
+        <w:t xml:space="preserve"> (anche per il partner): nuova sezione </w:t>
+      </w:r>
+      <w:r>
+        <w:rPr>
+          <w:b/>
+        </w:rPr>
+        <w:t xml:space="preserve">Calendario</w:t>
+      </w:r>
+      <w:r>
+        <w:rPr>
+          <w:b/>
+        </w:rPr>
+        <w:t xml:space="preserve"> (menu, per Admin/Operation/Partner/Valet) con vista </w:t>
+      </w:r>
+      <w:r>
+        <w:rPr>
+          <w:b/>
+        </w:rPr>
+        <w:t xml:space="preserve">mensile</w:t>
+      </w:r>
+      <w:r>
+        <w:rPr>
+          <w:b/>
+        </w:rPr>
+        <w:t xml:space="preserve"> che </w:t>
+      </w:r>
+      <w:r>
+        <w:rPr>
+          <w:b/>
+        </w:rPr>
+        <w:t xml:space="preserve">marca i giorni con ordini</w:t>
+      </w:r>
+      <w:r>
+        <w:rPr>
+          <w:b/>
+        </w:rPr>
+        <w:t xml:space="preserve"> (conteggio nel badge); cliccando un giorno si apre l'elenco delle consegne di quel giorno con link alla scheda. Filtrato </w:t>
+      </w:r>
+      <w:r>
+        <w:rPr>
+          <w:b/>
+        </w:rPr>
+        <w:t xml:space="preserve">per ruolo</w:t>
+      </w:r>
+      <w:r>
+        <w:rPr>
+          <w:b/>
+        </w:rPr>
+        <w:t xml:space="preserve">: il partner vede solo i propri ordini. Endpoint </w:t>
+      </w:r>
+      <w:r>
+        <w:rPr>
+          <w:b/>
+        </w:rPr>
+        <w:t xml:space="preserve">GET /deliveries/calendar?from=&amp;to=</w:t>
+      </w:r>
+      <w:r>
+        <w:rPr>
+          <w:b/>
+        </w:rPr>
+        <w:t xml:space="preserve"> (conteggio per giorno + per stato, role-scoped).</w:t>
       </w:r>
       <w:r>
         <w:rPr>

</xml_diff>

<commit_message>
Calendario: evidenzia i giorni di chiusura del partner (dai suoi orari)
- Per un utente PARTNER il calendario carica i suoi orari di apertura e marca i giorni di chiusura (motivo tratteggiato + legenda + avviso nel pannello del giorno)

- Non si applica ad admin/operation (nessun partnerId). i18n IT/EN

- Verificato: fioraio (domenica chiusa) -> tutte le domeniche evidenziate, avviso al click. Manuale + Word + handoff aggiornati

Co-Authored-By: Claude Fable 5 <noreply@anthropic.com>
</commit_message>
<xml_diff>
--- a/deluxy-platform-next/docs/COME-FUNZIONA-APP-DELUXY.docx
+++ b/deluxy-platform-next/docs/COME-FUNZIONA-APP-DELUXY.docx
@@ -246,7 +246,55 @@
         <w:rPr>
           <w:b/>
         </w:rPr>
-        <w:t xml:space="preserve"> (conteggio per giorno + per stato, role-scoped).</w:t>
+        <w:t xml:space="preserve"> (conteggio per giorno + per stato, role-scoped). Per il </w:t>
+      </w:r>
+      <w:r>
+        <w:rPr>
+          <w:b/>
+        </w:rPr>
+        <w:t xml:space="preserve">partner</w:t>
+      </w:r>
+      <w:r>
+        <w:rPr>
+          <w:b/>
+        </w:rPr>
+        <w:t xml:space="preserve">, i </w:t>
+      </w:r>
+      <w:r>
+        <w:rPr>
+          <w:b/>
+        </w:rPr>
+        <w:t xml:space="preserve">giorni di chiusura</w:t>
+      </w:r>
+      <w:r>
+        <w:rPr>
+          <w:b/>
+        </w:rPr>
+        <w:t xml:space="preserve"> (dai suoi orari di apertura, </w:t>
+      </w:r>
+      <w:r>
+        <w:rPr>
+          <w:b/>
+        </w:rPr>
+        <w:t xml:space="preserve">OpeningHour.closed</w:t>
+      </w:r>
+      <w:r>
+        <w:rPr>
+          <w:b/>
+        </w:rPr>
+        <w:t xml:space="preserve">) sono </w:t>
+      </w:r>
+      <w:r>
+        <w:rPr>
+          <w:b/>
+        </w:rPr>
+        <w:t xml:space="preserve">evidenziati</w:t>
+      </w:r>
+      <w:r>
+        <w:rPr>
+          <w:b/>
+        </w:rPr>
+        <w:t xml:space="preserve"> (motivo tratteggiato + legenda) e, selezionandone uno, un avviso segnala che il negozio è chiuso.</w:t>
       </w:r>
       <w:r>
         <w:rPr>

</xml_diff>

<commit_message>
Calendario: chiusure e orari speciali per data (eccezioni)
- Modello PartnerDayException (migrazione partner_day_exception): partnerId+date unique, closed, openTime/closeTime, note. Vince sull'orario settimanale
- Endpoint GET/PUT /partners/:id/day-exceptions + DELETE /:date. Il partner gestisce le proprie, admin/operation/PM quelle di ogni partner
- Calendario: editor nel pannello del giorno (Normale / Chiuso / Orario speciale + nota), solo con un partner in contesto. Marcatura celle: pallino rosso = chiuso, oro = orario speciale
- Verificato E2E via API (chiusura 22/07, orario speciale 23/07) e via UI (creazione chiusura 24/07); test ripuliti. i18n IT/EN; manuale + Word + handoff aggiornati

Co-Authored-By: Claude Fable 5 <noreply@anthropic.com>
</commit_message>
<xml_diff>
--- a/deluxy-platform-next/docs/COME-FUNZIONA-APP-DELUXY.docx
+++ b/deluxy-platform-next/docs/COME-FUNZIONA-APP-DELUXY.docx
@@ -169,6 +169,168 @@
           <w:b/>
         </w:rPr>
         <w:t xml:space="preserve">Changelog</w:t>
+      </w:r>
+      <w:r>
+        <w:rPr>
+          <w:b/>
+        </w:rPr>
+        <w:t xml:space="preserve">18/07/2026 (2) — </w:t>
+      </w:r>
+      <w:r>
+        <w:rPr>
+          <w:b/>
+        </w:rPr>
+        <w:t xml:space="preserve">Calendario: chiusure e orari speciali per data</w:t>
+      </w:r>
+      <w:r>
+        <w:rPr>
+          <w:b/>
+        </w:rPr>
+        <w:t xml:space="preserve"> (come la disponibilità per data dell'app reale). Dal pannello del giorno si imposta per una </w:t>
+      </w:r>
+      <w:r>
+        <w:rPr>
+          <w:b/>
+        </w:rPr>
+        <w:t xml:space="preserve">data specifica</w:t>
+      </w:r>
+      <w:r>
+        <w:rPr>
+          <w:b/>
+        </w:rPr>
+        <w:t xml:space="preserve">: </w:t>
+      </w:r>
+      <w:r>
+        <w:rPr>
+          <w:b/>
+        </w:rPr>
+        <w:t xml:space="preserve">Normale</w:t>
+      </w:r>
+      <w:r>
+        <w:rPr>
+          <w:b/>
+        </w:rPr>
+        <w:t xml:space="preserve"> / </w:t>
+      </w:r>
+      <w:r>
+        <w:rPr>
+          <w:b/>
+        </w:rPr>
+        <w:t xml:space="preserve">Chiuso</w:t>
+      </w:r>
+      <w:r>
+        <w:rPr>
+          <w:b/>
+        </w:rPr>
+        <w:t xml:space="preserve"> (chiusura straordinaria) / </w:t>
+      </w:r>
+      <w:r>
+        <w:rPr>
+          <w:b/>
+        </w:rPr>
+        <w:t xml:space="preserve">Orario speciale</w:t>
+      </w:r>
+      <w:r>
+        <w:rPr>
+          <w:b/>
+        </w:rPr>
+        <w:t xml:space="preserve"> (dalle–alle + nota). Le eccezioni </w:t>
+      </w:r>
+      <w:r>
+        <w:rPr>
+          <w:b/>
+        </w:rPr>
+        <w:t xml:space="preserve">vincono</w:t>
+      </w:r>
+      <w:r>
+        <w:rPr>
+          <w:b/>
+        </w:rPr>
+        <w:t xml:space="preserve"> sull'orario settimanale e sono marcate sulla griglia (pallino rosso = chiuso, oro = orario speciale). Modello </w:t>
+      </w:r>
+      <w:r>
+        <w:rPr>
+          <w:b/>
+        </w:rPr>
+        <w:t xml:space="preserve">PartnerDayException</w:t>
+      </w:r>
+      <w:r>
+        <w:rPr>
+          <w:b/>
+        </w:rPr>
+        <w:t xml:space="preserve"> (migrazione </w:t>
+      </w:r>
+      <w:r>
+        <w:rPr>
+          <w:b/>
+        </w:rPr>
+        <w:t xml:space="preserve">partner_day_exception</w:t>
+      </w:r>
+      <w:r>
+        <w:rPr>
+          <w:b/>
+        </w:rPr>
+        <w:t xml:space="preserve">), endpoint </w:t>
+      </w:r>
+      <w:r>
+        <w:rPr>
+          <w:b/>
+        </w:rPr>
+        <w:t xml:space="preserve">GET/PUT /partners/:id/day-exceptions</w:t>
+      </w:r>
+      <w:r>
+        <w:rPr>
+          <w:b/>
+        </w:rPr>
+        <w:t xml:space="preserve"> e </w:t>
+      </w:r>
+      <w:r>
+        <w:rPr>
+          <w:b/>
+        </w:rPr>
+        <w:t xml:space="preserve">DELETE /partners/:id/day-exceptions/:date</w:t>
+      </w:r>
+      <w:r>
+        <w:rPr>
+          <w:b/>
+        </w:rPr>
+        <w:t xml:space="preserve"> (il partner gestisce le proprie, admin/operation quelle di ogni partner). Inoltre </w:t>
+      </w:r>
+      <w:r>
+        <w:rPr>
+          <w:b/>
+        </w:rPr>
+        <w:t xml:space="preserve">admin/operation</w:t>
+      </w:r>
+      <w:r>
+        <w:rPr>
+          <w:b/>
+        </w:rPr>
+        <w:t xml:space="preserve"> aprono il calendario di uno specifico partner dalla sua </w:t>
+      </w:r>
+      <w:r>
+        <w:rPr>
+          <w:b/>
+        </w:rPr>
+        <w:t xml:space="preserve">scheda</w:t>
+      </w:r>
+      <w:r>
+        <w:rPr>
+          <w:b/>
+        </w:rPr>
+        <w:t xml:space="preserve"> (bottone Calendario → </w:t>
+      </w:r>
+      <w:r>
+        <w:rPr>
+          <w:b/>
+        </w:rPr>
+        <w:t xml:space="preserve">/calendar?partnerId=</w:t>
+      </w:r>
+      <w:r>
+        <w:rPr>
+          <w:b/>
+        </w:rPr>
+        <w:t xml:space="preserve">).</w:t>
       </w:r>
       <w:r>
         <w:rPr>

</xml_diff>

<commit_message>
Calendario e disponibilità per i valet
- ValetAvailability: aggiunto unique(valetId,date) + note (migrazione valet_availability_unique). available=false = non disponibile; timeFrom/timeTo = fascia
- Endpoint GET/PUT /valets/:id/availability + DELETE /:date. Il valet solo la propria, admin/operation/PM su tutti. Calendar accetta anche valetId
- CalendarComponent generalizzato: contesto partner o valet (da query o dal proprio account); modello Override unico normalizza eccezioni partner e disponibilità valet; editor con etichette per contesto (Chiuso/Orario speciale vs Non disponibile/Fascia). Marcatura: rosso=blocked, oro=timed
- Bottone Calendario nella scheda valet (admin/operation) -> /calendar?valetId=
- Verificato E2E via API e UI (valet1 disponibilità); lato partner invariato; test ripuliti. i18n IT/EN; manuale + Word + handoff aggiornati

Co-Authored-By: Claude Fable 5 <noreply@anthropic.com>
</commit_message>
<xml_diff>
--- a/deluxy-platform-next/docs/COME-FUNZIONA-APP-DELUXY.docx
+++ b/deluxy-platform-next/docs/COME-FUNZIONA-APP-DELUXY.docx
@@ -169,6 +169,192 @@
           <w:b/>
         </w:rPr>
         <w:t xml:space="preserve">Changelog</w:t>
+      </w:r>
+      <w:r>
+        <w:rPr>
+          <w:b/>
+        </w:rPr>
+        <w:t xml:space="preserve">18/07/2026 (3) — </w:t>
+      </w:r>
+      <w:r>
+        <w:rPr>
+          <w:b/>
+        </w:rPr>
+        <w:t xml:space="preserve">Calendario anche per i valet, con disponibilità</w:t>
+      </w:r>
+      <w:r>
+        <w:rPr>
+          <w:b/>
+        </w:rPr>
+        <w:t xml:space="preserve">: il valet ha il </w:t>
+      </w:r>
+      <w:r>
+        <w:rPr>
+          <w:b/>
+        </w:rPr>
+        <w:t xml:space="preserve">suo calendario</w:t>
+      </w:r>
+      <w:r>
+        <w:rPr>
+          <w:b/>
+        </w:rPr>
+        <w:t xml:space="preserve"> (consegne assegnate) e dal pannello del giorno imposta la </w:t>
+      </w:r>
+      <w:r>
+        <w:rPr>
+          <w:b/>
+        </w:rPr>
+        <w:t xml:space="preserve">disponibilità per data</w:t>
+      </w:r>
+      <w:r>
+        <w:rPr>
+          <w:b/>
+        </w:rPr>
+        <w:t xml:space="preserve">: </w:t>
+      </w:r>
+      <w:r>
+        <w:rPr>
+          <w:b/>
+        </w:rPr>
+        <w:t xml:space="preserve">Disponibile</w:t>
+      </w:r>
+      <w:r>
+        <w:rPr>
+          <w:b/>
+        </w:rPr>
+        <w:t xml:space="preserve"> / </w:t>
+      </w:r>
+      <w:r>
+        <w:rPr>
+          <w:b/>
+        </w:rPr>
+        <w:t xml:space="preserve">Non disponibile</w:t>
+      </w:r>
+      <w:r>
+        <w:rPr>
+          <w:b/>
+        </w:rPr>
+        <w:t xml:space="preserve"> / </w:t>
+      </w:r>
+      <w:r>
+        <w:rPr>
+          <w:b/>
+        </w:rPr>
+        <w:t xml:space="preserve">Disponibile in fascia</w:t>
+      </w:r>
+      <w:r>
+        <w:rPr>
+          <w:b/>
+        </w:rPr>
+        <w:t xml:space="preserve"> (dalle–alle + nota). Marcata sulla griglia (pallino rosso = non disponibile, oro = fascia). Modello </w:t>
+      </w:r>
+      <w:r>
+        <w:rPr>
+          <w:b/>
+        </w:rPr>
+        <w:t xml:space="preserve">ValetAvailability</w:t>
+      </w:r>
+      <w:r>
+        <w:rPr>
+          <w:b/>
+        </w:rPr>
+        <w:t xml:space="preserve"> (aggiunto vincolo unique </w:t>
+      </w:r>
+      <w:r>
+        <w:rPr>
+          <w:b/>
+        </w:rPr>
+        <w:t xml:space="preserve">valetId+date</w:t>
+      </w:r>
+      <w:r>
+        <w:rPr>
+          <w:b/>
+        </w:rPr>
+        <w:t xml:space="preserve"> e </w:t>
+      </w:r>
+      <w:r>
+        <w:rPr>
+          <w:b/>
+        </w:rPr>
+        <w:t xml:space="preserve">note</w:t>
+      </w:r>
+      <w:r>
+        <w:rPr>
+          <w:b/>
+        </w:rPr>
+        <w:t xml:space="preserve">, migrazione </w:t>
+      </w:r>
+      <w:r>
+        <w:rPr>
+          <w:b/>
+        </w:rPr>
+        <w:t xml:space="preserve">valet_availability_unique</w:t>
+      </w:r>
+      <w:r>
+        <w:rPr>
+          <w:b/>
+        </w:rPr>
+        <w:t xml:space="preserve">); endpoint </w:t>
+      </w:r>
+      <w:r>
+        <w:rPr>
+          <w:b/>
+        </w:rPr>
+        <w:t xml:space="preserve">GET/PUT /valets/:id/availability</w:t>
+      </w:r>
+      <w:r>
+        <w:rPr>
+          <w:b/>
+        </w:rPr>
+        <w:t xml:space="preserve"> e </w:t>
+      </w:r>
+      <w:r>
+        <w:rPr>
+          <w:b/>
+        </w:rPr>
+        <w:t xml:space="preserve">DELETE /valets/:id/availability/:date</w:t>
+      </w:r>
+      <w:r>
+        <w:rPr>
+          <w:b/>
+        </w:rPr>
+        <w:t xml:space="preserve"> (il valet solo la propria; admin/operation su tutti). Il componente calendario ora gestisce due contesti (partner→chiusure, valet→disponibilità). </w:t>
+      </w:r>
+      <w:r>
+        <w:rPr>
+          <w:b/>
+        </w:rPr>
+        <w:t xml:space="preserve">Admin/operation</w:t>
+      </w:r>
+      <w:r>
+        <w:rPr>
+          <w:b/>
+        </w:rPr>
+        <w:t xml:space="preserve"> aprono il calendario di un valet dalla sua </w:t>
+      </w:r>
+      <w:r>
+        <w:rPr>
+          <w:b/>
+        </w:rPr>
+        <w:t xml:space="preserve">scheda</w:t>
+      </w:r>
+      <w:r>
+        <w:rPr>
+          <w:b/>
+        </w:rPr>
+        <w:t xml:space="preserve"> (bottone Calendario → </w:t>
+      </w:r>
+      <w:r>
+        <w:rPr>
+          <w:b/>
+        </w:rPr>
+        <w:t xml:space="preserve">/calendar?valetId=</w:t>
+      </w:r>
+      <w:r>
+        <w:rPr>
+          <w:b/>
+        </w:rPr>
+        <w:t xml:space="preserve">).</w:t>
       </w:r>
       <w:r>
         <w:rPr>

</xml_diff>

<commit_message>
Sezione Stipendi (frontend, era stub)
- Pagina /salaries (SalariesListComponent) al posto dello stub: lista stipendi (valet, periodo, lordo, contanti, netto, documento, stato), filtro per valet, pannello Genera stipendi (valet+periodo), avanzamento flusso Bozza->Inviato->Ricevuta in attesa->Approvato->Pagato (solo admin/operation; il valet vede i propri in sola lettura)
- Backend gia' presente (Salary/Receipt, SalariesService: generate somma le paghe delle consegne effettuate meno i contanti, documento pro-forma o ricevuta ritenuta secondo la P.IVA). Aggiunto @Roles(ADMIN,OPERATION) sull'avanzamento stato (prima aperto a qualsiasi autenticato)
- i18n IT/EN (salaries.*). Verificato E2E (genera + avanza stato); test ripuliti. Manuale + Word + handoff aggiornati

Co-Authored-By: Claude Fable 5 <noreply@anthropic.com>
</commit_message>
<xml_diff>
--- a/deluxy-platform-next/docs/COME-FUNZIONA-APP-DELUXY.docx
+++ b/deluxy-platform-next/docs/COME-FUNZIONA-APP-DELUXY.docx
@@ -169,6 +169,138 @@
           <w:b/>
         </w:rPr>
         <w:t xml:space="preserve">Changelog</w:t>
+      </w:r>
+      <w:r>
+        <w:rPr>
+          <w:b/>
+        </w:rPr>
+        <w:t xml:space="preserve">18/07/2026 (4) — </w:t>
+      </w:r>
+      <w:r>
+        <w:rPr>
+          <w:b/>
+        </w:rPr>
+        <w:t xml:space="preserve">Sezione Stipendi</w:t>
+      </w:r>
+      <w:r>
+        <w:rPr>
+          <w:b/>
+        </w:rPr>
+        <w:t xml:space="preserve"> (era stub): </w:t>
+      </w:r>
+      <w:r>
+        <w:rPr>
+          <w:b/>
+        </w:rPr>
+        <w:t xml:space="preserve">Amministrazione → Stipendi</w:t>
+      </w:r>
+      <w:r>
+        <w:rPr>
+          <w:b/>
+        </w:rPr>
+        <w:t xml:space="preserve">. Lista degli stipendi (valet, periodo, lordo, contanti detratti, netto, documento, stato), </w:t>
+      </w:r>
+      <w:r>
+        <w:rPr>
+          <w:b/>
+        </w:rPr>
+        <w:t xml:space="preserve">filtro per valet</w:t>
+      </w:r>
+      <w:r>
+        <w:rPr>
+          <w:b/>
+        </w:rPr>
+        <w:t xml:space="preserve">, pannello </w:t>
+      </w:r>
+      <w:r>
+        <w:rPr>
+          <w:b/>
+        </w:rPr>
+        <w:t xml:space="preserve">Genera stipendi</w:t>
+      </w:r>
+      <w:r>
+        <w:rPr>
+          <w:b/>
+        </w:rPr>
+        <w:t xml:space="preserve"> (valet + periodo → somma le paghe delle consegne effettuate nel periodo meno i contanti incassati alla consegna; documento </w:t>
+      </w:r>
+      <w:r>
+        <w:rPr>
+          <w:b/>
+        </w:rPr>
+        <w:t xml:space="preserve">pro-forma fattura</w:t>
+      </w:r>
+      <w:r>
+        <w:rPr>
+          <w:b/>
+        </w:rPr>
+        <w:t xml:space="preserve"> se il valet ha P.IVA, altrimenti </w:t>
+      </w:r>
+      <w:r>
+        <w:rPr>
+          <w:b/>
+        </w:rPr>
+        <w:t xml:space="preserve">ricevuta con ritenuta</w:t>
+      </w:r>
+      <w:r>
+        <w:rPr>
+          <w:b/>
+        </w:rPr>
+        <w:t xml:space="preserve">), e </w:t>
+      </w:r>
+      <w:r>
+        <w:rPr>
+          <w:b/>
+        </w:rPr>
+        <w:t xml:space="preserve">avanzamento del flusso</w:t>
+      </w:r>
+      <w:r>
+        <w:rPr>
+          <w:b/>
+        </w:rPr>
+        <w:t xml:space="preserve">Bozza → Inviato → Ricevuta in attesa → Approvato → Pagato</w:t>
+      </w:r>
+      <w:r>
+        <w:rPr>
+          <w:b/>
+        </w:rPr>
+        <w:t xml:space="preserve"> (solo admin/operation; il valet vede i propri in sola lettura). Backend già presente (</w:t>
+      </w:r>
+      <w:r>
+        <w:rPr>
+          <w:b/>
+        </w:rPr>
+        <w:t xml:space="preserve">Salary</w:t>
+      </w:r>
+      <w:r>
+        <w:rPr>
+          <w:b/>
+        </w:rPr>
+        <w:t xml:space="preserve">/</w:t>
+      </w:r>
+      <w:r>
+        <w:rPr>
+          <w:b/>
+        </w:rPr>
+        <w:t xml:space="preserve">Receipt</w:t>
+      </w:r>
+      <w:r>
+        <w:rPr>
+          <w:b/>
+        </w:rPr>
+        <w:t xml:space="preserve">, </w:t>
+      </w:r>
+      <w:r>
+        <w:rPr>
+          <w:b/>
+        </w:rPr>
+        <w:t xml:space="preserve">SalariesService</w:t>
+      </w:r>
+      <w:r>
+        <w:rPr>
+          <w:b/>
+        </w:rPr>
+        <w:t xml:space="preserve">); aggiunto solo il gate ruolo sull'avanzamento stato.</w:t>
       </w:r>
       <w:r>
         <w:rPr>

</xml_diff>

<commit_message>
Sezione Pagamenti (frontend, era stub)
- Pagina /payments (PaymentsListComponent): rimborsi/reclami dei valet; il valet apre la richiesta, admin/operation approvano/rifiutano/pagano (Richiesto->Approvato/Rifiutato->Pagato); filtro valet

- Backend gia' presente; aggiunto @Roles(ADMIN,OPERATION,VALET) sulla creazione (no partner). i18n IT/EN

- Verificato E2E (valet crea rimborso, admin approva); test ripuliti. Manuale + Word + handoff aggiornati

Co-Authored-By: Claude Fable 5 <noreply@anthropic.com>
</commit_message>
<xml_diff>
--- a/deluxy-platform-next/docs/COME-FUNZIONA-APP-DELUXY.docx
+++ b/deluxy-platform-next/docs/COME-FUNZIONA-APP-DELUXY.docx
@@ -169,6 +169,108 @@
           <w:b/>
         </w:rPr>
         <w:t xml:space="preserve">Changelog</w:t>
+      </w:r>
+      <w:r>
+        <w:rPr>
+          <w:b/>
+        </w:rPr>
+        <w:t xml:space="preserve">18/07/2026 (5) — </w:t>
+      </w:r>
+      <w:r>
+        <w:rPr>
+          <w:b/>
+        </w:rPr>
+        <w:t xml:space="preserve">Sezione Pagamenti</w:t>
+      </w:r>
+      <w:r>
+        <w:rPr>
+          <w:b/>
+        </w:rPr>
+        <w:t xml:space="preserve"> (era stub): </w:t>
+      </w:r>
+      <w:r>
+        <w:rPr>
+          <w:b/>
+        </w:rPr>
+        <w:t xml:space="preserve">Amministrazione → Pagamenti</w:t>
+      </w:r>
+      <w:r>
+        <w:rPr>
+          <w:b/>
+        </w:rPr>
+        <w:t xml:space="preserve">. Rimborsi e reclami dei valet (es. rimborso Area C): il </w:t>
+      </w:r>
+      <w:r>
+        <w:rPr>
+          <w:b/>
+        </w:rPr>
+        <w:t xml:space="preserve">valet</w:t>
+      </w:r>
+      <w:r>
+        <w:rPr>
+          <w:b/>
+        </w:rPr>
+        <w:t xml:space="preserve"> apre una richiesta (Rimborso/Reclamo, importo, descrizione), </w:t>
+      </w:r>
+      <w:r>
+        <w:rPr>
+          <w:b/>
+        </w:rPr>
+        <w:t xml:space="preserve">admin/operation</w:t>
+      </w:r>
+      <w:r>
+        <w:rPr>
+          <w:b/>
+        </w:rPr>
+        <w:t xml:space="preserve"> la </w:t>
+      </w:r>
+      <w:r>
+        <w:rPr>
+          <w:b/>
+        </w:rPr>
+        <w:t xml:space="preserve">Approvano / Rifiutano / Segnano pagata</w:t>
+      </w:r>
+      <w:r>
+        <w:rPr>
+          <w:b/>
+        </w:rPr>
+        <w:t xml:space="preserve"> (flusso </w:t>
+      </w:r>
+      <w:r>
+        <w:rPr>
+          <w:b/>
+        </w:rPr>
+        <w:t xml:space="preserve">Richiesto → Approvato/Rifiutato → Pagato</w:t>
+      </w:r>
+      <w:r>
+        <w:rPr>
+          <w:b/>
+        </w:rPr>
+        <w:t xml:space="preserve">). Filtro per valet. Backend già presente (</w:t>
+      </w:r>
+      <w:r>
+        <w:rPr>
+          <w:b/>
+        </w:rPr>
+        <w:t xml:space="preserve">Payment</w:t>
+      </w:r>
+      <w:r>
+        <w:rPr>
+          <w:b/>
+        </w:rPr>
+        <w:t xml:space="preserve">, </w:t>
+      </w:r>
+      <w:r>
+        <w:rPr>
+          <w:b/>
+        </w:rPr>
+        <w:t xml:space="preserve">PaymentsService</w:t>
+      </w:r>
+      <w:r>
+        <w:rPr>
+          <w:b/>
+        </w:rPr>
+        <w:t xml:space="preserve">); aggiunto il gate ruolo sulla creazione (no partner).</w:t>
       </w:r>
       <w:r>
         <w:rPr>

</xml_diff>

<commit_message>
Stipendi: Attivi/Archivio, stato finanziario e riapertura (feedback)
- Un solo punto per scegliere il valet: il pannello Genera eredita il valet dal filtro in alto (niente doppia scelta)
- Default: mostra gli stipendi attivi (non archiviati); nuovo tab Attivi/Archivio
- Invia (Bozza -> Inviato) archivia lo stipendio: esce dagli attivi ed entra in Archivio
- Colonna Stato finanziario in Archivio (Non pagato finche' non e' Pagato)
- Riapri un record dall'archivio solo se non ancora pagato (POST /salaries/:id/reopen, 400 se PAID)
- Campo Salary.archived (migrazione salary_archived); GET /salaries?archived=true; findAll filtra su archived
- i18n IT/EN salaries.tab/fin/col.financial/action.reopen (parita' 955 chiavi)
- Doc + Word + handoff aggiornati; verificato E2E via API e in browser

Co-Authored-By: Claude Fable 5 <noreply@anthropic.com>
</commit_message>
<xml_diff>
--- a/deluxy-platform-next/docs/COME-FUNZIONA-APP-DELUXY.docx
+++ b/deluxy-platform-next/docs/COME-FUNZIONA-APP-DELUXY.docx
@@ -169,6 +169,252 @@
           <w:b/>
         </w:rPr>
         <w:t xml:space="preserve">Changelog</w:t>
+      </w:r>
+      <w:r>
+        <w:rPr>
+          <w:b/>
+        </w:rPr>
+        <w:t xml:space="preserve">18/07/2026 (6) — </w:t>
+      </w:r>
+      <w:r>
+        <w:rPr>
+          <w:b/>
+        </w:rPr>
+        <w:t xml:space="preserve">Stipendi: Attivi/Archivio, stato finanziario e riapertura</w:t>
+      </w:r>
+      <w:r>
+        <w:rPr>
+          <w:b/>
+        </w:rPr>
+        <w:t xml:space="preserve"> (feedback). Un solo punto in cui si sceglie il valet (il pannello </w:t>
+      </w:r>
+      <w:r>
+        <w:rPr>
+          <w:b/>
+        </w:rPr>
+        <w:t xml:space="preserve">Genera</w:t>
+      </w:r>
+      <w:r>
+        <w:rPr>
+          <w:b/>
+        </w:rPr>
+        <w:t xml:space="preserve"> eredita il valet dal </w:t>
+      </w:r>
+      <w:r>
+        <w:rPr>
+          <w:b/>
+        </w:rPr>
+        <w:t xml:space="preserve">filtro</w:t>
+      </w:r>
+      <w:r>
+        <w:rPr>
+          <w:b/>
+        </w:rPr>
+        <w:t xml:space="preserve"> in alto, niente doppia scelta). Di default la lista mostra gli </w:t>
+      </w:r>
+      <w:r>
+        <w:rPr>
+          <w:b/>
+        </w:rPr>
+        <w:t xml:space="preserve">stipendi attivi</w:t>
+      </w:r>
+      <w:r>
+        <w:rPr>
+          <w:b/>
+        </w:rPr>
+        <w:t xml:space="preserve"> (non in archivio); tab </w:t>
+      </w:r>
+      <w:r>
+        <w:rPr>
+          <w:b/>
+        </w:rPr>
+        <w:t xml:space="preserve">Archivio</w:t>
+      </w:r>
+      <w:r>
+        <w:rPr>
+          <w:b/>
+        </w:rPr>
+        <w:t xml:space="preserve"> per quelli inviati. </w:t>
+      </w:r>
+      <w:r>
+        <w:rPr>
+          <w:b/>
+        </w:rPr>
+        <w:t xml:space="preserve">Invia</w:t>
+      </w:r>
+      <w:r>
+        <w:rPr>
+          <w:b/>
+        </w:rPr>
+        <w:t xml:space="preserve"> (</w:t>
+      </w:r>
+      <w:r>
+        <w:rPr>
+          <w:b/>
+        </w:rPr>
+        <w:t xml:space="preserve">Bozza → Inviato</w:t>
+      </w:r>
+      <w:r>
+        <w:rPr>
+          <w:b/>
+        </w:rPr>
+        <w:t xml:space="preserve">) </w:t>
+      </w:r>
+      <w:r>
+        <w:rPr>
+          <w:b/>
+        </w:rPr>
+        <w:t xml:space="preserve">archivia</w:t>
+      </w:r>
+      <w:r>
+        <w:rPr>
+          <w:b/>
+        </w:rPr>
+        <w:t xml:space="preserve"> lo stipendio: esce dagli attivi ed entra in </w:t>
+      </w:r>
+      <w:r>
+        <w:rPr>
+          <w:b/>
+        </w:rPr>
+        <w:t xml:space="preserve">Archivio</w:t>
+      </w:r>
+      <w:r>
+        <w:rPr>
+          <w:b/>
+        </w:rPr>
+        <w:t xml:space="preserve">. In Archivio compare la colonna </w:t>
+      </w:r>
+      <w:r>
+        <w:rPr>
+          <w:b/>
+        </w:rPr>
+        <w:t xml:space="preserve">Stato finanziario</w:t>
+      </w:r>
+      <w:r>
+        <w:rPr>
+          <w:b/>
+        </w:rPr>
+        <w:t xml:space="preserve"> (</w:t>
+      </w:r>
+      <w:r>
+        <w:rPr>
+          <w:b/>
+        </w:rPr>
+        <w:t xml:space="preserve">Non pagato</w:t>
+      </w:r>
+      <w:r>
+        <w:rPr>
+          <w:b/>
+        </w:rPr>
+        <w:t xml:space="preserve"> finché lo stato non è </w:t>
+      </w:r>
+      <w:r>
+        <w:rPr>
+          <w:b/>
+        </w:rPr>
+        <w:t xml:space="preserve">Pagato</w:t>
+      </w:r>
+      <w:r>
+        <w:rPr>
+          <w:b/>
+        </w:rPr>
+        <w:t xml:space="preserve">, poi </w:t>
+      </w:r>
+      <w:r>
+        <w:rPr>
+          <w:b/>
+        </w:rPr>
+        <w:t xml:space="preserve">Pagato</w:t>
+      </w:r>
+      <w:r>
+        <w:rPr>
+          <w:b/>
+        </w:rPr>
+        <w:t xml:space="preserve">) e si può </w:t>
+      </w:r>
+      <w:r>
+        <w:rPr>
+          <w:b/>
+        </w:rPr>
+        <w:t xml:space="preserve">Riapri</w:t>
+      </w:r>
+      <w:r>
+        <w:rPr>
+          <w:b/>
+        </w:rPr>
+        <w:t xml:space="preserve">re un record (torna in Bozza tra gli attivi) </w:t>
+      </w:r>
+      <w:r>
+        <w:rPr>
+          <w:b/>
+        </w:rPr>
+        <w:t xml:space="preserve">solo se non è ancora pagato</w:t>
+      </w:r>
+      <w:r>
+        <w:rPr>
+          <w:b/>
+        </w:rPr>
+        <w:t xml:space="preserve">; uno stipendio </w:t>
+      </w:r>
+      <w:r>
+        <w:rPr>
+          <w:b/>
+        </w:rPr>
+        <w:t xml:space="preserve">Pagato</w:t>
+      </w:r>
+      <w:r>
+        <w:rPr>
+          <w:b/>
+        </w:rPr>
+        <w:t xml:space="preserve"> non è più riapribile. Campo </w:t>
+      </w:r>
+      <w:r>
+        <w:rPr>
+          <w:b/>
+        </w:rPr>
+        <w:t xml:space="preserve">Salary.archived</w:t>
+      </w:r>
+      <w:r>
+        <w:rPr>
+          <w:b/>
+        </w:rPr>
+        <w:t xml:space="preserve"> (migrazione </w:t>
+      </w:r>
+      <w:r>
+        <w:rPr>
+          <w:b/>
+        </w:rPr>
+        <w:t xml:space="preserve">salary_archived</w:t>
+      </w:r>
+      <w:r>
+        <w:rPr>
+          <w:b/>
+        </w:rPr>
+        <w:t xml:space="preserve">), endpoint </w:t>
+      </w:r>
+      <w:r>
+        <w:rPr>
+          <w:b/>
+        </w:rPr>
+        <w:t xml:space="preserve">GET /salaries?archived=true</w:t>
+      </w:r>
+      <w:r>
+        <w:rPr>
+          <w:b/>
+        </w:rPr>
+        <w:t xml:space="preserve"> e </w:t>
+      </w:r>
+      <w:r>
+        <w:rPr>
+          <w:b/>
+        </w:rPr>
+        <w:t xml:space="preserve">POST /salaries/:id/reopen</w:t>
+      </w:r>
+      <w:r>
+        <w:rPr>
+          <w:b/>
+        </w:rPr>
+        <w:t xml:space="preserve"> (admin/operation).</w:t>
       </w:r>
       <w:r>
         <w:rPr>

</xml_diff>

<commit_message>
Sync partner -> registro Anagrafiche (portata nel branch deluxy-scout)
L'integrazione esisteva in un'altra copia del repo ma mancava su questo branch:
creando un partner qui non partiva alcuna sync verso il registro centralizzato.

- Nuovo AnagraficheSyncService (api/src/partners/anagrafiche-sync.service.ts),
  registrato in PartnersModule e iniettato in PartnersService
- Chiamato fire-and-forget in create / update (entrambi i rami) / remove (soft delete)
- POST {ANAGRAFICHE_URL}/api/v1/partners con x-api-key: platformId, nome, pIva,
  categoria, contatti, stato attivo|dismesso, fonte 'platform'
- Best-effort: senza ANAGRAFICHE_API_KEY logga e prosegue, non blocca l'operazione
- Creato api/.env.example con placeholder (chiave reale NON committata)

Verificato E2E con un mock del registro su :3060: create -> POST stato attivo,
delete -> POST stato dismesso, header e payload corretti. nest build pulito.

Co-Authored-By: Claude Fable 5 <noreply@anthropic.com>
</commit_message>
<xml_diff>
--- a/deluxy-platform-next/docs/COME-FUNZIONA-APP-DELUXY.docx
+++ b/deluxy-platform-next/docs/COME-FUNZIONA-APP-DELUXY.docx
@@ -169,6 +169,198 @@
           <w:b/>
         </w:rPr>
         <w:t xml:space="preserve">Changelog</w:t>
+      </w:r>
+      <w:r>
+        <w:rPr>
+          <w:b/>
+        </w:rPr>
+        <w:t xml:space="preserve">18/07/2026 (8) — </w:t>
+      </w:r>
+      <w:r>
+        <w:rPr>
+          <w:b/>
+        </w:rPr>
+        <w:t xml:space="preserve">Sync partner → registro Anagrafiche (portata nel branch)</w:t>
+      </w:r>
+      <w:r>
+        <w:rPr>
+          <w:b/>
+        </w:rPr>
+        <w:t xml:space="preserve">. Alla creazione, modifica e disattivazione di un partner la piattaforma ora </w:t>
+      </w:r>
+      <w:r>
+        <w:rPr>
+          <w:b/>
+        </w:rPr>
+        <w:t xml:space="preserve">invia il partner al registro centralizzato Deluxy Anagrafiche</w:t>
+      </w:r>
+      <w:r>
+        <w:rPr>
+          <w:b/>
+        </w:rPr>
+        <w:t xml:space="preserve"> (</w:t>
+      </w:r>
+      <w:r>
+        <w:rPr>
+          <w:b/>
+        </w:rPr>
+        <w:t xml:space="preserve">POST /api/v1/partners</w:t>
+      </w:r>
+      <w:r>
+        <w:rPr>
+          <w:b/>
+        </w:rPr>
+        <w:t xml:space="preserve"> con </w:t>
+      </w:r>
+      <w:r>
+        <w:rPr>
+          <w:b/>
+        </w:rPr>
+        <w:t xml:space="preserve">platformId</w:t>
+      </w:r>
+      <w:r>
+        <w:rPr>
+          <w:b/>
+        </w:rPr>
+        <w:t xml:space="preserve"> = id del partner, </w:t>
+      </w:r>
+      <w:r>
+        <w:rPr>
+          <w:b/>
+        </w:rPr>
+        <w:t xml:space="preserve">fonte: platform</w:t>
+      </w:r>
+      <w:r>
+        <w:rPr>
+          <w:b/>
+        </w:rPr>
+        <w:t xml:space="preserve">, categoria, referenti; </w:t>
+      </w:r>
+      <w:r>
+        <w:rPr>
+          <w:b/>
+        </w:rPr>
+        <w:t xml:space="preserve">stato: attivo/dismesso</w:t>
+      </w:r>
+      <w:r>
+        <w:rPr>
+          <w:b/>
+        </w:rPr>
+        <w:t xml:space="preserve">). È l'unica app con chiave di </w:t>
+      </w:r>
+      <w:r>
+        <w:rPr>
+          <w:b/>
+        </w:rPr>
+        <w:t xml:space="preserve">scrittura</w:t>
+      </w:r>
+      <w:r>
+        <w:rPr>
+          <w:b/>
+        </w:rPr>
+        <w:t xml:space="preserve">; la sync è </w:t>
+      </w:r>
+      <w:r>
+        <w:rPr>
+          <w:b/>
+        </w:rPr>
+        <w:t xml:space="preserve">best-effort e fire-and-forget</w:t>
+      </w:r>
+      <w:r>
+        <w:rPr>
+          <w:b/>
+        </w:rPr>
+        <w:t xml:space="preserve"> (se il registro è spento o manca </w:t>
+      </w:r>
+      <w:r>
+        <w:rPr>
+          <w:b/>
+        </w:rPr>
+        <w:t xml:space="preserve">ANAGRAFICHE_API_KEY</w:t>
+      </w:r>
+      <w:r>
+        <w:rPr>
+          <w:b/>
+        </w:rPr>
+        <w:t xml:space="preserve">, l'operazione va comunque a buon fine e il mancato invio finisce nei log). Config in </w:t>
+      </w:r>
+      <w:r>
+        <w:rPr>
+          <w:b/>
+        </w:rPr>
+        <w:t xml:space="preserve">api/.env</w:t>
+      </w:r>
+      <w:r>
+        <w:rPr>
+          <w:b/>
+        </w:rPr>
+        <w:t xml:space="preserve"> (</w:t>
+      </w:r>
+      <w:r>
+        <w:rPr>
+          <w:b/>
+        </w:rPr>
+        <w:t xml:space="preserve">ANAGRAFICHE_URL</w:t>
+      </w:r>
+      <w:r>
+        <w:rPr>
+          <w:b/>
+        </w:rPr>
+        <w:t xml:space="preserve">, </w:t>
+      </w:r>
+      <w:r>
+        <w:rPr>
+          <w:b/>
+        </w:rPr>
+        <w:t xml:space="preserve">ANAGRAFICHE_API_KEY</w:t>
+      </w:r>
+      <w:r>
+        <w:rPr>
+          <w:b/>
+        </w:rPr>
+        <w:t xml:space="preserve">; esempio in </w:t>
+      </w:r>
+      <w:r>
+        <w:rPr>
+          <w:b/>
+        </w:rPr>
+        <w:t xml:space="preserve">.env.example</w:t>
+      </w:r>
+      <w:r>
+        <w:rPr>
+          <w:b/>
+        </w:rPr>
+        <w:t xml:space="preserve">). </w:t>
+      </w:r>
+      <w:r>
+        <w:rPr>
+          <w:b/>
+        </w:rPr>
+        <w:t xml:space="preserve">Nota: questa integrazione esisteva in un'altra copia del repo ma non era presente su questo branch — ora è allineata (</w:t>
+      </w:r>
+      <w:r>
+        <w:rPr>
+          <w:b/>
+        </w:rPr>
+        <w:t xml:space="preserve">AnagraficheSyncService</w:t>
+      </w:r>
+      <w:r>
+        <w:rPr>
+          <w:b/>
+        </w:rPr>
+        <w:t xml:space="preserve"> agganciato a create/update/remove di </w:t>
+      </w:r>
+      <w:r>
+        <w:rPr>
+          <w:b/>
+        </w:rPr>
+        <w:t xml:space="preserve">PartnersService</w:t>
+      </w:r>
+      <w:r>
+        <w:rPr>
+          <w:b/>
+        </w:rPr>
+        <w:t xml:space="preserve">).</w:t>
       </w:r>
       <w:r>
         <w:rPr>

</xml_diff>

<commit_message>
Ricevute: bottone Paga nella tab Firmate
Nella tab Firmate, admin/operation possono segnare lo stipendio come pagato
direttamente dalla ricevuta.

- ReceiptsListComponent: bottone Paga (solo canManage, ricevuta firmata, stipendio
  non ancora PAID) -> PATCH /salaries/:id/status {status:'PAID'}; se gia' pagato
  mostra badge "Pagato"; il valet non lo vede
- Aggiunto salary.id al tipo Receipt.salary (gia' incluso dal backend)
- i18n receipts.pay/paid/paidOk (IT/EN 993/993)

Verificato E2E in browser: Paga -> "Stipendio pagato" -> riga "Pagato"; via API
lo stipendio risulta PAID con paidAt. Nessuna modifica backend.

Co-Authored-By: Claude Fable 5 <noreply@anthropic.com>
</commit_message>
<xml_diff>
--- a/deluxy-platform-next/docs/COME-FUNZIONA-APP-DELUXY.docx
+++ b/deluxy-platform-next/docs/COME-FUNZIONA-APP-DELUXY.docx
@@ -24,7 +24,7 @@
           <w:color w:val="86868b"/>
           <w:sz w:val="18"/>
         </w:rPr>
-        <w:t xml:space="preserve">Word generato automaticamente dal manuale Markdown — 18 luglio 2026</w:t>
+        <w:t xml:space="preserve">Word generato automaticamente dal manuale Markdown — 19 luglio 2026</w:t>
       </w:r>
     </w:p>
     <w:p>
@@ -169,6 +169,96 @@
           <w:b/>
         </w:rPr>
         <w:t xml:space="preserve">Changelog</w:t>
+      </w:r>
+      <w:r>
+        <w:rPr>
+          <w:b/>
+        </w:rPr>
+        <w:t xml:space="preserve">18/07/2026 (10) — </w:t>
+      </w:r>
+      <w:r>
+        <w:rPr>
+          <w:b/>
+        </w:rPr>
+        <w:t xml:space="preserve">Ricevute: bottone "Paga"</w:t>
+      </w:r>
+      <w:r>
+        <w:rPr>
+          <w:b/>
+        </w:rPr>
+        <w:t xml:space="preserve"> (feedback). Nella tab </w:t>
+      </w:r>
+      <w:r>
+        <w:rPr>
+          <w:b/>
+        </w:rPr>
+        <w:t xml:space="preserve">Firmate</w:t>
+      </w:r>
+      <w:r>
+        <w:rPr>
+          <w:b/>
+        </w:rPr>
+        <w:t xml:space="preserve"> della pagina Ricevute, admin/operation hanno un bottone </w:t>
+      </w:r>
+      <w:r>
+        <w:rPr>
+          <w:b/>
+        </w:rPr>
+        <w:t xml:space="preserve">Paga</w:t>
+      </w:r>
+      <w:r>
+        <w:rPr>
+          <w:b/>
+        </w:rPr>
+        <w:t xml:space="preserve"> che segna lo stipendio collegato come </w:t>
+      </w:r>
+      <w:r>
+        <w:rPr>
+          <w:b/>
+        </w:rPr>
+        <w:t xml:space="preserve">pagato</w:t>
+      </w:r>
+      <w:r>
+        <w:rPr>
+          <w:b/>
+        </w:rPr>
+        <w:t xml:space="preserve"> (</w:t>
+      </w:r>
+      <w:r>
+        <w:rPr>
+          <w:b/>
+        </w:rPr>
+        <w:t xml:space="preserve">PATCH /salaries/:id/status</w:t>
+      </w:r>
+      <w:r>
+        <w:rPr>
+          <w:b/>
+        </w:rPr>
+        <w:t xml:space="preserve"> → </w:t>
+      </w:r>
+      <w:r>
+        <w:rPr>
+          <w:b/>
+        </w:rPr>
+        <w:t xml:space="preserve">PAID</w:t>
+      </w:r>
+      <w:r>
+        <w:rPr>
+          <w:b/>
+        </w:rPr>
+        <w:t xml:space="preserve">) direttamente dalla ricevuta, senza passare da Stipendi → Archivio. Dopo il pagamento la riga mostra il badge </w:t>
+      </w:r>
+      <w:r>
+        <w:rPr>
+          <w:b/>
+        </w:rPr>
+        <w:t xml:space="preserve">Pagato</w:t>
+      </w:r>
+      <w:r>
+        <w:rPr>
+          <w:b/>
+        </w:rPr>
+        <w:t xml:space="preserve">. Il valet non vede il bottone.</w:t>
       </w:r>
       <w:r>
         <w:rPr>

</xml_diff>

<commit_message>
Pagamento stipendio: crea lo storico in Pagamenti
Quando uno stipendio passa a Pagato (bottone Paga nelle Ricevute o Segna pagato
in Stipendi/Archivio) si crea automaticamente un record in Pagamenti.

- salaries.updateStatus: alla transizione a PAID crea un Payment tipo SALARY
  (amount=netAmount, status=PAID, salaryId collegato, description con periodo)
- Guardia salary.status !== PAID -> creato una sola volta (idempotente)
- Nuovo PaymentType.SALARY; i18n payments.type.SALARY (IT/EN 994/994)

Verificato E2E: paga -> 1 pagamento SALARY in /payments (idempotente al ri-paga);
in browser la pagina Pagamenti mostra la riga Stipendio/Pagato.

Co-Authored-By: Claude Fable 5 <noreply@anthropic.com>
</commit_message>
<xml_diff>
--- a/deluxy-platform-next/docs/COME-FUNZIONA-APP-DELUXY.docx
+++ b/deluxy-platform-next/docs/COME-FUNZIONA-APP-DELUXY.docx
@@ -169,6 +169,120 @@
           <w:b/>
         </w:rPr>
         <w:t xml:space="preserve">Changelog</w:t>
+      </w:r>
+      <w:r>
+        <w:rPr>
+          <w:b/>
+        </w:rPr>
+        <w:t xml:space="preserve">18/07/2026 (11) — </w:t>
+      </w:r>
+      <w:r>
+        <w:rPr>
+          <w:b/>
+        </w:rPr>
+        <w:t xml:space="preserve">Pagamento stipendio → storico in Pagamenti</w:t>
+      </w:r>
+      <w:r>
+        <w:rPr>
+          <w:b/>
+        </w:rPr>
+        <w:t xml:space="preserve"> (feedback). Quando uno stipendio passa a </w:t>
+      </w:r>
+      <w:r>
+        <w:rPr>
+          <w:b/>
+        </w:rPr>
+        <w:t xml:space="preserve">Pagato</w:t>
+      </w:r>
+      <w:r>
+        <w:rPr>
+          <w:b/>
+        </w:rPr>
+        <w:t xml:space="preserve"> (dal bottone </w:t>
+      </w:r>
+      <w:r>
+        <w:rPr>
+          <w:b/>
+        </w:rPr>
+        <w:t xml:space="preserve">Paga</w:t>
+      </w:r>
+      <w:r>
+        <w:rPr>
+          <w:b/>
+        </w:rPr>
+        <w:t xml:space="preserve"> nelle Ricevute o da </w:t>
+      </w:r>
+      <w:r>
+        <w:rPr>
+          <w:b/>
+        </w:rPr>
+        <w:t xml:space="preserve">Segna pagato</w:t>
+      </w:r>
+      <w:r>
+        <w:rPr>
+          <w:b/>
+        </w:rPr>
+        <w:t xml:space="preserve"> in Stipendi → Archivio), viene creato automaticamente un record in </w:t>
+      </w:r>
+      <w:r>
+        <w:rPr>
+          <w:b/>
+        </w:rPr>
+        <w:t xml:space="preserve">Pagamenti</w:t>
+      </w:r>
+      <w:r>
+        <w:rPr>
+          <w:b/>
+        </w:rPr>
+        <w:t xml:space="preserve"> come storico: tipo </w:t>
+      </w:r>
+      <w:r>
+        <w:rPr>
+          <w:b/>
+        </w:rPr>
+        <w:t xml:space="preserve">Stipendio</w:t>
+      </w:r>
+      <w:r>
+        <w:rPr>
+          <w:b/>
+        </w:rPr>
+        <w:t xml:space="preserve">, importo = netto, stato </w:t>
+      </w:r>
+      <w:r>
+        <w:rPr>
+          <w:b/>
+        </w:rPr>
+        <w:t xml:space="preserve">Pagato</w:t>
+      </w:r>
+      <w:r>
+        <w:rPr>
+          <w:b/>
+        </w:rPr>
+        <w:t xml:space="preserve">, descrizione col periodo, collegato allo stipendio (</w:t>
+      </w:r>
+      <w:r>
+        <w:rPr>
+          <w:b/>
+        </w:rPr>
+        <w:t xml:space="preserve">Payment.salaryId</w:t>
+      </w:r>
+      <w:r>
+        <w:rPr>
+          <w:b/>
+        </w:rPr>
+        <w:t xml:space="preserve">). Creato una sola volta (idempotente sulla transizione a PAID). Nuovo tipo </w:t>
+      </w:r>
+      <w:r>
+        <w:rPr>
+          <w:b/>
+        </w:rPr>
+        <w:t xml:space="preserve">PaymentType.SALARY</w:t>
+      </w:r>
+      <w:r>
+        <w:rPr>
+          <w:b/>
+        </w:rPr>
+        <w:t xml:space="preserve">.</w:t>
       </w:r>
       <w:r>
         <w:rPr>

</xml_diff>

<commit_message>
Fatture: webhook inbound "fattura pagata" (x-api-key)
Un sistema esterno puo' segnalare alla piattaforma che una fattura e' stata pagata.

- POST /api/v1/invoices/webhook/paid, @Public() + WebhookApiKeyGuard (header x-api-key
  == INVOICE_WEBHOOK_API_KEY; env vuota o chiave errata -> 401)
- Body { id | number, paidAt? }: identifica per id o numero (FAT-anno-n) -> status PAID,
  archived, paidAt. Idempotente (gia_pagata), 404 se non trovata, 400 se manca id+number
- INVOICE_WEBHOOK_API_KEY in .env.example (placeholder, chiave reale non committata)

Verificato E2E: 401 senza/chiave errata, PAID by number, idempotente, 404 inesistente.

Co-Authored-By: Claude Fable 5 <noreply@anthropic.com>
</commit_message>
<xml_diff>
--- a/deluxy-platform-next/docs/COME-FUNZIONA-APP-DELUXY.docx
+++ b/deluxy-platform-next/docs/COME-FUNZIONA-APP-DELUXY.docx
@@ -169,6 +169,156 @@
           <w:b/>
         </w:rPr>
         <w:t xml:space="preserve">Changelog</w:t>
+      </w:r>
+      <w:r>
+        <w:rPr>
+          <w:b/>
+        </w:rPr>
+        <w:t xml:space="preserve">19/07/2026 (1) — </w:t>
+      </w:r>
+      <w:r>
+        <w:rPr>
+          <w:b/>
+        </w:rPr>
+        <w:t xml:space="preserve">Webhook «fattura pagata»</w:t>
+      </w:r>
+      <w:r>
+        <w:rPr>
+          <w:b/>
+        </w:rPr>
+        <w:t xml:space="preserve"> (API inbound). Un sistema esterno (contabilità/incassi) può segnalare alla piattaforma che una fattura è stata pagata chiamando </w:t>
+      </w:r>
+      <w:r>
+        <w:rPr>
+          <w:b/>
+        </w:rPr>
+        <w:t xml:space="preserve">POST /api/v1/invoices/webhook/paid</w:t>
+      </w:r>
+      <w:r>
+        <w:rPr>
+          <w:b/>
+        </w:rPr>
+        <w:t xml:space="preserve"> con header </w:t>
+      </w:r>
+      <w:r>
+        <w:rPr>
+          <w:b/>
+        </w:rPr>
+        <w:t xml:space="preserve">x-api-key: &lt;INVOICE_WEBHOOK_API_KEY&gt;</w:t>
+      </w:r>
+      <w:r>
+        <w:rPr>
+          <w:b/>
+        </w:rPr>
+        <w:t xml:space="preserve"> e body </w:t>
+      </w:r>
+      <w:r>
+        <w:rPr>
+          <w:b/>
+        </w:rPr>
+        <w:t xml:space="preserve">{ "number": "FAT-2026-3" }</w:t>
+      </w:r>
+      <w:r>
+        <w:rPr>
+          <w:b/>
+        </w:rPr>
+        <w:t xml:space="preserve"> (oppure </w:t>
+      </w:r>
+      <w:r>
+        <w:rPr>
+          <w:b/>
+        </w:rPr>
+        <w:t xml:space="preserve">{ "id": "…" }</w:t>
+      </w:r>
+      <w:r>
+        <w:rPr>
+          <w:b/>
+        </w:rPr>
+        <w:t xml:space="preserve">, con </w:t>
+      </w:r>
+      <w:r>
+        <w:rPr>
+          <w:b/>
+        </w:rPr>
+        <w:t xml:space="preserve">paidAt</w:t>
+      </w:r>
+      <w:r>
+        <w:rPr>
+          <w:b/>
+        </w:rPr>
+        <w:t xml:space="preserve"> opzionale ISO). La fattura passa a </w:t>
+      </w:r>
+      <w:r>
+        <w:rPr>
+          <w:b/>
+        </w:rPr>
+        <w:t xml:space="preserve">Pagata</w:t>
+      </w:r>
+      <w:r>
+        <w:rPr>
+          <w:b/>
+        </w:rPr>
+        <w:t xml:space="preserve"> e va in Storico. </w:t>
+      </w:r>
+      <w:r>
+        <w:rPr>
+          <w:b/>
+        </w:rPr>
+        <w:t xml:space="preserve">Idempotente</w:t>
+      </w:r>
+      <w:r>
+        <w:rPr>
+          <w:b/>
+        </w:rPr>
+        <w:t xml:space="preserve"> (se già pagata risponde </w:t>
+      </w:r>
+      <w:r>
+        <w:rPr>
+          <w:b/>
+        </w:rPr>
+        <w:t xml:space="preserve">esito: gia_pagata</w:t>
+      </w:r>
+      <w:r>
+        <w:rPr>
+          <w:b/>
+        </w:rPr>
+        <w:t xml:space="preserve">), </w:t>
+      </w:r>
+      <w:r>
+        <w:rPr>
+          <w:b/>
+        </w:rPr>
+        <w:t xml:space="preserve">401</w:t>
+      </w:r>
+      <w:r>
+        <w:rPr>
+          <w:b/>
+        </w:rPr>
+        <w:t xml:space="preserve"> senza/chiave errata, </w:t>
+      </w:r>
+      <w:r>
+        <w:rPr>
+          <w:b/>
+        </w:rPr>
+        <w:t xml:space="preserve">404</w:t>
+      </w:r>
+      <w:r>
+        <w:rPr>
+          <w:b/>
+        </w:rPr>
+        <w:t xml:space="preserve"> se la fattura non esiste. La chiave sta in </w:t>
+      </w:r>
+      <w:r>
+        <w:rPr>
+          <w:b/>
+        </w:rPr>
+        <w:t xml:space="preserve">INVOICE_WEBHOOK_API_KEY</w:t>
+      </w:r>
+      <w:r>
+        <w:rPr>
+          <w:b/>
+        </w:rPr>
+        <w:t xml:space="preserve"> (env, non committata; se assente il webhook è disattivato). Macchina-a-macchina: non richiede login utente.</w:t>
       </w:r>
       <w:r>
         <w:rPr>

</xml_diff>

<commit_message>
Fatturazione: ogni consegna da fatturare + dettaglio riga per riga
Feedback: ogni consegna dovrebbe comparire in fatturazione. Confermate le regole:
tutte le consegne billable del periodo (qualsiasi stato tranne annullata/non
consegnata) + fattura con dettaglio riga per riga.

Backend:
- generate: filtro billable + status notIn [cancelled, notDelivered] (prima solo
  delivered); crea una riga per consegna
- Nuovo modello InvoiceLine (deliveryId, date, recipient, description=indirizzo,
  amount=price+plus; Invoice.lines cascade); migrazione invoice_lines; findAll include lines

Frontend:
- Bottone Dettaglio per riga -> sotto-tabella Data/Destinatario/Indirizzo/Importo
- i18n invoices.line.*, action.detail/hideDetail, noLines (IT/EN 1032/1032)

Verificato E2E: partner con 2 consegne "Da gestire" 25 -> fattura 50 EUR, 2 consegne,
2 righe con dettaglio; in browser Dettaglio espande la sotto-tabella.

Co-Authored-By: Claude Fable 5 <noreply@anthropic.com>
</commit_message>
<xml_diff>
--- a/deluxy-platform-next/docs/COME-FUNZIONA-APP-DELUXY.docx
+++ b/deluxy-platform-next/docs/COME-FUNZIONA-APP-DELUXY.docx
@@ -169,6 +169,156 @@
           <w:b/>
         </w:rPr>
         <w:t xml:space="preserve">Changelog</w:t>
+      </w:r>
+      <w:r>
+        <w:rPr>
+          <w:b/>
+        </w:rPr>
+        <w:t xml:space="preserve">19/07/2026 (2) — </w:t>
+      </w:r>
+      <w:r>
+        <w:rPr>
+          <w:b/>
+        </w:rPr>
+        <w:t xml:space="preserve">Fatturazione: regola consegne + dettaglio riga per riga</w:t>
+      </w:r>
+      <w:r>
+        <w:rPr>
+          <w:b/>
+        </w:rPr>
+        <w:t xml:space="preserve"> (feedback). La generazione fattura ora include </w:t>
+      </w:r>
+      <w:r>
+        <w:rPr>
+          <w:b/>
+        </w:rPr>
+        <w:t xml:space="preserve">ogni consegna «da fatturare»</w:t>
+      </w:r>
+      <w:r>
+        <w:rPr>
+          <w:b/>
+        </w:rPr>
+        <w:t xml:space="preserve"> (</w:t>
+      </w:r>
+      <w:r>
+        <w:rPr>
+          <w:b/>
+        </w:rPr>
+        <w:t xml:space="preserve">billable</w:t>
+      </w:r>
+      <w:r>
+        <w:rPr>
+          <w:b/>
+        </w:rPr>
+        <w:t xml:space="preserve">) del partner nel periodo </w:t>
+      </w:r>
+      <w:r>
+        <w:rPr>
+          <w:b/>
+        </w:rPr>
+        <w:t xml:space="preserve">in qualsiasi stato tranne annullata/non consegnata</w:t>
+      </w:r>
+      <w:r>
+        <w:rPr>
+          <w:b/>
+        </w:rPr>
+        <w:t xml:space="preserve"> (prima solo le </w:t>
+      </w:r>
+      <w:r>
+        <w:rPr>
+          <w:b/>
+        </w:rPr>
+        <w:t xml:space="preserve">consegnate</w:t>
+      </w:r>
+      <w:r>
+        <w:rPr>
+          <w:b/>
+        </w:rPr>
+        <w:t xml:space="preserve">) — così anche le consegne </w:t>
+      </w:r>
+      <w:r>
+        <w:rPr>
+          <w:b/>
+        </w:rPr>
+        <w:t xml:space="preserve">Da gestire</w:t>
+      </w:r>
+      <w:r>
+        <w:rPr>
+          <w:b/>
+        </w:rPr>
+        <w:t xml:space="preserve"> compaiono. La fattura ha ora il </w:t>
+      </w:r>
+      <w:r>
+        <w:rPr>
+          <w:b/>
+        </w:rPr>
+        <w:t xml:space="preserve">dettaglio riga per riga</w:t>
+      </w:r>
+      <w:r>
+        <w:rPr>
+          <w:b/>
+        </w:rPr>
+        <w:t xml:space="preserve">: una riga per consegna con </w:t>
+      </w:r>
+      <w:r>
+        <w:rPr>
+          <w:b/>
+        </w:rPr>
+        <w:t xml:space="preserve">data, destinatario, indirizzo, importo</w:t>
+      </w:r>
+      <w:r>
+        <w:rPr>
+          <w:b/>
+        </w:rPr>
+        <w:t xml:space="preserve"> (</w:t>
+      </w:r>
+      <w:r>
+        <w:rPr>
+          <w:b/>
+        </w:rPr>
+        <w:t xml:space="preserve">price + additionalPrice</w:t>
+      </w:r>
+      <w:r>
+        <w:rPr>
+          <w:b/>
+        </w:rPr>
+        <w:t xml:space="preserve">); il totale è la somma delle righe. Nuovo modello </w:t>
+      </w:r>
+      <w:r>
+        <w:rPr>
+          <w:b/>
+        </w:rPr>
+        <w:t xml:space="preserve">InvoiceLine</w:t>
+      </w:r>
+      <w:r>
+        <w:rPr>
+          <w:b/>
+        </w:rPr>
+        <w:t xml:space="preserve"> (migrazione </w:t>
+      </w:r>
+      <w:r>
+        <w:rPr>
+          <w:b/>
+        </w:rPr>
+        <w:t xml:space="preserve">invoice_lines</w:t>
+      </w:r>
+      <w:r>
+        <w:rPr>
+          <w:b/>
+        </w:rPr>
+        <w:t xml:space="preserve">), snapshot al momento della generazione; in pagina il bottone </w:t>
+      </w:r>
+      <w:r>
+        <w:rPr>
+          <w:b/>
+        </w:rPr>
+        <w:t xml:space="preserve">Dettaglio</w:t>
+      </w:r>
+      <w:r>
+        <w:rPr>
+          <w:b/>
+        </w:rPr>
+        <w:t xml:space="preserve"> espande le righe sotto la fattura.</w:t>
       </w:r>
       <w:r>
         <w:rPr>

</xml_diff>

<commit_message>
Piattaforma: le liste si aggiornano da sole (30", educato); «Crea prodotto» del form visibile (CSS modale mancante); Duplica anche sullo storico; tabelle brioche
- web/core/auto-aggiornamento.ts: polling solo a scheda visibile, sospeso con pop-up/azioni, ricarica silenziosa (filtri e selezione restano)
- Consegne (+proposte partner), Vendite, Segnalazioni, Attività, Richieste, Ricevute
- delivery-form: stile overlay/dialog della finestra «Nuovo prodotto» (era invisibile in fondo alla pagina), mousedown.preventDefault sulla tendina prodotti
- delivery-detail: canDuplicate() separato da canEdit() (partner: ogni sua consegna tranne le vendite)
- api/scripts/tabella-prezzi-brioche.mjs (sola lettura)
- Docs: HANDOFF, COME-FUNZIONA (+docx), guida-visiva, SEGNALAZIONI-UX/PERFORMANCE

Co-Authored-By: Claude Fable 5.1 <noreply@anthropic.com>
</commit_message>
<xml_diff>
--- a/deluxy-platform-next/docs/COME-FUNZIONA-APP-DELUXY.docx
+++ b/deluxy-platform-next/docs/COME-FUNZIONA-APP-DELUXY.docx
@@ -24,7 +24,7 @@
           <w:color w:val="86868b"/>
           <w:sz w:val="18"/>
         </w:rPr>
-        <w:t xml:space="preserve">Word generato automaticamente dal manuale Markdown — 3 settembre 2026</w:t>
+        <w:t xml:space="preserve">Word generato automaticamente dal manuale Markdown — 4 settembre 2026</w:t>
       </w:r>
     </w:p>
     <w:p>
@@ -169,6 +169,60 @@
           <w:b/>
         </w:rPr>
         <w:t xml:space="preserve">Changelog</w:t>
+      </w:r>
+      <w:r>
+        <w:rPr>
+          <w:b/>
+        </w:rPr>
+        <w:t xml:space="preserve">04/09/2026 — </w:t>
+      </w:r>
+      <w:r>
+        <w:rPr>
+          <w:b/>
+        </w:rPr>
+        <w:t xml:space="preserve">L'app si aggiorna da sola</w:t>
+      </w:r>
+      <w:r>
+        <w:rPr>
+          <w:b/>
+        </w:rPr>
+        <w:t xml:space="preserve">: Consegne (e le proposte del partner), Vendite, Segnalazioni, Attività, Richieste e Ricevute si riallineano ogni </w:t>
+      </w:r>
+      <w:r>
+        <w:rPr>
+          <w:b/>
+        </w:rPr>
+        <w:t xml:space="preserve">30 secondi</w:t>
+      </w:r>
+      <w:r>
+        <w:rPr>
+          <w:b/>
+        </w:rPr>
+        <w:t xml:space="preserve"> senza ricaricare la pagina — solo con la scheda visibile, mai mentre un pop-up o un'azione sono aperti, senza rotellina e senza perdere filtri o selezione (§3.1, «Aggiornamento automatico»). </w:t>
+      </w:r>
+      <w:r>
+        <w:rPr>
+          <w:b/>
+        </w:rPr>
+        <w:t xml:space="preserve">«Crea prodotto» nel form consegna riparato</w:t>
+      </w:r>
+      <w:r>
+        <w:rPr>
+          <w:b/>
+        </w:rPr>
+        <w:t xml:space="preserve">: la finestra «Nuovo prodotto» non aveva lo stile della modale e finiva invisibile in fondo alla pagina (segnalato dal partner Chanel); la tendina prodotti non si chiude più prima del click. </w:t>
+      </w:r>
+      <w:r>
+        <w:rPr>
+          <w:b/>
+        </w:rPr>
+        <w:t xml:space="preserve">Duplica anche in visualizzazione sullo storico</w:t>
+      </w:r>
+      <w:r>
+        <w:rPr>
+          <w:b/>
+        </w:rPr>
+        <w:t xml:space="preserve">: nel dettaglio consegna il partner vede «Duplica» su ogni sua consegna (non sulle vendite), l'ufficio sempre — prima spariva insieme a «Modifica» da gialla in poi.</w:t>
       </w:r>
       <w:r>
         <w:rPr>
@@ -20385,6 +20439,206 @@
     </w:p>
     <w:p>
       <w:pPr>
+        <w:pStyle w:val="Heading4"/>
+        <w:spacing w:lineRule="auto"/>
+      </w:pPr>
+      <w:r>
+        <w:rPr/>
+        <w:t xml:space="preserve">Aggiornamento automatico delle liste </w:t>
+      </w:r>
+      <w:r>
+        <w:rPr>
+          <w:b/>
+        </w:rPr>
+        <w:t xml:space="preserve">[NUOVO 04/09/2026]</w:t>
+      </w:r>
+    </w:p>
+    <w:p>
+      <w:pPr>
+        <w:spacing w:lineRule="auto"/>
+      </w:pPr>
+      <w:r>
+        <w:rPr/>
+        <w:t xml:space="preserve">Regola dell'utente: «gli utenti non devono aggiornare le pagine per vedere nuove consegne, ordini ecc.». Le liste </w:t>
+      </w:r>
+      <w:r>
+        <w:rPr>
+          <w:b/>
+        </w:rPr>
+        <w:t xml:space="preserve">Consegne</w:t>
+      </w:r>
+      <w:r>
+        <w:rPr/>
+        <w:t xml:space="preserve"> (con le proposte in attesa del partner), </w:t>
+      </w:r>
+      <w:r>
+        <w:rPr>
+          <w:b/>
+        </w:rPr>
+        <w:t xml:space="preserve">Vendite</w:t>
+      </w:r>
+      <w:r>
+        <w:rPr/>
+        <w:t xml:space="preserve">, </w:t>
+      </w:r>
+      <w:r>
+        <w:rPr>
+          <w:b/>
+        </w:rPr>
+        <w:t xml:space="preserve">Segnalazioni</w:t>
+      </w:r>
+      <w:r>
+        <w:rPr/>
+        <w:t xml:space="preserve">, </w:t>
+      </w:r>
+      <w:r>
+        <w:rPr>
+          <w:b/>
+        </w:rPr>
+        <w:t xml:space="preserve">Attività</w:t>
+      </w:r>
+      <w:r>
+        <w:rPr/>
+        <w:t xml:space="preserve">, </w:t>
+      </w:r>
+      <w:r>
+        <w:rPr>
+          <w:b/>
+        </w:rPr>
+        <w:t xml:space="preserve">Richieste</w:t>
+      </w:r>
+      <w:r>
+        <w:rPr/>
+        <w:t xml:space="preserve"> e </w:t>
+      </w:r>
+      <w:r>
+        <w:rPr>
+          <w:b/>
+        </w:rPr>
+        <w:t xml:space="preserve">Ricevute</w:t>
+      </w:r>
+      <w:r>
+        <w:rPr/>
+        <w:t xml:space="preserve"> si riallineano da sole ogni </w:t>
+      </w:r>
+      <w:r>
+        <w:rPr>
+          <w:b/>
+        </w:rPr>
+        <w:t xml:space="preserve">30 secondi</w:t>
+      </w:r>
+      <w:r>
+        <w:rPr/>
+        <w:t xml:space="preserve"> (</w:t>
+      </w:r>
+      <w:r>
+        <w:rPr/>
+        <w:t xml:space="preserve">web/src/app/core/auto-aggiornamento.ts</w:t>
+      </w:r>
+      <w:r>
+        <w:rPr/>
+        <w:t xml:space="preserve">, </w:t>
+      </w:r>
+      <w:r>
+        <w:rPr/>
+        <w:t xml:space="preserve">avviaAutoAggiornamento</w:t>
+      </w:r>
+      <w:r>
+        <w:rPr/>
+        <w:t xml:space="preserve">). È lo stesso «tempo reale» della chat e dei pallini: un polling, senza websocket.</w:t>
+      </w:r>
+    </w:p>
+    <w:p>
+      <w:pPr>
+        <w:numPr>
+          <w:ilvl w:val="0"/>
+          <w:numId w:val="43"/>
+        </w:numPr>
+        <w:spacing w:lineRule="auto"/>
+      </w:pPr>
+      <w:r>
+        <w:rPr>
+          <w:b/>
+        </w:rPr>
+        <w:t xml:space="preserve">Solo a scheda visibile</w:t>
+      </w:r>
+      <w:r>
+        <w:rPr/>
+        <w:t xml:space="preserve">: una scheda in secondo piano non chiede nulla; tornandoci si riallinea subito.</w:t>
+      </w:r>
+    </w:p>
+    <w:p>
+      <w:pPr>
+        <w:numPr>
+          <w:ilvl w:val="0"/>
+          <w:numId w:val="43"/>
+        </w:numPr>
+        <w:spacing w:lineRule="auto"/>
+      </w:pPr>
+      <w:r>
+        <w:rPr>
+          <w:b/>
+        </w:rPr>
+        <w:t xml:space="preserve">Mai sotto le mani</w:t>
+      </w:r>
+      <w:r>
+        <w:rPr/>
+        <w:t xml:space="preserve">: il giro si salta se è aperto un pop-up (assegna, stato, plus, segnalazione, conferma), un'azione di massa, una modifica in linea (Vendite), il form «Nuova» (Segnalazioni/Richieste), il pannello firma (Ricevute) o se una chiamata è ancora in corso.</w:t>
+      </w:r>
+    </w:p>
+    <w:p>
+      <w:pPr>
+        <w:numPr>
+          <w:ilvl w:val="0"/>
+          <w:numId w:val="43"/>
+        </w:numPr>
+        <w:spacing w:lineRule="auto"/>
+      </w:pPr>
+      <w:r>
+        <w:rPr>
+          <w:b/>
+        </w:rPr>
+        <w:t xml:space="preserve">Silenzioso</w:t>
+      </w:r>
+      <w:r>
+        <w:rPr/>
+        <w:t xml:space="preserve">: niente rotellina, filtri, pagina e ordinamento restano; in Consegne la selezione multipla resta e si pota solo degli id usciti dalla pagina; un errore di rete nel giro silenzioso non sporca la pagina (riprova al giro dopo).</w:t>
+      </w:r>
+    </w:p>
+    <w:p>
+      <w:pPr>
+        <w:numPr>
+          <w:ilvl w:val="0"/>
+          <w:numId w:val="43"/>
+        </w:numPr>
+        <w:spacing w:lineRule="auto"/>
+      </w:pPr>
+      <w:r>
+        <w:rPr>
+          <w:b/>
+        </w:rPr>
+        <w:t xml:space="preserve">Non incluse</w:t>
+      </w:r>
+      <w:r>
+        <w:rPr/>
+        <w:t xml:space="preserve"> Stipendi e Fatturazione: pagine batch pesanti («Da pagare» carica 36.642 consegne), si ricaricano a mano.</w:t>
+      </w:r>
+    </w:p>
+    <w:p>
+      <w:pPr>
+        <w:numPr>
+          <w:ilvl w:val="0"/>
+          <w:numId w:val="43"/>
+        </w:numPr>
+        <w:spacing w:lineRule="auto"/>
+      </w:pPr>
+      <w:r>
+        <w:rPr/>
+        <w:t xml:space="preserve">Peso dichiarato (registro PERFORMANCE): Consegne 31 KB per 20 righe (misura del 24/08) ogni 30″ per scheda aperta.</w:t>
+      </w:r>
+    </w:p>
+    <w:p>
+      <w:pPr>
         <w:pStyle w:val="Heading2"/>
         <w:spacing w:lineRule="auto"/>
       </w:pPr>
@@ -21561,7 +21815,7 @@
       <w:pPr>
         <w:numPr>
           <w:ilvl w:val="0"/>
-          <w:numId w:val="43"/>
+          <w:numId w:val="44"/>
         </w:numPr>
         <w:spacing w:lineRule="auto"/>
       </w:pPr>
@@ -21582,301 +21836,6 @@
       <w:r>
         <w:rPr/>
         <w:t xml:space="preserve"> (ambiente sandbox: dev.deluxy.it).</w:t>
-      </w:r>
-    </w:p>
-    <w:p>
-      <w:pPr>
-        <w:numPr>
-          <w:ilvl w:val="0"/>
-          <w:numId w:val="43"/>
-        </w:numPr>
-        <w:spacing w:lineRule="auto"/>
-      </w:pPr>
-      <w:r>
-        <w:rPr>
-          <w:b/>
-        </w:rPr>
-        <w:t xml:space="preserve">Autenticazione JWT</w:t>
-      </w:r>
-      <w:r>
-        <w:rPr/>
-        <w:t xml:space="preserve">: login → access token con ruoli (admin/expert/partner/operation); </w:t>
-      </w:r>
-      <w:r>
-        <w:rPr/>
-        <w:t xml:space="preserve">/api/users/me</w:t>
-      </w:r>
-      <w:r>
-        <w:rPr/>
-        <w:t xml:space="preserve"> restituisce l'utente corrente.</w:t>
-      </w:r>
-    </w:p>
-    <w:p>
-      <w:pPr>
-        <w:numPr>
-          <w:ilvl w:val="0"/>
-          <w:numId w:val="43"/>
-        </w:numPr>
-        <w:spacing w:lineRule="auto"/>
-      </w:pPr>
-      <w:r>
-        <w:rPr>
-          <w:b/>
-        </w:rPr>
-        <w:t xml:space="preserve">Convenzioni note</w:t>
-      </w:r>
-      <w:r>
-        <w:rPr/>
-        <w:t xml:space="preserve">: il valet è "expert" (es. </w:t>
-      </w:r>
-      <w:r>
-        <w:rPr/>
-        <w:t xml:space="preserve">/api/experts/delivery/experts</w:t>
-      </w:r>
-      <w:r>
-        <w:rPr/>
-        <w:t xml:space="preserve">); i codici piattaforma vendita sono </w:t>
-      </w:r>
-      <w:r>
-        <w:rPr/>
-        <w:t xml:space="preserve">shopifysale</w:t>
-      </w:r>
-      <w:r>
-        <w:rPr/>
-        <w:t xml:space="preserve">, </w:t>
-      </w:r>
-      <w:r>
-        <w:rPr/>
-        <w:t xml:space="preserve">cakesales</w:t>
-      </w:r>
-      <w:r>
-        <w:rPr/>
-        <w:t xml:space="preserve">, </w:t>
-      </w:r>
-      <w:r>
-        <w:rPr/>
-        <w:t xml:space="preserve">businesssales</w:t>
-      </w:r>
-      <w:r>
-        <w:rPr/>
-        <w:t xml:space="preserve">, </w:t>
-      </w:r>
-      <w:r>
-        <w:rPr/>
-        <w:t xml:space="preserve">flowerssales</w:t>
-      </w:r>
-      <w:r>
-        <w:rPr/>
-        <w:t xml:space="preserve">, </w:t>
-      </w:r>
-      <w:r>
-        <w:rPr/>
-        <w:t xml:space="preserve">deluxyexperiencesales</w:t>
-      </w:r>
-      <w:r>
-        <w:rPr/>
-        <w:t xml:space="preserve">, </w:t>
-      </w:r>
-      <w:r>
-        <w:rPr/>
-        <w:t xml:space="preserve">deluxydotcomsales</w:t>
-      </w:r>
-      <w:r>
-        <w:rPr/>
-        <w:t xml:space="preserve">; gli stati consegna sono </w:t>
-      </w:r>
-      <w:r>
-        <w:rPr/>
-        <w:t xml:space="preserve">created</w:t>
-      </w:r>
-      <w:r>
-        <w:rPr/>
-        <w:t xml:space="preserve">, </w:t>
-      </w:r>
-      <w:r>
-        <w:rPr/>
-        <w:t xml:space="preserve">assigned</w:t>
-      </w:r>
-      <w:r>
-        <w:rPr/>
-        <w:t xml:space="preserve">, </w:t>
-      </w:r>
-      <w:r>
-        <w:rPr/>
-        <w:t xml:space="preserve">delivering</w:t>
-      </w:r>
-      <w:r>
-        <w:rPr/>
-        <w:t xml:space="preserve">, </w:t>
-      </w:r>
-      <w:r>
-        <w:rPr/>
-        <w:t xml:space="preserve">inPreparation</w:t>
-      </w:r>
-      <w:r>
-        <w:rPr/>
-        <w:t xml:space="preserve">, </w:t>
-      </w:r>
-      <w:r>
-        <w:rPr/>
-        <w:t xml:space="preserve">accepted</w:t>
-      </w:r>
-      <w:r>
-        <w:rPr/>
-        <w:t xml:space="preserve">, </w:t>
-      </w:r>
-      <w:r>
-        <w:rPr/>
-        <w:t xml:space="preserve">requestCancellation</w:t>
-      </w:r>
-      <w:r>
-        <w:rPr/>
-        <w:t xml:space="preserve"> (+</w:t>
-      </w:r>
-      <w:r>
-        <w:rPr/>
-        <w:t xml:space="preserve">delivered</w:t>
-      </w:r>
-      <w:r>
-        <w:rPr/>
-        <w:t xml:space="preserve">, </w:t>
-      </w:r>
-      <w:r>
-        <w:rPr/>
-        <w:t xml:space="preserve">notDelivered</w:t>
-      </w:r>
-      <w:r>
-        <w:rPr/>
-        <w:t xml:space="preserve">, </w:t>
-      </w:r>
-      <w:r>
-        <w:rPr/>
-        <w:t xml:space="preserve">cancelled</w:t>
-      </w:r>
-      <w:r>
-        <w:rPr/>
-        <w:t xml:space="preserve"> in storico); i tipi servizio sono </w:t>
-      </w:r>
-      <w:r>
-        <w:rPr/>
-        <w:t xml:space="preserve">sales</w:t>
-      </w:r>
-      <w:r>
-        <w:rPr/>
-        <w:t xml:space="preserve">, </w:t>
-      </w:r>
-      <w:r>
-        <w:rPr/>
-        <w:t xml:space="preserve">hourlyrate</w:t>
-      </w:r>
-      <w:r>
-        <w:rPr/>
-        <w:t xml:space="preserve">, </w:t>
-      </w:r>
-      <w:r>
-        <w:rPr/>
-        <w:t xml:space="preserve">fixedprice</w:t>
-      </w:r>
-      <w:r>
-        <w:rPr/>
-        <w:t xml:space="preserve">, </w:t>
-      </w:r>
-      <w:r>
-        <w:rPr/>
-        <w:t xml:space="preserve">corporate</w:t>
-      </w:r>
-      <w:r>
-        <w:rPr/>
-        <w:t xml:space="preserve">, </w:t>
-      </w:r>
-      <w:r>
-        <w:rPr/>
-        <w:t xml:space="preserve">warehouseservice</w:t>
-      </w:r>
-      <w:r>
-        <w:rPr/>
-        <w:t xml:space="preserve">.</w:t>
-      </w:r>
-    </w:p>
-    <w:p>
-      <w:pPr>
-        <w:numPr>
-          <w:ilvl w:val="0"/>
-          <w:numId w:val="43"/>
-        </w:numPr>
-        <w:spacing w:lineRule="auto"/>
-      </w:pPr>
-      <w:r>
-        <w:rPr>
-          <w:b/>
-        </w:rPr>
-        <w:t xml:space="preserve">API key partner</w:t>
-      </w:r>
-      <w:r>
-        <w:rPr/>
-        <w:t xml:space="preserve"> (WooCommerce) generabile in autonomia dalla scheda partner; garantisce l'accesso alle API di invio ordini.</w:t>
-      </w:r>
-    </w:p>
-    <w:p>
-      <w:pPr>
-        <w:pStyle w:val="Heading3"/>
-        <w:spacing w:lineRule="auto"/>
-      </w:pPr>
-      <w:r>
-        <w:rPr/>
-        <w:t xml:space="preserve">La città è coperta? — rotta pubblica per i siti Shopify (</w:t>
-      </w:r>
-      <w:r>
-        <w:rPr/>
-        <w:t xml:space="preserve">/api/province-cities</w:t>
-      </w:r>
-      <w:r>
-        <w:rPr/>
-        <w:t xml:space="preserve">) </w:t>
-      </w:r>
-      <w:r>
-        <w:rPr>
-          <w:b/>
-        </w:rPr>
-        <w:t xml:space="preserve">[RINATA 03/09/2026]</w:t>
-      </w:r>
-    </w:p>
-    <w:p>
-      <w:pPr>
-        <w:spacing w:lineRule="auto"/>
-      </w:pPr>
-      <w:r>
-        <w:rPr/>
-        <w:t xml:space="preserve">Il tema di </w:t>
-      </w:r>
-      <w:r>
-        <w:rPr>
-          <w:b/>
-        </w:rPr>
-        <w:t xml:space="preserve">deluxy.it</w:t>
-      </w:r>
-      <w:r>
-        <w:rPr/>
-        <w:t xml:space="preserve">, per i prodotti </w:t>
-      </w:r>
-      <w:r>
-        <w:rPr/>
-        <w:t xml:space="preserve">non unici</w:t>
-      </w:r>
-      <w:r>
-        <w:rPr/>
-        <w:t xml:space="preserve"> (rose, bouquet, champagne, set…), prima di mettere nel carrello chiede alla piattaforma se la città dell'indirizzo è coperta:</w:t>
-      </w:r>
-    </w:p>
-    <w:p>
-      <w:pPr>
-        <w:spacing w:lineRule="auto"/>
-      </w:pPr>
-      <w:r>
-        <w:rPr>
-          <w:rFonts w:ascii="Courier" w:hAnsi="Courier"/>
-        </w:rPr>
-        <w:t xml:space="preserve">GET https://app.deluxy.it/api/province-cities/MI/Milano      → true GET https://app.deluxy.it/api/province-cities/MI/Rescaldina  → false </w:t>
       </w:r>
     </w:p>
     <w:p>
@@ -21891,17 +21850,19 @@
         <w:rPr>
           <w:b/>
         </w:rPr>
-        <w:t xml:space="preserve">Fuori dal prefisso </w:t>
-      </w:r>
-      <w:r>
-        <w:rPr>
-          <w:b/>
-        </w:rPr>
-        <w:t xml:space="preserve">/api/v1</w:t>
-      </w:r>
-      <w:r>
-        <w:rPr/>
-        <w:t xml:space="preserve">, perché è l'indirizzo che il tema chiama dai tempi del backend legacy (spento il 31/08/2026): cambiarlo avrebbe voluto dire toccare il tema Shopify. Dal 31/08 al 03/09 la rotta non esisteva e il pulsante «Acquista» dei prodotti non unici non faceva nulla.</w:t>
+        <w:t xml:space="preserve">Autenticazione JWT</w:t>
+      </w:r>
+      <w:r>
+        <w:rPr/>
+        <w:t xml:space="preserve">: login → access token con ruoli (admin/expert/partner/operation); </w:t>
+      </w:r>
+      <w:r>
+        <w:rPr/>
+        <w:t xml:space="preserve">/api/users/me</w:t>
+      </w:r>
+      <w:r>
+        <w:rPr/>
+        <w:t xml:space="preserve"> restituisce l'utente corrente.</w:t>
       </w:r>
     </w:p>
     <w:p>
@@ -21916,29 +21877,179 @@
         <w:rPr>
           <w:b/>
         </w:rPr>
-        <w:t xml:space="preserve">Pubblica, sola lettura, un booleano</w:t>
-      </w:r>
-      <w:r>
-        <w:rPr/>
-        <w:t xml:space="preserve">: </w:t>
-      </w:r>
-      <w:r>
-        <w:rPr/>
-        <w:t xml:space="preserve">true</w:t>
-      </w:r>
-      <w:r>
-        <w:rPr/>
-        <w:t xml:space="preserve"> se il nome (senza maiuscole né accenti) è fra le città della provincia in </w:t>
-      </w:r>
-      <w:r>
-        <w:rPr>
-          <w:b/>
-        </w:rPr>
-        <w:t xml:space="preserve">Configurazione → Province</w:t>
-      </w:r>
-      <w:r>
-        <w:rPr/>
-        <w:t xml:space="preserve"> (le 46 importate dal legacy: Milano e hinterland, Como, Monza, Roma, Firenze, Varese, Pavia, Bergamo, Lodi). Per coprire una città nuova basta aggiungerla lì: il sito la vede entro un'ora (cache sul bordo).</w:t>
+        <w:t xml:space="preserve">Convenzioni note</w:t>
+      </w:r>
+      <w:r>
+        <w:rPr/>
+        <w:t xml:space="preserve">: il valet è "expert" (es. </w:t>
+      </w:r>
+      <w:r>
+        <w:rPr/>
+        <w:t xml:space="preserve">/api/experts/delivery/experts</w:t>
+      </w:r>
+      <w:r>
+        <w:rPr/>
+        <w:t xml:space="preserve">); i codici piattaforma vendita sono </w:t>
+      </w:r>
+      <w:r>
+        <w:rPr/>
+        <w:t xml:space="preserve">shopifysale</w:t>
+      </w:r>
+      <w:r>
+        <w:rPr/>
+        <w:t xml:space="preserve">, </w:t>
+      </w:r>
+      <w:r>
+        <w:rPr/>
+        <w:t xml:space="preserve">cakesales</w:t>
+      </w:r>
+      <w:r>
+        <w:rPr/>
+        <w:t xml:space="preserve">, </w:t>
+      </w:r>
+      <w:r>
+        <w:rPr/>
+        <w:t xml:space="preserve">businesssales</w:t>
+      </w:r>
+      <w:r>
+        <w:rPr/>
+        <w:t xml:space="preserve">, </w:t>
+      </w:r>
+      <w:r>
+        <w:rPr/>
+        <w:t xml:space="preserve">flowerssales</w:t>
+      </w:r>
+      <w:r>
+        <w:rPr/>
+        <w:t xml:space="preserve">, </w:t>
+      </w:r>
+      <w:r>
+        <w:rPr/>
+        <w:t xml:space="preserve">deluxyexperiencesales</w:t>
+      </w:r>
+      <w:r>
+        <w:rPr/>
+        <w:t xml:space="preserve">, </w:t>
+      </w:r>
+      <w:r>
+        <w:rPr/>
+        <w:t xml:space="preserve">deluxydotcomsales</w:t>
+      </w:r>
+      <w:r>
+        <w:rPr/>
+        <w:t xml:space="preserve">; gli stati consegna sono </w:t>
+      </w:r>
+      <w:r>
+        <w:rPr/>
+        <w:t xml:space="preserve">created</w:t>
+      </w:r>
+      <w:r>
+        <w:rPr/>
+        <w:t xml:space="preserve">, </w:t>
+      </w:r>
+      <w:r>
+        <w:rPr/>
+        <w:t xml:space="preserve">assigned</w:t>
+      </w:r>
+      <w:r>
+        <w:rPr/>
+        <w:t xml:space="preserve">, </w:t>
+      </w:r>
+      <w:r>
+        <w:rPr/>
+        <w:t xml:space="preserve">delivering</w:t>
+      </w:r>
+      <w:r>
+        <w:rPr/>
+        <w:t xml:space="preserve">, </w:t>
+      </w:r>
+      <w:r>
+        <w:rPr/>
+        <w:t xml:space="preserve">inPreparation</w:t>
+      </w:r>
+      <w:r>
+        <w:rPr/>
+        <w:t xml:space="preserve">, </w:t>
+      </w:r>
+      <w:r>
+        <w:rPr/>
+        <w:t xml:space="preserve">accepted</w:t>
+      </w:r>
+      <w:r>
+        <w:rPr/>
+        <w:t xml:space="preserve">, </w:t>
+      </w:r>
+      <w:r>
+        <w:rPr/>
+        <w:t xml:space="preserve">requestCancellation</w:t>
+      </w:r>
+      <w:r>
+        <w:rPr/>
+        <w:t xml:space="preserve"> (+</w:t>
+      </w:r>
+      <w:r>
+        <w:rPr/>
+        <w:t xml:space="preserve">delivered</w:t>
+      </w:r>
+      <w:r>
+        <w:rPr/>
+        <w:t xml:space="preserve">, </w:t>
+      </w:r>
+      <w:r>
+        <w:rPr/>
+        <w:t xml:space="preserve">notDelivered</w:t>
+      </w:r>
+      <w:r>
+        <w:rPr/>
+        <w:t xml:space="preserve">, </w:t>
+      </w:r>
+      <w:r>
+        <w:rPr/>
+        <w:t xml:space="preserve">cancelled</w:t>
+      </w:r>
+      <w:r>
+        <w:rPr/>
+        <w:t xml:space="preserve"> in storico); i tipi servizio sono </w:t>
+      </w:r>
+      <w:r>
+        <w:rPr/>
+        <w:t xml:space="preserve">sales</w:t>
+      </w:r>
+      <w:r>
+        <w:rPr/>
+        <w:t xml:space="preserve">, </w:t>
+      </w:r>
+      <w:r>
+        <w:rPr/>
+        <w:t xml:space="preserve">hourlyrate</w:t>
+      </w:r>
+      <w:r>
+        <w:rPr/>
+        <w:t xml:space="preserve">, </w:t>
+      </w:r>
+      <w:r>
+        <w:rPr/>
+        <w:t xml:space="preserve">fixedprice</w:t>
+      </w:r>
+      <w:r>
+        <w:rPr/>
+        <w:t xml:space="preserve">, </w:t>
+      </w:r>
+      <w:r>
+        <w:rPr/>
+        <w:t xml:space="preserve">corporate</w:t>
+      </w:r>
+      <w:r>
+        <w:rPr/>
+        <w:t xml:space="preserve">, </w:t>
+      </w:r>
+      <w:r>
+        <w:rPr/>
+        <w:t xml:space="preserve">warehouseservice</w:t>
+      </w:r>
+      <w:r>
+        <w:rPr/>
+        <w:t xml:space="preserve">.</w:t>
       </w:r>
     </w:p>
     <w:p>
@@ -21953,219 +22064,62 @@
         <w:rPr>
           <w:b/>
         </w:rPr>
-        <w:t xml:space="preserve">CORS</w:t>
-      </w:r>
-      <w:r>
-        <w:rPr/>
-        <w:t xml:space="preserve"> solo per gli origin dei siti Deluxy (</w:t>
-      </w:r>
-      <w:r>
-        <w:rPr/>
+        <w:t xml:space="preserve">API key partner</w:t>
+      </w:r>
+      <w:r>
+        <w:rPr/>
+        <w:t xml:space="preserve"> (WooCommerce) generabile in autonomia dalla scheda partner; garantisce l'accesso alle API di invio ordini.</w:t>
+      </w:r>
+    </w:p>
+    <w:p>
+      <w:pPr>
+        <w:pStyle w:val="Heading3"/>
+        <w:spacing w:lineRule="auto"/>
+      </w:pPr>
+      <w:r>
+        <w:rPr/>
+        <w:t xml:space="preserve">La città è coperta? — rotta pubblica per i siti Shopify (</w:t>
+      </w:r>
+      <w:r>
+        <w:rPr/>
+        <w:t xml:space="preserve">/api/province-cities</w:t>
+      </w:r>
+      <w:r>
+        <w:rPr/>
+        <w:t xml:space="preserve">) </w:t>
+      </w:r>
+      <w:r>
+        <w:rPr>
+          <w:b/>
+        </w:rPr>
+        <w:t xml:space="preserve">[RINATA 03/09/2026]</w:t>
+      </w:r>
+    </w:p>
+    <w:p>
+      <w:pPr>
+        <w:spacing w:lineRule="auto"/>
+      </w:pPr>
+      <w:r>
+        <w:rPr/>
+        <w:t xml:space="preserve">Il tema di </w:t>
+      </w:r>
+      <w:r>
+        <w:rPr>
+          <w:b/>
+        </w:rPr>
         <w:t xml:space="preserve">deluxy.it</w:t>
       </w:r>
       <w:r>
         <w:rPr/>
-        <w:t xml:space="preserve">, </w:t>
-      </w:r>
-      <w:r>
-        <w:rPr/>
-        <w:t xml:space="preserve">www.deluxy.it</w:t>
-      </w:r>
-      <w:r>
-        <w:rPr/>
-        <w:t xml:space="preserve">, </w:t>
-      </w:r>
-      <w:r>
-        <w:rPr/>
-        <w:t xml:space="preserve">deluxygifts.myshopify.com</w:t>
-      </w:r>
-      <w:r>
-        <w:rPr/>
-        <w:t xml:space="preserve">, più quelli in </w:t>
-      </w:r>
-      <w:r>
-        <w:rPr/>
-        <w:t xml:space="preserve">CORS_SITI_ORIGINS</w:t>
-      </w:r>
-      <w:r>
-        <w:rPr/>
-        <w:t xml:space="preserve">); risponde anche al preflight </w:t>
-      </w:r>
-      <w:r>
-        <w:rPr/>
-        <w:t xml:space="preserve">OPTIONS</w:t>
-      </w:r>
-      <w:r>
-        <w:rPr/>
-        <w:t xml:space="preserve">.</w:t>
-      </w:r>
-    </w:p>
-    <w:p>
-      <w:pPr>
-        <w:pStyle w:val="Heading3"/>
-        <w:spacing w:lineRule="auto"/>
-      </w:pPr>
-      <w:r>
-        <w:rPr/>
-        <w:t xml:space="preserve">Richieste (</w:t>
-      </w:r>
-      <w:r>
-        <w:rPr/>
-        <w:t xml:space="preserve">/richieste</w:t>
-      </w:r>
-      <w:r>
-        <w:rPr/>
-        <w:t xml:space="preserve">) </w:t>
-      </w:r>
-      <w:r>
-        <w:rPr>
-          <w:b/>
-        </w:rPr>
-        <w:t xml:space="preserve">[NUOVO 28/08/2026]</w:t>
-      </w:r>
-    </w:p>
-    <w:p>
-      <w:pPr>
-        <w:spacing w:lineRule="auto"/>
-      </w:pPr>
-      <w:r>
-        <w:rPr>
-          <w:b/>
-        </w:rPr>
-        <w:t xml:space="preserve">Operatività → Richieste</w:t>
-      </w:r>
-      <w:r>
-        <w:rPr/>
-        <w:t xml:space="preserve">, per </w:t>
-      </w:r>
-      <w:r>
-        <w:rPr>
-          <w:b/>
-        </w:rPr>
-        <w:t xml:space="preserve">Admin</w:t>
-      </w:r>
-      <w:r>
-        <w:rPr/>
-        <w:t xml:space="preserve"> e </w:t>
-      </w:r>
-      <w:r>
-        <w:rPr>
-          <w:b/>
-        </w:rPr>
-        <w:t xml:space="preserve">Operation</w:t>
-      </w:r>
-      <w:r>
-        <w:rPr/>
-        <w:t xml:space="preserve"> — e il </w:t>
-      </w:r>
-      <w:r>
-        <w:rPr>
-          <w:b/>
-        </w:rPr>
-        <w:t xml:space="preserve">Customer Service</w:t>
-      </w:r>
-      <w:r>
-        <w:rPr/>
-        <w:t xml:space="preserve"> è un Operation (</w:t>
-      </w:r>
-      <w:r>
-        <w:rPr/>
-        <w:t xml:space="preserve">operationRole = customer_service</w:t>
-      </w:r>
-      <w:r>
-        <w:rPr/>
-        <w:t xml:space="preserve">), quindi è già dentro senza un ruolo nuovo.</w:t>
-      </w:r>
-    </w:p>
-    <w:p>
-      <w:pPr>
-        <w:spacing w:lineRule="auto"/>
-      </w:pPr>
-      <w:r>
-        <w:rPr/>
-        <w:t xml:space="preserve">È la </w:t>
-      </w:r>
-      <w:r>
-        <w:rPr>
-          <w:b/>
-        </w:rPr>
-        <w:t xml:space="preserve">posta in arrivo delle domande di consegna</w:t>
-      </w:r>
-      <w:r>
-        <w:rPr/>
-        <w:t xml:space="preserve"> scritte a parole dalle altre app di Deluxy. Chi manda — il Customer Service da una chat, Scout da una visita, un fornitore al telefono — </w:t>
-      </w:r>
-      <w:r>
-        <w:rPr>
-          <w:b/>
-        </w:rPr>
-        <w:t xml:space="preserve">non compila un modulo di venti campi che non ha sotto mano</w:t>
-      </w:r>
-      <w:r>
-        <w:rPr/>
-        <w:t xml:space="preserve">: scrive quello che sa, e qui una persona legge e decide.</w:t>
-      </w:r>
-    </w:p>
-    <w:p>
-      <w:pPr>
-        <w:spacing w:lineRule="auto"/>
-      </w:pPr>
-      <w:r>
-        <w:rPr/>
-        <w:t xml:space="preserve">⚠️ </w:t>
-      </w:r>
-      <w:r>
-        <w:rPr>
-          <w:b/>
-        </w:rPr>
-        <w:t xml:space="preserve">Una richiesta non è una consegna: è una domanda.</w:t>
-      </w:r>
-      <w:r>
-        <w:rPr/>
-        <w:t xml:space="preserve"> Nasce </w:t>
-      </w:r>
-      <w:r>
-        <w:rPr/>
-        <w:t xml:space="preserve">nuova</w:t>
-      </w:r>
-      <w:r>
-        <w:rPr/>
-        <w:t xml:space="preserve"> e diventa una consegna </w:t>
-      </w:r>
-      <w:r>
-        <w:rPr>
-          <w:b/>
-        </w:rPr>
-        <w:t xml:space="preserve">solo quando qualcuno la accetta</w:t>
-      </w:r>
-      <w:r>
-        <w:rPr/>
-        <w:t xml:space="preserve">. Farla diventare consegna da sola vorrebbe dire mandare un valet su un indirizzo che nessuno ha riletto — e il giro dei valet costa denaro vero.</w:t>
-      </w:r>
-    </w:p>
-    <w:p>
-      <w:pPr>
-        <w:spacing w:lineRule="auto"/>
-      </w:pPr>
-      <w:r>
-        <w:rPr>
-          <w:b/>
-        </w:rPr>
-        <w:t xml:space="preserve">Come arriva.</w:t>
-      </w:r>
-      <w:r>
-        <w:rPr/>
-        <w:t xml:space="preserve"> Sul canale app-to-app, con una chiave di </w:t>
-      </w:r>
-      <w:r>
-        <w:rPr>
-          <w:b/>
-        </w:rPr>
-        <w:t xml:space="preserve">scrittura</w:t>
-      </w:r>
-      <w:r>
-        <w:rPr/>
-        <w:t xml:space="preserve">:</w:t>
+        <w:t xml:space="preserve">, per i prodotti </w:t>
+      </w:r>
+      <w:r>
+        <w:rPr/>
+        <w:t xml:space="preserve">non unici</w:t>
+      </w:r>
+      <w:r>
+        <w:rPr/>
+        <w:t xml:space="preserve"> (rose, bouquet, champagne, set…), prima di mettere nel carrello chiede alla piattaforma se la città dell'indirizzo è coperta:</w:t>
       </w:r>
     </w:p>
     <w:p>
@@ -22176,7 +22130,7 @@
         <w:rPr>
           <w:rFonts w:ascii="Courier" w:hAnsi="Courier"/>
         </w:rPr>
-        <w:t xml:space="preserve">POST /api/v1/app/richieste       x-api-key: &lt;chiave con scrittura&gt; { "testo": "…", "riferimento": "ORD-1234", "contatto": "marta@…" } </w:t>
+        <w:t xml:space="preserve">GET https://app.deluxy.it/api/province-cities/MI/Milano      → true GET https://app.deluxy.it/api/province-cities/MI/Rescaldina  → false </w:t>
       </w:r>
     </w:p>
     <w:p>
@@ -22188,26 +22142,20 @@
         <w:spacing w:lineRule="auto"/>
       </w:pPr>
       <w:r>
-        <w:rPr/>
-        <w:t xml:space="preserve">Una chiave di </w:t>
-      </w:r>
-      <w:r>
-        <w:rPr>
-          <w:b/>
-        </w:rPr>
-        <w:t xml:space="preserve">sola lettura viene rifiutata</w:t>
-      </w:r>
-      <w:r>
-        <w:rPr/>
-        <w:t xml:space="preserve"> (</w:t>
-      </w:r>
-      <w:r>
-        <w:rPr/>
-        <w:t xml:space="preserve">401</w:t>
-      </w:r>
-      <w:r>
-        <w:rPr/>
-        <w:t xml:space="preserve">): mandare richieste è scrivere.</w:t>
+        <w:rPr>
+          <w:b/>
+        </w:rPr>
+        <w:t xml:space="preserve">Fuori dal prefisso </w:t>
+      </w:r>
+      <w:r>
+        <w:rPr>
+          <w:b/>
+        </w:rPr>
+        <w:t xml:space="preserve">/api/v1</w:t>
+      </w:r>
+      <w:r>
+        <w:rPr/>
+        <w:t xml:space="preserve">, perché è l'indirizzo che il tema chiama dai tempi del backend legacy (spento il 31/08/2026): cambiarlo avrebbe voluto dire toccare il tema Shopify. Dal 31/08 al 03/09 la rotta non esisteva e il pulsante «Acquista» dei prodotti non unici non faceva nulla.</w:t>
       </w:r>
     </w:p>
     <w:p>
@@ -22219,28 +22167,32 @@
         <w:spacing w:lineRule="auto"/>
       </w:pPr>
       <w:r>
-        <w:rPr/>
-        <w:t xml:space="preserve">L'</w:t>
-      </w:r>
-      <w:r>
-        <w:rPr>
-          <w:b/>
-        </w:rPr>
-        <w:t xml:space="preserve">origine</w:t>
-      </w:r>
-      <w:r>
-        <w:rPr/>
-        <w:t xml:space="preserve"> registrata è il </w:t>
-      </w:r>
-      <w:r>
-        <w:rPr>
-          <w:b/>
-        </w:rPr>
-        <w:t xml:space="preserve">nome della chiave</w:t>
-      </w:r>
-      <w:r>
-        <w:rPr/>
-        <w:t xml:space="preserve">, non un'etichetta generica: fra un mese si deve poter capire con chi parlare.</w:t>
+        <w:rPr>
+          <w:b/>
+        </w:rPr>
+        <w:t xml:space="preserve">Pubblica, sola lettura, un booleano</w:t>
+      </w:r>
+      <w:r>
+        <w:rPr/>
+        <w:t xml:space="preserve">: </w:t>
+      </w:r>
+      <w:r>
+        <w:rPr/>
+        <w:t xml:space="preserve">true</w:t>
+      </w:r>
+      <w:r>
+        <w:rPr/>
+        <w:t xml:space="preserve"> se il nome (senza maiuscole né accenti) è fra le città della provincia in </w:t>
+      </w:r>
+      <w:r>
+        <w:rPr>
+          <w:b/>
+        </w:rPr>
+        <w:t xml:space="preserve">Configurazione → Province</w:t>
+      </w:r>
+      <w:r>
+        <w:rPr/>
+        <w:t xml:space="preserve"> (le 46 importate dal legacy: Milano e hinterland, Como, Monza, Roma, Firenze, Varese, Pavia, Bergamo, Lodi). Per coprire una città nuova basta aggiungerla lì: il sito la vede entro un'ora (cache sul bordo).</w:t>
       </w:r>
     </w:p>
     <w:p>
@@ -22255,98 +22207,230 @@
         <w:rPr>
           <w:b/>
         </w:rPr>
-        <w:t xml:space="preserve">Idempotente sul riferimento</w:t>
-      </w:r>
-      <w:r>
-        <w:rPr/>
-        <w:t xml:space="preserve">: la stessa app che ritenta lo stesso </w:t>
-      </w:r>
-      <w:r>
-        <w:rPr/>
-        <w:t xml:space="preserve">riferimento</w:t>
-      </w:r>
-      <w:r>
-        <w:rPr>
-          <w:b/>
-        </w:rPr>
-        <w:t xml:space="preserve">non crea un doppione</w:t>
-      </w:r>
-      <w:r>
-        <w:rPr/>
-        <w:t xml:space="preserve">, si rilegge quella che c'è già (</w:t>
-      </w:r>
-      <w:r>
-        <w:rPr/>
-        <w:t xml:space="preserve">giaEsistente: true</w:t>
-      </w:r>
-      <w:r>
-        <w:rPr/>
-        <w:t xml:space="preserve">). Chi manda ritenta spesso — un timeout, un cron che ripassa — e due richieste identiche in lista sono due persone che lavorano la stessa cosa.</w:t>
-      </w:r>
-    </w:p>
-    <w:p>
-      <w:pPr>
-        <w:numPr>
-          <w:ilvl w:val="0"/>
-          <w:numId w:val="45"/>
-        </w:numPr>
-        <w:spacing w:lineRule="auto"/>
-      </w:pPr>
-      <w:r>
-        <w:rPr/>
-        <w:t xml:space="preserve">Il testo sotto i </w:t>
-      </w:r>
-      <w:r>
-        <w:rPr>
-          <w:b/>
-        </w:rPr>
-        <w:t xml:space="preserve">10 caratteri</w:t>
-      </w:r>
-      <w:r>
-        <w:rPr/>
-        <w:t xml:space="preserve"> è rifiutato: «ok» non è una richiesta, è una chiamata partita per sbaglio.</w:t>
-      </w:r>
-    </w:p>
-    <w:p>
-      <w:pPr>
-        <w:numPr>
-          <w:ilvl w:val="0"/>
-          <w:numId w:val="45"/>
-        </w:numPr>
-        <w:spacing w:lineRule="auto"/>
-      </w:pPr>
-      <w:r>
-        <w:rPr/>
-        <w:t xml:space="preserve">L'esito si rilegge con </w:t>
-      </w:r>
-      <w:r>
-        <w:rPr/>
-        <w:t xml:space="preserve">GET /api/v1/app/richieste/:riferimento</w:t>
-      </w:r>
-      <w:r>
-        <w:rPr/>
-        <w:t xml:space="preserve">, e </w:t>
-      </w:r>
-      <w:r>
-        <w:rPr>
-          <w:b/>
-        </w:rPr>
-        <w:t xml:space="preserve">solo dentro la propria origine</w:t>
-      </w:r>
-      <w:r>
-        <w:rPr/>
-        <w:t xml:space="preserve">: un'altra app non legge le richieste altrui indovinandone il riferimento.</w:t>
-      </w:r>
-    </w:p>
-    <w:p>
-      <w:pPr>
-        <w:spacing w:lineRule="auto"/>
-      </w:pPr>
-      <w:r>
-        <w:rPr>
-          <w:b/>
-        </w:rPr>
-        <w:t xml:space="preserve">Cosa si fa in pagina.</w:t>
+        <w:t xml:space="preserve">CORS</w:t>
+      </w:r>
+      <w:r>
+        <w:rPr/>
+        <w:t xml:space="preserve"> solo per gli origin dei siti Deluxy (</w:t>
+      </w:r>
+      <w:r>
+        <w:rPr/>
+        <w:t xml:space="preserve">deluxy.it</w:t>
+      </w:r>
+      <w:r>
+        <w:rPr/>
+        <w:t xml:space="preserve">, </w:t>
+      </w:r>
+      <w:r>
+        <w:rPr/>
+        <w:t xml:space="preserve">www.deluxy.it</w:t>
+      </w:r>
+      <w:r>
+        <w:rPr/>
+        <w:t xml:space="preserve">, </w:t>
+      </w:r>
+      <w:r>
+        <w:rPr/>
+        <w:t xml:space="preserve">deluxygifts.myshopify.com</w:t>
+      </w:r>
+      <w:r>
+        <w:rPr/>
+        <w:t xml:space="preserve">, più quelli in </w:t>
+      </w:r>
+      <w:r>
+        <w:rPr/>
+        <w:t xml:space="preserve">CORS_SITI_ORIGINS</w:t>
+      </w:r>
+      <w:r>
+        <w:rPr/>
+        <w:t xml:space="preserve">); risponde anche al preflight </w:t>
+      </w:r>
+      <w:r>
+        <w:rPr/>
+        <w:t xml:space="preserve">OPTIONS</w:t>
+      </w:r>
+      <w:r>
+        <w:rPr/>
+        <w:t xml:space="preserve">.</w:t>
+      </w:r>
+    </w:p>
+    <w:p>
+      <w:pPr>
+        <w:pStyle w:val="Heading3"/>
+        <w:spacing w:lineRule="auto"/>
+      </w:pPr>
+      <w:r>
+        <w:rPr/>
+        <w:t xml:space="preserve">Richieste (</w:t>
+      </w:r>
+      <w:r>
+        <w:rPr/>
+        <w:t xml:space="preserve">/richieste</w:t>
+      </w:r>
+      <w:r>
+        <w:rPr/>
+        <w:t xml:space="preserve">) </w:t>
+      </w:r>
+      <w:r>
+        <w:rPr>
+          <w:b/>
+        </w:rPr>
+        <w:t xml:space="preserve">[NUOVO 28/08/2026]</w:t>
+      </w:r>
+    </w:p>
+    <w:p>
+      <w:pPr>
+        <w:spacing w:lineRule="auto"/>
+      </w:pPr>
+      <w:r>
+        <w:rPr>
+          <w:b/>
+        </w:rPr>
+        <w:t xml:space="preserve">Operatività → Richieste</w:t>
+      </w:r>
+      <w:r>
+        <w:rPr/>
+        <w:t xml:space="preserve">, per </w:t>
+      </w:r>
+      <w:r>
+        <w:rPr>
+          <w:b/>
+        </w:rPr>
+        <w:t xml:space="preserve">Admin</w:t>
+      </w:r>
+      <w:r>
+        <w:rPr/>
+        <w:t xml:space="preserve"> e </w:t>
+      </w:r>
+      <w:r>
+        <w:rPr>
+          <w:b/>
+        </w:rPr>
+        <w:t xml:space="preserve">Operation</w:t>
+      </w:r>
+      <w:r>
+        <w:rPr/>
+        <w:t xml:space="preserve"> — e il </w:t>
+      </w:r>
+      <w:r>
+        <w:rPr>
+          <w:b/>
+        </w:rPr>
+        <w:t xml:space="preserve">Customer Service</w:t>
+      </w:r>
+      <w:r>
+        <w:rPr/>
+        <w:t xml:space="preserve"> è un Operation (</w:t>
+      </w:r>
+      <w:r>
+        <w:rPr/>
+        <w:t xml:space="preserve">operationRole = customer_service</w:t>
+      </w:r>
+      <w:r>
+        <w:rPr/>
+        <w:t xml:space="preserve">), quindi è già dentro senza un ruolo nuovo.</w:t>
+      </w:r>
+    </w:p>
+    <w:p>
+      <w:pPr>
+        <w:spacing w:lineRule="auto"/>
+      </w:pPr>
+      <w:r>
+        <w:rPr/>
+        <w:t xml:space="preserve">È la </w:t>
+      </w:r>
+      <w:r>
+        <w:rPr>
+          <w:b/>
+        </w:rPr>
+        <w:t xml:space="preserve">posta in arrivo delle domande di consegna</w:t>
+      </w:r>
+      <w:r>
+        <w:rPr/>
+        <w:t xml:space="preserve"> scritte a parole dalle altre app di Deluxy. Chi manda — il Customer Service da una chat, Scout da una visita, un fornitore al telefono — </w:t>
+      </w:r>
+      <w:r>
+        <w:rPr>
+          <w:b/>
+        </w:rPr>
+        <w:t xml:space="preserve">non compila un modulo di venti campi che non ha sotto mano</w:t>
+      </w:r>
+      <w:r>
+        <w:rPr/>
+        <w:t xml:space="preserve">: scrive quello che sa, e qui una persona legge e decide.</w:t>
+      </w:r>
+    </w:p>
+    <w:p>
+      <w:pPr>
+        <w:spacing w:lineRule="auto"/>
+      </w:pPr>
+      <w:r>
+        <w:rPr/>
+        <w:t xml:space="preserve">⚠️ </w:t>
+      </w:r>
+      <w:r>
+        <w:rPr>
+          <w:b/>
+        </w:rPr>
+        <w:t xml:space="preserve">Una richiesta non è una consegna: è una domanda.</w:t>
+      </w:r>
+      <w:r>
+        <w:rPr/>
+        <w:t xml:space="preserve"> Nasce </w:t>
+      </w:r>
+      <w:r>
+        <w:rPr/>
+        <w:t xml:space="preserve">nuova</w:t>
+      </w:r>
+      <w:r>
+        <w:rPr/>
+        <w:t xml:space="preserve"> e diventa una consegna </w:t>
+      </w:r>
+      <w:r>
+        <w:rPr>
+          <w:b/>
+        </w:rPr>
+        <w:t xml:space="preserve">solo quando qualcuno la accetta</w:t>
+      </w:r>
+      <w:r>
+        <w:rPr/>
+        <w:t xml:space="preserve">. Farla diventare consegna da sola vorrebbe dire mandare un valet su un indirizzo che nessuno ha riletto — e il giro dei valet costa denaro vero.</w:t>
+      </w:r>
+    </w:p>
+    <w:p>
+      <w:pPr>
+        <w:spacing w:lineRule="auto"/>
+      </w:pPr>
+      <w:r>
+        <w:rPr>
+          <w:b/>
+        </w:rPr>
+        <w:t xml:space="preserve">Come arriva.</w:t>
+      </w:r>
+      <w:r>
+        <w:rPr/>
+        <w:t xml:space="preserve"> Sul canale app-to-app, con una chiave di </w:t>
+      </w:r>
+      <w:r>
+        <w:rPr>
+          <w:b/>
+        </w:rPr>
+        <w:t xml:space="preserve">scrittura</w:t>
+      </w:r>
+      <w:r>
+        <w:rPr/>
+        <w:t xml:space="preserve">:</w:t>
+      </w:r>
+    </w:p>
+    <w:p>
+      <w:pPr>
+        <w:spacing w:lineRule="auto"/>
+      </w:pPr>
+      <w:r>
+        <w:rPr>
+          <w:rFonts w:ascii="Courier" w:hAnsi="Courier"/>
+        </w:rPr>
+        <w:t xml:space="preserve">POST /api/v1/app/richieste       x-api-key: &lt;chiave con scrittura&gt; { "testo": "…", "riferimento": "ORD-1234", "contatto": "marta@…" } </w:t>
       </w:r>
     </w:p>
     <w:p>
@@ -22359,57 +22443,25 @@
       </w:pPr>
       <w:r>
         <w:rPr/>
-        <w:t xml:space="preserve">Filtri a pillola per stato — </w:t>
-      </w:r>
-      <w:r>
-        <w:rPr/>
-        <w:t xml:space="preserve">Nuove</w:t>
-      </w:r>
-      <w:r>
-        <w:rPr/>
-        <w:t xml:space="preserve"> (col </w:t>
-      </w:r>
-      <w:r>
-        <w:rPr>
-          <w:b/>
-        </w:rPr>
-        <w:t xml:space="preserve">pallino rosso</w:t>
-      </w:r>
-      <w:r>
-        <w:rPr/>
-        <w:t xml:space="preserve"> di quante nessuno ha ancora guardato), </w:t>
-      </w:r>
-      <w:r>
-        <w:rPr/>
-        <w:t xml:space="preserve">In lavorazione</w:t>
-      </w:r>
-      <w:r>
-        <w:rPr/>
-        <w:t xml:space="preserve">, </w:t>
-      </w:r>
-      <w:r>
-        <w:rPr/>
-        <w:t xml:space="preserve">Accettate</w:t>
-      </w:r>
-      <w:r>
-        <w:rPr/>
-        <w:t xml:space="preserve">, </w:t>
-      </w:r>
-      <w:r>
-        <w:rPr/>
-        <w:t xml:space="preserve">Rifiutate</w:t>
-      </w:r>
-      <w:r>
-        <w:rPr/>
-        <w:t xml:space="preserve">, </w:t>
-      </w:r>
-      <w:r>
-        <w:rPr/>
-        <w:t xml:space="preserve">Tutte</w:t>
-      </w:r>
-      <w:r>
-        <w:rPr/>
-        <w:t xml:space="preserve">.</w:t>
+        <w:t xml:space="preserve">Una chiave di </w:t>
+      </w:r>
+      <w:r>
+        <w:rPr>
+          <w:b/>
+        </w:rPr>
+        <w:t xml:space="preserve">sola lettura viene rifiutata</w:t>
+      </w:r>
+      <w:r>
+        <w:rPr/>
+        <w:t xml:space="preserve"> (</w:t>
+      </w:r>
+      <w:r>
+        <w:rPr/>
+        <w:t xml:space="preserve">401</w:t>
+      </w:r>
+      <w:r>
+        <w:rPr/>
+        <w:t xml:space="preserve">): mandare richieste è scrivere.</w:t>
       </w:r>
     </w:p>
     <w:p>
@@ -22422,17 +22474,27 @@
       </w:pPr>
       <w:r>
         <w:rPr/>
-        <w:t xml:space="preserve">Il </w:t>
-      </w:r>
-      <w:r>
-        <w:rPr>
-          <w:b/>
-        </w:rPr>
-        <w:t xml:space="preserve">testo si mostra com'è arrivato</w:t>
-      </w:r>
-      <w:r>
-        <w:rPr/>
-        <w:t xml:space="preserve">, a capo compresi: è la fonte, e riformattarlo vorrebbe dire interpretarlo prima che lo legga una persona.</w:t>
+        <w:t xml:space="preserve">L'</w:t>
+      </w:r>
+      <w:r>
+        <w:rPr>
+          <w:b/>
+        </w:rPr>
+        <w:t xml:space="preserve">origine</w:t>
+      </w:r>
+      <w:r>
+        <w:rPr/>
+        <w:t xml:space="preserve"> registrata è il </w:t>
+      </w:r>
+      <w:r>
+        <w:rPr>
+          <w:b/>
+        </w:rPr>
+        <w:t xml:space="preserve">nome della chiave</w:t>
+      </w:r>
+      <w:r>
+        <w:rPr/>
+        <w:t xml:space="preserve">, non un'etichetta generica: fra un mese si deve poter capire con chi parlare.</w:t>
       </w:r>
     </w:p>
     <w:p>
@@ -22447,49 +22509,33 @@
         <w:rPr>
           <w:b/>
         </w:rPr>
-        <w:t xml:space="preserve">Crea consegna</w:t>
-      </w:r>
-      <w:r>
-        <w:rPr/>
-        <w:t xml:space="preserve"> porta al modulo della consegna col testo </w:t>
-      </w:r>
-      <w:r>
-        <w:rPr>
-          <w:b/>
-        </w:rPr>
-        <w:t xml:space="preserve">già dentro il pannello «Compila con l'AI»</w:t>
-      </w:r>
-      <w:r>
-        <w:rPr/>
-        <w:t xml:space="preserve">, aperto: l'AI </w:t>
-      </w:r>
-      <w:r>
-        <w:rPr/>
-        <w:t xml:space="preserve">propone</w:t>
-      </w:r>
-      <w:r>
-        <w:rPr/>
-        <w:t xml:space="preserve"> i campi, che restano tutti correggibili prima di salvare. Salvata la consegna, la richiesta diventa </w:t>
-      </w:r>
-      <w:r>
-        <w:rPr>
-          <w:b/>
-        </w:rPr>
-        <w:t xml:space="preserve">accettata</w:t>
-      </w:r>
-      <w:r>
-        <w:rPr/>
-        <w:t xml:space="preserve"> e le resta </w:t>
-      </w:r>
-      <w:r>
-        <w:rPr>
-          <w:b/>
-        </w:rPr>
-        <w:t xml:space="preserve">collegato il numero</w:t>
-      </w:r>
-      <w:r>
-        <w:rPr/>
-        <w:t xml:space="preserve"> della consegna nata.</w:t>
+        <w:t xml:space="preserve">Idempotente sul riferimento</w:t>
+      </w:r>
+      <w:r>
+        <w:rPr/>
+        <w:t xml:space="preserve">: la stessa app che ritenta lo stesso </w:t>
+      </w:r>
+      <w:r>
+        <w:rPr/>
+        <w:t xml:space="preserve">riferimento</w:t>
+      </w:r>
+      <w:r>
+        <w:rPr>
+          <w:b/>
+        </w:rPr>
+        <w:t xml:space="preserve">non crea un doppione</w:t>
+      </w:r>
+      <w:r>
+        <w:rPr/>
+        <w:t xml:space="preserve">, si rilegge quella che c'è già (</w:t>
+      </w:r>
+      <w:r>
+        <w:rPr/>
+        <w:t xml:space="preserve">giaEsistente: true</w:t>
+      </w:r>
+      <w:r>
+        <w:rPr/>
+        <w:t xml:space="preserve">). Chi manda ritenta spesso — un timeout, un cron che ripassa — e due richieste identiche in lista sono due persone che lavorano la stessa cosa.</w:t>
       </w:r>
     </w:p>
     <w:p>
@@ -22501,22 +22547,18 @@
         <w:spacing w:lineRule="auto"/>
       </w:pPr>
       <w:r>
-        <w:rPr>
-          <w:b/>
-        </w:rPr>
-        <w:t xml:space="preserve">Prendi in carico</w:t>
-      </w:r>
-      <w:r>
-        <w:rPr/>
-        <w:t xml:space="preserve"> la mette </w:t>
-      </w:r>
-      <w:r>
-        <w:rPr/>
-        <w:t xml:space="preserve">in lavorazione</w:t>
-      </w:r>
-      <w:r>
-        <w:rPr/>
-        <w:t xml:space="preserve">: chi altro apre la pagina sa che ci sta già lavorando qualcuno.</w:t>
+        <w:rPr/>
+        <w:t xml:space="preserve">Il testo sotto i </w:t>
+      </w:r>
+      <w:r>
+        <w:rPr>
+          <w:b/>
+        </w:rPr>
+        <w:t xml:space="preserve">10 caratteri</w:t>
+      </w:r>
+      <w:r>
+        <w:rPr/>
+        <w:t xml:space="preserve"> è rifiutato: «ok» non è una richiesta, è una chiamata partita per sbaglio.</w:t>
       </w:r>
     </w:p>
     <w:p>
@@ -22528,147 +22570,37 @@
         <w:spacing w:lineRule="auto"/>
       </w:pPr>
       <w:r>
-        <w:rPr>
-          <w:b/>
-        </w:rPr>
-        <w:t xml:space="preserve">Rifiuta</w:t>
-      </w:r>
-      <w:r>
-        <w:rPr/>
-        <w:t xml:space="preserve"> chiede un </w:t>
-      </w:r>
-      <w:r>
-        <w:rPr>
-          <w:b/>
-        </w:rPr>
-        <w:t xml:space="preserve">motivo obbligatorio</w:t>
-      </w:r>
-      <w:r>
-        <w:rPr/>
-        <w:t xml:space="preserve"> — lo pretende anche il server: chi ha mandato la richiesta legge l'esito, e un «no» muto si trasforma in una seconda richiesta identica.</w:t>
-      </w:r>
-    </w:p>
-    <w:p>
-      <w:pPr>
-        <w:numPr>
-          <w:ilvl w:val="0"/>
-          <w:numId w:val="46"/>
-        </w:numPr>
-        <w:spacing w:lineRule="auto"/>
-      </w:pPr>
-      <w:r>
-        <w:rPr/>
-        <w:t xml:space="preserve">Su accettata e rifiutata resta scritto </w:t>
-      </w:r>
-      <w:r>
-        <w:rPr>
-          <w:b/>
-        </w:rPr>
-        <w:t xml:space="preserve">chi ha deciso e quando</w:t>
-      </w:r>
-      <w:r>
-        <w:rPr/>
-        <w:t xml:space="preserve">.</w:t>
-      </w:r>
-    </w:p>
-    <w:p>
-      <w:pPr>
-        <w:numPr>
-          <w:ilvl w:val="0"/>
-          <w:numId w:val="46"/>
-        </w:numPr>
-        <w:spacing w:lineRule="auto"/>
-      </w:pPr>
-      <w:r>
-        <w:rPr>
-          <w:b/>
-        </w:rPr>
-        <w:t xml:space="preserve">Registra a mano</w:t>
-      </w:r>
-      <w:r>
-        <w:rPr/>
-        <w:t xml:space="preserve"> serve quando la richiesta arriva al telefono e non da un'app: l'origine diventa </w:t>
-      </w:r>
-      <w:r>
-        <w:rPr/>
-        <w:t xml:space="preserve">manuale · &lt;email di chi l'ha registrata&gt;</w:t>
-      </w:r>
-      <w:r>
-        <w:rPr/>
-        <w:t xml:space="preserve">.</w:t>
-      </w:r>
-    </w:p>
-    <w:p>
-      <w:pPr>
-        <w:pStyle w:val="Heading3"/>
-        <w:spacing w:lineRule="auto"/>
-      </w:pPr>
-      <w:r>
-        <w:rPr/>
-        <w:t xml:space="preserve">Chiavi delle app (</w:t>
-      </w:r>
-      <w:r>
-        <w:rPr/>
-        <w:t xml:space="preserve">/api-keys</w:t>
-      </w:r>
-      <w:r>
-        <w:rPr/>
-        <w:t xml:space="preserve">) </w:t>
-      </w:r>
-      <w:r>
-        <w:rPr>
-          <w:b/>
-        </w:rPr>
-        <w:t xml:space="preserve">[NUOVO 28/08/2026]</w:t>
-      </w:r>
-    </w:p>
-    <w:p>
-      <w:pPr>
-        <w:spacing w:lineRule="auto"/>
-      </w:pPr>
-      <w:r>
-        <w:rPr>
-          <w:b/>
-        </w:rPr>
-        <w:t xml:space="preserve">Configurazione → Chiavi delle app</w:t>
-      </w:r>
-      <w:r>
-        <w:rPr/>
-        <w:t xml:space="preserve">, solo </w:t>
-      </w:r>
-      <w:r>
-        <w:rPr>
-          <w:b/>
-        </w:rPr>
-        <w:t xml:space="preserve">Admin</w:t>
-      </w:r>
-      <w:r>
-        <w:rPr/>
-        <w:t xml:space="preserve">: le chiavi con cui le </w:t>
-      </w:r>
-      <w:r>
-        <w:rPr/>
-        <w:t xml:space="preserve">altre app di Deluxy</w:t>
-      </w:r>
-      <w:r>
-        <w:rPr/>
-        <w:t xml:space="preserve"> (Orders, Budgets, Customer Service, Scout…) chiamano questa piattaforma sul canale </w:t>
-      </w:r>
-      <w:r>
-        <w:rPr/>
-        <w:t xml:space="preserve">/api/v1/app/*</w:t>
-      </w:r>
-      <w:r>
-        <w:rPr/>
-        <w:t xml:space="preserve">, presentandosi con l'intestazione </w:t>
-      </w:r>
-      <w:r>
-        <w:rPr/>
-        <w:t xml:space="preserve">x-api-key</w:t>
-      </w:r>
-      <w:r>
-        <w:rPr/>
-        <w:t xml:space="preserve">.</w:t>
+        <w:rPr/>
+        <w:t xml:space="preserve">L'esito si rilegge con </w:t>
+      </w:r>
+      <w:r>
+        <w:rPr/>
+        <w:t xml:space="preserve">GET /api/v1/app/richieste/:riferimento</w:t>
+      </w:r>
+      <w:r>
+        <w:rPr/>
+        <w:t xml:space="preserve">, e </w:t>
+      </w:r>
+      <w:r>
+        <w:rPr>
+          <w:b/>
+        </w:rPr>
+        <w:t xml:space="preserve">solo dentro la propria origine</w:t>
+      </w:r>
+      <w:r>
+        <w:rPr/>
+        <w:t xml:space="preserve">: un'altra app non legge le richieste altrui indovinandone il riferimento.</w:t>
+      </w:r>
+    </w:p>
+    <w:p>
+      <w:pPr>
+        <w:spacing w:lineRule="auto"/>
+      </w:pPr>
+      <w:r>
+        <w:rPr>
+          <w:b/>
+        </w:rPr>
+        <w:t xml:space="preserve">Cosa si fa in pagina.</w:t>
       </w:r>
     </w:p>
     <w:p>
@@ -22680,40 +22612,58 @@
         <w:spacing w:lineRule="auto"/>
       </w:pPr>
       <w:r>
-        <w:rPr>
-          <w:b/>
-        </w:rPr>
-        <w:t xml:space="preserve">Due livelli</w:t>
-      </w:r>
-      <w:r>
-        <w:rPr/>
-        <w:t xml:space="preserve">: </w:t>
-      </w:r>
-      <w:r>
-        <w:rPr/>
-        <w:t xml:space="preserve">sola lettura</w:t>
-      </w:r>
-      <w:r>
-        <w:rPr/>
-        <w:t xml:space="preserve"> (consegne, vendite, costi) oppure </w:t>
-      </w:r>
-      <w:r>
-        <w:rPr/>
-        <w:t xml:space="preserve">lettura e scrittura</w:t>
-      </w:r>
-      <w:r>
-        <w:rPr/>
-        <w:t xml:space="preserve"> (può anche </w:t>
-      </w:r>
-      <w:r>
-        <w:rPr>
-          <w:b/>
-        </w:rPr>
-        <w:t xml:space="preserve">creare consegne</w:t>
-      </w:r>
-      <w:r>
-        <w:rPr/>
-        <w:t xml:space="preserve">).</w:t>
+        <w:rPr/>
+        <w:t xml:space="preserve">Filtri a pillola per stato — </w:t>
+      </w:r>
+      <w:r>
+        <w:rPr/>
+        <w:t xml:space="preserve">Nuove</w:t>
+      </w:r>
+      <w:r>
+        <w:rPr/>
+        <w:t xml:space="preserve"> (col </w:t>
+      </w:r>
+      <w:r>
+        <w:rPr>
+          <w:b/>
+        </w:rPr>
+        <w:t xml:space="preserve">pallino rosso</w:t>
+      </w:r>
+      <w:r>
+        <w:rPr/>
+        <w:t xml:space="preserve"> di quante nessuno ha ancora guardato), </w:t>
+      </w:r>
+      <w:r>
+        <w:rPr/>
+        <w:t xml:space="preserve">In lavorazione</w:t>
+      </w:r>
+      <w:r>
+        <w:rPr/>
+        <w:t xml:space="preserve">, </w:t>
+      </w:r>
+      <w:r>
+        <w:rPr/>
+        <w:t xml:space="preserve">Accettate</w:t>
+      </w:r>
+      <w:r>
+        <w:rPr/>
+        <w:t xml:space="preserve">, </w:t>
+      </w:r>
+      <w:r>
+        <w:rPr/>
+        <w:t xml:space="preserve">Rifiutate</w:t>
+      </w:r>
+      <w:r>
+        <w:rPr/>
+        <w:t xml:space="preserve">, </w:t>
+      </w:r>
+      <w:r>
+        <w:rPr/>
+        <w:t xml:space="preserve">Tutte</w:t>
+      </w:r>
+      <w:r>
+        <w:rPr/>
+        <w:t xml:space="preserve">.</w:t>
       </w:r>
     </w:p>
     <w:p>
@@ -22726,37 +22676,17 @@
       </w:pPr>
       <w:r>
         <w:rPr/>
-        <w:t xml:space="preserve">⚠️ </w:t>
-      </w:r>
-      <w:r>
-        <w:rPr>
-          <w:b/>
-        </w:rPr>
-        <w:t xml:space="preserve">Il valore si vede una volta sola</w:t>
-      </w:r>
-      <w:r>
-        <w:rPr/>
-        <w:t xml:space="preserve">, subito dopo la generazione: in archivio resta solo l'impronta SHA-256, e </w:t>
-      </w:r>
-      <w:r>
-        <w:rPr>
-          <w:b/>
-        </w:rPr>
-        <w:t xml:space="preserve">nessuna rotta lo rilegge</w:t>
-      </w:r>
-      <w:r>
-        <w:rPr/>
-        <w:t xml:space="preserve">. Chi la perde </w:t>
-      </w:r>
-      <w:r>
-        <w:rPr>
-          <w:b/>
-        </w:rPr>
-        <w:t xml:space="preserve">rigenera</w:t>
-      </w:r>
-      <w:r>
-        <w:rPr/>
-        <w:t xml:space="preserve">.</w:t>
+        <w:t xml:space="preserve">Il </w:t>
+      </w:r>
+      <w:r>
+        <w:rPr>
+          <w:b/>
+        </w:rPr>
+        <w:t xml:space="preserve">testo si mostra com'è arrivato</w:t>
+      </w:r>
+      <w:r>
+        <w:rPr/>
+        <w:t xml:space="preserve">, a capo compresi: è la fonte, e riformattarlo vorrebbe dire interpretarlo prima che lo legga una persona.</w:t>
       </w:r>
     </w:p>
     <w:p>
@@ -22771,21 +22701,49 @@
         <w:rPr>
           <w:b/>
         </w:rPr>
-        <w:t xml:space="preserve">Rigenera</w:t>
-      </w:r>
-      <w:r>
-        <w:rPr/>
-        <w:t xml:space="preserve"> dà una chiave nuova alla stessa app: la vecchia smette di funzionare </w:t>
-      </w:r>
-      <w:r>
-        <w:rPr>
-          <w:b/>
-        </w:rPr>
-        <w:t xml:space="preserve">all'istante</w:t>
-      </w:r>
-      <w:r>
-        <w:rPr/>
-        <w:t xml:space="preserve">, quindi l'app va aggiornata subito.</w:t>
+        <w:t xml:space="preserve">Crea consegna</w:t>
+      </w:r>
+      <w:r>
+        <w:rPr/>
+        <w:t xml:space="preserve"> porta al modulo della consegna col testo </w:t>
+      </w:r>
+      <w:r>
+        <w:rPr>
+          <w:b/>
+        </w:rPr>
+        <w:t xml:space="preserve">già dentro il pannello «Compila con l'AI»</w:t>
+      </w:r>
+      <w:r>
+        <w:rPr/>
+        <w:t xml:space="preserve">, aperto: l'AI </w:t>
+      </w:r>
+      <w:r>
+        <w:rPr/>
+        <w:t xml:space="preserve">propone</w:t>
+      </w:r>
+      <w:r>
+        <w:rPr/>
+        <w:t xml:space="preserve"> i campi, che restano tutti correggibili prima di salvare. Salvata la consegna, la richiesta diventa </w:t>
+      </w:r>
+      <w:r>
+        <w:rPr>
+          <w:b/>
+        </w:rPr>
+        <w:t xml:space="preserve">accettata</w:t>
+      </w:r>
+      <w:r>
+        <w:rPr/>
+        <w:t xml:space="preserve"> e le resta </w:t>
+      </w:r>
+      <w:r>
+        <w:rPr>
+          <w:b/>
+        </w:rPr>
+        <w:t xml:space="preserve">collegato il numero</w:t>
+      </w:r>
+      <w:r>
+        <w:rPr/>
+        <w:t xml:space="preserve"> della consegna nata.</w:t>
       </w:r>
     </w:p>
     <w:p>
@@ -22800,45 +22758,19 @@
         <w:rPr>
           <w:b/>
         </w:rPr>
-        <w:t xml:space="preserve">Scadenza</w:t>
-      </w:r>
-      <w:r>
-        <w:rPr/>
-        <w:t xml:space="preserve"> facoltativa (vuota = non scade), verificata </w:t>
-      </w:r>
-      <w:r>
-        <w:rPr>
-          <w:b/>
-        </w:rPr>
-        <w:t xml:space="preserve">a ogni chiamata</w:t>
-      </w:r>
-      <w:r>
-        <w:rPr/>
-        <w:t xml:space="preserve">. Una chiave scaduta risponde </w:t>
-      </w:r>
-      <w:r>
-        <w:rPr/>
-        <w:t xml:space="preserve">401</w:t>
-      </w:r>
-      <w:r>
-        <w:rPr/>
-        <w:t xml:space="preserve"> dicendo </w:t>
-      </w:r>
-      <w:r>
-        <w:rPr/>
-        <w:t xml:space="preserve">scaduta</w:t>
-      </w:r>
-      <w:r>
-        <w:rPr/>
-        <w:t xml:space="preserve">, non </w:t>
-      </w:r>
-      <w:r>
-        <w:rPr/>
-        <w:t xml:space="preserve">non valida</w:t>
-      </w:r>
-      <w:r>
-        <w:rPr/>
-        <w:t xml:space="preserve">.</w:t>
+        <w:t xml:space="preserve">Prendi in carico</w:t>
+      </w:r>
+      <w:r>
+        <w:rPr/>
+        <w:t xml:space="preserve"> la mette </w:t>
+      </w:r>
+      <w:r>
+        <w:rPr/>
+        <w:t xml:space="preserve">in lavorazione</w:t>
+      </w:r>
+      <w:r>
+        <w:rPr/>
+        <w:t xml:space="preserve">: chi altro apre la pagina sa che ci sta già lavorando qualcuno.</w:t>
       </w:r>
     </w:p>
     <w:p>
@@ -22850,18 +22782,24 @@
         <w:spacing w:lineRule="auto"/>
       </w:pPr>
       <w:r>
-        <w:rPr/>
-        <w:t xml:space="preserve">L'elenco mostra </w:t>
-      </w:r>
-      <w:r>
-        <w:rPr>
-          <w:b/>
-        </w:rPr>
-        <w:t xml:space="preserve">da quanti giorni non la usa nessuno</w:t>
-      </w:r>
-      <w:r>
-        <w:rPr/>
-        <w:t xml:space="preserve">: una chiave viva che nessuno chiama è una porta aperta senza motivo.</w:t>
+        <w:rPr>
+          <w:b/>
+        </w:rPr>
+        <w:t xml:space="preserve">Rifiuta</w:t>
+      </w:r>
+      <w:r>
+        <w:rPr/>
+        <w:t xml:space="preserve"> chiede un </w:t>
+      </w:r>
+      <w:r>
+        <w:rPr>
+          <w:b/>
+        </w:rPr>
+        <w:t xml:space="preserve">motivo obbligatorio</w:t>
+      </w:r>
+      <w:r>
+        <w:rPr/>
+        <w:t xml:space="preserve"> — lo pretende anche il server: chi ha mandato la richiesta legge l'esito, e un «no» muto si trasforma in una seconda richiesta identica.</w:t>
       </w:r>
     </w:p>
     <w:p>
@@ -22873,61 +22811,118 @@
         <w:spacing w:lineRule="auto"/>
       </w:pPr>
       <w:r>
-        <w:rPr>
-          <w:b/>
-        </w:rPr>
-        <w:t xml:space="preserve">Spegni/Accendi</w:t>
-      </w:r>
-      <w:r>
-        <w:rPr/>
-        <w:t xml:space="preserve"> senza cancellare, ed </w:t>
-      </w:r>
-      <w:r>
-        <w:rPr>
-          <w:b/>
-        </w:rPr>
-        <w:t xml:space="preserve">Elimina</w:t>
-      </w:r>
-      <w:r>
-        <w:rPr/>
-        <w:t xml:space="preserve"> definitivo.</w:t>
-      </w:r>
-    </w:p>
-    <w:p>
-      <w:pPr>
-        <w:spacing w:lineRule="auto"/>
-      </w:pPr>
-      <w:r>
-        <w:rPr/>
-        <w:t xml:space="preserve">⚠️ Le chiavi </w:t>
-      </w:r>
-      <w:r>
-        <w:rPr>
-          <w:b/>
-        </w:rPr>
-        <w:t xml:space="preserve">non hanno ancora uno scope per rotta</w:t>
-      </w:r>
-      <w:r>
-        <w:rPr/>
-        <w:t xml:space="preserve">: una chiave di sola lettura legge </w:t>
-      </w:r>
-      <w:r>
-        <w:rPr/>
-        <w:t xml:space="preserve">tutto</w:t>
-      </w:r>
-      <w:r>
-        <w:rPr/>
-        <w:t xml:space="preserve"> il canale app, compresi nome, indirizzo e telefono dei destinatari. È un punto aperto dichiarato nell'handoff.</w:t>
-      </w:r>
-    </w:p>
-    <w:p>
-      <w:pPr>
-        <w:pStyle w:val="Heading2"/>
-        <w:spacing w:lineRule="auto"/>
-      </w:pPr>
-      <w:r>
-        <w:rPr/>
-        <w:t xml:space="preserve">9. Piano di modernizzazione (staging)</w:t>
+        <w:rPr/>
+        <w:t xml:space="preserve">Su accettata e rifiutata resta scritto </w:t>
+      </w:r>
+      <w:r>
+        <w:rPr>
+          <w:b/>
+        </w:rPr>
+        <w:t xml:space="preserve">chi ha deciso e quando</w:t>
+      </w:r>
+      <w:r>
+        <w:rPr/>
+        <w:t xml:space="preserve">.</w:t>
+      </w:r>
+    </w:p>
+    <w:p>
+      <w:pPr>
+        <w:numPr>
+          <w:ilvl w:val="0"/>
+          <w:numId w:val="47"/>
+        </w:numPr>
+        <w:spacing w:lineRule="auto"/>
+      </w:pPr>
+      <w:r>
+        <w:rPr>
+          <w:b/>
+        </w:rPr>
+        <w:t xml:space="preserve">Registra a mano</w:t>
+      </w:r>
+      <w:r>
+        <w:rPr/>
+        <w:t xml:space="preserve"> serve quando la richiesta arriva al telefono e non da un'app: l'origine diventa </w:t>
+      </w:r>
+      <w:r>
+        <w:rPr/>
+        <w:t xml:space="preserve">manuale · &lt;email di chi l'ha registrata&gt;</w:t>
+      </w:r>
+      <w:r>
+        <w:rPr/>
+        <w:t xml:space="preserve">.</w:t>
+      </w:r>
+    </w:p>
+    <w:p>
+      <w:pPr>
+        <w:pStyle w:val="Heading3"/>
+        <w:spacing w:lineRule="auto"/>
+      </w:pPr>
+      <w:r>
+        <w:rPr/>
+        <w:t xml:space="preserve">Chiavi delle app (</w:t>
+      </w:r>
+      <w:r>
+        <w:rPr/>
+        <w:t xml:space="preserve">/api-keys</w:t>
+      </w:r>
+      <w:r>
+        <w:rPr/>
+        <w:t xml:space="preserve">) </w:t>
+      </w:r>
+      <w:r>
+        <w:rPr>
+          <w:b/>
+        </w:rPr>
+        <w:t xml:space="preserve">[NUOVO 28/08/2026]</w:t>
+      </w:r>
+    </w:p>
+    <w:p>
+      <w:pPr>
+        <w:spacing w:lineRule="auto"/>
+      </w:pPr>
+      <w:r>
+        <w:rPr>
+          <w:b/>
+        </w:rPr>
+        <w:t xml:space="preserve">Configurazione → Chiavi delle app</w:t>
+      </w:r>
+      <w:r>
+        <w:rPr/>
+        <w:t xml:space="preserve">, solo </w:t>
+      </w:r>
+      <w:r>
+        <w:rPr>
+          <w:b/>
+        </w:rPr>
+        <w:t xml:space="preserve">Admin</w:t>
+      </w:r>
+      <w:r>
+        <w:rPr/>
+        <w:t xml:space="preserve">: le chiavi con cui le </w:t>
+      </w:r>
+      <w:r>
+        <w:rPr/>
+        <w:t xml:space="preserve">altre app di Deluxy</w:t>
+      </w:r>
+      <w:r>
+        <w:rPr/>
+        <w:t xml:space="preserve"> (Orders, Budgets, Customer Service, Scout…) chiamano questa piattaforma sul canale </w:t>
+      </w:r>
+      <w:r>
+        <w:rPr/>
+        <w:t xml:space="preserve">/api/v1/app/*</w:t>
+      </w:r>
+      <w:r>
+        <w:rPr/>
+        <w:t xml:space="preserve">, presentandosi con l'intestazione </w:t>
+      </w:r>
+      <w:r>
+        <w:rPr/>
+        <w:t xml:space="preserve">x-api-key</w:t>
+      </w:r>
+      <w:r>
+        <w:rPr/>
+        <w:t xml:space="preserve">.</w:t>
       </w:r>
     </w:p>
     <w:p>
@@ -22942,11 +22937,37 @@
         <w:rPr>
           <w:b/>
         </w:rPr>
-        <w:t xml:space="preserve">Problema</w:t>
-      </w:r>
-      <w:r>
-        <w:rPr/>
-        <w:t xml:space="preserve">: Node.js v12 e Angular datati — dipendenze deprecate, difficoltà a integrare strumenti moderni, manutenzione rischiosa.</w:t>
+        <w:t xml:space="preserve">Due livelli</w:t>
+      </w:r>
+      <w:r>
+        <w:rPr/>
+        <w:t xml:space="preserve">: </w:t>
+      </w:r>
+      <w:r>
+        <w:rPr/>
+        <w:t xml:space="preserve">sola lettura</w:t>
+      </w:r>
+      <w:r>
+        <w:rPr/>
+        <w:t xml:space="preserve"> (consegne, vendite, costi) oppure </w:t>
+      </w:r>
+      <w:r>
+        <w:rPr/>
+        <w:t xml:space="preserve">lettura e scrittura</w:t>
+      </w:r>
+      <w:r>
+        <w:rPr/>
+        <w:t xml:space="preserve"> (può anche </w:t>
+      </w:r>
+      <w:r>
+        <w:rPr>
+          <w:b/>
+        </w:rPr>
+        <w:t xml:space="preserve">creare consegne</w:t>
+      </w:r>
+      <w:r>
+        <w:rPr/>
+        <w:t xml:space="preserve">).</w:t>
       </w:r>
     </w:p>
     <w:p>
@@ -22958,14 +22979,38 @@
         <w:spacing w:lineRule="auto"/>
       </w:pPr>
       <w:r>
-        <w:rPr>
-          <w:b/>
-        </w:rPr>
-        <w:t xml:space="preserve">Approccio</w:t>
-      </w:r>
-      <w:r>
-        <w:rPr/>
-        <w:t xml:space="preserve">: la produzione resta stabile; in parallelo un ambiente di staging con stack aggiornato replica il dominio (utenti/ruoli, consegne, activities, partner, valet, prodotti, vendite, stipendi, regole, finanza) e si migra gradualmente.</w:t>
+        <w:rPr/>
+        <w:t xml:space="preserve">⚠️ </w:t>
+      </w:r>
+      <w:r>
+        <w:rPr>
+          <w:b/>
+        </w:rPr>
+        <w:t xml:space="preserve">Il valore si vede una volta sola</w:t>
+      </w:r>
+      <w:r>
+        <w:rPr/>
+        <w:t xml:space="preserve">, subito dopo la generazione: in archivio resta solo l'impronta SHA-256, e </w:t>
+      </w:r>
+      <w:r>
+        <w:rPr>
+          <w:b/>
+        </w:rPr>
+        <w:t xml:space="preserve">nessuna rotta lo rilegge</w:t>
+      </w:r>
+      <w:r>
+        <w:rPr/>
+        <w:t xml:space="preserve">. Chi la perde </w:t>
+      </w:r>
+      <w:r>
+        <w:rPr>
+          <w:b/>
+        </w:rPr>
+        <w:t xml:space="preserve">rigenera</w:t>
+      </w:r>
+      <w:r>
+        <w:rPr/>
+        <w:t xml:space="preserve">.</w:t>
       </w:r>
     </w:p>
     <w:p>
@@ -22980,27 +23025,21 @@
         <w:rPr>
           <w:b/>
         </w:rPr>
-        <w:t xml:space="preserve">Nuovo ambiente creato</w:t>
-      </w:r>
-      <w:r>
-        <w:rPr/>
-        <w:t xml:space="preserve">: </w:t>
-      </w:r>
-      <w:r>
-        <w:rPr/>
-        <w:t xml:space="preserve">deluxy-platform-next</w:t>
-      </w:r>
-      <w:r>
-        <w:rPr/>
-        <w:t xml:space="preserve"> — monorepo con API NestJS (Node 22 LTS, TypeScript, Prisma, JWT+ruoli, Swagger su </w:t>
-      </w:r>
-      <w:r>
-        <w:rPr/>
-        <w:t xml:space="preserve">/api/docs</w:t>
-      </w:r>
-      <w:r>
-        <w:rPr/>
-        <w:t xml:space="preserve">) e frontend Angular moderno standalone/PWA, seed demo, Docker Compose, README con strategia di migrazione (strangler pattern).</w:t>
+        <w:t xml:space="preserve">Rigenera</w:t>
+      </w:r>
+      <w:r>
+        <w:rPr/>
+        <w:t xml:space="preserve"> dà una chiave nuova alla stessa app: la vecchia smette di funzionare </w:t>
+      </w:r>
+      <w:r>
+        <w:rPr>
+          <w:b/>
+        </w:rPr>
+        <w:t xml:space="preserve">all'istante</w:t>
+      </w:r>
+      <w:r>
+        <w:rPr/>
+        <w:t xml:space="preserve">, quindi l'app va aggiornata subito.</w:t>
       </w:r>
     </w:p>
     <w:p>
@@ -23008,6 +23047,221 @@
         <w:numPr>
           <w:ilvl w:val="0"/>
           <w:numId w:val="48"/>
+        </w:numPr>
+        <w:spacing w:lineRule="auto"/>
+      </w:pPr>
+      <w:r>
+        <w:rPr>
+          <w:b/>
+        </w:rPr>
+        <w:t xml:space="preserve">Scadenza</w:t>
+      </w:r>
+      <w:r>
+        <w:rPr/>
+        <w:t xml:space="preserve"> facoltativa (vuota = non scade), verificata </w:t>
+      </w:r>
+      <w:r>
+        <w:rPr>
+          <w:b/>
+        </w:rPr>
+        <w:t xml:space="preserve">a ogni chiamata</w:t>
+      </w:r>
+      <w:r>
+        <w:rPr/>
+        <w:t xml:space="preserve">. Una chiave scaduta risponde </w:t>
+      </w:r>
+      <w:r>
+        <w:rPr/>
+        <w:t xml:space="preserve">401</w:t>
+      </w:r>
+      <w:r>
+        <w:rPr/>
+        <w:t xml:space="preserve"> dicendo </w:t>
+      </w:r>
+      <w:r>
+        <w:rPr/>
+        <w:t xml:space="preserve">scaduta</w:t>
+      </w:r>
+      <w:r>
+        <w:rPr/>
+        <w:t xml:space="preserve">, non </w:t>
+      </w:r>
+      <w:r>
+        <w:rPr/>
+        <w:t xml:space="preserve">non valida</w:t>
+      </w:r>
+      <w:r>
+        <w:rPr/>
+        <w:t xml:space="preserve">.</w:t>
+      </w:r>
+    </w:p>
+    <w:p>
+      <w:pPr>
+        <w:numPr>
+          <w:ilvl w:val="0"/>
+          <w:numId w:val="48"/>
+        </w:numPr>
+        <w:spacing w:lineRule="auto"/>
+      </w:pPr>
+      <w:r>
+        <w:rPr/>
+        <w:t xml:space="preserve">L'elenco mostra </w:t>
+      </w:r>
+      <w:r>
+        <w:rPr>
+          <w:b/>
+        </w:rPr>
+        <w:t xml:space="preserve">da quanti giorni non la usa nessuno</w:t>
+      </w:r>
+      <w:r>
+        <w:rPr/>
+        <w:t xml:space="preserve">: una chiave viva che nessuno chiama è una porta aperta senza motivo.</w:t>
+      </w:r>
+    </w:p>
+    <w:p>
+      <w:pPr>
+        <w:numPr>
+          <w:ilvl w:val="0"/>
+          <w:numId w:val="48"/>
+        </w:numPr>
+        <w:spacing w:lineRule="auto"/>
+      </w:pPr>
+      <w:r>
+        <w:rPr>
+          <w:b/>
+        </w:rPr>
+        <w:t xml:space="preserve">Spegni/Accendi</w:t>
+      </w:r>
+      <w:r>
+        <w:rPr/>
+        <w:t xml:space="preserve"> senza cancellare, ed </w:t>
+      </w:r>
+      <w:r>
+        <w:rPr>
+          <w:b/>
+        </w:rPr>
+        <w:t xml:space="preserve">Elimina</w:t>
+      </w:r>
+      <w:r>
+        <w:rPr/>
+        <w:t xml:space="preserve"> definitivo.</w:t>
+      </w:r>
+    </w:p>
+    <w:p>
+      <w:pPr>
+        <w:spacing w:lineRule="auto"/>
+      </w:pPr>
+      <w:r>
+        <w:rPr/>
+        <w:t xml:space="preserve">⚠️ Le chiavi </w:t>
+      </w:r>
+      <w:r>
+        <w:rPr>
+          <w:b/>
+        </w:rPr>
+        <w:t xml:space="preserve">non hanno ancora uno scope per rotta</w:t>
+      </w:r>
+      <w:r>
+        <w:rPr/>
+        <w:t xml:space="preserve">: una chiave di sola lettura legge </w:t>
+      </w:r>
+      <w:r>
+        <w:rPr/>
+        <w:t xml:space="preserve">tutto</w:t>
+      </w:r>
+      <w:r>
+        <w:rPr/>
+        <w:t xml:space="preserve"> il canale app, compresi nome, indirizzo e telefono dei destinatari. È un punto aperto dichiarato nell'handoff.</w:t>
+      </w:r>
+    </w:p>
+    <w:p>
+      <w:pPr>
+        <w:pStyle w:val="Heading2"/>
+        <w:spacing w:lineRule="auto"/>
+      </w:pPr>
+      <w:r>
+        <w:rPr/>
+        <w:t xml:space="preserve">9. Piano di modernizzazione (staging)</w:t>
+      </w:r>
+    </w:p>
+    <w:p>
+      <w:pPr>
+        <w:numPr>
+          <w:ilvl w:val="0"/>
+          <w:numId w:val="49"/>
+        </w:numPr>
+        <w:spacing w:lineRule="auto"/>
+      </w:pPr>
+      <w:r>
+        <w:rPr>
+          <w:b/>
+        </w:rPr>
+        <w:t xml:space="preserve">Problema</w:t>
+      </w:r>
+      <w:r>
+        <w:rPr/>
+        <w:t xml:space="preserve">: Node.js v12 e Angular datati — dipendenze deprecate, difficoltà a integrare strumenti moderni, manutenzione rischiosa.</w:t>
+      </w:r>
+    </w:p>
+    <w:p>
+      <w:pPr>
+        <w:numPr>
+          <w:ilvl w:val="0"/>
+          <w:numId w:val="49"/>
+        </w:numPr>
+        <w:spacing w:lineRule="auto"/>
+      </w:pPr>
+      <w:r>
+        <w:rPr>
+          <w:b/>
+        </w:rPr>
+        <w:t xml:space="preserve">Approccio</w:t>
+      </w:r>
+      <w:r>
+        <w:rPr/>
+        <w:t xml:space="preserve">: la produzione resta stabile; in parallelo un ambiente di staging con stack aggiornato replica il dominio (utenti/ruoli, consegne, activities, partner, valet, prodotti, vendite, stipendi, regole, finanza) e si migra gradualmente.</w:t>
+      </w:r>
+    </w:p>
+    <w:p>
+      <w:pPr>
+        <w:numPr>
+          <w:ilvl w:val="0"/>
+          <w:numId w:val="49"/>
+        </w:numPr>
+        <w:spacing w:lineRule="auto"/>
+      </w:pPr>
+      <w:r>
+        <w:rPr>
+          <w:b/>
+        </w:rPr>
+        <w:t xml:space="preserve">Nuovo ambiente creato</w:t>
+      </w:r>
+      <w:r>
+        <w:rPr/>
+        <w:t xml:space="preserve">: </w:t>
+      </w:r>
+      <w:r>
+        <w:rPr/>
+        <w:t xml:space="preserve">deluxy-platform-next</w:t>
+      </w:r>
+      <w:r>
+        <w:rPr/>
+        <w:t xml:space="preserve"> — monorepo con API NestJS (Node 22 LTS, TypeScript, Prisma, JWT+ruoli, Swagger su </w:t>
+      </w:r>
+      <w:r>
+        <w:rPr/>
+        <w:t xml:space="preserve">/api/docs</w:t>
+      </w:r>
+      <w:r>
+        <w:rPr/>
+        <w:t xml:space="preserve">) e frontend Angular moderno standalone/PWA, seed demo, Docker Compose, README con strategia di migrazione (strangler pattern).</w:t>
+      </w:r>
+    </w:p>
+    <w:p>
+      <w:pPr>
+        <w:numPr>
+          <w:ilvl w:val="0"/>
+          <w:numId w:val="49"/>
         </w:numPr>
         <w:spacing w:lineRule="auto"/>
       </w:pPr>
@@ -28715,6 +28969,128 @@
     </w:lvl>
   </w:abstractNum>
   <w:abstractNum w:abstractNumId="48">
+    <w:lvl w:ilvl="0">
+      <w:start w:val="1"/>
+      <w:numFmt w:val="bullet"/>
+      <w:lvlText w:val=""/>
+      <w:lvlJc w:val="left"/>
+      <w:pPr>
+        <w:tabs>
+          <w:tab w:val="num" w:pos="720"/>
+        </w:tabs>
+        <w:ind w:left="720" w:hanging="360"/>
+      </w:pPr>
+      <w:rPr>
+        <w:rFonts w:ascii="Symbol" w:hAnsi="Symbol" w:hint="default"/>
+      </w:rPr>
+    </w:lvl>
+    <w:lvl w:ilvl="1">
+      <w:start w:val="1"/>
+      <w:numFmt w:val="bullet"/>
+      <w:lvlText w:val=""/>
+      <w:lvlJc w:val="left"/>
+      <w:pPr>
+        <w:tabs>
+          <w:tab w:val="num" w:pos="1440"/>
+        </w:tabs>
+        <w:ind w:left="1440" w:hanging="360"/>
+      </w:pPr>
+      <w:rPr>
+        <w:rFonts w:ascii="Symbol" w:hAnsi="Symbol" w:hint="default"/>
+      </w:rPr>
+    </w:lvl>
+    <w:lvl w:ilvl="2">
+      <w:start w:val="1"/>
+      <w:numFmt w:val="bullet"/>
+      <w:lvlText w:val=""/>
+      <w:lvlJc w:val="left"/>
+      <w:pPr>
+        <w:tabs>
+          <w:tab w:val="num" w:pos="2160"/>
+        </w:tabs>
+        <w:ind w:left="2160" w:hanging="360"/>
+      </w:pPr>
+      <w:rPr>
+        <w:rFonts w:ascii="Symbol" w:hAnsi="Symbol" w:hint="default"/>
+      </w:rPr>
+    </w:lvl>
+    <w:lvl w:ilvl="3">
+      <w:start w:val="1"/>
+      <w:numFmt w:val="bullet"/>
+      <w:lvlText w:val=""/>
+      <w:lvlJc w:val="left"/>
+      <w:pPr>
+        <w:tabs>
+          <w:tab w:val="num" w:pos="2880"/>
+        </w:tabs>
+        <w:ind w:left="2880" w:hanging="360"/>
+      </w:pPr>
+      <w:rPr>
+        <w:rFonts w:ascii="Symbol" w:hAnsi="Symbol" w:hint="default"/>
+      </w:rPr>
+    </w:lvl>
+    <w:lvl w:ilvl="4">
+      <w:start w:val="1"/>
+      <w:numFmt w:val="bullet"/>
+      <w:lvlText w:val=""/>
+      <w:lvlJc w:val="left"/>
+      <w:pPr>
+        <w:tabs>
+          <w:tab w:val="num" w:pos="3600"/>
+        </w:tabs>
+        <w:ind w:left="3600" w:hanging="360"/>
+      </w:pPr>
+      <w:rPr>
+        <w:rFonts w:ascii="Symbol" w:hAnsi="Symbol" w:hint="default"/>
+      </w:rPr>
+    </w:lvl>
+    <w:lvl w:ilvl="5">
+      <w:start w:val="1"/>
+      <w:numFmt w:val="bullet"/>
+      <w:lvlText w:val=""/>
+      <w:lvlJc w:val="left"/>
+      <w:pPr>
+        <w:tabs>
+          <w:tab w:val="num" w:pos="4320"/>
+        </w:tabs>
+        <w:ind w:left="4320" w:hanging="360"/>
+      </w:pPr>
+      <w:rPr>
+        <w:rFonts w:ascii="Symbol" w:hAnsi="Symbol" w:hint="default"/>
+      </w:rPr>
+    </w:lvl>
+    <w:lvl w:ilvl="6">
+      <w:start w:val="1"/>
+      <w:numFmt w:val="bullet"/>
+      <w:lvlText w:val=""/>
+      <w:lvlJc w:val="left"/>
+      <w:pPr>
+        <w:tabs>
+          <w:tab w:val="num" w:pos="5040"/>
+        </w:tabs>
+        <w:ind w:left="5040" w:hanging="360"/>
+      </w:pPr>
+      <w:rPr>
+        <w:rFonts w:ascii="Symbol" w:hAnsi="Symbol" w:hint="default"/>
+      </w:rPr>
+    </w:lvl>
+    <w:lvl w:ilvl="7">
+      <w:start w:val="1"/>
+      <w:numFmt w:val="bullet"/>
+      <w:lvlText w:val=""/>
+      <w:lvlJc w:val="left"/>
+      <w:pPr>
+        <w:tabs>
+          <w:tab w:val="num" w:pos="5760"/>
+        </w:tabs>
+        <w:ind w:left="5760" w:hanging="360"/>
+      </w:pPr>
+      <w:rPr>
+        <w:rFonts w:ascii="Symbol" w:hAnsi="Symbol" w:hint="default"/>
+      </w:rPr>
+    </w:lvl>
+  </w:abstractNum>
+  <w:abstractNum w:abstractNumId="49">
     <w:lvl w:ilvl="0">
       <w:start w:val="1"/>
       <w:numFmt w:val="bullet"/>
@@ -28979,6 +29355,9 @@
   </w:num>
   <w:num w:numId="48">
     <w:abstractNumId w:val="48"/>
+  </w:num>
+  <w:num w:numId="49">
+    <w:abstractNumId w:val="49"/>
   </w:num>
 </w:numbering>
 </file>

</xml_diff>

<commit_message>
Piattaforma: home «Servizi» del partner rifatta (servizi del listino → form già impostato), accesa per email da Impostazioni (oggi chanel_consegne); Duplica dallo storico con data vuota
- partner-home: tessere dai PartnerService attivi, prezzo per modello, link /deliveries/new?servizio=<id>
- login: user.homeVetrina dal setting homePartnerEmails (solo PARTNER); atterraggio /home e voce «Servizi Deluxy» solo con il flag
- settings: chiave homePartnerEmails + campo in Impostazioni; script imposta-home-partner.mjs
- delivery-form: ?servizio= applicato all'arrivo dei servizi; duplica non eredita la data (dataDaScegliere)
- Docs: HANDOFF, COME-FUNZIONA (+docx), guida-visiva, SEGNALAZIONI-UX

Co-Authored-By: Claude Fable 5.1 <noreply@anthropic.com>
</commit_message>
<xml_diff>
--- a/deluxy-platform-next/docs/COME-FUNZIONA-APP-DELUXY.docx
+++ b/deluxy-platform-next/docs/COME-FUNZIONA-APP-DELUXY.docx
@@ -169,6 +169,96 @@
           <w:b/>
         </w:rPr>
         <w:t xml:space="preserve">Changelog</w:t>
+      </w:r>
+      <w:r>
+        <w:rPr>
+          <w:b/>
+        </w:rPr>
+        <w:t xml:space="preserve">04/09/2026 (2) — </w:t>
+      </w:r>
+      <w:r>
+        <w:rPr>
+          <w:b/>
+        </w:rPr>
+        <w:t xml:space="preserve">Home «Servizi» del partner, accesa per email</w:t>
+      </w:r>
+      <w:r>
+        <w:rPr>
+          <w:b/>
+        </w:rPr>
+        <w:t xml:space="preserve">: per i partner elencati in Configurazione → Impostazioni → «Home Servizi all'accesso» (oggi: </w:t>
+      </w:r>
+      <w:r>
+        <w:rPr>
+          <w:b/>
+        </w:rPr>
+        <w:t xml:space="preserve">chanel_consegne@deluxy.it</w:t>
+      </w:r>
+      <w:r>
+        <w:rPr>
+          <w:b/>
+        </w:rPr>
+        <w:t xml:space="preserve">) la prima schermata è </w:t>
+      </w:r>
+      <w:r>
+        <w:rPr>
+          <w:b/>
+        </w:rPr>
+        <w:t xml:space="preserve">/home</w:t>
+      </w:r>
+      <w:r>
+        <w:rPr>
+          <w:b/>
+        </w:rPr>
+        <w:t xml:space="preserve"> con </w:t>
+      </w:r>
+      <w:r>
+        <w:rPr>
+          <w:b/>
+        </w:rPr>
+        <w:t xml:space="preserve">i servizi del proprio listino</w:t>
+      </w:r>
+      <w:r>
+        <w:rPr>
+          <w:b/>
+        </w:rPr>
+        <w:t xml:space="preserve">, una tessera ciascuno (modello e prezzo) che apre il form consegna </w:t>
+      </w:r>
+      <w:r>
+        <w:rPr>
+          <w:b/>
+        </w:rPr>
+        <w:t xml:space="preserve">col servizio già scelto</w:t>
+      </w:r>
+      <w:r>
+        <w:rPr>
+          <w:b/>
+        </w:rPr>
+        <w:t xml:space="preserve"> (</w:t>
+      </w:r>
+      <w:r>
+        <w:rPr>
+          <w:b/>
+        </w:rPr>
+        <w:t xml:space="preserve">?servizio=</w:t>
+      </w:r>
+      <w:r>
+        <w:rPr>
+          <w:b/>
+        </w:rPr>
+        <w:t xml:space="preserve">); in menu compare «Servizi Deluxy». Gli altri partner entrano sulle Consegne come prima. </w:t>
+      </w:r>
+      <w:r>
+        <w:rPr>
+          <w:b/>
+        </w:rPr>
+        <w:t xml:space="preserve">Duplica dallo storico: la data resta vuota</w:t>
+      </w:r>
+      <w:r>
+        <w:rPr>
+          <w:b/>
+        </w:rPr>
+        <w:t xml:space="preserve">, la sceglie chi compila.</w:t>
       </w:r>
       <w:r>
         <w:rPr>
@@ -20444,6 +20534,130 @@
       </w:pPr>
       <w:r>
         <w:rPr/>
+        <w:t xml:space="preserve">Home «Servizi» del partner </w:t>
+      </w:r>
+      <w:r>
+        <w:rPr>
+          <w:b/>
+        </w:rPr>
+        <w:t xml:space="preserve">[RIFATTA 04/09/2026, accesa per email]</w:t>
+      </w:r>
+    </w:p>
+    <w:p>
+      <w:pPr>
+        <w:spacing w:lineRule="auto"/>
+      </w:pPr>
+      <w:r>
+        <w:rPr/>
+        <w:t xml:space="preserve">La pagina </w:t>
+      </w:r>
+      <w:r>
+        <w:rPr/>
+        <w:t xml:space="preserve">/home</w:t>
+      </w:r>
+      <w:r>
+        <w:rPr/>
+        <w:t xml:space="preserve"> (solo PARTNER) mostra </w:t>
+      </w:r>
+      <w:r>
+        <w:rPr>
+          <w:b/>
+        </w:rPr>
+        <w:t xml:space="preserve">i servizi del listino del partner</w:t>
+      </w:r>
+      <w:r>
+        <w:rPr/>
+        <w:t xml:space="preserve"> che può richiedere: i </w:t>
+      </w:r>
+      <w:r>
+        <w:rPr/>
+        <w:t xml:space="preserve">PartnerService</w:t>
+      </w:r>
+      <w:r>
+        <w:rPr/>
+        <w:t xml:space="preserve"> attivi della sua scheda, nell'ordine del form consegna (prezzo fisso → vendita → a ore → resto, poi per nome). Ogni tessera dice modello e prezzo (da X €, km inclusi, €/ora con minimo ore, quota % sulle vendite, €/pezzo a magazzino; gli zeri non si mostrano) e apre </w:t>
+      </w:r>
+      <w:r>
+        <w:rPr/>
+        <w:t xml:space="preserve">/deliveries/new?servizio=&lt;serviceTypeId&gt;</w:t>
+      </w:r>
+      <w:r>
+        <w:rPr/>
+        <w:t xml:space="preserve">: il form parte col servizio già selezionato (parametro nuovo, applicato appena arriva la lista servizi). In coda le tessere «Servizio ricorrente» (→ Servizi ricorrenti) e «Ti serve altro?» (→ Preventivi); restano il bottone WhatsApp e le ultime richieste di preventivo.</w:t>
+      </w:r>
+    </w:p>
+    <w:p>
+      <w:pPr>
+        <w:spacing w:lineRule="auto"/>
+      </w:pPr>
+      <w:r>
+        <w:rPr>
+          <w:b/>
+        </w:rPr>
+        <w:t xml:space="preserve">Chi la vede</w:t>
+      </w:r>
+      <w:r>
+        <w:rPr/>
+        <w:t xml:space="preserve">: l'impostazione </w:t>
+      </w:r>
+      <w:r>
+        <w:rPr/>
+        <w:t xml:space="preserve">homePartnerEmails</w:t>
+      </w:r>
+      <w:r>
+        <w:rPr/>
+        <w:t xml:space="preserve"> (Configurazione → Impostazioni → Canale partner → «Home Servizi all'accesso», email separate da virgola). Al login il server calcola </w:t>
+      </w:r>
+      <w:r>
+        <w:rPr/>
+        <w:t xml:space="preserve">user.homeVetrina</w:t>
+      </w:r>
+      <w:r>
+        <w:rPr/>
+        <w:t xml:space="preserve"> = ruolo PARTNER </w:t>
+      </w:r>
+      <w:r>
+        <w:rPr>
+          <w:b/>
+        </w:rPr>
+        <w:t xml:space="preserve">e</w:t>
+      </w:r>
+      <w:r>
+        <w:rPr/>
+        <w:t xml:space="preserve"> email in elenco: con il flag il login atterra su </w:t>
+      </w:r>
+      <w:r>
+        <w:rPr/>
+        <w:t xml:space="preserve">/home</w:t>
+      </w:r>
+      <w:r>
+        <w:rPr/>
+        <w:t xml:space="preserve"> e il menu ha «Servizi Deluxy»; senza, la prima schermata resta Consegne e la voce non c'è (la rotta </w:t>
+      </w:r>
+      <w:r>
+        <w:rPr/>
+        <w:t xml:space="preserve">/home</w:t>
+      </w:r>
+      <w:r>
+        <w:rPr/>
+        <w:t xml:space="preserve"> resta raggiungibile a mano da ogni partner). Il flag viaggia col login: una modifica all'elenco vale dal login successivo. Al 04/09 l'elenco contiene solo </w:t>
+      </w:r>
+      <w:r>
+        <w:rPr/>
+        <w:t xml:space="preserve">chanel_consegne@deluxy.it</w:t>
+      </w:r>
+      <w:r>
+        <w:rPr/>
+        <w:t xml:space="preserve">.</w:t>
+      </w:r>
+    </w:p>
+    <w:p>
+      <w:pPr>
+        <w:pStyle w:val="Heading4"/>
+        <w:spacing w:lineRule="auto"/>
+      </w:pPr>
+      <w:r>
+        <w:rPr/>
         <w:t xml:space="preserve">Aggiornamento automatico delle liste </w:t>
       </w:r>
       <w:r>

</xml_diff>

<commit_message>
Fatturazione: il plus/minus RECEPISCE la regola carnet, non si somma (regola utente, caso Armani: −18 −18 → 0 invece di 9,98)
- prezzoConsegna: con regola, extra = plus scritto se ≠ 0 altrimenti aggiustamento regola; senza regola il plus. Una casa: fatturazione, da fatturare, Calcoli, costo verso Orders
- dettaglio consegna: stessa lettura in plusMinus()
- ricalcola-righe-bozze-regola.mjs: anteprima/applica sulle bozze DRAFT già generate (non tocca FINANCE)
- Docs: HANDOFF, COME-FUNZIONA (+docx, §7-bis), guida-visiva (regola del posto)

Co-Authored-By: Claude Fable 5.1 <noreply@anthropic.com>
</commit_message>
<xml_diff>
--- a/deluxy-platform-next/docs/COME-FUNZIONA-APP-DELUXY.docx
+++ b/deluxy-platform-next/docs/COME-FUNZIONA-APP-DELUXY.docx
@@ -169,6 +169,36 @@
           <w:b/>
         </w:rPr>
         <w:t xml:space="preserve">Changelog</w:t>
+      </w:r>
+      <w:r>
+        <w:rPr>
+          <w:b/>
+        </w:rPr>
+        <w:t xml:space="preserve">04/09/2026 (3) — </w:t>
+      </w:r>
+      <w:r>
+        <w:rPr>
+          <w:b/>
+        </w:rPr>
+        <w:t xml:space="preserve">Il plus/minus recepisce la regola carnet, non si somma a lei</w:t>
+      </w:r>
+      <w:r>
+        <w:rPr>
+          <w:b/>
+        </w:rPr>
+        <w:t xml:space="preserve"> (regola dell'utente, caso Armani Fiori): con una regola agganciata il plus/minus scritto sulla consegna È lo sconto della regola (il legacy lo ricopiava lì su 3.455 consegne) e in fattura conta una volta sola — vale il plus scritto se c'è, altrimenti l'aggiustamento della regola. Prima si sommavano e una consegna da 27,98 € con regola −18 e plus −18 fatturava 0 invece di 9,98. Vale in Fatturazione, Da fatturare, Calcoli, dettaglio consegna e nel costo comunicato a Orders (§7-bis). Le bozze già generate si ricalcolano con </w:t>
+      </w:r>
+      <w:r>
+        <w:rPr>
+          <w:b/>
+        </w:rPr>
+        <w:t xml:space="preserve">ricalcola-righe-bozze-regola.mjs</w:t>
+      </w:r>
+      <w:r>
+        <w:rPr>
+          <w:b/>
+        </w:rPr>
+        <w:t xml:space="preserve">.</w:t>
       </w:r>
       <w:r>
         <w:rPr>
@@ -21168,6 +21198,63 @@
     </w:p>
     <w:p>
       <w:pPr>
+        <w:spacing w:lineRule="auto"/>
+      </w:pPr>
+      <w:r>
+        <w:rPr>
+          <w:b/>
+        </w:rPr>
+        <w:t xml:space="preserve">Plus/minus e regola carnet (regola dell'utente, 04/09/2026).</w:t>
+      </w:r>
+      <w:r>
+        <w:rPr/>
+        <w:t xml:space="preserve"> Il plus/minus del partner (</w:t>
+      </w:r>
+      <w:r>
+        <w:rPr/>
+        <w:t xml:space="preserve">Delivery.additionalPrice</w:t>
+      </w:r>
+      <w:r>
+        <w:rPr/>
+        <w:t xml:space="preserve">) non è un valore in più rispetto alla regola carnet agganciata (</w:t>
+      </w:r>
+      <w:r>
+        <w:rPr/>
+        <w:t xml:space="preserve">DeliveryRule.partnerBillingAdjustment</w:t>
+      </w:r>
+      <w:r>
+        <w:rPr/>
+        <w:t xml:space="preserve">): la </w:t>
+      </w:r>
+      <w:r>
+        <w:rPr>
+          <w:b/>
+        </w:rPr>
+        <w:t xml:space="preserve">recepisce</w:t>
+      </w:r>
+      <w:r>
+        <w:rPr/>
+        <w:t xml:space="preserve">. In </w:t>
+      </w:r>
+      <w:r>
+        <w:rPr/>
+        <w:t xml:space="preserve">prezzoConsegna</w:t>
+      </w:r>
+      <w:r>
+        <w:rPr/>
+        <w:t xml:space="preserve"> l'extra da sommare al prezzo è: con regola → il plus scritto se diverso da zero, altrimenti l'aggiustamento della regola; senza regola → il plus scritto. Mai la somma dei due. Una regola con </w:t>
+      </w:r>
+      <w:r>
+        <w:rPr/>
+        <w:t xml:space="preserve">toBill = false</w:t>
+      </w:r>
+      <w:r>
+        <w:rPr/>
+        <w:t xml:space="preserve"> continua a vincere su tutto (non si fattura).</w:t>
+      </w:r>
+    </w:p>
+    <w:p>
+      <w:pPr>
         <w:pStyle w:val="Heading3"/>
         <w:spacing w:lineRule="auto"/>
       </w:pPr>

</xml_diff>

<commit_message>
Consegna: campo «Regole» (ruleAdjustment) separato dal plus/minus manuale — regola utente 04/09
- schema: Delivery.ruleAdjustment (ALTER additivo, già in prod); scritto all'aggancio della regola carnet
- prezzoConsegna: extra = plus manuale + (ruleAdjustment ?? aggiustamento regola); stessa somma in app-api, orders-sync, finance
- dettaglio: riga «Regole» + «Plus / minus» distinti; form: Regole in sola lettura; Fatturazione › Da fatturare: colonna Regole
- maschere: ruleAdjustment nei SOLDI_DEL_PARTNER e nei CAMPI_DI_UFFICIO
- migra-plus-in-regole.mjs (anteprima/applica, backup + registro); script report allineati
- Docs: HANDOFF, COME-FUNZIONA (+docx), guida-visiva, SEGNALAZIONI-UX

Co-Authored-By: Claude Fable 5.1 <noreply@anthropic.com>
</commit_message>
<xml_diff>
--- a/deluxy-platform-next/docs/COME-FUNZIONA-APP-DELUXY.docx
+++ b/deluxy-platform-next/docs/COME-FUNZIONA-APP-DELUXY.docx
@@ -169,6 +169,48 @@
           <w:b/>
         </w:rPr>
         <w:t xml:space="preserve">Changelog</w:t>
+      </w:r>
+      <w:r>
+        <w:rPr>
+          <w:b/>
+        </w:rPr>
+        <w:t xml:space="preserve">04/09/2026 (4) — </w:t>
+      </w:r>
+      <w:r>
+        <w:rPr>
+          <w:b/>
+        </w:rPr>
+        <w:t xml:space="preserve">Campo «Regole» sulla consegna</w:t>
+      </w:r>
+      <w:r>
+        <w:rPr>
+          <w:b/>
+        </w:rPr>
+        <w:t xml:space="preserve">: il valore della regola carnet applicata (sconto o maggiorazione in fattura) ha un campo suo, </w:t>
+      </w:r>
+      <w:r>
+        <w:rPr>
+          <w:b/>
+        </w:rPr>
+        <w:t xml:space="preserve">ruleAdjustment</w:t>
+      </w:r>
+      <w:r>
+        <w:rPr>
+          <w:b/>
+        </w:rPr>
+        <w:t xml:space="preserve">, fotografato all'aggancio della regola; il </w:t>
+      </w:r>
+      <w:r>
+        <w:rPr>
+          <w:b/>
+        </w:rPr>
+        <w:t xml:space="preserve">plus/minus resta solo per le variazioni manuali</w:t>
+      </w:r>
+      <w:r>
+        <w:rPr>
+          <w:b/>
+        </w:rPr>
+        <w:t xml:space="preserve">. Si vede nel dettaglio consegna (riga «Regole» con il nome della regola), nel form (sola lettura) e in Fatturazione › Da fatturare (colonna «Regole», col plus manuale accanto). In fattura i due si sommano al prezzo. Migrati i dati: nelle 3.455 consegne dove il plus era la copia della regola il valore è passato in «Regole» e il plus è tornato vuoto; nelle 3.373 con la sola regola «Regole» è stato valorizzato; nelle 54 con un plus diverso il plus manuale è diventato la differenza, a totale invariato.</w:t>
       </w:r>
       <w:r>
         <w:rPr>
@@ -21208,33 +21250,41 @@
       </w:r>
       <w:r>
         <w:rPr/>
-        <w:t xml:space="preserve"> Il plus/minus del partner (</w:t>
-      </w:r>
-      <w:r>
-        <w:rPr/>
-        <w:t xml:space="preserve">Delivery.additionalPrice</w:t>
-      </w:r>
-      <w:r>
-        <w:rPr/>
-        <w:t xml:space="preserve">) non è un valore in più rispetto alla regola carnet agganciata (</w:t>
-      </w:r>
-      <w:r>
-        <w:rPr/>
-        <w:t xml:space="preserve">DeliveryRule.partnerBillingAdjustment</w:t>
-      </w:r>
-      <w:r>
-        <w:rPr/>
-        <w:t xml:space="preserve">): la </w:t>
-      </w:r>
-      <w:r>
-        <w:rPr>
-          <w:b/>
-        </w:rPr>
-        <w:t xml:space="preserve">recepisce</w:t>
-      </w:r>
-      <w:r>
-        <w:rPr/>
-        <w:t xml:space="preserve">. In </w:t>
+        <w:t xml:space="preserve"> Sulla consegna ci sono DUE campi: </w:t>
+      </w:r>
+      <w:r>
+        <w:rPr/>
+        <w:t xml:space="preserve">additionalPrice</w:t>
+      </w:r>
+      <w:r>
+        <w:rPr/>
+        <w:t xml:space="preserve"> = plus/minus </w:t>
+      </w:r>
+      <w:r>
+        <w:rPr>
+          <w:b/>
+        </w:rPr>
+        <w:t xml:space="preserve">manuale</w:t>
+      </w:r>
+      <w:r>
+        <w:rPr/>
+        <w:t xml:space="preserve">; </w:t>
+      </w:r>
+      <w:r>
+        <w:rPr/>
+        <w:t xml:space="preserve">ruleAdjustment</w:t>
+      </w:r>
+      <w:r>
+        <w:rPr/>
+        <w:t xml:space="preserve"> («Regole») = il valore della regola carnet applicata, fotografato all'aggancio (</w:t>
+      </w:r>
+      <w:r>
+        <w:rPr/>
+        <w:t xml:space="preserve">agganciaRegolaCarnet</w:t>
+      </w:r>
+      <w:r>
+        <w:rPr/>
+        <w:t xml:space="preserve">). In </w:t>
       </w:r>
       <w:r>
         <w:rPr/>
@@ -21242,7 +21292,15 @@
       </w:r>
       <w:r>
         <w:rPr/>
-        <w:t xml:space="preserve"> l'extra da sommare al prezzo è: con regola → il plus scritto se diverso da zero, altrimenti l'aggiustamento della regola; senza regola → il plus scritto. Mai la somma dei due. Una regola con </w:t>
+        <w:t xml:space="preserve"> l'extra sommato al prezzo è </w:t>
+      </w:r>
+      <w:r>
+        <w:rPr/>
+        <w:t xml:space="preserve">additionalPrice + (ruleAdjustment ?? partnerBillingAdjustment della regola)</w:t>
+      </w:r>
+      <w:r>
+        <w:rPr/>
+        <w:t xml:space="preserve"> — il ripiego sulla regola serve solo alle consegne non ancora fotografate. Una regola con </w:t>
       </w:r>
       <w:r>
         <w:rPr/>
@@ -21250,7 +21308,7 @@
       </w:r>
       <w:r>
         <w:rPr/>
-        <w:t xml:space="preserve"> continua a vincere su tutto (non si fattura).</w:t>
+        <w:t xml:space="preserve"> continua a vincere su tutto (non si fattura). Lo stesso extra entra nel costo comunicato a Orders/Budgets e nella Finanza.</w:t>
       </w:r>
     </w:p>
     <w:p>

</xml_diff>

<commit_message>
Vendite: rifiuto a due esiti (partner → ufficio, ufficio → storico), pop-up di dettaglio col registro (SaleLog), stato in Orders, data storico; Consegne: le caselle della selezione multipla si spuntano (niente affondo sui controlli)
IN LOCALE — non pushato, non deployato (regola utente 04/09: push e deploy solo a comando).
- SaleLog + Sale.historyAt (migrazione additiva in applica-migrazione-registro-vendite.mjs, da lanciare prima del deploy)
- registra() su creazione/accetta/rifiuta/presa in mano/modifica/collega/CS/annullo Orders/rifiuto consegna
- GET /sales/:id anche al partner (solo le sue, ufficio mascherato); findAll arricchito con lo stato in Orders (cache 2')
- styles.css: .row-link:has(controllo:active) niente transform

Co-Authored-By: Claude Fable 5.1 <noreply@anthropic.com>
</commit_message>
<xml_diff>
--- a/deluxy-platform-next/docs/COME-FUNZIONA-APP-DELUXY.docx
+++ b/deluxy-platform-next/docs/COME-FUNZIONA-APP-DELUXY.docx
@@ -169,6 +169,96 @@
           <w:b/>
         </w:rPr>
         <w:t xml:space="preserve">Changelog</w:t>
+      </w:r>
+      <w:r>
+        <w:rPr>
+          <w:b/>
+        </w:rPr>
+        <w:t xml:space="preserve">04/09/2026 (5) — </w:t>
+      </w:r>
+      <w:r>
+        <w:rPr>
+          <w:b/>
+        </w:rPr>
+        <w:t xml:space="preserve">Vendite</w:t>
+      </w:r>
+      <w:r>
+        <w:rPr>
+          <w:b/>
+        </w:rPr>
+        <w:t xml:space="preserve">: il </w:t>
+      </w:r>
+      <w:r>
+        <w:rPr>
+          <w:b/>
+        </w:rPr>
+        <w:t xml:space="preserve">rifiuto ha due esiti</w:t>
+      </w:r>
+      <w:r>
+        <w:rPr>
+          <w:b/>
+        </w:rPr>
+        <w:t xml:space="preserve"> — il partner che rifiuta la rimanda all'ufficio «da gestire» (non gira più al partner successivo), l'ufficio che rifiuta la chiude in storico come non accettata; </w:t>
+      </w:r>
+      <w:r>
+        <w:rPr>
+          <w:b/>
+        </w:rPr>
+        <w:t xml:space="preserve">pop-up di dettaglio</w:t>
+      </w:r>
+      <w:r>
+        <w:rPr>
+          <w:b/>
+        </w:rPr>
+        <w:t xml:space="preserve"> cliccando la riga (stessa struttura del Customer Service) con in fondo il </w:t>
+      </w:r>
+      <w:r>
+        <w:rPr>
+          <w:b/>
+        </w:rPr>
+        <w:t xml:space="preserve">registro</w:t>
+      </w:r>
+      <w:r>
+        <w:rPr>
+          <w:b/>
+        </w:rPr>
+        <w:t xml:space="preserve"> della vendita (creazione, cambi di stato, modifiche campo per campo, agganci, con chi li ha fatti); colonna </w:t>
+      </w:r>
+      <w:r>
+        <w:rPr>
+          <w:b/>
+        </w:rPr>
+        <w:t xml:space="preserve">Stato in Orders</w:t>
+      </w:r>
+      <w:r>
+        <w:rPr>
+          <w:b/>
+        </w:rPr>
+        <w:t xml:space="preserve"> letta dal vivo; nello Storico la </w:t>
+      </w:r>
+      <w:r>
+        <w:rPr>
+          <w:b/>
+        </w:rPr>
+        <w:t xml:space="preserve">Data storico</w:t>
+      </w:r>
+      <w:r>
+        <w:rPr>
+          <w:b/>
+        </w:rPr>
+        <w:t xml:space="preserve">. </w:t>
+      </w:r>
+      <w:r>
+        <w:rPr>
+          <w:b/>
+        </w:rPr>
+        <w:t xml:space="preserve">Consegne</w:t>
+      </w:r>
+      <w:r>
+        <w:rPr>
+          <w:b/>
+        </w:rPr>
+        <w:t xml:space="preserve">: le caselle della selezione multipla non si spuntavano (l'affondo della riga spostava la casella sotto il mouse): corretto.</w:t>
       </w:r>
       <w:r>
         <w:rPr>

</xml_diff>

<commit_message>
Recap del mattino: oggi e i sei giorni seguenti, un blocco per giorno; una riga di registro per partner e invio
Co-Authored-By: Claude Fable 5.1 <noreply@anthropic.com>
</commit_message>
<xml_diff>
--- a/deluxy-platform-next/docs/COME-FUNZIONA-APP-DELUXY.docx
+++ b/deluxy-platform-next/docs/COME-FUNZIONA-APP-DELUXY.docx
@@ -336,7 +336,31 @@
         <w:rPr>
           <w:b/>
         </w:rPr>
-        <w:t xml:space="preserve"> le sue consegne VIVE (non chiuse, non cancellate) del giorno: la mattina quelle di oggi, la sera quelle di domani, e la sera solo a chi domani ha qualcosa. ⚠️ </w:t>
+        <w:t xml:space="preserve"> le sue consegne VIVE (non chiuse, non cancellate): la mattina quelle di </w:t>
+      </w:r>
+      <w:r>
+        <w:rPr>
+          <w:b/>
+        </w:rPr>
+        <w:t xml:space="preserve">oggi e dei sei giorni seguenti</w:t>
+      </w:r>
+      <w:r>
+        <w:rPr>
+          <w:b/>
+        </w:rPr>
+        <w:t xml:space="preserve"> (una settimana, </w:t>
+      </w:r>
+      <w:r>
+        <w:rPr>
+          <w:b/>
+        </w:rPr>
+        <w:t xml:space="preserve">GIORNI_RECAP_MATTINA</w:t>
+      </w:r>
+      <w:r>
+        <w:rPr>
+          <w:b/>
+        </w:rPr>
+        <w:t xml:space="preserve">, raggruppate per giorno con oggi in testa — regola utente: «non solo di oggi ma dei prossimi giorni»), la sera quelle di domani, e la sera solo a chi domani ha qualcosa. ⚠️ </w:t>
       </w:r>
       <w:r>
         <w:rPr>
@@ -33402,7 +33426,17 @@
       </w:r>
       <w:r>
         <w:rPr/>
-        <w:t xml:space="preserve"> — «Oggi hai N consegne»: le consegne di oggi ancora vive (stato non chiuso, non cancellate).</w:t>
+        <w:t xml:space="preserve"> — «Oggi hai N consegne, e M nei prossimi giorni»: le consegne ancora vive (stato non chiuso, non cancellate) di </w:t>
+      </w:r>
+      <w:r>
+        <w:rPr>
+          <w:b/>
+        </w:rPr>
+        <w:t xml:space="preserve">oggi e dei sei giorni seguenti</w:t>
+      </w:r>
+      <w:r>
+        <w:rPr/>
+        <w:t xml:space="preserve">, un blocco per giorno («Oggi», «Domani», poi la data), oggi in testa.</w:t>
       </w:r>
     </w:p>
     <w:p>
@@ -33548,15 +33582,25 @@
       </w:r>
       <w:r>
         <w:rPr/>
-        <w:t xml:space="preserve">), registrati ciascuno a due ore UTC (5 e 6; 16:30 e 17:30) perché Vercel non conosce l'ora legale: la rotta controlla l'ora di Roma e parte solo all'ora giusta. Un marcatore nel registro di ogni consegna (</w:t>
-      </w:r>
-      <w:r>
-        <w:rPr/>
-        <w:t xml:space="preserve">[recap-partner:&lt;tipo&gt;:&lt;giorno&gt;]</w:t>
-      </w:r>
-      <w:r>
-        <w:rPr/>
-        <w:t xml:space="preserve">, riga «Recap del mattino inviato al partner») garantisce </w:t>
+        <w:t xml:space="preserve">), registrati ciascuno a due ore UTC (5 e 6; 16:30 e 17:30) perché Vercel non conosce l'ora legale: la rotta controlla l'ora di Roma e parte solo all'ora giusta. Un marcatore nel registro (</w:t>
+      </w:r>
+      <w:r>
+        <w:rPr/>
+        <w:t xml:space="preserve">[recap-partner:&lt;tipo&gt;:&lt;giorno dell'invio&gt;]</w:t>
+      </w:r>
+      <w:r>
+        <w:rPr/>
+        <w:t xml:space="preserve">, </w:t>
+      </w:r>
+      <w:r>
+        <w:rPr>
+          <w:b/>
+        </w:rPr>
+        <w:t xml:space="preserve">una</w:t>
+      </w:r>
+      <w:r>
+        <w:rPr/>
+        <w:t xml:space="preserve"> riga «Recap del mattino inviato al partner: N consegne dal … al …» sulla prima consegna dell'elenco) garantisce </w:t>
       </w:r>
       <w:r>
         <w:rPr>

</xml_diff>

<commit_message>
Vendita accettata → consegna sempre («Vendita Deluxy»); pezzi e importo dalle righe d'ordine; script per le vendite ferme
- creaConsegna usa «Vendita Deluxy» quando la vendita non ha un servizio (15 accettate senza consegna dal 24/08, #12901 di Rizzi compresa); accetta scrive il servizio sulla vendita
- creaConsegnaMancante + POST /sales/:id/crea-consegna (ufficio, idempotente, dice cosa manca)
- orders-sync: per i prodotti a catalogo amount = prezzo × pezzi e quantity = pezzi (Macarons ×2 nasceva 130 € × 1)
- scripts/crea-consegne-vendite-ferme.ts: cerca prima una consegna esistente e la aggancia; stesso ordine e partner = una consegna con più righe; riallinea pezzi dalla riga d'ordine. Eseguito su #12901: consegna #101130
- Manuale (64) + Word, guida visiva, handoff (14)

Co-Authored-By: Claude Fable 5.1 <noreply@anthropic.com>
</commit_message>
<xml_diff>
--- a/deluxy-platform-next/docs/COME-FUNZIONA-APP-DELUXY.docx
+++ b/deluxy-platform-next/docs/COME-FUNZIONA-APP-DELUXY.docx
@@ -169,6 +169,204 @@
           <w:b/>
         </w:rPr>
         <w:t xml:space="preserve">Changelog</w:t>
+      </w:r>
+      <w:r>
+        <w:rPr>
+          <w:b/>
+        </w:rPr>
+        <w:t xml:space="preserve">07/09/2026 (64) — </w:t>
+      </w:r>
+      <w:r>
+        <w:rPr>
+          <w:b/>
+        </w:rPr>
+        <w:t xml:space="preserve">La vendita accettata fa SEMPRE nascere la consegna: il tipo di servizio è «Vendita Deluxy»; le righe d'ordine portano i pezzi</w:t>
+      </w:r>
+      <w:r>
+        <w:rPr>
+          <w:b/>
+        </w:rPr>
+        <w:t xml:space="preserve"> (regola utente, sul caso #12901: «il tipo di servizio è sempre vendita deluxy, crea anche le consegne»). Prima le vendite arrivate da Orders non avevano un tipo di servizio e </w:t>
+      </w:r>
+      <w:r>
+        <w:rPr>
+          <w:b/>
+        </w:rPr>
+        <w:t xml:space="preserve">creaConsegna</w:t>
+      </w:r>
+      <w:r>
+        <w:rPr>
+          <w:b/>
+        </w:rPr>
+        <w:t xml:space="preserve"> usciva in silenzio: «Accettata dal partner — consegna NON creata (dati mancanti)» su 15 vendite dal 24/08; #12901 (Rizzi, 655 €) accettata in 20 secondi e mai diventata consegna. Ora </w:t>
+      </w:r>
+      <w:r>
+        <w:rPr>
+          <w:b/>
+        </w:rPr>
+        <w:t xml:space="preserve">SalesService.creaConsegna</w:t>
+      </w:r>
+      <w:r>
+        <w:rPr>
+          <w:b/>
+        </w:rPr>
+        <w:t xml:space="preserve"> usa «Vendita Deluxy» (</w:t>
+      </w:r>
+      <w:r>
+        <w:rPr>
+          <w:b/>
+        </w:rPr>
+        <w:t xml:space="preserve">servizioVenditaDeluxy()</w:t>
+      </w:r>
+      <w:r>
+        <w:rPr>
+          <w:b/>
+        </w:rPr>
+        <w:t xml:space="preserve">, letto per nome, tenuto in memoria) quando la vendita non lo dice, e lo scrive anche sulla vendita all'accettazione. </w:t>
+      </w:r>
+      <w:r>
+        <w:rPr>
+          <w:b/>
+        </w:rPr>
+        <w:t xml:space="preserve">Nuovo</w:t>
+      </w:r>
+      <w:r>
+        <w:rPr>
+          <w:b/>
+        </w:rPr>
+        <w:t xml:space="preserve">POST /sales/:id/crea-consegna</w:t>
+      </w:r>
+      <w:r>
+        <w:rPr>
+          <w:b/>
+        </w:rPr>
+        <w:t xml:space="preserve"> (ADMIN/OPERATION, </w:t>
+      </w:r>
+      <w:r>
+        <w:rPr>
+          <w:b/>
+        </w:rPr>
+        <w:t xml:space="preserve">creaConsegnaMancante</w:t>
+      </w:r>
+      <w:r>
+        <w:rPr>
+          <w:b/>
+        </w:rPr>
+        <w:t xml:space="preserve">): crea a posteriori la consegna di una vendita accettata rimasta senza, idempotente, e dice cosa manca (partner, data, destinatario, indirizzo). Script </w:t>
+      </w:r>
+      <w:r>
+        <w:rPr>
+          <w:b/>
+        </w:rPr>
+        <w:t xml:space="preserve">api/scripts/crea-consegne-vendite-ferme.ts</w:t>
+      </w:r>
+      <w:r>
+        <w:rPr>
+          <w:b/>
+        </w:rPr>
+        <w:t xml:space="preserve"> (prova senza argomenti, </w:t>
+      </w:r>
+      <w:r>
+        <w:rPr>
+          <w:b/>
+        </w:rPr>
+        <w:t xml:space="preserve">--applica</w:t>
+      </w:r>
+      <w:r>
+        <w:rPr>
+          <w:b/>
+        </w:rPr>
+        <w:t xml:space="preserve">, </w:t>
+      </w:r>
+      <w:r>
+        <w:rPr>
+          <w:b/>
+        </w:rPr>
+        <w:t xml:space="preserve">--solo</w:t>
+      </w:r>
+      <w:r>
+        <w:rPr>
+          <w:b/>
+        </w:rPr>
+        <w:t xml:space="preserve">, </w:t>
+      </w:r>
+      <w:r>
+        <w:rPr>
+          <w:b/>
+        </w:rPr>
+        <w:t xml:space="preserve">--salta</w:t>
+      </w:r>
+      <w:r>
+        <w:rPr>
+          <w:b/>
+        </w:rPr>
+        <w:t xml:space="preserve">): per le vendite ferme </w:t>
+      </w:r>
+      <w:r>
+        <w:rPr>
+          <w:b/>
+        </w:rPr>
+        <w:t xml:space="preserve">cerca prima una consegna già esistente</w:t>
+      </w:r>
+      <w:r>
+        <w:rPr>
+          <w:b/>
+        </w:rPr>
+        <w:t xml:space="preserve"> (DDT = numero d'ordine, o partner + data + cognome) e la aggancia invece di duplicare; più vendite dello stesso ordine per lo stesso partner = </w:t>
+      </w:r>
+      <w:r>
+        <w:rPr>
+          <w:b/>
+        </w:rPr>
+        <w:t xml:space="preserve">una</w:t>
+      </w:r>
+      <w:r>
+        <w:rPr>
+          <w:b/>
+        </w:rPr>
+        <w:t xml:space="preserve"> consegna con più righe; rilegge la riga d'ordine in Orders e riallinea pezzi e importo. </w:t>
+      </w:r>
+      <w:r>
+        <w:rPr>
+          <w:b/>
+        </w:rPr>
+        <w:t xml:space="preserve">Corretto insieme in </w:t>
+      </w:r>
+      <w:r>
+        <w:rPr>
+          <w:b/>
+        </w:rPr>
+        <w:t xml:space="preserve">orders-sync</w:t>
+      </w:r>
+      <w:r>
+        <w:rPr>
+          <w:b/>
+        </w:rPr>
+        <w:t xml:space="preserve">: il prezzo di riga di Orders è unitario e i pezzi non passavano — «Macarons ×2 a 130 €» nasceva come vendita da 130 € × 1; ora la vendita porta </w:t>
+      </w:r>
+      <w:r>
+        <w:rPr>
+          <w:b/>
+        </w:rPr>
+        <w:t xml:space="preserve">quantity</w:t>
+      </w:r>
+      <w:r>
+        <w:rPr>
+          <w:b/>
+        </w:rPr>
+        <w:t xml:space="preserve"> e </w:t>
+      </w:r>
+      <w:r>
+        <w:rPr>
+          <w:b/>
+        </w:rPr>
+        <w:t xml:space="preserve">amount = prezzo × pezzi</w:t>
+      </w:r>
+      <w:r>
+        <w:rPr>
+          <w:b/>
+        </w:rPr>
+        <w:t xml:space="preserve">, come i generici, e la riga della consegna nasce con la quantità giusta.</w:t>
       </w:r>
       <w:r>
         <w:rPr>

</xml_diff>

<commit_message>
Proposta di vendita: il fornitore legge il prodotto col nome per il partner di Merchandising; chiusure decise dall'utente
- merchandising-sync: allineaNote copia anche alternateName/useAlternateName per codice
- sales: nomePerIlPartner() nel campanello e nella mail «Nuova proposta di vendita»
- script chiusure-chanel-10-09 (applicato): 5 cancellazioni richieste e 2 Rinascente legacy
  annullate, #63113 e #100876 consegnate
- handoff: Minimo Orario non e' sincronizzato con gli orari dei partner (verificato), province
  non risolte per anno, i 5 agganci proposti

Co-Authored-By: Claude Fable 5.1 <noreply@anthropic.com>
</commit_message>
<xml_diff>
--- a/deluxy-platform-next/docs/COME-FUNZIONA-APP-DELUXY.docx
+++ b/deluxy-platform-next/docs/COME-FUNZIONA-APP-DELUXY.docx
@@ -169,6 +169,60 @@
           <w:b/>
         </w:rPr>
         <w:t xml:space="preserve">Changelog</w:t>
+      </w:r>
+      <w:r>
+        <w:rPr>
+          <w:b/>
+        </w:rPr>
+        <w:t xml:space="preserve">10/09/2026 (102) — </w:t>
+      </w:r>
+      <w:r>
+        <w:rPr>
+          <w:b/>
+        </w:rPr>
+        <w:t xml:space="preserve">Il fornitore legge il prodotto col SUO nome</w:t>
+      </w:r>
+      <w:r>
+        <w:rPr>
+          <w:b/>
+        </w:rPr>
+        <w:t xml:space="preserve"> (regola utente). In Merchandising ogni prodotto può avere un «nome per il partner» con la spunta che dice se usarlo («2 Colazioni in Famiglia» per la «Colazione 5 Stelle - Clivati Milano (2 persone)»): da oggi la sincronizzazione con Merchandising lo copia sul prodotto della piattaforma (</w:t>
+      </w:r>
+      <w:r>
+        <w:rPr>
+          <w:b/>
+        </w:rPr>
+        <w:t xml:space="preserve">alternateName</w:t>
+      </w:r>
+      <w:r>
+        <w:rPr>
+          <w:b/>
+        </w:rPr>
+        <w:t xml:space="preserve"> + </w:t>
+      </w:r>
+      <w:r>
+        <w:rPr>
+          <w:b/>
+        </w:rPr>
+        <w:t xml:space="preserve">useAlternateName</w:t>
+      </w:r>
+      <w:r>
+        <w:rPr>
+          <w:b/>
+        </w:rPr>
+        <w:t xml:space="preserve">, insieme alle note di specifica) e la </w:t>
+      </w:r>
+      <w:r>
+        <w:rPr>
+          <w:b/>
+        </w:rPr>
+        <w:t xml:space="preserve">proposta di vendita</w:t>
+      </w:r>
+      <w:r>
+        <w:rPr>
+          <w:b/>
+        </w:rPr>
+        <w:t xml:space="preserve"> — campanello in app e mail — mostra al fornitore quel nome al posto del commerciale. Se la spunta è spenta o il campo è vuoto, resta il nome commerciale. Misura: 1 prodotto su 4.610 ce l'ha attivo oggi.</w:t>
       </w:r>
       <w:r>
         <w:rPr>

</xml_diff>

<commit_message>
Catalogo del partner: i prodotti si presentano col nome per il partner (Merchandising); handoff con le misure per disponibilita' e minimo orario
Co-Authored-By: Claude Fable 5.1 <noreply@anthropic.com>
</commit_message>
<xml_diff>
--- a/deluxy-platform-next/docs/COME-FUNZIONA-APP-DELUXY.docx
+++ b/deluxy-platform-next/docs/COME-FUNZIONA-APP-DELUXY.docx
@@ -169,6 +169,24 @@
           <w:b/>
         </w:rPr>
         <w:t xml:space="preserve">Changelog</w:t>
+      </w:r>
+      <w:r>
+        <w:rPr>
+          <w:b/>
+        </w:rPr>
+        <w:t xml:space="preserve">10/09/2026 (103) — </w:t>
+      </w:r>
+      <w:r>
+        <w:rPr>
+          <w:b/>
+        </w:rPr>
+        <w:t xml:space="preserve">Il catalogo del partner parla col suo nome</w:t>
+      </w:r>
+      <w:r>
+        <w:rPr>
+          <w:b/>
+        </w:rPr>
+        <w:t xml:space="preserve"> (regola utente). Per chi entra come PARTNER ogni prodotto si presenta col «nome per il partner» di Merchandising (in Prodotti, nel modulo consegna, ovunque passi dalla lista prodotti); il nome commerciale resta accanto come . Per l'ufficio non cambia niente. In Merchandising il campo è stato riempito per tutti i 5.081 prodotti col nome attuale (attivo), così il partner legge sempre un nome: oggi identico al commerciale tranne la Colazione Clivati («2 Colazioni in Famiglia»), e da lì in avanti si cambia in Merchandising.</w:t>
       </w:r>
       <w:r>
         <w:rPr>

</xml_diff>

<commit_message>
Manuale: refuso nel changelog 103
Co-Authored-By: Claude Fable 5.1 <noreply@anthropic.com>
</commit_message>
<xml_diff>
--- a/deluxy-platform-next/docs/COME-FUNZIONA-APP-DELUXY.docx
+++ b/deluxy-platform-next/docs/COME-FUNZIONA-APP-DELUXY.docx
@@ -186,7 +186,19 @@
         <w:rPr>
           <w:b/>
         </w:rPr>
-        <w:t xml:space="preserve"> (regola utente). Per chi entra come PARTNER ogni prodotto si presenta col «nome per il partner» di Merchandising (in Prodotti, nel modulo consegna, ovunque passi dalla lista prodotti); il nome commerciale resta accanto come . Per l'ufficio non cambia niente. In Merchandising il campo è stato riempito per tutti i 5.081 prodotti col nome attuale (attivo), così il partner legge sempre un nome: oggi identico al commerciale tranne la Colazione Clivati («2 Colazioni in Famiglia»), e da lì in avanti si cambia in Merchandising.</w:t>
+        <w:t xml:space="preserve"> (regola utente). Per chi entra come PARTNER ogni prodotto si presenta col «nome per il partner» di Merchandising (in Prodotti, nel modulo consegna, ovunque passi dalla lista prodotti); il nome commerciale resta accanto come </w:t>
+      </w:r>
+      <w:r>
+        <w:rPr>
+          <w:b/>
+        </w:rPr>
+        <w:t xml:space="preserve">nomeCommerciale</w:t>
+      </w:r>
+      <w:r>
+        <w:rPr>
+          <w:b/>
+        </w:rPr>
+        <w:t xml:space="preserve">. Per l'ufficio non cambia niente. In Merchandising il campo è stato riempito per tutti i 5.081 prodotti col nome attuale (attivo), così il partner legge sempre un nome: oggi identico al commerciale tranne la Colazione Clivati («2 Colazioni in Famiglia»), e da lì in avanti si cambia in Merchandising.</w:t>
       </w:r>
       <w:r>
         <w:rPr>

</xml_diff>

<commit_message>
Catalogo del partner: il nome commerciale non arriva al partner (regola utente)
Co-Authored-By: Claude Fable 5.1 <noreply@anthropic.com>
</commit_message>
<xml_diff>
--- a/deluxy-platform-next/docs/COME-FUNZIONA-APP-DELUXY.docx
+++ b/deluxy-platform-next/docs/COME-FUNZIONA-APP-DELUXY.docx
@@ -186,19 +186,19 @@
         <w:rPr>
           <w:b/>
         </w:rPr>
-        <w:t xml:space="preserve"> (regola utente). Per chi entra come PARTNER ogni prodotto si presenta col «nome per il partner» di Merchandising (in Prodotti, nel modulo consegna, ovunque passi dalla lista prodotti); il nome commerciale resta accanto come </w:t>
-      </w:r>
-      <w:r>
-        <w:rPr>
-          <w:b/>
-        </w:rPr>
-        <w:t xml:space="preserve">nomeCommerciale</w:t>
-      </w:r>
-      <w:r>
-        <w:rPr>
-          <w:b/>
-        </w:rPr>
-        <w:t xml:space="preserve">. Per l'ufficio non cambia niente. In Merchandising il campo è stato riempito per tutti i 5.081 prodotti col nome attuale (attivo), così il partner legge sempre un nome: oggi identico al commerciale tranne la Colazione Clivati («2 Colazioni in Famiglia»), e da lì in avanti si cambia in Merchandising.</w:t>
+        <w:t xml:space="preserve"> (regola utente). Per chi entra come PARTNER ogni prodotto si presenta col «nome per il partner» di Merchandising (in Prodotti, nel modulo consegna, ovunque passi dalla lista prodotti); il nome commerciale </w:t>
+      </w:r>
+      <w:r>
+        <w:rPr>
+          <w:b/>
+        </w:rPr>
+        <w:t xml:space="preserve">non gli arriva</w:t>
+      </w:r>
+      <w:r>
+        <w:rPr>
+          <w:b/>
+        </w:rPr>
+        <w:t xml:space="preserve"> (regola utente: «il partner non lo vede»). Per l'ufficio non cambia niente. In Merchandising il campo è stato riempito per tutti i 5.081 prodotti col nome attuale (attivo), così il partner legge sempre un nome: oggi identico al commerciale tranne la Colazione Clivati («2 Colazioni in Famiglia»), e da lì in avanti si cambia in Merchandising.</w:t>
       </w:r>
       <w:r>
         <w:rPr>

</xml_diff>

<commit_message>
Prodotti unici: il calendario del partner va a Merchandising ogni mezz'ora (giorni minimi e ora minima sul sito); flag «prodotto app»
- calendario-unici.module.ts: calendario dei proprietari (statoDelGiorno, 14 giorni), POST a
  Merchandising /api/v1/prodotti/disponibilita, rotte d'ufficio prova/anteprima/manda,
  cron /cron/calendario-unici (14,44 * * * *)
- Product.prodottoApp (colonna applicata in prod): fuori dal calendario e dagli allineamenti
  per SKU con Merchandising; toggle nel modulo prodotto, i18n it/en
- manuale (104, 105), guida visiva, handoff

Co-Authored-By: Claude Fable 5.1 <noreply@anthropic.com>
</commit_message>
<xml_diff>
--- a/deluxy-platform-next/docs/COME-FUNZIONA-APP-DELUXY.docx
+++ b/deluxy-platform-next/docs/COME-FUNZIONA-APP-DELUXY.docx
@@ -169,6 +169,150 @@
           <w:b/>
         </w:rPr>
         <w:t xml:space="preserve">Changelog</w:t>
+      </w:r>
+      <w:r>
+        <w:rPr>
+          <w:b/>
+        </w:rPr>
+        <w:t xml:space="preserve">10/09/2026 (105) — </w:t>
+      </w:r>
+      <w:r>
+        <w:rPr>
+          <w:b/>
+        </w:rPr>
+        <w:t xml:space="preserve">Flag «Prodotto app»</w:t>
+      </w:r>
+      <w:r>
+        <w:rPr>
+          <w:b/>
+        </w:rPr>
+        <w:t xml:space="preserve"> (regola utente). Nel modulo prodotto c'è la spunta «Prodotto app»: il prodotto vive solo nella piattaforma consegne e </w:t>
+      </w:r>
+      <w:r>
+        <w:rPr>
+          <w:b/>
+        </w:rPr>
+        <w:t xml:space="preserve">non si espone a Merchandising</w:t>
+      </w:r>
+      <w:r>
+        <w:rPr>
+          <w:b/>
+        </w:rPr>
+        <w:t xml:space="preserve"> — fuori dal calendario dei prodotti unici e da ogni allineamento per SKU (note, tipologie, nomi partner). Colonna </w:t>
+      </w:r>
+      <w:r>
+        <w:rPr>
+          <w:b/>
+        </w:rPr>
+        <w:t xml:space="preserve">Product.prodottoApp</w:t>
+      </w:r>
+      <w:r>
+        <w:rPr>
+          <w:b/>
+        </w:rPr>
+        <w:t xml:space="preserve"> (default false, aggiunta in produzione il 10/09).</w:t>
+      </w:r>
+      <w:r>
+        <w:rPr>
+          <w:b/>
+        </w:rPr>
+        <w:t xml:space="preserve">10/09/2026 (104) — </w:t>
+      </w:r>
+      <w:r>
+        <w:rPr>
+          <w:b/>
+        </w:rPr>
+        <w:t xml:space="preserve">I prodotti unici seguono il calendario del partner sul sito</w:t>
+      </w:r>
+      <w:r>
+        <w:rPr>
+          <w:b/>
+        </w:rPr>
+        <w:t xml:space="preserve"> (regola utente). Ogni mezz'ora (cron </w:t>
+      </w:r>
+      <w:r>
+        <w:rPr>
+          <w:b/>
+        </w:rPr>
+        <w:t xml:space="preserve">/api/v1/cron/calendario-unici</w:t>
+      </w:r>
+      <w:r>
+        <w:rPr>
+          <w:b/>
+        </w:rPr>
+        <w:t xml:space="preserve">) la piattaforma manda a Merchandising, per ogni prodotto UNICO attivo con SKU e proprietario, i prossimi 14 giorni del proprietario — aperto/chiuso e ora di apertura, con la stessa cascata dello smistamento (eccezione del giorno &gt; fasce &gt; orario settimanale) — e Merchandising aggiorna sul negozio i metafield «giorni minimi» (</w:t>
+      </w:r>
+      <w:r>
+        <w:rPr>
+          <w:b/>
+        </w:rPr>
+        <w:t xml:space="preserve">prodotto.consegna</w:t>
+      </w:r>
+      <w:r>
+        <w:rPr>
+          <w:b/>
+        </w:rPr>
+        <w:t xml:space="preserve">) e «minimo orario» (</w:t>
+      </w:r>
+      <w:r>
+        <w:rPr>
+          <w:b/>
+        </w:rPr>
+        <w:t xml:space="preserve">custom.minimo_orario</w:t>
+      </w:r>
+      <w:r>
+        <w:rPr>
+          <w:b/>
+        </w:rPr>
+        <w:t xml:space="preserve">): base 1 → 2 se domani il partner è chiuso → torna 1 quando riapre; l'ora minima è la prima ora piena dopo l'apertura di quel giorno, 9 se il partner non ha orari. La base resta quella dichiarata in Merchandising (</w:t>
+      </w:r>
+      <w:r>
+        <w:rPr>
+          <w:b/>
+        </w:rPr>
+        <w:t xml:space="preserve">gg_disp_min</w:t>
+      </w:r>
+      <w:r>
+        <w:rPr>
+          <w:b/>
+        </w:rPr>
+        <w:t xml:space="preserve">): se manca, non si inventa. Rotte d'ufficio: </w:t>
+      </w:r>
+      <w:r>
+        <w:rPr>
+          <w:b/>
+        </w:rPr>
+        <w:t xml:space="preserve">GET /merchandising-sync/calendario/prova</w:t>
+      </w:r>
+      <w:r>
+        <w:rPr>
+          <w:b/>
+        </w:rPr>
+        <w:t xml:space="preserve">, </w:t>
+      </w:r>
+      <w:r>
+        <w:rPr>
+          <w:b/>
+        </w:rPr>
+        <w:t xml:space="preserve">POST …/calendario/anteprima</w:t>
+      </w:r>
+      <w:r>
+        <w:rPr>
+          <w:b/>
+        </w:rPr>
+        <w:t xml:space="preserve">, </w:t>
+      </w:r>
+      <w:r>
+        <w:rPr>
+          <w:b/>
+        </w:rPr>
+        <w:t xml:space="preserve">POST …/calendario</w:t>
+      </w:r>
+      <w:r>
+        <w:rPr>
+          <w:b/>
+        </w:rPr>
+        <w:t xml:space="preserve">. Misura al 10/09: 224 unici in vendita, 184 con la base, 40 senza (Clivati 9, Stefanelli 6, Martesana 4, Brioni 4…).</w:t>
       </w:r>
       <w:r>
         <w:rPr>

</xml_diff>

<commit_message>
Calendario unici: scatto al salvataggio di orari/chiusure/attivazione del partner (solo lui) + orologio ogni mezz'ora; oggi conta come chiuso passata l'ora di chiusura (regola utente)
Co-Authored-By: Claude Fable 5.1 <noreply@anthropic.com>
</commit_message>
<xml_diff>
--- a/deluxy-platform-next/docs/COME-FUNZIONA-APP-DELUXY.docx
+++ b/deluxy-platform-next/docs/COME-FUNZIONA-APP-DELUXY.docx
@@ -228,7 +228,7 @@
         <w:rPr>
           <w:b/>
         </w:rPr>
-        <w:t xml:space="preserve"> (regola utente). Ogni mezz'ora (cron </w:t>
+        <w:t xml:space="preserve"> (regola utente). Appena un partner salva orari, chiusure del giorno o attivazione (solo per lui, best-effort) e comunque a orologio ogni mezz'ora (cron </w:t>
       </w:r>
       <w:r>
         <w:rPr>
@@ -240,7 +240,19 @@
         <w:rPr>
           <w:b/>
         </w:rPr>
-        <w:t xml:space="preserve">) la piattaforma manda a Merchandising, per ogni prodotto UNICO attivo con SKU e proprietario, i prossimi 14 giorni del proprietario — aperto/chiuso e ora di apertura, con la stessa cascata dello smistamento (eccezione del giorno &gt; fasce &gt; orario settimanale) — e Merchandising aggiorna sul negozio i metafield «giorni minimi» (</w:t>
+        <w:t xml:space="preserve">: il numero cambia anche senza toccare gli orari — chiuso sabato, giovedì il sito dice «da domani», venerdì «fra 2 giorni» — e </w:t>
+      </w:r>
+      <w:r>
+        <w:rPr>
+          <w:b/>
+        </w:rPr>
+        <w:t xml:space="preserve">oggi conta come chiuso appena passa l'ora di chiusura del partner</w:t>
+      </w:r>
+      <w:r>
+        <w:rPr>
+          <w:b/>
+        </w:rPr>
+        <w:t xml:space="preserve">: «se Clivati oggi chiude alle 15 e sono le 16, i suoi prodotti sono acquistabili da domani») la piattaforma manda a Merchandising, per ogni prodotto UNICO attivo con SKU e proprietario, i prossimi 14 giorni del proprietario — aperto/chiuso e ora di apertura, con la stessa cascata dello smistamento (eccezione del giorno &gt; fasce &gt; orario settimanale) — e Merchandising aggiorna sul negozio i metafield «giorni minimi» (</w:t>
       </w:r>
       <w:r>
         <w:rPr>

</xml_diff>

<commit_message>
Vendite: la riga della consegna vale quanto va al partner (regola utente); 2 consegne corrette; 4 agganci; script per l'indice unico su Sale.deliveryId (non applicato)
Co-Authored-By: Claude Fable 5.1 <noreply@anthropic.com>
</commit_message>
<xml_diff>
--- a/deluxy-platform-next/docs/COME-FUNZIONA-APP-DELUXY.docx
+++ b/deluxy-platform-next/docs/COME-FUNZIONA-APP-DELUXY.docx
@@ -169,6 +169,36 @@
           <w:b/>
         </w:rPr>
         <w:t xml:space="preserve">Changelog</w:t>
+      </w:r>
+      <w:r>
+        <w:rPr>
+          <w:b/>
+        </w:rPr>
+        <w:t xml:space="preserve">10/09/2026 (106) — </w:t>
+      </w:r>
+      <w:r>
+        <w:rPr>
+          <w:b/>
+        </w:rPr>
+        <w:t xml:space="preserve">La consegna nata da una vendita porta in riga QUANTO VA AL PARTNER</w:t>
+      </w:r>
+      <w:r>
+        <w:rPr>
+          <w:b/>
+        </w:rPr>
+        <w:t xml:space="preserve"> (regola utente su #101251: «60 € è il valore da cui incassare la nostra commissione + IVA»). Se la vendita ha una quota (dal Customer Service, da un patto o dal listino del proprietario), la riga prodotto vale il pubblico meno la quota — 85 € − 29,41 % = </w:t>
+      </w:r>
+      <w:r>
+        <w:rPr>
+          <w:b/>
+        </w:rPr>
+        <w:t xml:space="preserve">60 €</w:t>
+      </w:r>
+      <w:r>
+        <w:rPr>
+          <w:b/>
+        </w:rPr>
+        <w:t xml:space="preserve"> — e la scheda applica su quel valore la commissione del listino del partner più IVA (Lijoi 22 %: 13,20 + 2,90 → dovuto 43,90 €). Prima vinceva il listino della variante, che sui prodotti non unici è il prezzo pubblico: la mail diceva 60 e la scheda 85. Senza quota resta il listino, che sugli unici è già il prezzo del partner. Misura su 69 vendite dal 06/09: solo 2 righe erano al pubblico (#101251 e #101138), corrette; le altre 25 differenze erano già prezzi partner da listino o patto.</w:t>
       </w:r>
       <w:r>
         <w:rPr>

</xml_diff>

<commit_message>
Attività: partner su ogni riga e assegnazione da ufficio e team leader (cambia la consegna e tutte le sue attività); conto vendita: etichette per l'ufficio «quello che guadagna il partner»
Co-Authored-By: Claude Fable 5.1 <noreply@anthropic.com>
</commit_message>
<xml_diff>
--- a/deluxy-platform-next/docs/COME-FUNZIONA-APP-DELUXY.docx
+++ b/deluxy-platform-next/docs/COME-FUNZIONA-APP-DELUXY.docx
@@ -169,6 +169,186 @@
           <w:b/>
         </w:rPr>
         <w:t xml:space="preserve">Changelog</w:t>
+      </w:r>
+      <w:r>
+        <w:rPr>
+          <w:b/>
+        </w:rPr>
+        <w:t xml:space="preserve">10/09/2026 (108) — </w:t>
+      </w:r>
+      <w:r>
+        <w:rPr>
+          <w:b/>
+        </w:rPr>
+        <w:t xml:space="preserve">Attività: il partner su ogni riga, e l'assegnazione da lì</w:t>
+      </w:r>
+      <w:r>
+        <w:rPr>
+          <w:b/>
+        </w:rPr>
+        <w:t xml:space="preserve"> (regola utente). Nell'elenco Attività c'è la colonna </w:t>
+      </w:r>
+      <w:r>
+        <w:rPr>
+          <w:b/>
+        </w:rPr>
+        <w:t xml:space="preserve">Partner</w:t>
+      </w:r>
+      <w:r>
+        <w:rPr>
+          <w:b/>
+        </w:rPr>
+        <w:t xml:space="preserve">; l'ufficio e il </w:t>
+      </w:r>
+      <w:r>
+        <w:rPr>
+          <w:b/>
+        </w:rPr>
+        <w:t xml:space="preserve">team leader</w:t>
+      </w:r>
+      <w:r>
+        <w:rPr>
+          <w:b/>
+        </w:rPr>
+        <w:t xml:space="preserve"> hanno nella colonna Valet una tendina «Assegna a…» con i valet attivi della provincia della consegna (col suo servizio a listino, se ce l'hanno). L'assegnazione è quella della </w:t>
+      </w:r>
+      <w:r>
+        <w:rPr>
+          <w:b/>
+        </w:rPr>
+        <w:t xml:space="preserve">consegna</w:t>
+      </w:r>
+      <w:r>
+        <w:rPr>
+          <w:b/>
+        </w:rPr>
+        <w:t xml:space="preserve">: passa da </w:t>
+      </w:r>
+      <w:r>
+        <w:rPr>
+          <w:b/>
+        </w:rPr>
+        <w:t xml:space="preserve">PATCH /activities/:id/assegna</w:t>
+      </w:r>
+      <w:r>
+        <w:rPr>
+          <w:b/>
+        </w:rPr>
+        <w:t xml:space="preserve"> → </w:t>
+      </w:r>
+      <w:r>
+        <w:rPr>
+          <w:b/>
+        </w:rPr>
+        <w:t xml:space="preserve">DeliveriesService.assignValet</w:t>
+      </w:r>
+      <w:r>
+        <w:rPr>
+          <w:b/>
+        </w:rPr>
+        <w:t xml:space="preserve">, quindi cambia il valet sulla consegna, su TUTTE le sue attività (ritiro e consegna), nel registro, con le stesse regole del dettaglio (team leader solo nel suo ambito, storico intoccabile). Nella risposta di </w:t>
+      </w:r>
+      <w:r>
+        <w:rPr>
+          <w:b/>
+        </w:rPr>
+        <w:t xml:space="preserve">GET /activities</w:t>
+      </w:r>
+      <w:r>
+        <w:rPr>
+          <w:b/>
+        </w:rPr>
+        <w:t xml:space="preserve"> la consegna porta </w:t>
+      </w:r>
+      <w:r>
+        <w:rPr>
+          <w:b/>
+        </w:rPr>
+        <w:t xml:space="preserve">partner</w:t>
+      </w:r>
+      <w:r>
+        <w:rPr>
+          <w:b/>
+        </w:rPr>
+        <w:t xml:space="preserve">, </w:t>
+      </w:r>
+      <w:r>
+        <w:rPr>
+          <w:b/>
+        </w:rPr>
+        <w:t xml:space="preserve">provinceId</w:t>
+      </w:r>
+      <w:r>
+        <w:rPr>
+          <w:b/>
+        </w:rPr>
+        <w:t xml:space="preserve">, </w:t>
+      </w:r>
+      <w:r>
+        <w:rPr>
+          <w:b/>
+        </w:rPr>
+        <w:t xml:space="preserve">serviceTypeId</w:t>
+      </w:r>
+      <w:r>
+        <w:rPr>
+          <w:b/>
+        </w:rPr>
+        <w:t xml:space="preserve">, </w:t>
+      </w:r>
+      <w:r>
+        <w:rPr>
+          <w:b/>
+        </w:rPr>
+        <w:t xml:space="preserve">province.code</w:t>
+      </w:r>
+      <w:r>
+        <w:rPr>
+          <w:b/>
+        </w:rPr>
+        <w:t xml:space="preserve">.</w:t>
+      </w:r>
+      <w:r>
+        <w:rPr>
+          <w:b/>
+        </w:rPr>
+        <w:t xml:space="preserve">10/09/2026 (107) — </w:t>
+      </w:r>
+      <w:r>
+        <w:rPr>
+          <w:b/>
+        </w:rPr>
+        <w:t xml:space="preserve">Il conto della vendita, letto dall'ufficio, dice che è il guadagno del partner</w:t>
+      </w:r>
+      <w:r>
+        <w:rPr>
+          <w:b/>
+        </w:rPr>
+        <w:t xml:space="preserve"> (regola utente). Nel dettaglio consegna il riquadro «Il conto di questa vendita» cambia etichette secondo chi guarda: al partner «Il tuo incasso / Totale a te dovuto»; all'ufficio «Incasso del partner (valore al partner) / Commissione Deluxy trattenuta / </w:t>
+      </w:r>
+      <w:r>
+        <w:rPr>
+          <w:b/>
+        </w:rPr>
+        <w:t xml:space="preserve">Totale dovuto al partner: il suo guadagno</w:t>
+      </w:r>
+      <w:r>
+        <w:rPr>
+          <w:b/>
+        </w:rPr>
+        <w:t xml:space="preserve">», con la nota sul lordo che compare in Fatturazione. I numeri sono gli stessi (</w:t>
+      </w:r>
+      <w:r>
+        <w:rPr>
+          <w:b/>
+        </w:rPr>
+        <w:t xml:space="preserve">saleAccountOffice.*</w:t>
+      </w:r>
+      <w:r>
+        <w:rPr>
+          <w:b/>
+        </w:rPr>
+        <w:t xml:space="preserve"> in it/en).</w:t>
       </w:r>
       <w:r>
         <w:rPr>

</xml_diff>

<commit_message>
Scheda partner: tre strade dopo il confronto col registro (crea, aggancia con ricerca libera, sotto un'altra entita' di fatturazione = capogruppo scelto fra i partner)
Co-Authored-By: Claude Fable 5.1 <noreply@anthropic.com>
</commit_message>
<xml_diff>
--- a/deluxy-platform-next/docs/COME-FUNZIONA-APP-DELUXY.docx
+++ b/deluxy-platform-next/docs/COME-FUNZIONA-APP-DELUXY.docx
@@ -169,6 +169,120 @@
           <w:b/>
         </w:rPr>
         <w:t xml:space="preserve">Changelog</w:t>
+      </w:r>
+      <w:r>
+        <w:rPr>
+          <w:b/>
+        </w:rPr>
+        <w:t xml:space="preserve">10/09/2026 (109) — </w:t>
+      </w:r>
+      <w:r>
+        <w:rPr>
+          <w:b/>
+        </w:rPr>
+        <w:t xml:space="preserve">Scheda partner, Registro Anagrafiche: tre strade dopo «Confronta col registro»</w:t>
+      </w:r>
+      <w:r>
+        <w:rPr>
+          <w:b/>
+        </w:rPr>
+        <w:t xml:space="preserve"> (regola utente sul caso Diptyque Brera / Olfattorio SRL). Per l'ufficio, dopo il confronto, compaiono sempre tre bottoni: </w:t>
+      </w:r>
+      <w:r>
+        <w:rPr>
+          <w:b/>
+        </w:rPr>
+        <w:t xml:space="preserve">Crea una scheda nuova</w:t>
+      </w:r>
+      <w:r>
+        <w:rPr>
+          <w:b/>
+        </w:rPr>
+        <w:t xml:space="preserve"> (come prima, ma sempre visibile), </w:t>
+      </w:r>
+      <w:r>
+        <w:rPr>
+          <w:b/>
+        </w:rPr>
+        <w:t xml:space="preserve">Aggancia ad anagrafica esistente</w:t>
+      </w:r>
+      <w:r>
+        <w:rPr>
+          <w:b/>
+        </w:rPr>
+        <w:t xml:space="preserve"> (ricerca libera nel registro per nome, ragione sociale o P.IVA, poi il collegamento e la tabella delle differenze come ora) e </w:t>
+      </w:r>
+      <w:r>
+        <w:rPr>
+          <w:b/>
+        </w:rPr>
+        <w:t xml:space="preserve">Sotto un'altra entità di fatturazione</w:t>
+      </w:r>
+      <w:r>
+        <w:rPr>
+          <w:b/>
+        </w:rPr>
+        <w:t xml:space="preserve">: si sceglie fra i </w:t>
+      </w:r>
+      <w:r>
+        <w:rPr>
+          <w:b/>
+        </w:rPr>
+        <w:t xml:space="preserve">partner della piattaforma</w:t>
+      </w:r>
+      <w:r>
+        <w:rPr>
+          <w:b/>
+        </w:rPr>
+        <w:t xml:space="preserve"> quello che rappresenta la società che fattura, e la scheda di questo punto vendita entra nel suo </w:t>
+      </w:r>
+      <w:r>
+        <w:rPr>
+          <w:b/>
+        </w:rPr>
+        <w:t xml:space="preserve">capogruppo</w:t>
+      </w:r>
+      <w:r>
+        <w:rPr>
+          <w:b/>
+        </w:rPr>
+        <w:t xml:space="preserve"> del registro con «paga da sé = no»; se il capogruppo non esiste il registro lo crea dalla capofila (ragione sociale e dati fiscali). Da lì Finance legge P.IVA, SDI, IBAN e condizioni dal capogruppo. Nella sezione si legge «Fattura sotto: ‹capogruppo›». Rotte: </w:t>
+      </w:r>
+      <w:r>
+        <w:rPr>
+          <w:b/>
+        </w:rPr>
+        <w:t xml:space="preserve">POST /partners/:id/anagrafica/capogruppo {partnerId}</w:t>
+      </w:r>
+      <w:r>
+        <w:rPr>
+          <w:b/>
+        </w:rPr>
+        <w:t xml:space="preserve">, </w:t>
+      </w:r>
+      <w:r>
+        <w:rPr>
+          <w:b/>
+        </w:rPr>
+        <w:t xml:space="preserve">GET /partners/anagrafiche/cerca?q=</w:t>
+      </w:r>
+      <w:r>
+        <w:rPr>
+          <w:b/>
+        </w:rPr>
+        <w:t xml:space="preserve">; nel registro </w:t>
+      </w:r>
+      <w:r>
+        <w:rPr>
+          <w:b/>
+        </w:rPr>
+        <w:t xml:space="preserve">POST /api/v1/partners/:id/capogruppo</w:t>
+      </w:r>
+      <w:r>
+        <w:rPr>
+          <w:b/>
+        </w:rPr>
+        <w:t xml:space="preserve"> (chiave di scrittura; :id e capofila accettano anche il platformId). Caso di prova: Diptyque Brera, Diptyque Manzoni, Olfattorio, Olfattorio Rinascente e Olfattorio BAR A Parfums Vittoria hanno tutti P.IVA 08699330018.</w:t>
       </w:r>
       <w:r>
         <w:rPr>

</xml_diff>

<commit_message>
Fatturazione: due fatture separate (servizi e commissioni) per partner e periodo; categorie dal catalogo Merchandising (268 scritte)
Co-Authored-By: Claude Fable 5.1 <noreply@anthropic.com>
</commit_message>
<xml_diff>
--- a/deluxy-platform-next/docs/COME-FUNZIONA-APP-DELUXY.docx
+++ b/deluxy-platform-next/docs/COME-FUNZIONA-APP-DELUXY.docx
@@ -169,6 +169,126 @@
           <w:b/>
         </w:rPr>
         <w:t xml:space="preserve">Changelog</w:t>
+      </w:r>
+      <w:r>
+        <w:rPr>
+          <w:b/>
+        </w:rPr>
+        <w:t xml:space="preserve">10/09/2026 (111) — </w:t>
+      </w:r>
+      <w:r>
+        <w:rPr>
+          <w:b/>
+        </w:rPr>
+        <w:t xml:space="preserve">Categorie dal catalogo Merchandising</w:t>
+      </w:r>
+      <w:r>
+        <w:rPr>
+          <w:b/>
+        </w:rPr>
+        <w:t xml:space="preserve"> (decisione utente «sistema pure»). 268 prodotti attivi senza categoria l'hanno presa da Merchandising con la mappa FIORI/BOUQUET/COMPOSIZIONE → Fiori (2), TORTE_DOLCI → Torte (2), REGALI → Gift Boutique, VINI_SPIRITS → Vini, ORIGINALI_DELUXY → Originali Deluxy; abbinamento per codice, nome esatto, o nome base quando in piattaforma c'è la taglia dopo il trattino (</w:t>
+      </w:r>
+      <w:r>
+        <w:rPr>
+          <w:b/>
+        </w:rPr>
+        <w:t xml:space="preserve">scripts/categorie-da-merchandising.mjs</w:t>
+      </w:r>
+      <w:r>
+        <w:rPr>
+          <w:b/>
+        </w:rPr>
+        <w:t xml:space="preserve">). Restano 631 senza (417 «DA_CLASSIFICARE» anche di là, il resto senza corrispondenza). Senza categoria una vendita non ha mestiere né lista e resta «da gestire» (caso 12927).</w:t>
+      </w:r>
+      <w:r>
+        <w:rPr>
+          <w:b/>
+        </w:rPr>
+        <w:t xml:space="preserve">10/09/2026 (110) — </w:t>
+      </w:r>
+      <w:r>
+        <w:rPr>
+          <w:b/>
+        </w:rPr>
+        <w:t xml:space="preserve">Due fatture separate per partner e periodo: servizi e commissioni</w:t>
+      </w:r>
+      <w:r>
+        <w:rPr>
+          <w:b/>
+        </w:rPr>
+        <w:t xml:space="preserve"> (regola utente: «organizza sempre due fatture separate — attenzione che un partner potrebbe avere solo una delle due»). «Invia a Finance» genera una fattura </w:t>
+      </w:r>
+      <w:r>
+        <w:rPr>
+          <w:b/>
+        </w:rPr>
+        <w:t xml:space="preserve">servizi</w:t>
+      </w:r>
+      <w:r>
+        <w:rPr>
+          <w:b/>
+        </w:rPr>
+        <w:t xml:space="preserve"> (consegne a prezzo fisso, a ora, magazzino, corporate: il partner ci paga) e una fattura </w:t>
+      </w:r>
+      <w:r>
+        <w:rPr>
+          <w:b/>
+        </w:rPr>
+        <w:t xml:space="preserve">commissioni</w:t>
+      </w:r>
+      <w:r>
+        <w:rPr>
+          <w:b/>
+        </w:rPr>
+        <w:t xml:space="preserve"> (righe di vendita: noi tratteniamo la commissione e giriamo il resto), ognuna solo se ha righe. La servizi va in FINANCE come </w:t>
+      </w:r>
+      <w:r>
+        <w:rPr>
+          <w:b/>
+        </w:rPr>
+        <w:t xml:space="preserve">pro-forma</w:t>
+      </w:r>
+      <w:r>
+        <w:rPr>
+          <w:b/>
+        </w:rPr>
+        <w:t xml:space="preserve"> e come imponibile dei servizi nel </w:t>
+      </w:r>
+      <w:r>
+        <w:rPr>
+          <w:b/>
+        </w:rPr>
+        <w:t xml:space="preserve">mese</w:t>
+      </w:r>
+      <w:r>
+        <w:rPr>
+          <w:b/>
+        </w:rPr>
+        <w:t xml:space="preserve"> (FINANCE crea la fattura servizi «Consegne», che prima l'ufficio faceva a mano); la commissioni va solo nel </w:t>
+      </w:r>
+      <w:r>
+        <w:rPr>
+          <w:b/>
+        </w:rPr>
+        <w:t xml:space="preserve">mese</w:t>
+      </w:r>
+      <w:r>
+        <w:rPr>
+          <w:b/>
+        </w:rPr>
+        <w:t xml:space="preserve"> (venduto e commissione). All'invio riuscito la fattura interna passa in </w:t>
+      </w:r>
+      <w:r>
+        <w:rPr>
+          <w:b/>
+        </w:rPr>
+        <w:t xml:space="preserve">Storico</w:t>
+      </w:r>
+      <w:r>
+        <w:rPr>
+          <w:b/>
+        </w:rPr>
+        <w:t xml:space="preserve">. Il banner racconta ogni fattura: numero, righe, importo, esito pro-forma, esito mese. Prima era un documento solo, e in FINANCE la pro-forma di Rizzi conteneva anche 2 righe di vendita.</w:t>
       </w:r>
       <w:r>
         <w:rPr>

</xml_diff>

<commit_message>
Vendite: nel preventivo si sceglie il partner a cui è stato chiesto (attivi nella provincia) e il suo prezzo; handoff e manuale (110-112)
Co-Authored-By: Claude Fable 5.1 <noreply@anthropic.com>
</commit_message>
<xml_diff>
--- a/deluxy-platform-next/docs/COME-FUNZIONA-APP-DELUXY.docx
+++ b/deluxy-platform-next/docs/COME-FUNZIONA-APP-DELUXY.docx
@@ -169,6 +169,60 @@
           <w:b/>
         </w:rPr>
         <w:t xml:space="preserve">Changelog</w:t>
+      </w:r>
+      <w:r>
+        <w:rPr>
+          <w:b/>
+        </w:rPr>
+        <w:t xml:space="preserve">10/09/2026 (112) — </w:t>
+      </w:r>
+      <w:r>
+        <w:rPr>
+          <w:b/>
+        </w:rPr>
+        <w:t xml:space="preserve">Preventivo del partner: a chi è stato chiesto, e il prezzo che fa</w:t>
+      </w:r>
+      <w:r>
+        <w:rPr>
+          <w:b/>
+        </w:rPr>
+        <w:t xml:space="preserve"> (segnalazione utente). Nella finestra «Preventivo del partner» (Vendite, prodotti a preventivo) si sceglie il </w:t>
+      </w:r>
+      <w:r>
+        <w:rPr>
+          <w:b/>
+        </w:rPr>
+        <w:t xml:space="preserve">partner a cui è stato chiesto</w:t>
+      </w:r>
+      <w:r>
+        <w:rPr>
+          <w:b/>
+        </w:rPr>
+        <w:t xml:space="preserve"> fra quelli attivi, non esclusi dalle proposte, che lavorano nella </w:t>
+      </w:r>
+      <w:r>
+        <w:rPr>
+          <w:b/>
+        </w:rPr>
+        <w:t xml:space="preserve">provincia della vendita</w:t>
+      </w:r>
+      <w:r>
+        <w:rPr>
+          <w:b/>
+        </w:rPr>
+        <w:t xml:space="preserve">, e si scrive il </w:t>
+      </w:r>
+      <w:r>
+        <w:rPr>
+          <w:b/>
+        </w:rPr>
+        <w:t xml:space="preserve">prezzo al partner</w:t>
+      </w:r>
+      <w:r>
+        <w:rPr>
+          <w:b/>
+        </w:rPr>
+        <w:t xml:space="preserve">. Salvando, la vendita passa a quel partner con la quota ricavata dal prezzo, e nasce (o si aggiorna) la riconciliazione prodotto×provincia per le prossime volte. Prima la finestra chiedeva solo il prezzo e usava il partner già sulla vendita; se non c'era, rifiutava.</w:t>
       </w:r>
       <w:r>
         <w:rPr>

</xml_diff>

<commit_message>
Partner: capogruppo in piattaforma (chi paga, paga da sé) cablato su modulo, dettaglio, elenco; comunicato al registro Anagrafiche; manuale 113, guida visiva, handoff
Co-Authored-By: Claude Fable 5.1 <noreply@anthropic.com>
</commit_message>
<xml_diff>
--- a/deluxy-platform-next/docs/COME-FUNZIONA-APP-DELUXY.docx
+++ b/deluxy-platform-next/docs/COME-FUNZIONA-APP-DELUXY.docx
@@ -169,6 +169,192 @@
           <w:b/>
         </w:rPr>
         <w:t xml:space="preserve">Changelog</w:t>
+      </w:r>
+      <w:r>
+        <w:rPr>
+          <w:b/>
+        </w:rPr>
+        <w:t xml:space="preserve">10/09/2026 (113) — </w:t>
+      </w:r>
+      <w:r>
+        <w:rPr>
+          <w:b/>
+        </w:rPr>
+        <w:t xml:space="preserve">Il capogruppo anche in piattaforma: per ogni partner, chi paga</w:t>
+      </w:r>
+      <w:r>
+        <w:rPr>
+          <w:b/>
+        </w:rPr>
+        <w:t xml:space="preserve"> (regola utente: «crea anche qui su app una entità capogruppo che indica per ogni partner chi paga — Chanel e Diptyque — e comunica questa cosa anche con Anagrafiche»). Il concetto: un </w:t>
+      </w:r>
+      <w:r>
+        <w:rPr>
+          <w:b/>
+        </w:rPr>
+        <w:t xml:space="preserve">partner</w:t>
+      </w:r>
+      <w:r>
+        <w:rPr>
+          <w:b/>
+        </w:rPr>
+        <w:t xml:space="preserve"> è un punto vendita; un </w:t>
+      </w:r>
+      <w:r>
+        <w:rPr>
+          <w:b/>
+        </w:rPr>
+        <w:t xml:space="preserve">capogruppo</w:t>
+      </w:r>
+      <w:r>
+        <w:rPr>
+          <w:b/>
+        </w:rPr>
+        <w:t xml:space="preserve"> è la società che fattura per uno o più punti vendita (OLFATTORIO SRL per Diptyque Brera e le altre sedi); ogni partner ha «chi paga» (</w:t>
+      </w:r>
+      <w:r>
+        <w:rPr>
+          <w:b/>
+        </w:rPr>
+        <w:t xml:space="preserve">capogruppoId</w:t>
+      </w:r>
+      <w:r>
+        <w:rPr>
+          <w:b/>
+        </w:rPr>
+        <w:t xml:space="preserve">) e «paga da sé» (</w:t>
+      </w:r>
+      <w:r>
+        <w:rPr>
+          <w:b/>
+        </w:rPr>
+        <w:t xml:space="preserve">pagaDaSe</w:t>
+      </w:r>
+      <w:r>
+        <w:rPr>
+          <w:b/>
+        </w:rPr>
+        <w:t xml:space="preserve">: true = si fattura da solo, false = fattura il capogruppo). Dove: nel </w:t>
+      </w:r>
+      <w:r>
+        <w:rPr>
+          <w:b/>
+        </w:rPr>
+        <w:t xml:space="preserve">modulo partner</w:t>
+      </w:r>
+      <w:r>
+        <w:rPr>
+          <w:b/>
+        </w:rPr>
+        <w:t xml:space="preserve">, sezione Pagamenti, tendina «Chi paga (capogruppo)» coi capogruppi esistenti e «Nuovo capogruppo…» (ragione sociale e P.IVA) più la spunta «paga da sé»; nel </w:t>
+      </w:r>
+      <w:r>
+        <w:rPr>
+          <w:b/>
+        </w:rPr>
+        <w:t xml:space="preserve">dettaglio</w:t>
+      </w:r>
+      <w:r>
+        <w:rPr>
+          <w:b/>
+        </w:rPr>
+        <w:t xml:space="preserve"> la riga «Chi paga»; nell'</w:t>
+      </w:r>
+      <w:r>
+        <w:rPr>
+          <w:b/>
+        </w:rPr>
+        <w:t xml:space="preserve">elenco</w:t>
+      </w:r>
+      <w:r>
+        <w:rPr>
+          <w:b/>
+        </w:rPr>
+        <w:t xml:space="preserve"> la colonna «Fattura a» (↑ = fattura il capogruppo). Rotte </w:t>
+      </w:r>
+      <w:r>
+        <w:rPr>
+          <w:b/>
+        </w:rPr>
+        <w:t xml:space="preserve">GET/POST/PATCH /capogruppi</w:t>
+      </w:r>
+      <w:r>
+        <w:rPr>
+          <w:b/>
+        </w:rPr>
+        <w:t xml:space="preserve">. </w:t>
+      </w:r>
+      <w:r>
+        <w:rPr>
+          <w:b/>
+        </w:rPr>
+        <w:t xml:space="preserve">Comunicazione col registro Anagrafiche</w:t>
+      </w:r>
+      <w:r>
+        <w:rPr>
+          <w:b/>
+        </w:rPr>
+        <w:t xml:space="preserve">: a ogni cambio del capogruppo o di «paga da sé» la piattaforma manda </w:t>
+      </w:r>
+      <w:r>
+        <w:rPr>
+          <w:b/>
+        </w:rPr>
+        <w:t xml:space="preserve">POST /api/v1/partners/:platformId/capogruppo { capogruppo: {nome, pIva, registroId}, pagaDaSe }</w:t>
+      </w:r>
+      <w:r>
+        <w:rPr>
+          <w:b/>
+        </w:rPr>
+        <w:t xml:space="preserve"> (o </w:t>
+      </w:r>
+      <w:r>
+        <w:rPr>
+          <w:b/>
+        </w:rPr>
+        <w:t xml:space="preserve">{ capogruppo: null }</w:t>
+      </w:r>
+      <w:r>
+        <w:rPr>
+          <w:b/>
+        </w:rPr>
+        <w:t xml:space="preserve"> per toglierlo); il registro crea o riconosce il suo capogruppo e risponde con l'id, che qui si salva in </w:t>
+      </w:r>
+      <w:r>
+        <w:rPr>
+          <w:b/>
+        </w:rPr>
+        <w:t xml:space="preserve">registroId</w:t>
+      </w:r>
+      <w:r>
+        <w:rPr>
+          <w:b/>
+        </w:rPr>
+        <w:t xml:space="preserve">. In senso inverso, «Confronta col registro» rispecchia qui un capogruppo che di là c'è e qui manca. Anche «Sotto un'altra entità di fatturazione» ora scrive il capogruppo in piattaforma (capofila «paga da sé», sede no). Tabella </w:t>
+      </w:r>
+      <w:r>
+        <w:rPr>
+          <w:b/>
+        </w:rPr>
+        <w:t xml:space="preserve">Capogruppo</w:t>
+      </w:r>
+      <w:r>
+        <w:rPr>
+          <w:b/>
+        </w:rPr>
+        <w:t xml:space="preserve"> + colonne </w:t>
+      </w:r>
+      <w:r>
+        <w:rPr>
+          <w:b/>
+        </w:rPr>
+        <w:t xml:space="preserve">Partner.capogruppoId/pagaDaSe</w:t>
+      </w:r>
+      <w:r>
+        <w:rPr>
+          <w:b/>
+        </w:rPr>
+        <w:t xml:space="preserve"> create in produzione il 10/09.</w:t>
       </w:r>
       <w:r>
         <w:rPr>

</xml_diff>

<commit_message>
Ufficio 10/09: venduto solo nelle vendite (Velo #62638); stipendi con storico a dettagli, filtro sui servizi dei valet, Genera che si vede; tabella valet con aree; cron tipologie da Merchandising (ordine 2902); manuale 114
Co-Authored-By: Claude Fable 5.1 <noreply@anthropic.com>
</commit_message>
<xml_diff>
--- a/deluxy-platform-next/docs/COME-FUNZIONA-APP-DELUXY.docx
+++ b/deluxy-platform-next/docs/COME-FUNZIONA-APP-DELUXY.docx
@@ -169,6 +169,144 @@
           <w:b/>
         </w:rPr>
         <w:t xml:space="preserve">Changelog</w:t>
+      </w:r>
+      <w:r>
+        <w:rPr>
+          <w:b/>
+        </w:rPr>
+        <w:t xml:space="preserve">10/09/2026 (114) — </w:t>
+      </w:r>
+      <w:r>
+        <w:rPr>
+          <w:b/>
+        </w:rPr>
+        <w:t xml:space="preserve">Sei correzioni dalla giornata dell'ufficio.</w:t>
+      </w:r>
+      <w:r>
+        <w:rPr>
+          <w:b/>
+        </w:rPr>
+        <w:t xml:space="preserve"> (1) </w:t>
+      </w:r>
+      <w:r>
+        <w:rPr>
+          <w:b/>
+        </w:rPr>
+        <w:t xml:space="preserve">Fatturazione, il venduto solo nelle vendite</w:t>
+      </w:r>
+      <w:r>
+        <w:rPr>
+          <w:b/>
+        </w:rPr>
+        <w:t xml:space="preserve"> (segnalazione: «la 62638 di Velo esce con un venduto di 55 € se è un servizio a prezzo fisso»): la colonna e il totale «Venduto» contavano il valore dei prodotti anche su consegne a prezzo fisso; ora esistono solo per le righe di VENDITA (Velo agosto: venduto 55 €, non 130). (2) </w:t>
+      </w:r>
+      <w:r>
+        <w:rPr>
+          <w:b/>
+        </w:rPr>
+        <w:t xml:space="preserve">Stipendi, storico con dettagli</w:t>
+      </w:r>
+      <w:r>
+        <w:rPr>
+          <w:b/>
+        </w:rPr>
+        <w:t xml:space="preserve">: nello «Storico pagamenti» ogni riga che ha uno stipendio dietro ha «Dettagli ▾», che apre periodo, stato, netto e le righe (data, consegna #, descrizione, importo); le ricevute importate dal sistema precedente non ne hanno. Rotta </w:t>
+      </w:r>
+      <w:r>
+        <w:rPr>
+          <w:b/>
+        </w:rPr>
+        <w:t xml:space="preserve">GET /salaries/dettaglio/:id</w:t>
+      </w:r>
+      <w:r>
+        <w:rPr>
+          <w:b/>
+        </w:rPr>
+        <w:t xml:space="preserve"> (il valet vede solo i propri). (3) </w:t>
+      </w:r>
+      <w:r>
+        <w:rPr>
+          <w:b/>
+        </w:rPr>
+        <w:t xml:space="preserve">Stipendi, filtro per servizi dei valet</w:t>
+      </w:r>
+      <w:r>
+        <w:rPr>
+          <w:b/>
+        </w:rPr>
+        <w:t xml:space="preserve">: le caselle «Tipologie di servizio» sono le tipologie che i valet FANNO (le loro tariffe), non tutto il catalogo; scelto un valet, solo le sue. Rotta </w:t>
+      </w:r>
+      <w:r>
+        <w:rPr>
+          <w:b/>
+        </w:rPr>
+        <w:t xml:space="preserve">GET /salaries/servizi-valet?valetId=</w:t>
+      </w:r>
+      <w:r>
+        <w:rPr>
+          <w:b/>
+        </w:rPr>
+        <w:t xml:space="preserve">. (4) </w:t>
+      </w:r>
+      <w:r>
+        <w:rPr>
+          <w:b/>
+        </w:rPr>
+        <w:t xml:space="preserve">Stipendi, «Genera» che sembrava non fare nulla</w:t>
+      </w:r>
+      <w:r>
+        <w:rPr>
+          <w:b/>
+        </w:rPr>
+        <w:t xml:space="preserve"> (De Rosa, agosto): lo stipendio nasceva ma il filtro «Dal» del mese corrente lo nascondeva; ora dopo la generazione i filtri si mettono sul valet e sul periodo appena generato. (5) </w:t>
+      </w:r>
+      <w:r>
+        <w:rPr>
+          <w:b/>
+        </w:rPr>
+        <w:t xml:space="preserve">Tabella valet: aree di consegna</w:t>
+      </w:r>
+      <w:r>
+        <w:rPr>
+          <w:b/>
+        </w:rPr>
+        <w:t xml:space="preserve"> al posto delle province (le province restano come ripiego per chi non ha ancora un'area; la ricerca trova anche il nome dell'area). (6) </w:t>
+      </w:r>
+      <w:r>
+        <w:rPr>
+          <w:b/>
+        </w:rPr>
+        <w:t xml:space="preserve">Tipologia di vendita: specchio automatico</w:t>
+      </w:r>
+      <w:r>
+        <w:rPr>
+          <w:b/>
+        </w:rPr>
+        <w:t xml:space="preserve"> (ordine 2902, «abbiamo cambiato la tipologia di prodotto, aggiorna i bottoni»): i bottoni della vendita (chiedi/salva preventivo, inserisci, rifiuta) leggono la tipologia in piattaforma, che si riallineava da Merchandising solo a mano; ora lo fa il cron ogni ora (</w:t>
+      </w:r>
+      <w:r>
+        <w:rPr>
+          <w:b/>
+        </w:rPr>
+        <w:t xml:space="preserve">/cron/tipologie</w:t>
+      </w:r>
+      <w:r>
+        <w:rPr>
+          <w:b/>
+        </w:rPr>
+        <w:t xml:space="preserve">, minuto 20) e lo script </w:t>
+      </w:r>
+      <w:r>
+        <w:rPr>
+          <w:b/>
+        </w:rPr>
+        <w:t xml:space="preserve">api/scripts/tipologie-da-merchandising.mjs</w:t>
+      </w:r>
+      <w:r>
+        <w:rPr>
+          <w:b/>
+        </w:rPr>
+        <w:t xml:space="preserve"> l'ha fatto subito (110 prodotti, fra cui «Cesto Fiori Taormina» preventivo → mix). Dove l'ufficio chiede un anticipo per un valet: scheda valet → «Richiesta pagamento» → tipo «Anticipo — si scala dal prossimo stipendio»; la richiesta va a Deluxy Transactions.</w:t>
       </w:r>
       <w:r>
         <w:rPr>

</xml_diff>

<commit_message>
Docs: le tipologie da Merchandising non sono state scritte dalla sessione (lo fa il cron o il comando)
Co-Authored-By: Claude Fable 5.1 <noreply@anthropic.com>
</commit_message>
<xml_diff>
--- a/deluxy-platform-next/docs/COME-FUNZIONA-APP-DELUXY.docx
+++ b/deluxy-platform-next/docs/COME-FUNZIONA-APP-DELUXY.docx
@@ -294,19 +294,19 @@
         <w:rPr>
           <w:b/>
         </w:rPr>
-        <w:t xml:space="preserve">, minuto 20) e lo script </w:t>
-      </w:r>
-      <w:r>
-        <w:rPr>
-          <w:b/>
-        </w:rPr>
-        <w:t xml:space="preserve">api/scripts/tipologie-da-merchandising.mjs</w:t>
-      </w:r>
-      <w:r>
-        <w:rPr>
-          <w:b/>
-        </w:rPr>
-        <w:t xml:space="preserve"> l'ha fatto subito (110 prodotti, fra cui «Cesto Fiori Taormina» preventivo → mix). Dove l'ufficio chiede un anticipo per un valet: scheda valet → «Richiesta pagamento» → tipo «Anticipo — si scala dal prossimo stipendio»; la richiesta va a Deluxy Transactions.</w:t>
+        <w:t xml:space="preserve">, minuto 20) ; lo script </w:t>
+      </w:r>
+      <w:r>
+        <w:rPr>
+          <w:b/>
+        </w:rPr>
+        <w:t xml:space="preserve">api/scripts/tipologie-da-merchandising.mjs --applica</w:t>
+      </w:r>
+      <w:r>
+        <w:rPr>
+          <w:b/>
+        </w:rPr>
+        <w:t xml:space="preserve"> lo fa subito (anteprima del 10/09: 110 prodotti da cambiare, fra cui «Cesto Fiori Taormina» preventivo → mix — NON ancora scritti: la scrittura dalla sessione è stata bloccata; li scrive il primo giro del cron dopo il deploy, o il comando lanciato dall'ufficio). Dove l'ufficio chiede un anticipo per un valet: scheda valet → «Richiesta pagamento» → tipo «Anticipo — si scala dal prossimo stipendio»; la richiesta va a Deluxy Transactions.</w:t>
       </w:r>
       <w:r>
         <w:rPr>

</xml_diff>

<commit_message>
Dettaglio consegna: i margini della vendita per l'ufficio (resta a Deluxy, paga valet, margine dopo il valet); etichette capogruppo del modulo partner al posto giusto negli i18n; manuale 115
Co-Authored-By: Claude Fable 5.1 <noreply@anthropic.com>
</commit_message>
<xml_diff>
--- a/deluxy-platform-next/docs/COME-FUNZIONA-APP-DELUXY.docx
+++ b/deluxy-platform-next/docs/COME-FUNZIONA-APP-DELUXY.docx
@@ -169,6 +169,84 @@
           <w:b/>
         </w:rPr>
         <w:t xml:space="preserve">Changelog</w:t>
+      </w:r>
+      <w:r>
+        <w:rPr>
+          <w:b/>
+        </w:rPr>
+        <w:t xml:space="preserve">10/09/2026 (115) — </w:t>
+      </w:r>
+      <w:r>
+        <w:rPr>
+          <w:b/>
+        </w:rPr>
+        <w:t xml:space="preserve">I margini della vendita nel dettaglio consegna, per l'ufficio</w:t>
+      </w:r>
+      <w:r>
+        <w:rPr>
+          <w:b/>
+        </w:rPr>
+        <w:t xml:space="preserve"> (regola utente su #101251: «mostra a ufficio anche i margini dal dettaglio consegna con i margini della vendita»). Sotto il riquadro «Il conto di questa vendita: quello che guadagna il partner» compare, SOLO per l'ufficio, «I margini di questa vendita: quello che resta a Deluxy»: prezzo pagato dal cliente (il totale della vendita, con il numero d'ordine), valore al partner (con lo sconto %), margine sul prodotto (prezzo − valore), commissione Deluxy sul valore (+ IVA), dovuto netto al partner, </w:t>
+      </w:r>
+      <w:r>
+        <w:rPr>
+          <w:b/>
+        </w:rPr>
+        <w:t xml:space="preserve">resta a Deluxy</w:t>
+      </w:r>
+      <w:r>
+        <w:rPr>
+          <w:b/>
+        </w:rPr>
+        <w:t xml:space="preserve"> (prezzo − dovuto netto, con la % sul prezzo), paga del valet per la consegna (la stessa di Stipendi: congelata o dal listino), </w:t>
+      </w:r>
+      <w:r>
+        <w:rPr>
+          <w:b/>
+        </w:rPr>
+        <w:t xml:space="preserve">margine dopo il valet</w:t>
+      </w:r>
+      <w:r>
+        <w:rPr>
+          <w:b/>
+        </w:rPr>
+        <w:t xml:space="preserve"> (in rosso se negativo). Numeri di cassa, non conto economico (lo dice la nota): niente IVA sulla vendita né costi generali. Il server lo calcola in </w:t>
+      </w:r>
+      <w:r>
+        <w:rPr>
+          <w:b/>
+        </w:rPr>
+        <w:t xml:space="preserve">margineVendita</w:t>
+      </w:r>
+      <w:r>
+        <w:rPr>
+          <w:b/>
+        </w:rPr>
+        <w:t xml:space="preserve"> con i numeri che già esistono (nessuna regola economica nuova, Standard §7) e lo toglie a partner e valet. </w:t>
+      </w:r>
+      <w:r>
+        <w:rPr>
+          <w:b/>
+        </w:rPr>
+        <w:t xml:space="preserve">Correzione</w:t>
+      </w:r>
+      <w:r>
+        <w:rPr>
+          <w:b/>
+        </w:rPr>
+        <w:t xml:space="preserve">: le etichette «Chi paga (capogruppo)» del modulo partner uscivano come chiavi grezze (</w:t>
+      </w:r>
+      <w:r>
+        <w:rPr>
+          <w:b/>
+        </w:rPr>
+        <w:t xml:space="preserve">partnerForm.payments.capogruppo</w:t>
+      </w:r>
+      <w:r>
+        <w:rPr>
+          <w:b/>
+        </w:rPr>
+        <w:t xml:space="preserve">): erano finite nel blocco sbagliato dell'it/en.json; spostate al posto giusto.</w:t>
       </w:r>
       <w:r>
         <w:rPr>

</xml_diff>

<commit_message>
Ufficio sera 10/09: partner accetta/rifiuta la vendita dal dettaglio; «Ordina per» da telefono; vendite con margine < 5% in rosso (ufficio); Vendite risponde subito (stati esterni a parte) e ha i filtri; manuale 116
Co-Authored-By: Claude Fable 5.1 <noreply@anthropic.com>
</commit_message>
<xml_diff>
--- a/deluxy-platform-next/docs/COME-FUNZIONA-APP-DELUXY.docx
+++ b/deluxy-platform-next/docs/COME-FUNZIONA-APP-DELUXY.docx
@@ -169,6 +169,120 @@
           <w:b/>
         </w:rPr>
         <w:t xml:space="preserve">Changelog</w:t>
+      </w:r>
+      <w:r>
+        <w:rPr>
+          <w:b/>
+        </w:rPr>
+        <w:t xml:space="preserve">10/09/2026 (116) — </w:t>
+      </w:r>
+      <w:r>
+        <w:rPr>
+          <w:b/>
+        </w:rPr>
+        <w:t xml:space="preserve">Cinque richieste dell'ufficio (sera).</w:t>
+      </w:r>
+      <w:r>
+        <w:rPr>
+          <w:b/>
+        </w:rPr>
+        <w:t xml:space="preserve"> (1) </w:t>
+      </w:r>
+      <w:r>
+        <w:rPr>
+          <w:b/>
+        </w:rPr>
+        <w:t xml:space="preserve">Dettaglio consegna, il partner accetta o rifiuta la vendita</w:t>
+      </w:r>
+      <w:r>
+        <w:rPr>
+          <w:b/>
+        </w:rPr>
+        <w:t xml:space="preserve"> («in dettagli consegna per il partner manca la possibilità di accettare»): nella fila delle azioni, alle stesse condizioni della tabella (vendita sua, non ancora accettata, in «da gestire» o «assegnata»), «Accetta» e «Rifiuta» (con motivo facoltativo); dopo, la pillola «Vendita accettata ✓». (2) </w:t>
+      </w:r>
+      <w:r>
+        <w:rPr>
+          <w:b/>
+        </w:rPr>
+        <w:t xml:space="preserve">Consegne da telefono: «Ordina per»</w:t>
+      </w:r>
+      <w:r>
+        <w:rPr>
+          <w:b/>
+        </w:rPr>
+        <w:t xml:space="preserve"> («da mobile serve come poter decidere ordinamento consegne»): nel pannello Filtri, solo sotto gli 800 px, una tendina con le stesse colonne delle intestazioni e il bottone del verso (crescente/decrescente). (3) </w:t>
+      </w:r>
+      <w:r>
+        <w:rPr>
+          <w:b/>
+        </w:rPr>
+        <w:t xml:space="preserve">Consegne, vendite con margine basso in rosso</w:t>
+      </w:r>
+      <w:r>
+        <w:rPr>
+          <w:b/>
+        </w:rPr>
+        <w:t xml:space="preserve"> («per ufficio le vendite con margine inferiore al 5% o negativo hanno testo in rosso», anche nello Storico): il server calcola per l'ufficio il margine di ogni riga di vendita con gli stessi numeri del dettaglio (prezzo del cliente − dovuto netto al partner − paga del valet, scritta o dal listino); sotto il 5 % del prezzo, o negativo, la riga è rossa e il passaggio del mouse dice margine e percentuale. Partner e valet non ricevono il campo. (4) </w:t>
+      </w:r>
+      <w:r>
+        <w:rPr>
+          <w:b/>
+        </w:rPr>
+        <w:t xml:space="preserve">Vendite: caricamento lento</w:t>
+      </w:r>
+      <w:r>
+        <w:rPr>
+          <w:b/>
+        </w:rPr>
+        <w:t xml:space="preserve"> — misurato: la lettura dal database è 637 righe in ~450 ms; ad aspettare erano le chiamate a Orders (fino a 25 pagine) e al Customer Service (fino a 60 numeri) fatte prima di rispondere. Ora </w:t>
+      </w:r>
+      <w:r>
+        <w:rPr>
+          <w:b/>
+        </w:rPr>
+        <w:t xml:space="preserve">GET /sales</w:t>
+      </w:r>
+      <w:r>
+        <w:rPr>
+          <w:b/>
+        </w:rPr>
+        <w:t xml:space="preserve"> risponde subito e gli stati esterni arrivano con </w:t>
+      </w:r>
+      <w:r>
+        <w:rPr>
+          <w:b/>
+        </w:rPr>
+        <w:t xml:space="preserve">GET /sales/stati-esterni</w:t>
+      </w:r>
+      <w:r>
+        <w:rPr>
+          <w:b/>
+        </w:rPr>
+        <w:t xml:space="preserve">, che la pagina chiama dopo e fonde in tabella (stessa cache di 2′). (5) </w:t>
+      </w:r>
+      <w:r>
+        <w:rPr>
+          <w:b/>
+        </w:rPr>
+        <w:t xml:space="preserve">Vendite: i filtri</w:t>
+      </w:r>
+      <w:r>
+        <w:rPr>
+          <w:b/>
+        </w:rPr>
+        <w:t xml:space="preserve"> («mettere dei filtri in vendite, valuta quelli utili»): provincia, partner, negozio (brand), tipologia del prodotto (unico / preventivo / mix…), data di consegna dal/al; le tendine offrono solo i valori presenti in lista; «Azzera» li toglie; il conteggio «n su m» e lo stato vuoto tengono conto dei filtri. </w:t>
+      </w:r>
+      <w:r>
+        <w:rPr>
+          <w:b/>
+        </w:rPr>
+        <w:t xml:space="preserve">Nota su Clivati</w:t>
+      </w:r>
+      <w:r>
+        <w:rPr>
+          <w:b/>
+        </w:rPr>
+        <w:t xml:space="preserve"> («ieri sera diceva di aver accettato due vendite e poi di non vederle più»): le due accettazioni ci sono (12921 → #101246 alle 17:18, 12917 → #101248 alle 18:31, entrambe «da gestire» per il 12/09 e il 15/09); ieri sera la sua lista «Attive» era ordinata per data crescente con 616 consegne vecchie (2021 → settembre 2026) davanti, chiuse solo stamattina dagli script: le due nuove erano pagine più in là. Oggi le sue attive sono 3 e le vede subito.</w:t>
       </w:r>
       <w:r>
         <w:rPr>

</xml_diff>

<commit_message>
Consegne: le appena accettate si vedono subito sopra la tabella (riquadro con link); manuale 117
Co-Authored-By: Claude Fable 5.1 <noreply@anthropic.com>
</commit_message>
<xml_diff>
--- a/deluxy-platform-next/docs/COME-FUNZIONA-APP-DELUXY.docx
+++ b/deluxy-platform-next/docs/COME-FUNZIONA-APP-DELUXY.docx
@@ -169,6 +169,24 @@
           <w:b/>
         </w:rPr>
         <w:t xml:space="preserve">Changelog</w:t>
+      </w:r>
+      <w:r>
+        <w:rPr>
+          <w:b/>
+        </w:rPr>
+        <w:t xml:space="preserve">10/09/2026 (117) — </w:t>
+      </w:r>
+      <w:r>
+        <w:rPr>
+          <w:b/>
+        </w:rPr>
+        <w:t xml:space="preserve">Le consegne appena accettate si vedono subito</w:t>
+      </w:r>
+      <w:r>
+        <w:rPr>
+          <w:b/>
+        </w:rPr>
+        <w:t xml:space="preserve"> (regola utente: «mostra sempre subito consegne accettate», dopo il caso Clivati). Quando il partner accetta un ordine proposto in Consegne, la consegna che ne nasce compare SUBITO in un riquadro «Appena accettate» sopra la tabella (numero con link, data e orario, destinatario, indirizzo, stato), qualunque siano ordine e pagina della lista; resta lì finché la pagina non si chiude o si preme «Ho visto». In tabella la riga sta comunque al suo posto per data. Solo web (nessuna rotta nuova: il riquadro rilegge la consegna appena nata).</w:t>
       </w:r>
       <w:r>
         <w:rPr>

</xml_diff>

<commit_message>
Tutte le liste: il numero di record sopra ogni tabella, anche filtrando («N record» / «n di m record (filtrati)»); manuale 118
Co-Authored-By: Claude Fable 5.1 <noreply@anthropic.com>
</commit_message>
<xml_diff>
--- a/deluxy-platform-next/docs/COME-FUNZIONA-APP-DELUXY.docx
+++ b/deluxy-platform-next/docs/COME-FUNZIONA-APP-DELUXY.docx
@@ -169,6 +169,60 @@
           <w:b/>
         </w:rPr>
         <w:t xml:space="preserve">Changelog</w:t>
+      </w:r>
+      <w:r>
+        <w:rPr>
+          <w:b/>
+        </w:rPr>
+        <w:t xml:space="preserve">10/09/2026 (118) — </w:t>
+      </w:r>
+      <w:r>
+        <w:rPr>
+          <w:b/>
+        </w:rPr>
+        <w:t xml:space="preserve">Il numero di record sopra ogni tabella, anche filtrando</w:t>
+      </w:r>
+      <w:r>
+        <w:rPr>
+          <w:b/>
+        </w:rPr>
+        <w:t xml:space="preserve"> (regola utente). Una riga uguale in tutte le liste, subito sopra la tabella: «N record», oppure «n di m record (filtrati)» quando ricerca o filtri ne nascondono una parte. Pagine: Consegne e Prodotti e Clienti (conteggio del server, già filtrato), Vendite, Partner (aveva già «x di y» nel sottotitolo), Valet, Attività, Fatturazione (da fatturare e fatture), Stipendi (da pagare e stipendi), Pagamenti, Ricevute, Utenti, Operatori, Servizi, Categorie, Province, Modelli SMS. Le vecchie scritte «n di m» che comparivano solo cercando sono state tolte: ora la riga c'è sempre. Stile globale </w:t>
+      </w:r>
+      <w:r>
+        <w:rPr>
+          <w:b/>
+        </w:rPr>
+        <w:t xml:space="preserve">.conto-record</w:t>
+      </w:r>
+      <w:r>
+        <w:rPr>
+          <w:b/>
+        </w:rPr>
+        <w:t xml:space="preserve">, chiavi </w:t>
+      </w:r>
+      <w:r>
+        <w:rPr>
+          <w:b/>
+        </w:rPr>
+        <w:t xml:space="preserve">comune.record</w:t>
+      </w:r>
+      <w:r>
+        <w:rPr>
+          <w:b/>
+        </w:rPr>
+        <w:t xml:space="preserve"> / </w:t>
+      </w:r>
+      <w:r>
+        <w:rPr>
+          <w:b/>
+        </w:rPr>
+        <w:t xml:space="preserve">comune.recordFiltrati</w:t>
+      </w:r>
+      <w:r>
+        <w:rPr>
+          <w:b/>
+        </w:rPr>
+        <w:t xml:space="preserve">. Il Listino fiori non è una lista di record e resta com'è.</w:t>
       </w:r>
       <w:r>
         <w:rPr>

</xml_diff>

<commit_message>
Margini della vendita sul totale pagato dal cliente (letto da Orders via client condiviso); righe rosse con la stessa regola; manuale 119
Co-Authored-By: Claude Fable 5.1 <noreply@anthropic.com>
</commit_message>
<xml_diff>
--- a/deluxy-platform-next/docs/COME-FUNZIONA-APP-DELUXY.docx
+++ b/deluxy-platform-next/docs/COME-FUNZIONA-APP-DELUXY.docx
@@ -24,7 +24,7 @@
           <w:color w:val="86868b"/>
           <w:sz w:val="18"/>
         </w:rPr>
-        <w:t xml:space="preserve">Word generato automaticamente dal manuale Markdown — 10 settembre 2026</w:t>
+        <w:t xml:space="preserve">Word generato automaticamente dal manuale Markdown — 11 settembre 2026</w:t>
       </w:r>
     </w:p>
     <w:p>
@@ -169,6 +169,84 @@
           <w:b/>
         </w:rPr>
         <w:t xml:space="preserve">Changelog</w:t>
+      </w:r>
+      <w:r>
+        <w:rPr>
+          <w:b/>
+        </w:rPr>
+        <w:t xml:space="preserve">11/09/2026 (119) — </w:t>
+      </w:r>
+      <w:r>
+        <w:rPr>
+          <w:b/>
+        </w:rPr>
+        <w:t xml:space="preserve">Margini della vendita sul totale pagato dal cliente</w:t>
+      </w:r>
+      <w:r>
+        <w:rPr>
+          <w:b/>
+        </w:rPr>
+        <w:t xml:space="preserve"> (segnalazione utente: «nei margini manca il vero totale pagato dal cliente», ordine 12913: prodotto 10 €, pagato 25 €). Il totale viene da </w:t>
+      </w:r>
+      <w:r>
+        <w:rPr>
+          <w:b/>
+        </w:rPr>
+        <w:t xml:space="preserve">Orders</w:t>
+      </w:r>
+      <w:r>
+        <w:rPr>
+          <w:b/>
+        </w:rPr>
+        <w:t xml:space="preserve">, la casa dell'ordine (Standard §7): nessuna copia, lettura dal vivo con cache di 2′ — la stessa che Vendite usava per la colonna «Orders», spostata in un client condiviso (</w:t>
+      </w:r>
+      <w:r>
+        <w:rPr>
+          <w:b/>
+        </w:rPr>
+        <w:t xml:space="preserve">orders/orders-client.module.ts</w:t>
+      </w:r>
+      <w:r>
+        <w:rPr>
+          <w:b/>
+        </w:rPr>
+        <w:t xml:space="preserve">) e ora usata anche dalle Consegne. Nel riquadro «I margini di questa vendita»: </w:t>
+      </w:r>
+      <w:r>
+        <w:rPr>
+          <w:b/>
+        </w:rPr>
+        <w:t xml:space="preserve">Prodotto di questa vendita</w:t>
+      </w:r>
+      <w:r>
+        <w:rPr>
+          <w:b/>
+        </w:rPr>
+        <w:t xml:space="preserve"> (la riga, es. 10 €), </w:t>
+      </w:r>
+      <w:r>
+        <w:rPr>
+          <w:b/>
+        </w:rPr>
+        <w:t xml:space="preserve">Totale pagato dal cliente (ordine)</w:t>
+      </w:r>
+      <w:r>
+        <w:rPr>
+          <w:b/>
+        </w:rPr>
+        <w:t xml:space="preserve"> con la composizione «prodotti + consegna e altro» (25 € = 10 + 15), e — quando l'ordine ha più vendite, cioè più consegne, o quando il totale non coincide col prodotto — </w:t>
+      </w:r>
+      <w:r>
+        <w:rPr>
+          <w:b/>
+        </w:rPr>
+        <w:t xml:space="preserve">Attribuito a questa consegna</w:t>
+      </w:r>
+      <w:r>
+        <w:rPr>
+          <w:b/>
+        </w:rPr>
+        <w:t xml:space="preserve">: il prodotto più la sua parte, in parti uguali, di consegna/extra/sconti. «Resta a Deluxy», la percentuale, la paga del valet e il margine dopo il valet si calcolano su quel numero. Se Orders non risponde, il conto usa il solo prodotto e la scheda lo dice. Stessa regola per le righe rosse in tabella (margine &lt; 5 %): una mappa di Orders per pagina e una groupBy delle vendite per ordine.</w:t>
       </w:r>
       <w:r>
         <w:rPr>

</xml_diff>

<commit_message>
Prodotti del partner: il nome è il nome partner; verso Merchandising da approvare (prototipo) e poi su Shopify; manuale 120
Co-Authored-By: Claude Fable 5.1 <noreply@anthropic.com>
</commit_message>
<xml_diff>
--- a/deluxy-platform-next/docs/COME-FUNZIONA-APP-DELUXY.docx
+++ b/deluxy-platform-next/docs/COME-FUNZIONA-APP-DELUXY.docx
@@ -169,6 +169,144 @@
           <w:b/>
         </w:rPr>
         <w:t xml:space="preserve">Changelog</w:t>
+      </w:r>
+      <w:r>
+        <w:rPr>
+          <w:b/>
+        </w:rPr>
+        <w:t xml:space="preserve">11/09/2026 (120) — </w:t>
+      </w:r>
+      <w:r>
+        <w:rPr>
+          <w:b/>
+        </w:rPr>
+        <w:t xml:space="preserve">Il giro del prodotto creato dal partner</w:t>
+      </w:r>
+      <w:r>
+        <w:rPr>
+          <w:b/>
+        </w:rPr>
+        <w:t xml:space="preserve"> (regola utente: «quando un partner crea il proprio prodotto il nome che mette è il nome partner; il prodotto finisce in Merchandising con nome uguale a quello del partner e sarà da approvare; se viene approvato finisce su Shopify»). (1) </w:t>
+      </w:r>
+      <w:r>
+        <w:rPr>
+          <w:b/>
+        </w:rPr>
+        <w:t xml:space="preserve">Piattaforma</w:t>
+      </w:r>
+      <w:r>
+        <w:rPr>
+          <w:b/>
+        </w:rPr>
+        <w:t xml:space="preserve">: il nome scritto dal partner diventa anche il suo «nome partner» (</w:t>
+      </w:r>
+      <w:r>
+        <w:rPr>
+          <w:b/>
+        </w:rPr>
+        <w:t xml:space="preserve">alternateName</w:t>
+      </w:r>
+      <w:r>
+        <w:rPr>
+          <w:b/>
+        </w:rPr>
+        <w:t xml:space="preserve">, acceso): resta suo anche quando il prodotto prenderà il nome commerciale; sotto il campo Nome il partner legge cosa succede. (2) </w:t>
+      </w:r>
+      <w:r>
+        <w:rPr>
+          <w:b/>
+        </w:rPr>
+        <w:t xml:space="preserve">Verso Merchandising</w:t>
+      </w:r>
+      <w:r>
+        <w:rPr>
+          <w:b/>
+        </w:rPr>
+        <w:t xml:space="preserve">: il prodotto nato dal partner parte con </w:t>
+      </w:r>
+      <w:r>
+        <w:rPr>
+          <w:b/>
+        </w:rPr>
+        <w:t xml:space="preserve">origine: partner</w:t>
+      </w:r>
+      <w:r>
+        <w:rPr>
+          <w:b/>
+        </w:rPr>
+        <w:t xml:space="preserve">, </w:t>
+      </w:r>
+      <w:r>
+        <w:rPr>
+          <w:b/>
+        </w:rPr>
+        <w:t xml:space="preserve">nomePartner</w:t>
+      </w:r>
+      <w:r>
+        <w:rPr>
+          <w:b/>
+        </w:rPr>
+        <w:t xml:space="preserve"> = il suo nome, fase </w:t>
+      </w:r>
+      <w:r>
+        <w:rPr>
+          <w:b/>
+        </w:rPr>
+        <w:t xml:space="preserve">«prototipo»</w:t>
+      </w:r>
+      <w:r>
+        <w:rPr>
+          <w:b/>
+        </w:rPr>
+        <w:t xml:space="preserve"> (da approvare) e una nota di sviluppo «Creato dal partner … dalla piattaforma il …: DA APPROVARE». Quelli creati dall'ufficio partono come prima. L'API di Merchandising accetta </w:t>
+      </w:r>
+      <w:r>
+        <w:rPr>
+          <w:b/>
+        </w:rPr>
+        <w:t xml:space="preserve">nomePartner</w:t>
+      </w:r>
+      <w:r>
+        <w:rPr>
+          <w:b/>
+        </w:rPr>
+        <w:t xml:space="preserve">, </w:t>
+      </w:r>
+      <w:r>
+        <w:rPr>
+          <w:b/>
+        </w:rPr>
+        <w:t xml:space="preserve">nomePartnerAttivo</w:t>
+      </w:r>
+      <w:r>
+        <w:rPr>
+          <w:b/>
+        </w:rPr>
+        <w:t xml:space="preserve">, </w:t>
+      </w:r>
+      <w:r>
+        <w:rPr>
+          <w:b/>
+        </w:rPr>
+        <w:t xml:space="preserve">noteSviluppo</w:t>
+      </w:r>
+      <w:r>
+        <w:rPr>
+          <w:b/>
+        </w:rPr>
+        <w:t xml:space="preserve"> (il nome partner non si cancella se un aggiornamento non lo manda). (3) </w:t>
+      </w:r>
+      <w:r>
+        <w:rPr>
+          <w:b/>
+        </w:rPr>
+        <w:t xml:space="preserve">Approvazione in Merchandising → Shopify</w:t>
+      </w:r>
+      <w:r>
+        <w:rPr>
+          <w:b/>
+        </w:rPr>
+        <w:t xml:space="preserve">: «Approvato» crea la scheda sul negozio in bozza, «Pubblico» la pubblica (regola del 09/09). Dalla scheda prodotto il tasto rapido «Approvato»/«Pubblico» su un prodotto non ancora sul negozio porta al modulo Modifica con la fase già scelta: si controllano negozio, prezzi, foto e campi e si salva — è il salvataggio che lo manda su Shopify. Chi è già sul negozio cambia solo fase.</w:t>
       </w:r>
       <w:r>
         <w:rPr>

</xml_diff>

<commit_message>
Capogruppo: se fattura lui i dati di fatturazione del partner sono i suoi e non si modificano (server + modulo); sezione Capogruppi (elenco, modifica, nuovo); manuale 121-122
Co-Authored-By: Claude Fable 5.1 <noreply@anthropic.com>
</commit_message>
<xml_diff>
--- a/deluxy-platform-next/docs/COME-FUNZIONA-APP-DELUXY.docx
+++ b/deluxy-platform-next/docs/COME-FUNZIONA-APP-DELUXY.docx
@@ -169,6 +169,66 @@
           <w:b/>
         </w:rPr>
         <w:t xml:space="preserve">Changelog</w:t>
+      </w:r>
+      <w:r>
+        <w:rPr>
+          <w:b/>
+        </w:rPr>
+        <w:t xml:space="preserve">11/09/2026 (122) — </w:t>
+      </w:r>
+      <w:r>
+        <w:rPr>
+          <w:b/>
+        </w:rPr>
+        <w:t xml:space="preserve">Sezione «Capogruppi»</w:t>
+      </w:r>
+      <w:r>
+        <w:rPr>
+          <w:b/>
+        </w:rPr>
+        <w:t xml:space="preserve"> (regola utente: «in partner metti una sezione Capogruppo dove si possono visualizzare e modificare»). Nuova voce di menu accanto a Partner (anche bottone «Capogruppi» nell'elenco partner e link dal modulo): tabella dei capogruppi con ragione sociale, P.IVA, SDI, PEC, le sedi (chip col nome; «↑» = fattura il capogruppo, link alla scheda) e il collegamento al registro; «Modifica» apre la riga con ragione sociale, P.IVA, codice fiscale, SDI, PEC, email fatture, note; «+ Nuovo capogruppo». Rotte già esistenti </w:t>
+      </w:r>
+      <w:r>
+        <w:rPr>
+          <w:b/>
+        </w:rPr>
+        <w:t xml:space="preserve">GET/POST/PATCH /capogruppi</w:t>
+      </w:r>
+      <w:r>
+        <w:rPr>
+          <w:b/>
+        </w:rPr>
+        <w:t xml:space="preserve">. Salvando, i dati si riscrivono su tutte le sedi che fatturano sotto quel capogruppo (vedi 121).</w:t>
+      </w:r>
+      <w:r>
+        <w:rPr>
+          <w:b/>
+        </w:rPr>
+        <w:t xml:space="preserve">11/09/2026 (121) — </w:t>
+      </w:r>
+      <w:r>
+        <w:rPr>
+          <w:b/>
+        </w:rPr>
+        <w:t xml:space="preserve">Se fattura il capogruppo, i dati di fatturazione sono i suoi e non si modificano</w:t>
+      </w:r>
+      <w:r>
+        <w:rPr>
+          <w:b/>
+        </w:rPr>
+        <w:t xml:space="preserve"> (regole utente: «la partita IVA del partner diventa la stessa del capogruppo e non è modificabile», «se i dati sono già inseriti i dati di fatturazione non sono modificabili»). Con un capogruppo scelto e «paga da sé» spento: ragione sociale, P.IVA, codice fiscale, SDI, PEC ed email fatture del partner sono quelli del capogruppo — nel modulo i campi mostrano i valori del capogruppo e sono chiusi (solo quelli che il capogruppo ha compilati; gli altri restano del partner), con l'avviso «Fattura il capogruppo: … non si modificano qui» e il link a Capogruppi. Il server la impone comunque: creazione, modifica (anche una che non tocca il capogruppo: si guarda com'è il partner dopo), «Sotto un'altra entità di fatturazione», rispecchio dal registro. Cambiando i dati del capogruppo (pagina Capogruppi o </w:t>
+      </w:r>
+      <w:r>
+        <w:rPr>
+          <w:b/>
+        </w:rPr>
+        <w:t xml:space="preserve">PATCH /capogruppi/:id</w:t>
+      </w:r>
+      <w:r>
+        <w:rPr>
+          <w:b/>
+        </w:rPr>
+        <w:t xml:space="preserve">) cambiano su tutte le sedi che fatturano sotto di lui. Rimettendo «paga da sé», i campi tornano modificabili. L'IBAN resta del partner (in piattaforma il capogruppo non lo porta; Finance lo legge dal registro).</w:t>
       </w:r>
       <w:r>
         <w:rPr>

</xml_diff>

<commit_message>
Partner: «Disattiva / Riattiva» anche in tabella, con conferma; manuale 123
Co-Authored-By: Claude Fable 5.1 <noreply@anthropic.com>
</commit_message>
<xml_diff>
--- a/deluxy-platform-next/docs/COME-FUNZIONA-APP-DELUXY.docx
+++ b/deluxy-platform-next/docs/COME-FUNZIONA-APP-DELUXY.docx
@@ -169,6 +169,48 @@
           <w:b/>
         </w:rPr>
         <w:t xml:space="preserve">Changelog</w:t>
+      </w:r>
+      <w:r>
+        <w:rPr>
+          <w:b/>
+        </w:rPr>
+        <w:t xml:space="preserve">11/09/2026 (123) — </w:t>
+      </w:r>
+      <w:r>
+        <w:rPr>
+          <w:b/>
+        </w:rPr>
+        <w:t xml:space="preserve">«Disattiva» anche nella tabella Partner</w:t>
+      </w:r>
+      <w:r>
+        <w:rPr>
+          <w:b/>
+        </w:rPr>
+        <w:t xml:space="preserve"> (regola utente). Nella colonna Azioni, fra «Modifica» ed «Elimina», il bottone «Disattiva» (con conferma: «non riceverà più proposte e sparisce dalle liste di lavoro; si può riattivare») che su un partner disattivato diventa «Riattiva». Stesse rotte della scheda (</w:t>
+      </w:r>
+      <w:r>
+        <w:rPr>
+          <w:b/>
+        </w:rPr>
+        <w:t xml:space="preserve">PATCH /partners/:id/disattiva</w:t>
+      </w:r>
+      <w:r>
+        <w:rPr>
+          <w:b/>
+        </w:rPr>
+        <w:t xml:space="preserve"> e </w:t>
+      </w:r>
+      <w:r>
+        <w:rPr>
+          <w:b/>
+        </w:rPr>
+        <w:t xml:space="preserve">/attiva</w:t>
+      </w:r>
+      <w:r>
+        <w:rPr>
+          <w:b/>
+        </w:rPr>
+        <w:t xml:space="preserve">); la riga si aggiorna senza ricaricare.</w:t>
       </w:r>
       <w:r>
         <w:rPr>

</xml_diff>

<commit_message>
Consegne: il partner vede il nome partner del prodotto anche nel dettaglio; nomi partner specchiati da Merchandising (3.005); manuale 124
Co-Authored-By: Claude Fable 5.1 <noreply@anthropic.com>
</commit_message>
<xml_diff>
--- a/deluxy-platform-next/docs/COME-FUNZIONA-APP-DELUXY.docx
+++ b/deluxy-platform-next/docs/COME-FUNZIONA-APP-DELUXY.docx
@@ -169,6 +169,48 @@
           <w:b/>
         </w:rPr>
         <w:t xml:space="preserve">Changelog</w:t>
+      </w:r>
+      <w:r>
+        <w:rPr>
+          <w:b/>
+        </w:rPr>
+        <w:t xml:space="preserve">11/09/2026 (124) — </w:t>
+      </w:r>
+      <w:r>
+        <w:rPr>
+          <w:b/>
+        </w:rPr>
+        <w:t xml:space="preserve">Il nome partner del prodotto anche nella consegna</w:t>
+      </w:r>
+      <w:r>
+        <w:rPr>
+          <w:b/>
+        </w:rPr>
+        <w:t xml:space="preserve"> (segnalazione utente: «come mai Clivati non vede il nome aggiornato su questa?»). Due cause. (1) I nomi partner non erano MAI arrivati in piattaforma: 0 prodotti su 16.528 avevano il «nome per il partner», perché «allinea note» in Impostazioni non era stato lanciato. Lanciato l'11/09 con </w:t>
+      </w:r>
+      <w:r>
+        <w:rPr>
+          <w:b/>
+        </w:rPr>
+        <w:t xml:space="preserve">api/scripts/nomi-partner-da-merchandising.mjs</w:t>
+      </w:r>
+      <w:r>
+        <w:rPr>
+          <w:b/>
+        </w:rPr>
+        <w:t xml:space="preserve"> (stessa regola del bottone, solo i nomi): 3.005 prodotti scritti, di cui 198 con un nome partner diverso dal commerciale (es. «Sacher» → «Sacher Stefanelli», «Torta Porpora» → «Mousse Cioccolato e Lampone»). (2) Il dettaglio consegna mostrava al partner il nome commerciale: la sostituzione col nome partner valeva solo per catalogo e proposta (10/09). Ora vale anche nella consegna (</w:t>
+      </w:r>
+      <w:r>
+        <w:rPr>
+          <w:b/>
+        </w:rPr>
+        <w:t xml:space="preserve">soloIMieiSoldi</w:t>
+      </w:r>
+      <w:r>
+        <w:rPr>
+          <w:b/>
+        </w:rPr>
+        <w:t xml:space="preserve">, ruolo partner): il partner legge il suo nome, il commerciale non gli arriva. Ricordare: il nome partner si scrive in Merchandising («nome partner» del prodotto); in piattaforma arriva solo con «allinea note» in Impostazioni (o con lo script): il cron delle tipologie non porta i nomi.</w:t>
       </w:r>
       <w:r>
         <w:rPr>

</xml_diff>

<commit_message>
Modulo prodotto del partner: solo ciò che è suo (unico, categorie sue, niente Partner/Shopify/aggiuntivi/superprodotto/campi/prezzo pubblico); immagini e video dai propri file (prodotto e varianti) via Drive; manuale 125
Co-Authored-By: Claude Fable 5.1 <noreply@anthropic.com>
</commit_message>
<xml_diff>
--- a/deluxy-platform-next/docs/COME-FUNZIONA-APP-DELUXY.docx
+++ b/deluxy-platform-next/docs/COME-FUNZIONA-APP-DELUXY.docx
@@ -169,6 +169,144 @@
           <w:b/>
         </w:rPr>
         <w:t xml:space="preserve">Changelog</w:t>
+      </w:r>
+      <w:r>
+        <w:rPr>
+          <w:b/>
+        </w:rPr>
+        <w:t xml:space="preserve">11/09/2026 (125) — </w:t>
+      </w:r>
+      <w:r>
+        <w:rPr>
+          <w:b/>
+        </w:rPr>
+        <w:t xml:space="preserve">Il modulo prodotto del partner, ridotto a ciò che è suo</w:t>
+      </w:r>
+      <w:r>
+        <w:rPr>
+          <w:b/>
+        </w:rPr>
+        <w:t xml:space="preserve"> (otto regole utente dell'11/09). Per il ruolo PARTNER, in creazione e modifica: (1) </w:t>
+      </w:r>
+      <w:r>
+        <w:rPr>
+          <w:b/>
+        </w:rPr>
+        <w:t xml:space="preserve">Tipologia di vendita</w:t>
+      </w:r>
+      <w:r>
+        <w:rPr>
+          <w:b/>
+        </w:rPr>
+        <w:t xml:space="preserve"> nascosta — il suo prodotto è UNICO con tipologia «unico» (il modulo lo imposta, il server lo impone); (2) </w:t>
+      </w:r>
+      <w:r>
+        <w:rPr>
+          <w:b/>
+        </w:rPr>
+        <w:t xml:space="preserve">Categorie</w:t>
+      </w:r>
+      <w:r>
+        <w:rPr>
+          <w:b/>
+        </w:rPr>
+        <w:t xml:space="preserve">: solo quelle abilitate al partner nella sua scheda (se non ne ha, tutte); (3) </w:t>
+      </w:r>
+      <w:r>
+        <w:rPr>
+          <w:b/>
+        </w:rPr>
+        <w:t xml:space="preserve">Partner</w:t>
+      </w:r>
+      <w:r>
+        <w:rPr>
+          <w:b/>
+        </w:rPr>
+        <w:t xml:space="preserve"> nascosto: è lui che crea, lo mette il server; (4) </w:t>
+      </w:r>
+      <w:r>
+        <w:rPr>
+          <w:b/>
+        </w:rPr>
+        <w:t xml:space="preserve">scheda Shopify</w:t>
+      </w:r>
+      <w:r>
+        <w:rPr>
+          <w:b/>
+        </w:rPr>
+        <w:t xml:space="preserve"> nascosta (approvato, attivo, non fisico, prodotto app, piattaforme, descrizioni per piattaforma); (5) </w:t>
+      </w:r>
+      <w:r>
+        <w:rPr>
+          <w:b/>
+        </w:rPr>
+        <w:t xml:space="preserve">Partner aggiuntivi</w:t>
+      </w:r>
+      <w:r>
+        <w:rPr>
+          <w:b/>
+        </w:rPr>
+        <w:t xml:space="preserve"> e (6) </w:t>
+      </w:r>
+      <w:r>
+        <w:rPr>
+          <w:b/>
+        </w:rPr>
+        <w:t xml:space="preserve">Superprodotto</w:t>
+      </w:r>
+      <w:r>
+        <w:rPr>
+          <w:b/>
+        </w:rPr>
+        <w:t xml:space="preserve"> nascosti; (7) </w:t>
+      </w:r>
+      <w:r>
+        <w:rPr>
+          <w:b/>
+        </w:rPr>
+        <w:t xml:space="preserve">Campi personalizzati</w:t>
+      </w:r>
+      <w:r>
+        <w:rPr>
+          <w:b/>
+        </w:rPr>
+        <w:t xml:space="preserve"> nascosti; (8) </w:t>
+      </w:r>
+      <w:r>
+        <w:rPr>
+          <w:b/>
+        </w:rPr>
+        <w:t xml:space="preserve">prezzo pubblico</w:t>
+      </w:r>
+      <w:r>
+        <w:rPr>
+          <w:b/>
+        </w:rPr>
+        <w:t xml:space="preserve"> nascosto, sul prodotto e sulle varianti: «lo decidiamo noi» — resta il suo prezzo. In modifica il server scarta dal partner tipo, tipologia, partner, prezzo pubblico, superprodotto, visibilità agli altri partner, approvato/attivo/prodotto app. </w:t>
+      </w:r>
+      <w:r>
+        <w:rPr>
+          <w:b/>
+        </w:rPr>
+        <w:t xml:space="preserve">Immagini e video dai propri file</w:t>
+      </w:r>
+      <w:r>
+        <w:rPr>
+          <w:b/>
+        </w:rPr>
+        <w:t xml:space="preserve"> (per tutti, ufficio compreso): scheda «Immagini» a parte con «Carica dai tuoi file» (più file, immagini e video, 25 MB) e lo stesso bottone su ogni variante; il file va su Drive «File App» (</w:t>
+      </w:r>
+      <w:r>
+        <w:rPr>
+          <w:b/>
+        </w:rPr>
+        <w:t xml:space="preserve">POST /products/upload</w:t>
+      </w:r>
+      <w:r>
+        <w:rPr>
+          <w:b/>
+        </w:rPr>
+        <w:t xml:space="preserve">, come le ricevute) e qui resta il link; anteprime nel modulo e galleria con immagini e video nel dettaglio prodotto. Senza Drive collegato il caricamento dice che non si può.</w:t>
       </w:r>
       <w:r>
         <w:rPr>

</xml_diff>

<commit_message>
Elenco partner: aree di consegna al posto delle province; manuale 126
Co-Authored-By: Claude Fable 5.1 <noreply@anthropic.com>
</commit_message>
<xml_diff>
--- a/deluxy-platform-next/docs/COME-FUNZIONA-APP-DELUXY.docx
+++ b/deluxy-platform-next/docs/COME-FUNZIONA-APP-DELUXY.docx
@@ -169,6 +169,24 @@
           <w:b/>
         </w:rPr>
         <w:t xml:space="preserve">Changelog</w:t>
+      </w:r>
+      <w:r>
+        <w:rPr>
+          <w:b/>
+        </w:rPr>
+        <w:t xml:space="preserve">11/09/2026 (126) — </w:t>
+      </w:r>
+      <w:r>
+        <w:rPr>
+          <w:b/>
+        </w:rPr>
+        <w:t xml:space="preserve">Elenco partner: le aree di consegna al posto delle province</w:t>
+      </w:r>
+      <w:r>
+        <w:rPr>
+          <w:b/>
+        </w:rPr>
+        <w:t xml:space="preserve"> (regola utente, come già per i valet il 10/09). La colonna mostra le aree del partner (fino a 6, poi «+N» col tooltip); le province restano solo per chi non ha ancora un'area. La ricerca trova anche il nome dell'area.</w:t>
       </w:r>
       <w:r>
         <w:rPr>

</xml_diff>

<commit_message>
Drive: la cartella File App si puo incollare come link (upload prodotti non piu «File not found»); al partner niente «usa nome alternativo»; manuale 127
Co-Authored-By: Claude Opus 5 <noreply@anthropic.com>
</commit_message>
<xml_diff>
--- a/deluxy-platform-next/docs/COME-FUNZIONA-APP-DELUXY.docx
+++ b/deluxy-platform-next/docs/COME-FUNZIONA-APP-DELUXY.docx
@@ -169,6 +169,72 @@
           <w:b/>
         </w:rPr>
         <w:t xml:space="preserve">Changelog</w:t>
+      </w:r>
+      <w:r>
+        <w:rPr>
+          <w:b/>
+        </w:rPr>
+        <w:t xml:space="preserve">11/09/2026 (127) — </w:t>
+      </w:r>
+      <w:r>
+        <w:rPr>
+          <w:b/>
+        </w:rPr>
+        <w:t xml:space="preserve">La cartella di Drive si può incollare come link</w:t>
+      </w:r>
+      <w:r>
+        <w:rPr>
+          <w:b/>
+        </w:rPr>
+        <w:t xml:space="preserve"> (segnalazione utente: caricando l'immagine di un prodotto, «Drive rifiuta il caricamento: File not found: </w:t>
+      </w:r>
+      <w:r>
+        <w:rPr>
+          <w:b/>
+        </w:rPr>
+        <w:t xml:space="preserve">https://drive.google.com/drive/folders/1gZ5…»</w:t>
+      </w:r>
+      <w:r>
+        <w:rPr>
+          <w:b/>
+        </w:rPr>
+        <w:t xml:space="preserve">). In Impostazioni → File App il campo vuole l'</w:t>
+      </w:r>
+      <w:r>
+        <w:rPr>
+          <w:b/>
+        </w:rPr>
+        <w:t xml:space="preserve">id</w:t>
+      </w:r>
+      <w:r>
+        <w:rPr>
+          <w:b/>
+        </w:rPr>
+        <w:t xml:space="preserve"> della cartella, ma dal tasto «Condividi» di Drive si copia il </w:t>
+      </w:r>
+      <w:r>
+        <w:rPr>
+          <w:b/>
+        </w:rPr>
+        <w:t xml:space="preserve">link</w:t>
+      </w:r>
+      <w:r>
+        <w:rPr>
+          <w:b/>
+        </w:rPr>
+        <w:t xml:space="preserve">: chi lo incolla riceveva un errore a ogni caricamento. Ora l'id si ricava dal link (dal pezzo «/folders/…» o «?id=…»), e un id scritto a mano continua a valere. Vale per tutti i caricamenti su Drive: immagini e video dei prodotti, ricevute firmate, firme in app. </w:t>
+      </w:r>
+      <w:r>
+        <w:rPr>
+          <w:b/>
+        </w:rPr>
+        <w:t xml:space="preserve">Inoltre</w:t>
+      </w:r>
+      <w:r>
+        <w:rPr>
+          <w:b/>
+        </w:rPr>
+        <w:t xml:space="preserve">: al partner non si mostra più la spunta «usa nome alternativo» nel modulo prodotto — il nome che scrive È già il suo nome partner (regola dell'11/09).</w:t>
       </w:r>
       <w:r>
         <w:rPr>

</xml_diff>

<commit_message>
Stipendi: partner, orario, da pagare e plus da regola nel dettaglio (anche storico); Fatturazione: filtro per famiglia di servizio e venduto in tabella; consegne con stesso DDT allineate; manuale 128
Co-Authored-By: Claude Opus 5 <noreply@anthropic.com>
</commit_message>
<xml_diff>
--- a/deluxy-platform-next/docs/COME-FUNZIONA-APP-DELUXY.docx
+++ b/deluxy-platform-next/docs/COME-FUNZIONA-APP-DELUXY.docx
@@ -169,6 +169,120 @@
           <w:b/>
         </w:rPr>
         <w:t xml:space="preserve">Changelog</w:t>
+      </w:r>
+      <w:r>
+        <w:rPr>
+          <w:b/>
+        </w:rPr>
+        <w:t xml:space="preserve">11/09/2026 (128) — </w:t>
+      </w:r>
+      <w:r>
+        <w:rPr>
+          <w:b/>
+        </w:rPr>
+        <w:t xml:space="preserve">Quattro richieste dell'ufficio su Stipendi, Fatturazione e consegne correlate.</w:t>
+      </w:r>
+      <w:r>
+        <w:rPr>
+          <w:b/>
+        </w:rPr>
+        <w:t xml:space="preserve"> (1) </w:t>
+      </w:r>
+      <w:r>
+        <w:rPr>
+          <w:b/>
+        </w:rPr>
+        <w:t xml:space="preserve">Stipendi, dettaglio della consegna</w:t>
+      </w:r>
+      <w:r>
+        <w:rPr>
+          <w:b/>
+        </w:rPr>
+        <w:t xml:space="preserve">: nel pannello «Da pagare» e nel dettaglio di uno stipendio dello storico si leggono ora </w:t>
+      </w:r>
+      <w:r>
+        <w:rPr>
+          <w:b/>
+        </w:rPr>
+        <w:t xml:space="preserve">partner</w:t>
+      </w:r>
+      <w:r>
+        <w:rPr>
+          <w:b/>
+        </w:rPr>
+        <w:t xml:space="preserve">, </w:t>
+      </w:r>
+      <w:r>
+        <w:rPr>
+          <w:b/>
+        </w:rPr>
+        <w:t xml:space="preserve">orario di consegna</w:t>
+      </w:r>
+      <w:r>
+        <w:rPr>
+          <w:b/>
+        </w:rPr>
+        <w:t xml:space="preserve">, </w:t>
+      </w:r>
+      <w:r>
+        <w:rPr>
+          <w:b/>
+        </w:rPr>
+        <w:t xml:space="preserve">da pagare sì/no</w:t>
+      </w:r>
+      <w:r>
+        <w:rPr>
+          <w:b/>
+        </w:rPr>
+        <w:t xml:space="preserve"> (pillola verde o ambra) e, sotto i plus/minus, quanto di quella cifra arriva </w:t>
+      </w:r>
+      <w:r>
+        <w:rPr>
+          <w:b/>
+        </w:rPr>
+        <w:t xml:space="preserve">da una regola</w:t>
+      </w:r>
+      <w:r>
+        <w:rPr>
+          <w:b/>
+        </w:rPr>
+        <w:t xml:space="preserve">. (2) </w:t>
+      </w:r>
+      <w:r>
+        <w:rPr>
+          <w:b/>
+        </w:rPr>
+        <w:t xml:space="preserve">Fatturazione, filtro per macro servizio</w:t>
+      </w:r>
+      <w:r>
+        <w:rPr>
+          <w:b/>
+        </w:rPr>
+        <w:t xml:space="preserve">: le linguette «Tipologie di servizio» non elencano più i 40 servizi puntuali ma le cinque famiglie (prezzo fisso, a ora, vendita, magazzino, corporate); sceglierne una filtra tutti i servizi che le appartengono. (3) </w:t>
+      </w:r>
+      <w:r>
+        <w:rPr>
+          <w:b/>
+        </w:rPr>
+        <w:t xml:space="preserve">Fatturazione, il venduto nella riga della fattura</w:t>
+      </w:r>
+      <w:r>
+        <w:rPr>
+          <w:b/>
+        </w:rPr>
+        <w:t xml:space="preserve">: accanto a numero di consegne e imponibile c'è la colonna «Venduto» (solo le righe di vendita ne hanno uno), senza aprire il dettaglio. (4) </w:t>
+      </w:r>
+      <w:r>
+        <w:rPr>
+          <w:b/>
+        </w:rPr>
+        <w:t xml:space="preserve">Consegne con lo stesso DDT</w:t>
+      </w:r>
+      <w:r>
+        <w:rPr>
+          <w:b/>
+        </w:rPr>
+        <w:t xml:space="preserve">: la cella del prodotto ora c'è sempre — quando una consegna non aveva prodotti le colonne slittavano e le righe non erano più incolonnate; le celle lunghe si accorciano invece di sfondare la riga, e i riquadri dei legami (riconsegna, corporate) hanno lo stesso respiro delle altre schede.</w:t>
       </w:r>
       <w:r>
         <w:rPr>

</xml_diff>

<commit_message>
Script di sola lettura sulle paghe uguali ai chilometri; scheda valet con tabella che scorre e layout da telefono; manuale 129
Co-Authored-By: Claude Opus 5 <noreply@anthropic.com>
</commit_message>
<xml_diff>
--- a/deluxy-platform-next/docs/COME-FUNZIONA-APP-DELUXY.docx
+++ b/deluxy-platform-next/docs/COME-FUNZIONA-APP-DELUXY.docx
@@ -169,6 +169,36 @@
           <w:b/>
         </w:rPr>
         <w:t xml:space="preserve">Changelog</w:t>
+      </w:r>
+      <w:r>
+        <w:rPr>
+          <w:b/>
+        </w:rPr>
+        <w:t xml:space="preserve">11/09/2026 (129) — </w:t>
+      </w:r>
+      <w:r>
+        <w:rPr>
+          <w:b/>
+        </w:rPr>
+        <w:t xml:space="preserve">La lista Consegne non cade più sotto carico</w:t>
+      </w:r>
+      <w:r>
+        <w:rPr>
+          <w:b/>
+        </w:rPr>
+        <w:t xml:space="preserve"> (segnalazione utente: «Internal server error» sulla pagina Consegne). Nei log della funzione: «Timed out fetching a new connection from the connection pool (timeout 10, connection limit 3)». Il calcolo del margine introdotto il 10/09 faceva QUATTRO letture in parallelo a ogni pagina di Consegne: con un pool da tre connessioni se le prendeva tutte, e il resto della richiesta aspettava fino al timeout. Ora le stesse letture vanno in fila: una connessione per volta, qualche decina di millisecondi in più, nessun errore. Nella stessa mezz'ora è comparso anche un errore diverso — «max client connections reached, limit: 200» del pooler Supabase condiviso fra le app — rientrato da solo. </w:t>
+      </w:r>
+      <w:r>
+        <w:rPr>
+          <w:b/>
+        </w:rPr>
+        <w:t xml:space="preserve">Scheda valet</w:t>
+      </w:r>
+      <w:r>
+        <w:rPr>
+          <w:b/>
+        </w:rPr>
+        <w:t xml:space="preserve">: la tabella delle tariffe scorre dentro la scheda invece di allargarla, gli importi sono allineati a destra, e sul telefono etichette e valori si impilano.</w:t>
       </w:r>
       <w:r>
         <w:rPr>

</xml_diff>

<commit_message>
Stipendi: anticipo o extra si chiedono anche dalla riga del valet; manuale 130
Co-Authored-By: Claude Opus 5 <noreply@anthropic.com>
</commit_message>
<xml_diff>
--- a/deluxy-platform-next/docs/COME-FUNZIONA-APP-DELUXY.docx
+++ b/deluxy-platform-next/docs/COME-FUNZIONA-APP-DELUXY.docx
@@ -169,6 +169,24 @@
           <w:b/>
         </w:rPr>
         <w:t xml:space="preserve">Changelog</w:t>
+      </w:r>
+      <w:r>
+        <w:rPr>
+          <w:b/>
+        </w:rPr>
+        <w:t xml:space="preserve">11/09/2026 (130) — </w:t>
+      </w:r>
+      <w:r>
+        <w:rPr>
+          <w:b/>
+        </w:rPr>
+        <w:t xml:space="preserve">Anticipo o extra si chiedono anche da Stipendi</w:t>
+      </w:r>
+      <w:r>
+        <w:rPr>
+          <w:b/>
+        </w:rPr>
+        <w:t xml:space="preserve"> (regola utente). Nel pannello «Da pagare», sulla riga di ogni valet, accanto a «Dettaglio» e «Recap» c'è «Richiesta pagamento»: apre la stessa finestra della scheda valet — tipo («Anticipo, si scala dal prossimo stipendio» oppure «Extra concordato»), importo, causale — e manda la richiesta a Deluxy Transactions, dove una persona autorizza il bonifico. Prima di chiedere si legge l'IBAN del valet: senza IBAN il bottone d'invio resta spento, perché quei soldi devono arrivare da qualche parte. Stessa rotta e stesse regole di sempre (importo fino a 5.000 €, causale obbligatoria, solo ufficio): cambia solo il punto da cui si parte, che è la pagina dove si pagano gli stipendi.</w:t>
       </w:r>
       <w:r>
         <w:rPr>

</xml_diff>

<commit_message>
Consegne: margini presi dalla sezione Finanza (il conto fatto in casa dava numeri sbagliati); estrazione per Excel di tutte le consegne per ufficio e partner; manuale 131-132
Co-Authored-By: Claude Opus 5 <noreply@anthropic.com>
</commit_message>
<xml_diff>
--- a/deluxy-platform-next/docs/COME-FUNZIONA-APP-DELUXY.docx
+++ b/deluxy-platform-next/docs/COME-FUNZIONA-APP-DELUXY.docx
@@ -169,6 +169,150 @@
           <w:b/>
         </w:rPr>
         <w:t xml:space="preserve">Changelog</w:t>
+      </w:r>
+      <w:r>
+        <w:rPr>
+          <w:b/>
+        </w:rPr>
+        <w:t xml:space="preserve">11/09/2026 (132) — </w:t>
+      </w:r>
+      <w:r>
+        <w:rPr>
+          <w:b/>
+        </w:rPr>
+        <w:t xml:space="preserve">Estrazione per Excel di tutte le consegne</w:t>
+      </w:r>
+      <w:r>
+        <w:rPr>
+          <w:b/>
+        </w:rPr>
+        <w:t xml:space="preserve"> (regola utente), per l'ufficio e per il partner. In Consegne, accanto a «Ricerca avanzata», il bottone «Esporta per Excel» scarica </w:t>
+      </w:r>
+      <w:r>
+        <w:rPr>
+          <w:b/>
+        </w:rPr>
+        <w:t xml:space="preserve">tutte</w:t>
+      </w:r>
+      <w:r>
+        <w:rPr>
+          <w:b/>
+        </w:rPr>
+        <w:t xml:space="preserve"> le consegne che i filtri selezionano — non solo la pagina a schermo — in un file che Excel apre con un doppio click. Le colonne: consegna, data, orario di consegna e di ritiro, stato, servizio, partner, destinatario, indirizzo, provincia, ritiro, prodotti, DDT, prezzo, plus/minus, fatturabile, fatturata; per l'ufficio anche valet, paga del valet, plus/minus del valet, «da pagare» e margine. Il partner scarica le sue consegne e non riceve i numeri che non lo riguardano, esattamente come in tabella. Oltre 20.000 righe l'estrazione si ferma e lo dice: si restringe il periodo.</w:t>
+      </w:r>
+      <w:r>
+        <w:rPr>
+          <w:b/>
+        </w:rPr>
+        <w:t xml:space="preserve">11/09/2026 (131) — </w:t>
+      </w:r>
+      <w:r>
+        <w:rPr>
+          <w:b/>
+        </w:rPr>
+        <w:t xml:space="preserve">I margini della consegna ora sono quelli della Finanza</w:t>
+      </w:r>
+      <w:r>
+        <w:rPr>
+          <w:b/>
+        </w:rPr>
+        <w:t xml:space="preserve"> (segnalazione utente: «questi margini son tutti sbagliati, controlla come calcola i margini la sezione Finanza e copia da lì»). Il riquadro del dettaglio faceva un conto suo: prezzo attribuito alla consegna meno «dovuto netto al partner», dove il dovuto nasceva dalle righe a prezzo partner e il prezzo dalla vendita. Due basi diverse nella stessa sottrazione: su un ordine sano usciva −4,20 €. Adesso il numero lo dà la </w:t>
+      </w:r>
+      <w:r>
+        <w:rPr>
+          <w:b/>
+        </w:rPr>
+        <w:t xml:space="preserve">sezione Finanza</w:t>
+      </w:r>
+      <w:r>
+        <w:rPr>
+          <w:b/>
+        </w:rPr>
+        <w:t xml:space="preserve">, che di quel conto è la proprietaria, e non è una formula ricopiata: la piattaforma chiama il suo codice. Il riquadro mostra quello che mostra la Finanza — </w:t>
+      </w:r>
+      <w:r>
+        <w:rPr>
+          <w:b/>
+        </w:rPr>
+        <w:t xml:space="preserve">pagato dal cliente</w:t>
+      </w:r>
+      <w:r>
+        <w:rPr>
+          <w:b/>
+        </w:rPr>
+        <w:t xml:space="preserve"> (prodotti + consegna, dall'ordine vero quando c'è, altrimenti stimato dal listino e dichiarato), </w:t>
+      </w:r>
+      <w:r>
+        <w:rPr>
+          <w:b/>
+        </w:rPr>
+        <w:t xml:space="preserve">pagato al partner</w:t>
+      </w:r>
+      <w:r>
+        <w:rPr>
+          <w:b/>
+        </w:rPr>
+        <w:t xml:space="preserve">, </w:t>
+      </w:r>
+      <w:r>
+        <w:rPr>
+          <w:b/>
+        </w:rPr>
+        <w:t xml:space="preserve">guadagno netto IVA</w:t>
+      </w:r>
+      <w:r>
+        <w:rPr>
+          <w:b/>
+        </w:rPr>
+        <w:t xml:space="preserve"> (col lordo e l'IVA sotto), </w:t>
+      </w:r>
+      <w:r>
+        <w:rPr>
+          <w:b/>
+        </w:rPr>
+        <w:t xml:space="preserve">quota fatturata al partner</w:t>
+      </w:r>
+      <w:r>
+        <w:rPr>
+          <w:b/>
+        </w:rPr>
+        <w:t xml:space="preserve">, </w:t>
+      </w:r>
+      <w:r>
+        <w:rPr>
+          <w:b/>
+        </w:rPr>
+        <w:t xml:space="preserve">costo della consegna</w:t>
+      </w:r>
+      <w:r>
+        <w:rPr>
+          <w:b/>
+        </w:rPr>
+        <w:t xml:space="preserve"> (paga del valet), </w:t>
+      </w:r>
+      <w:r>
+        <w:rPr>
+          <w:b/>
+        </w:rPr>
+        <w:t xml:space="preserve">commissione d'incasso</w:t>
+      </w:r>
+      <w:r>
+        <w:rPr>
+          <w:b/>
+        </w:rPr>
+        <w:t xml:space="preserve"> (zero dichiarato quando il metodo di pagamento non si sa) e infine il </w:t>
+      </w:r>
+      <w:r>
+        <w:rPr>
+          <w:b/>
+        </w:rPr>
+        <w:t xml:space="preserve">margine</w:t>
+      </w:r>
+      <w:r>
+        <w:rPr>
+          <w:b/>
+        </w:rPr>
+        <w:t xml:space="preserve"> con la percentuale. Se l'ordine ha più consegne il margine è dell'ordine, e la scheda lo dice. Stessa regola per le righe rosse in tabella (margine sotto il 5 %), che ora costano due letture per pagina invece di quattro per riga.</w:t>
       </w:r>
       <w:r>
         <w:rPr>

</xml_diff>

<commit_message>
Quattro richieste: luogo della consegna salvato, allegati in chat e filo che si apre da solo, estrazione Excel piu leggera; manuale 133-135
Co-Authored-By: Claude Opus 5 <noreply@anthropic.com>
</commit_message>
<xml_diff>
--- a/deluxy-platform-next/docs/COME-FUNZIONA-APP-DELUXY.docx
+++ b/deluxy-platform-next/docs/COME-FUNZIONA-APP-DELUXY.docx
@@ -174,6 +174,108 @@
         <w:rPr>
           <w:b/>
         </w:rPr>
+        <w:t xml:space="preserve">11/09/2026 (135) — </w:t>
+      </w:r>
+      <w:r>
+        <w:rPr>
+          <w:b/>
+        </w:rPr>
+        <w:t xml:space="preserve">Chat: si allega un'immagine, e per l'ufficio il filo si apre da solo</w:t>
+      </w:r>
+      <w:r>
+        <w:rPr>
+          <w:b/>
+        </w:rPr>
+        <w:t xml:space="preserve"> (regole utente). Nel pannello della chat, accanto a «Invia», la graffetta carica un'immagine (o un PDF, fino a 10 MB): il file va su Drive «File App» e nel messaggio resta il link, che chi legge vede come anteprima e può aprire a schermo intero. Rotta </w:t>
+      </w:r>
+      <w:r>
+        <w:rPr>
+          <w:b/>
+        </w:rPr>
+        <w:t xml:space="preserve">POST /chat/allegato</w:t>
+      </w:r>
+      <w:r>
+        <w:rPr>
+          <w:b/>
+        </w:rPr>
+        <w:t xml:space="preserve">; nessuna colonna nuova sul database. </w:t>
+      </w:r>
+      <w:r>
+        <w:rPr>
+          <w:b/>
+        </w:rPr>
+        <w:t xml:space="preserve">E l'apertura diretta</w:t>
+      </w:r>
+      <w:r>
+        <w:rPr>
+          <w:b/>
+        </w:rPr>
+        <w:t xml:space="preserve">: quando l'ufficio apre la chat e c'è una sola conversazione con messaggi da leggere, entra subito in quella; se ce ne sono due o più resta l'elenco, perché da chi cominciare lo decide chi lavora.</w:t>
+      </w:r>
+      <w:r>
+        <w:rPr>
+          <w:b/>
+        </w:rPr>
+        <w:t xml:space="preserve">11/09/2026 (134) — </w:t>
+      </w:r>
+      <w:r>
+        <w:rPr>
+          <w:b/>
+        </w:rPr>
+        <w:t xml:space="preserve">Il luogo della consegna, riempito da solo</w:t>
+      </w:r>
+      <w:r>
+        <w:rPr>
+          <w:b/>
+        </w:rPr>
+        <w:t xml:space="preserve"> (regola utente: «metti anche un campo che si riempie automaticamente dove si vede il luogo che è stato ricercato — in questo caso era un hotel»). Scegliendo l'indirizzo su Google, se è un POSTO con un nome («Hotel Da Vinci Milano», «Ospedale Niguarda»), il modulo scrive quel nome nel campo </w:t>
+      </w:r>
+      <w:r>
+        <w:rPr>
+          <w:b/>
+        </w:rPr>
+        <w:t xml:space="preserve">Luogo</w:t>
+      </w:r>
+      <w:r>
+        <w:rPr>
+          <w:b/>
+        </w:rPr>
+        <w:t xml:space="preserve">, sotto l'indirizzo del destinatario. Si può correggere a mano e non viene sovrascritto. Il luogo si salva sulla consegna (colonna </w:t>
+      </w:r>
+      <w:r>
+        <w:rPr>
+          <w:b/>
+        </w:rPr>
+        <w:t xml:space="preserve">recipientPlace</w:t>
+      </w:r>
+      <w:r>
+        <w:rPr>
+          <w:b/>
+        </w:rPr>
+        <w:t xml:space="preserve">, aggiunta in produzione l'11/09), si legge nella scheda accanto all'indirizzo e finisce nell'estrazione per Excel. Serve al valet prima di partire: a un hotel si passa dalla reception, a una casa si suona il citofono.</w:t>
+      </w:r>
+      <w:r>
+        <w:rPr>
+          <w:b/>
+        </w:rPr>
+        <w:t xml:space="preserve">11/09/2026 (133) — </w:t>
+      </w:r>
+      <w:r>
+        <w:rPr>
+          <w:b/>
+        </w:rPr>
+        <w:t xml:space="preserve">Customer Service: la quantità è quella del prodotto principale</w:t>
+      </w:r>
+      <w:r>
+        <w:rPr>
+          <w:b/>
+        </w:rPr>
+        <w:t xml:space="preserve"> (regola utente, dopo il caso dell'ordine 1820). Il modulo «Manda in app» proponeva la quantità della PRIMA riga dell'ordine: sui negozi che modellano i supplementi come righe da un euro («Extra» 35 × 1,00 €) arrivava 35, e con un prezzo concordato di 80 € la consegna nasceva con 2.800 € di merce. Ora si guarda la riga che pesa di più sull'ordine (prezzo × quantità) — la torta, non il supplemento — e da lì si prendono prodotto, descrizione e quantità. Le tre consegne già nate così (#101230, #101207, #101229) restano da correggere a mano.</w:t>
+      </w:r>
+      <w:r>
+        <w:rPr>
+          <w:b/>
+        </w:rPr>
         <w:t xml:space="preserve">11/09/2026 (132) — </w:t>
       </w:r>
       <w:r>
@@ -198,7 +300,7 @@
         <w:rPr>
           <w:b/>
         </w:rPr>
-        <w:t xml:space="preserve"> le consegne che i filtri selezionano — non solo la pagina a schermo — in un file che Excel apre con un doppio click. Le colonne: consegna, data, orario di consegna e di ritiro, stato, servizio, partner, destinatario, indirizzo, provincia, ritiro, prodotti, DDT, prezzo, plus/minus, fatturabile, fatturata; per l'ufficio anche valet, paga del valet, plus/minus del valet, «da pagare» e margine. Il partner scarica le sue consegne e non riceve i numeri che non lo riguardano, esattamente come in tabella. Oltre 20.000 righe l'estrazione si ferma e lo dice: si restringe il periodo.</w:t>
+        <w:t xml:space="preserve"> le consegne che i filtri selezionano — non solo la pagina a schermo — in un file che Excel apre con un doppio click. Le colonne: consegna, data, orario di consegna e di ritiro, stato, servizio, partner, destinatario, indirizzo, provincia, ritiro, prodotti, DDT, prezzo, plus/minus, fatturabile, fatturata; per l'ufficio anche valet, paga del valet, plus/minus del valet, «da pagare» e margine. Il partner scarica le sue consegne e non riceve i numeri che non lo riguardano, esattamente come in tabella. Oltre 20.000 righe l'estrazione si ferma e lo dice: si restringe il periodo. ⚡ L'estrazione salta i calcoli che servono solo a schermo (margini, puntualità, aggancio delle vendite): senza, restava ferma su «Preparo il file» anche per settanta righe.</w:t>
       </w:r>
       <w:r>
         <w:rPr>

</xml_diff>